<commit_message>
docs(ciclo-v2): 작업 보고서 폰트를 Pretendard 로
사이트 본문과 같은 폰트로 맞췄다. docx-js 는 문자열 하나로 rFonts 의
ascii·hAnsi·cs·eastAsia 네 슬롯을 모두 채우므로 한글도 함께 잡힌다
(Word 는 한글을 eastAsia 슬롯으로 고르기 때문에 이 부분을 확인했다).

검증: document.xml·styles.xml 에 쓰이는 폰트 'Pretendard' 하나뿐
      맑은 고딕 잔존 0 · 런 414개 전부 폰트 지정
      표 너비 9026 = A4 본문 폭 · 넘침 0 · 음영 clear · 깨진 문자 0

※ 읽는 PC 에 Pretendard 가 설치돼 있어야 그대로 보인다. 폰트 파일을 문서에
  임베드하면 설치 없이도 되지만, 이 환경은 폰트 CDN 이 막혀 있어 원본
  ttf/otf 를 받을 수 없었다.

Co-Authored-By: Claude Opus 5 <noreply@anthropic.com>
Claude-Session: https://claude.ai/code/session_01WexMN5qMzsTVufd77zVtDk
</commit_message>
<xml_diff>
--- a/ciclo-v2/씨클로-홈페이지-v2-작업보고서.docx
+++ b/ciclo-v2/씨클로-홈페이지-v2-작업보고서.docx
@@ -13,7 +13,7 @@
       </w:pPr>
       <w:r>
         <w:rPr>
-          <w:rFonts w:ascii="맑은 고딕" w:cs="맑은 고딕" w:eastAsia="맑은 고딕" w:hAnsi="맑은 고딕"/>
+          <w:rFonts w:ascii="Pretendard" w:cs="Pretendard" w:eastAsia="Pretendard" w:hAnsi="Pretendard"/>
           <w:b/>
           <w:bCs/>
           <w:color w:val="1A1A1A"/>
@@ -32,7 +32,7 @@
       </w:pPr>
       <w:r>
         <w:rPr>
-          <w:rFonts w:ascii="맑은 고딕" w:cs="맑은 고딕" w:eastAsia="맑은 고딕" w:hAnsi="맑은 고딕"/>
+          <w:rFonts w:ascii="Pretendard" w:cs="Pretendard" w:eastAsia="Pretendard" w:hAnsi="Pretendard"/>
           <w:b/>
           <w:bCs/>
           <w:color w:val="111E6C"/>
@@ -48,7 +48,7 @@
       </w:pPr>
       <w:r>
         <w:rPr>
-          <w:rFonts w:ascii="맑은 고딕" w:cs="맑은 고딕" w:eastAsia="맑은 고딕" w:hAnsi="맑은 고딕"/>
+          <w:rFonts w:ascii="Pretendard" w:cs="Pretendard" w:eastAsia="Pretendard" w:hAnsi="Pretendard"/>
           <w:color w:val="5C5C5C"/>
           <w:sz w:val="22"/>
           <w:szCs w:val="22"/>
@@ -94,7 +94,7 @@
             </w:pPr>
             <w:r>
               <w:rPr>
-                <w:rFonts w:ascii="맑은 고딕" w:cs="맑은 고딕" w:eastAsia="맑은 고딕" w:hAnsi="맑은 고딕"/>
+                <w:rFonts w:ascii="Pretendard" w:cs="Pretendard" w:eastAsia="Pretendard" w:hAnsi="Pretendard"/>
                 <w:b/>
                 <w:bCs/>
                 <w:color w:val="FFFFFF"/>
@@ -123,7 +123,7 @@
             </w:pPr>
             <w:r>
               <w:rPr>
-                <w:rFonts w:ascii="맑은 고딕" w:cs="맑은 고딕" w:eastAsia="맑은 고딕" w:hAnsi="맑은 고딕"/>
+                <w:rFonts w:ascii="Pretendard" w:cs="Pretendard" w:eastAsia="Pretendard" w:hAnsi="Pretendard"/>
                 <w:b/>
                 <w:bCs/>
                 <w:color w:val="FFFFFF"/>
@@ -156,7 +156,7 @@
             </w:pPr>
             <w:r>
               <w:rPr>
-                <w:rFonts w:ascii="맑은 고딕" w:cs="맑은 고딕" w:eastAsia="맑은 고딕" w:hAnsi="맑은 고딕"/>
+                <w:rFonts w:ascii="Pretendard" w:cs="Pretendard" w:eastAsia="Pretendard" w:hAnsi="Pretendard"/>
                 <w:b w:val="false"/>
                 <w:bCs w:val="false"/>
                 <w:color w:val="1A1A1A"/>
@@ -184,7 +184,7 @@
             </w:pPr>
             <w:r>
               <w:rPr>
-                <w:rFonts w:ascii="맑은 고딕" w:cs="맑은 고딕" w:eastAsia="맑은 고딕" w:hAnsi="맑은 고딕"/>
+                <w:rFonts w:ascii="Pretendard" w:cs="Pretendard" w:eastAsia="Pretendard" w:hAnsi="Pretendard"/>
                 <w:b w:val="false"/>
                 <w:bCs w:val="false"/>
                 <w:color w:val="1A1A1A"/>
@@ -217,7 +217,7 @@
             </w:pPr>
             <w:r>
               <w:rPr>
-                <w:rFonts w:ascii="맑은 고딕" w:cs="맑은 고딕" w:eastAsia="맑은 고딕" w:hAnsi="맑은 고딕"/>
+                <w:rFonts w:ascii="Pretendard" w:cs="Pretendard" w:eastAsia="Pretendard" w:hAnsi="Pretendard"/>
                 <w:b w:val="false"/>
                 <w:bCs w:val="false"/>
                 <w:color w:val="1A1A1A"/>
@@ -245,7 +245,7 @@
             </w:pPr>
             <w:r>
               <w:rPr>
-                <w:rFonts w:ascii="맑은 고딕" w:cs="맑은 고딕" w:eastAsia="맑은 고딕" w:hAnsi="맑은 고딕"/>
+                <w:rFonts w:ascii="Pretendard" w:cs="Pretendard" w:eastAsia="Pretendard" w:hAnsi="Pretendard"/>
                 <w:b w:val="false"/>
                 <w:bCs w:val="false"/>
                 <w:color w:val="1A1A1A"/>
@@ -278,7 +278,7 @@
             </w:pPr>
             <w:r>
               <w:rPr>
-                <w:rFonts w:ascii="맑은 고딕" w:cs="맑은 고딕" w:eastAsia="맑은 고딕" w:hAnsi="맑은 고딕"/>
+                <w:rFonts w:ascii="Pretendard" w:cs="Pretendard" w:eastAsia="Pretendard" w:hAnsi="Pretendard"/>
                 <w:b w:val="false"/>
                 <w:bCs w:val="false"/>
                 <w:color w:val="1A1A1A"/>
@@ -306,7 +306,7 @@
             </w:pPr>
             <w:r>
               <w:rPr>
-                <w:rFonts w:ascii="맑은 고딕" w:cs="맑은 고딕" w:eastAsia="맑은 고딕" w:hAnsi="맑은 고딕"/>
+                <w:rFonts w:ascii="Pretendard" w:cs="Pretendard" w:eastAsia="Pretendard" w:hAnsi="Pretendard"/>
                 <w:b w:val="false"/>
                 <w:bCs w:val="false"/>
                 <w:color w:val="1A1A1A"/>
@@ -339,7 +339,7 @@
             </w:pPr>
             <w:r>
               <w:rPr>
-                <w:rFonts w:ascii="맑은 고딕" w:cs="맑은 고딕" w:eastAsia="맑은 고딕" w:hAnsi="맑은 고딕"/>
+                <w:rFonts w:ascii="Pretendard" w:cs="Pretendard" w:eastAsia="Pretendard" w:hAnsi="Pretendard"/>
                 <w:b w:val="false"/>
                 <w:bCs w:val="false"/>
                 <w:color w:val="1A1A1A"/>
@@ -367,7 +367,7 @@
             </w:pPr>
             <w:r>
               <w:rPr>
-                <w:rFonts w:ascii="맑은 고딕" w:cs="맑은 고딕" w:eastAsia="맑은 고딕" w:hAnsi="맑은 고딕"/>
+                <w:rFonts w:ascii="Pretendard" w:cs="Pretendard" w:eastAsia="Pretendard" w:hAnsi="Pretendard"/>
                 <w:b w:val="false"/>
                 <w:bCs w:val="false"/>
                 <w:color w:val="1A1A1A"/>
@@ -400,7 +400,7 @@
             </w:pPr>
             <w:r>
               <w:rPr>
-                <w:rFonts w:ascii="맑은 고딕" w:cs="맑은 고딕" w:eastAsia="맑은 고딕" w:hAnsi="맑은 고딕"/>
+                <w:rFonts w:ascii="Pretendard" w:cs="Pretendard" w:eastAsia="Pretendard" w:hAnsi="Pretendard"/>
                 <w:b w:val="false"/>
                 <w:bCs w:val="false"/>
                 <w:color w:val="1A1A1A"/>
@@ -428,7 +428,7 @@
             </w:pPr>
             <w:r>
               <w:rPr>
-                <w:rFonts w:ascii="맑은 고딕" w:cs="맑은 고딕" w:eastAsia="맑은 고딕" w:hAnsi="맑은 고딕"/>
+                <w:rFonts w:ascii="Pretendard" w:cs="Pretendard" w:eastAsia="Pretendard" w:hAnsi="Pretendard"/>
                 <w:b w:val="false"/>
                 <w:bCs w:val="false"/>
                 <w:color w:val="1A1A1A"/>
@@ -453,7 +453,7 @@
       </w:pPr>
       <w:r>
         <w:rPr>
-          <w:rFonts w:ascii="맑은 고딕" w:cs="맑은 고딕" w:eastAsia="맑은 고딕" w:hAnsi="맑은 고딕"/>
+          <w:rFonts w:ascii="Pretendard" w:cs="Pretendard" w:eastAsia="Pretendard" w:hAnsi="Pretendard"/>
           <w:b/>
           <w:bCs/>
           <w:color w:val="111E6C"/>
@@ -469,7 +469,7 @@
       </w:pPr>
       <w:r>
         <w:rPr>
-          <w:rFonts w:ascii="맑은 고딕" w:cs="맑은 고딕" w:eastAsia="맑은 고딕" w:hAnsi="맑은 고딕"/>
+          <w:rFonts w:ascii="Pretendard" w:cs="Pretendard" w:eastAsia="Pretendard" w:hAnsi="Pretendard"/>
           <w:color w:val="1A1A1A"/>
           <w:sz w:val="20"/>
           <w:szCs w:val="20"/>
@@ -484,7 +484,7 @@
       </w:pPr>
       <w:r>
         <w:rPr>
-          <w:rFonts w:ascii="맑은 고딕" w:cs="맑은 고딕" w:eastAsia="맑은 고딕" w:hAnsi="맑은 고딕"/>
+          <w:rFonts w:ascii="Pretendard" w:cs="Pretendard" w:eastAsia="Pretendard" w:hAnsi="Pretendard"/>
           <w:b/>
           <w:bCs/>
           <w:color w:val="1A1A1A"/>
@@ -505,7 +505,7 @@
       </w:pPr>
       <w:r>
         <w:rPr>
-          <w:rFonts w:ascii="맑은 고딕" w:cs="맑은 고딕" w:eastAsia="맑은 고딕" w:hAnsi="맑은 고딕"/>
+          <w:rFonts w:ascii="Pretendard" w:cs="Pretendard" w:eastAsia="Pretendard" w:hAnsi="Pretendard"/>
           <w:color w:val="1A1A1A"/>
           <w:sz w:val="20"/>
           <w:szCs w:val="20"/>
@@ -514,7 +514,7 @@
       </w:r>
       <w:r>
         <w:rPr>
-          <w:rFonts w:ascii="맑은 고딕" w:cs="맑은 고딕" w:eastAsia="맑은 고딕" w:hAnsi="맑은 고딕"/>
+          <w:rFonts w:ascii="Pretendard" w:cs="Pretendard" w:eastAsia="Pretendard" w:hAnsi="Pretendard"/>
           <w:b/>
           <w:bCs/>
           <w:color w:val="1A1A1A"/>
@@ -525,7 +525,7 @@
       </w:r>
       <w:r>
         <w:rPr>
-          <w:rFonts w:ascii="맑은 고딕" w:cs="맑은 고딕" w:eastAsia="맑은 고딕" w:hAnsi="맑은 고딕"/>
+          <w:rFonts w:ascii="Pretendard" w:cs="Pretendard" w:eastAsia="Pretendard" w:hAnsi="Pretendard"/>
           <w:color w:val="1A1A1A"/>
           <w:sz w:val="20"/>
           <w:szCs w:val="20"/>
@@ -544,7 +544,7 @@
       </w:pPr>
       <w:r>
         <w:rPr>
-          <w:rFonts w:ascii="맑은 고딕" w:cs="맑은 고딕" w:eastAsia="맑은 고딕" w:hAnsi="맑은 고딕"/>
+          <w:rFonts w:ascii="Pretendard" w:cs="Pretendard" w:eastAsia="Pretendard" w:hAnsi="Pretendard"/>
           <w:color w:val="1A1A1A"/>
           <w:sz w:val="20"/>
           <w:szCs w:val="20"/>
@@ -553,7 +553,7 @@
       </w:r>
       <w:r>
         <w:rPr>
-          <w:rFonts w:ascii="맑은 고딕" w:cs="맑은 고딕" w:eastAsia="맑은 고딕" w:hAnsi="맑은 고딕"/>
+          <w:rFonts w:ascii="Pretendard" w:cs="Pretendard" w:eastAsia="Pretendard" w:hAnsi="Pretendard"/>
           <w:b/>
           <w:bCs/>
           <w:color w:val="1A1A1A"/>
@@ -564,7 +564,7 @@
       </w:r>
       <w:r>
         <w:rPr>
-          <w:rFonts w:ascii="맑은 고딕" w:cs="맑은 고딕" w:eastAsia="맑은 고딕" w:hAnsi="맑은 고딕"/>
+          <w:rFonts w:ascii="Pretendard" w:cs="Pretendard" w:eastAsia="Pretendard" w:hAnsi="Pretendard"/>
           <w:color w:val="1A1A1A"/>
           <w:sz w:val="20"/>
           <w:szCs w:val="20"/>
@@ -583,7 +583,7 @@
       </w:pPr>
       <w:r>
         <w:rPr>
-          <w:rFonts w:ascii="맑은 고딕" w:cs="맑은 고딕" w:eastAsia="맑은 고딕" w:hAnsi="맑은 고딕"/>
+          <w:rFonts w:ascii="Pretendard" w:cs="Pretendard" w:eastAsia="Pretendard" w:hAnsi="Pretendard"/>
           <w:color w:val="1A1A1A"/>
           <w:sz w:val="20"/>
           <w:szCs w:val="20"/>
@@ -592,7 +592,7 @@
       </w:r>
       <w:r>
         <w:rPr>
-          <w:rFonts w:ascii="맑은 고딕" w:cs="맑은 고딕" w:eastAsia="맑은 고딕" w:hAnsi="맑은 고딕"/>
+          <w:rFonts w:ascii="Pretendard" w:cs="Pretendard" w:eastAsia="Pretendard" w:hAnsi="Pretendard"/>
           <w:b/>
           <w:bCs/>
           <w:color w:val="1A1A1A"/>
@@ -603,7 +603,7 @@
       </w:r>
       <w:r>
         <w:rPr>
-          <w:rFonts w:ascii="맑은 고딕" w:cs="맑은 고딕" w:eastAsia="맑은 고딕" w:hAnsi="맑은 고딕"/>
+          <w:rFonts w:ascii="Pretendard" w:cs="Pretendard" w:eastAsia="Pretendard" w:hAnsi="Pretendard"/>
           <w:color w:val="1A1A1A"/>
           <w:sz w:val="20"/>
           <w:szCs w:val="20"/>
@@ -621,7 +621,7 @@
       </w:pPr>
       <w:r>
         <w:rPr>
-          <w:rFonts w:ascii="맑은 고딕" w:cs="맑은 고딕" w:eastAsia="맑은 고딕" w:hAnsi="맑은 고딕"/>
+          <w:rFonts w:ascii="Pretendard" w:cs="Pretendard" w:eastAsia="Pretendard" w:hAnsi="Pretendard"/>
           <w:b/>
           <w:bCs/>
           <w:color w:val="1A1A1A"/>
@@ -635,7 +635,7 @@
       </w:r>
       <w:r>
         <w:rPr>
-          <w:rFonts w:ascii="맑은 고딕" w:cs="맑은 고딕" w:eastAsia="맑은 고딕" w:hAnsi="맑은 고딕"/>
+          <w:rFonts w:ascii="Pretendard" w:cs="Pretendard" w:eastAsia="Pretendard" w:hAnsi="Pretendard"/>
           <w:color w:val="5C5C5C"/>
           <w:sz w:val="19"/>
           <w:szCs w:val="19"/>
@@ -655,7 +655,7 @@
       </w:pPr>
       <w:r>
         <w:rPr>
-          <w:rFonts w:ascii="맑은 고딕" w:cs="맑은 고딕" w:eastAsia="맑은 고딕" w:hAnsi="맑은 고딕"/>
+          <w:rFonts w:ascii="Pretendard" w:cs="Pretendard" w:eastAsia="Pretendard" w:hAnsi="Pretendard"/>
           <w:b/>
           <w:bCs/>
           <w:color w:val="111E6C"/>
@@ -671,7 +671,7 @@
       </w:pPr>
       <w:r>
         <w:rPr>
-          <w:rFonts w:ascii="맑은 고딕" w:cs="맑은 고딕" w:eastAsia="맑은 고딕" w:hAnsi="맑은 고딕"/>
+          <w:rFonts w:ascii="Pretendard" w:cs="Pretendard" w:eastAsia="Pretendard" w:hAnsi="Pretendard"/>
           <w:color w:val="1A1A1A"/>
           <w:sz w:val="20"/>
           <w:szCs w:val="20"/>
@@ -723,7 +723,7 @@
             </w:pPr>
             <w:r>
               <w:rPr>
-                <w:rFonts w:ascii="맑은 고딕" w:cs="맑은 고딕" w:eastAsia="맑은 고딕" w:hAnsi="맑은 고딕"/>
+                <w:rFonts w:ascii="Pretendard" w:cs="Pretendard" w:eastAsia="Pretendard" w:hAnsi="Pretendard"/>
                 <w:b/>
                 <w:bCs/>
                 <w:color w:val="FFFFFF"/>
@@ -752,7 +752,7 @@
             </w:pPr>
             <w:r>
               <w:rPr>
-                <w:rFonts w:ascii="맑은 고딕" w:cs="맑은 고딕" w:eastAsia="맑은 고딕" w:hAnsi="맑은 고딕"/>
+                <w:rFonts w:ascii="Pretendard" w:cs="Pretendard" w:eastAsia="Pretendard" w:hAnsi="Pretendard"/>
                 <w:b/>
                 <w:bCs/>
                 <w:color w:val="FFFFFF"/>
@@ -781,7 +781,7 @@
             </w:pPr>
             <w:r>
               <w:rPr>
-                <w:rFonts w:ascii="맑은 고딕" w:cs="맑은 고딕" w:eastAsia="맑은 고딕" w:hAnsi="맑은 고딕"/>
+                <w:rFonts w:ascii="Pretendard" w:cs="Pretendard" w:eastAsia="Pretendard" w:hAnsi="Pretendard"/>
                 <w:b/>
                 <w:bCs/>
                 <w:color w:val="FFFFFF"/>
@@ -814,7 +814,7 @@
             </w:pPr>
             <w:r>
               <w:rPr>
-                <w:rFonts w:ascii="맑은 고딕" w:cs="맑은 고딕" w:eastAsia="맑은 고딕" w:hAnsi="맑은 고딕"/>
+                <w:rFonts w:ascii="Pretendard" w:cs="Pretendard" w:eastAsia="Pretendard" w:hAnsi="Pretendard"/>
                 <w:b w:val="false"/>
                 <w:bCs w:val="false"/>
                 <w:color w:val="1A1A1A"/>
@@ -842,7 +842,7 @@
             </w:pPr>
             <w:r>
               <w:rPr>
-                <w:rFonts w:ascii="맑은 고딕" w:cs="맑은 고딕" w:eastAsia="맑은 고딕" w:hAnsi="맑은 고딕"/>
+                <w:rFonts w:ascii="Pretendard" w:cs="Pretendard" w:eastAsia="Pretendard" w:hAnsi="Pretendard"/>
                 <w:b w:val="false"/>
                 <w:bCs w:val="false"/>
                 <w:color w:val="1A1A1A"/>
@@ -870,7 +870,7 @@
             </w:pPr>
             <w:r>
               <w:rPr>
-                <w:rFonts w:ascii="맑은 고딕" w:cs="맑은 고딕" w:eastAsia="맑은 고딕" w:hAnsi="맑은 고딕"/>
+                <w:rFonts w:ascii="Pretendard" w:cs="Pretendard" w:eastAsia="Pretendard" w:hAnsi="Pretendard"/>
                 <w:b w:val="false"/>
                 <w:bCs w:val="false"/>
                 <w:color w:val="1A1A1A"/>
@@ -903,7 +903,7 @@
             </w:pPr>
             <w:r>
               <w:rPr>
-                <w:rFonts w:ascii="맑은 고딕" w:cs="맑은 고딕" w:eastAsia="맑은 고딕" w:hAnsi="맑은 고딕"/>
+                <w:rFonts w:ascii="Pretendard" w:cs="Pretendard" w:eastAsia="Pretendard" w:hAnsi="Pretendard"/>
                 <w:b w:val="false"/>
                 <w:bCs w:val="false"/>
                 <w:color w:val="1A1A1A"/>
@@ -931,7 +931,7 @@
             </w:pPr>
             <w:r>
               <w:rPr>
-                <w:rFonts w:ascii="맑은 고딕" w:cs="맑은 고딕" w:eastAsia="맑은 고딕" w:hAnsi="맑은 고딕"/>
+                <w:rFonts w:ascii="Pretendard" w:cs="Pretendard" w:eastAsia="Pretendard" w:hAnsi="Pretendard"/>
                 <w:b w:val="false"/>
                 <w:bCs w:val="false"/>
                 <w:color w:val="1A1A1A"/>
@@ -959,7 +959,7 @@
             </w:pPr>
             <w:r>
               <w:rPr>
-                <w:rFonts w:ascii="맑은 고딕" w:cs="맑은 고딕" w:eastAsia="맑은 고딕" w:hAnsi="맑은 고딕"/>
+                <w:rFonts w:ascii="Pretendard" w:cs="Pretendard" w:eastAsia="Pretendard" w:hAnsi="Pretendard"/>
                 <w:b w:val="false"/>
                 <w:bCs w:val="false"/>
                 <w:color w:val="1A1A1A"/>
@@ -992,7 +992,7 @@
             </w:pPr>
             <w:r>
               <w:rPr>
-                <w:rFonts w:ascii="맑은 고딕" w:cs="맑은 고딕" w:eastAsia="맑은 고딕" w:hAnsi="맑은 고딕"/>
+                <w:rFonts w:ascii="Pretendard" w:cs="Pretendard" w:eastAsia="Pretendard" w:hAnsi="Pretendard"/>
                 <w:b w:val="false"/>
                 <w:bCs w:val="false"/>
                 <w:color w:val="1A1A1A"/>
@@ -1020,7 +1020,7 @@
             </w:pPr>
             <w:r>
               <w:rPr>
-                <w:rFonts w:ascii="맑은 고딕" w:cs="맑은 고딕" w:eastAsia="맑은 고딕" w:hAnsi="맑은 고딕"/>
+                <w:rFonts w:ascii="Pretendard" w:cs="Pretendard" w:eastAsia="Pretendard" w:hAnsi="Pretendard"/>
                 <w:b w:val="false"/>
                 <w:bCs w:val="false"/>
                 <w:color w:val="1A1A1A"/>
@@ -1048,7 +1048,7 @@
             </w:pPr>
             <w:r>
               <w:rPr>
-                <w:rFonts w:ascii="맑은 고딕" w:cs="맑은 고딕" w:eastAsia="맑은 고딕" w:hAnsi="맑은 고딕"/>
+                <w:rFonts w:ascii="Pretendard" w:cs="Pretendard" w:eastAsia="Pretendard" w:hAnsi="Pretendard"/>
                 <w:b w:val="false"/>
                 <w:bCs w:val="false"/>
                 <w:color w:val="1A1A1A"/>
@@ -1081,7 +1081,7 @@
             </w:pPr>
             <w:r>
               <w:rPr>
-                <w:rFonts w:ascii="맑은 고딕" w:cs="맑은 고딕" w:eastAsia="맑은 고딕" w:hAnsi="맑은 고딕"/>
+                <w:rFonts w:ascii="Pretendard" w:cs="Pretendard" w:eastAsia="Pretendard" w:hAnsi="Pretendard"/>
                 <w:b w:val="false"/>
                 <w:bCs w:val="false"/>
                 <w:color w:val="1A1A1A"/>
@@ -1109,7 +1109,7 @@
             </w:pPr>
             <w:r>
               <w:rPr>
-                <w:rFonts w:ascii="맑은 고딕" w:cs="맑은 고딕" w:eastAsia="맑은 고딕" w:hAnsi="맑은 고딕"/>
+                <w:rFonts w:ascii="Pretendard" w:cs="Pretendard" w:eastAsia="Pretendard" w:hAnsi="Pretendard"/>
                 <w:b w:val="false"/>
                 <w:bCs w:val="false"/>
                 <w:color w:val="1A1A1A"/>
@@ -1137,7 +1137,7 @@
             </w:pPr>
             <w:r>
               <w:rPr>
-                <w:rFonts w:ascii="맑은 고딕" w:cs="맑은 고딕" w:eastAsia="맑은 고딕" w:hAnsi="맑은 고딕"/>
+                <w:rFonts w:ascii="Pretendard" w:cs="Pretendard" w:eastAsia="Pretendard" w:hAnsi="Pretendard"/>
                 <w:b w:val="false"/>
                 <w:bCs w:val="false"/>
                 <w:color w:val="1A1A1A"/>
@@ -1170,7 +1170,7 @@
             </w:pPr>
             <w:r>
               <w:rPr>
-                <w:rFonts w:ascii="맑은 고딕" w:cs="맑은 고딕" w:eastAsia="맑은 고딕" w:hAnsi="맑은 고딕"/>
+                <w:rFonts w:ascii="Pretendard" w:cs="Pretendard" w:eastAsia="Pretendard" w:hAnsi="Pretendard"/>
                 <w:b w:val="false"/>
                 <w:bCs w:val="false"/>
                 <w:color w:val="1A1A1A"/>
@@ -1198,7 +1198,7 @@
             </w:pPr>
             <w:r>
               <w:rPr>
-                <w:rFonts w:ascii="맑은 고딕" w:cs="맑은 고딕" w:eastAsia="맑은 고딕" w:hAnsi="맑은 고딕"/>
+                <w:rFonts w:ascii="Pretendard" w:cs="Pretendard" w:eastAsia="Pretendard" w:hAnsi="Pretendard"/>
                 <w:b w:val="false"/>
                 <w:bCs w:val="false"/>
                 <w:color w:val="1A1A1A"/>
@@ -1226,7 +1226,7 @@
             </w:pPr>
             <w:r>
               <w:rPr>
-                <w:rFonts w:ascii="맑은 고딕" w:cs="맑은 고딕" w:eastAsia="맑은 고딕" w:hAnsi="맑은 고딕"/>
+                <w:rFonts w:ascii="Pretendard" w:cs="Pretendard" w:eastAsia="Pretendard" w:hAnsi="Pretendard"/>
                 <w:b w:val="false"/>
                 <w:bCs w:val="false"/>
                 <w:color w:val="1A1A1A"/>
@@ -1259,7 +1259,7 @@
             </w:pPr>
             <w:r>
               <w:rPr>
-                <w:rFonts w:ascii="맑은 고딕" w:cs="맑은 고딕" w:eastAsia="맑은 고딕" w:hAnsi="맑은 고딕"/>
+                <w:rFonts w:ascii="Pretendard" w:cs="Pretendard" w:eastAsia="Pretendard" w:hAnsi="Pretendard"/>
                 <w:b w:val="false"/>
                 <w:bCs w:val="false"/>
                 <w:color w:val="1A1A1A"/>
@@ -1287,7 +1287,7 @@
             </w:pPr>
             <w:r>
               <w:rPr>
-                <w:rFonts w:ascii="맑은 고딕" w:cs="맑은 고딕" w:eastAsia="맑은 고딕" w:hAnsi="맑은 고딕"/>
+                <w:rFonts w:ascii="Pretendard" w:cs="Pretendard" w:eastAsia="Pretendard" w:hAnsi="Pretendard"/>
                 <w:b w:val="false"/>
                 <w:bCs w:val="false"/>
                 <w:color w:val="1A1A1A"/>
@@ -1315,7 +1315,7 @@
             </w:pPr>
             <w:r>
               <w:rPr>
-                <w:rFonts w:ascii="맑은 고딕" w:cs="맑은 고딕" w:eastAsia="맑은 고딕" w:hAnsi="맑은 고딕"/>
+                <w:rFonts w:ascii="Pretendard" w:cs="Pretendard" w:eastAsia="Pretendard" w:hAnsi="Pretendard"/>
                 <w:b w:val="false"/>
                 <w:bCs w:val="false"/>
                 <w:color w:val="1A1A1A"/>
@@ -1348,7 +1348,7 @@
             </w:pPr>
             <w:r>
               <w:rPr>
-                <w:rFonts w:ascii="맑은 고딕" w:cs="맑은 고딕" w:eastAsia="맑은 고딕" w:hAnsi="맑은 고딕"/>
+                <w:rFonts w:ascii="Pretendard" w:cs="Pretendard" w:eastAsia="Pretendard" w:hAnsi="Pretendard"/>
                 <w:b w:val="false"/>
                 <w:bCs w:val="false"/>
                 <w:color w:val="1A1A1A"/>
@@ -1376,7 +1376,7 @@
             </w:pPr>
             <w:r>
               <w:rPr>
-                <w:rFonts w:ascii="맑은 고딕" w:cs="맑은 고딕" w:eastAsia="맑은 고딕" w:hAnsi="맑은 고딕"/>
+                <w:rFonts w:ascii="Pretendard" w:cs="Pretendard" w:eastAsia="Pretendard" w:hAnsi="Pretendard"/>
                 <w:b w:val="false"/>
                 <w:bCs w:val="false"/>
                 <w:color w:val="1A1A1A"/>
@@ -1404,7 +1404,7 @@
             </w:pPr>
             <w:r>
               <w:rPr>
-                <w:rFonts w:ascii="맑은 고딕" w:cs="맑은 고딕" w:eastAsia="맑은 고딕" w:hAnsi="맑은 고딕"/>
+                <w:rFonts w:ascii="Pretendard" w:cs="Pretendard" w:eastAsia="Pretendard" w:hAnsi="Pretendard"/>
                 <w:b w:val="false"/>
                 <w:bCs w:val="false"/>
                 <w:color w:val="1A1A1A"/>
@@ -1437,7 +1437,7 @@
             </w:pPr>
             <w:r>
               <w:rPr>
-                <w:rFonts w:ascii="맑은 고딕" w:cs="맑은 고딕" w:eastAsia="맑은 고딕" w:hAnsi="맑은 고딕"/>
+                <w:rFonts w:ascii="Pretendard" w:cs="Pretendard" w:eastAsia="Pretendard" w:hAnsi="Pretendard"/>
                 <w:b w:val="false"/>
                 <w:bCs w:val="false"/>
                 <w:color w:val="1A1A1A"/>
@@ -1465,7 +1465,7 @@
             </w:pPr>
             <w:r>
               <w:rPr>
-                <w:rFonts w:ascii="맑은 고딕" w:cs="맑은 고딕" w:eastAsia="맑은 고딕" w:hAnsi="맑은 고딕"/>
+                <w:rFonts w:ascii="Pretendard" w:cs="Pretendard" w:eastAsia="Pretendard" w:hAnsi="Pretendard"/>
                 <w:b w:val="false"/>
                 <w:bCs w:val="false"/>
                 <w:color w:val="1A1A1A"/>
@@ -1493,7 +1493,7 @@
             </w:pPr>
             <w:r>
               <w:rPr>
-                <w:rFonts w:ascii="맑은 고딕" w:cs="맑은 고딕" w:eastAsia="맑은 고딕" w:hAnsi="맑은 고딕"/>
+                <w:rFonts w:ascii="Pretendard" w:cs="Pretendard" w:eastAsia="Pretendard" w:hAnsi="Pretendard"/>
                 <w:b w:val="false"/>
                 <w:bCs w:val="false"/>
                 <w:color w:val="1A1A1A"/>
@@ -1518,7 +1518,7 @@
       </w:pPr>
       <w:r>
         <w:rPr>
-          <w:rFonts w:ascii="맑은 고딕" w:cs="맑은 고딕" w:eastAsia="맑은 고딕" w:hAnsi="맑은 고딕"/>
+          <w:rFonts w:ascii="Pretendard" w:cs="Pretendard" w:eastAsia="Pretendard" w:hAnsi="Pretendard"/>
           <w:b/>
           <w:bCs/>
           <w:color w:val="111E6C"/>
@@ -1534,7 +1534,7 @@
       </w:pPr>
       <w:r>
         <w:rPr>
-          <w:rFonts w:ascii="맑은 고딕" w:cs="맑은 고딕" w:eastAsia="맑은 고딕" w:hAnsi="맑은 고딕"/>
+          <w:rFonts w:ascii="Pretendard" w:cs="Pretendard" w:eastAsia="Pretendard" w:hAnsi="Pretendard"/>
           <w:color w:val="1A1A1A"/>
           <w:sz w:val="20"/>
           <w:szCs w:val="20"/>
@@ -1548,7 +1548,7 @@
       </w:pPr>
       <w:r>
         <w:rPr>
-          <w:rFonts w:ascii="맑은 고딕" w:cs="맑은 고딕" w:eastAsia="맑은 고딕" w:hAnsi="맑은 고딕"/>
+          <w:rFonts w:ascii="Pretendard" w:cs="Pretendard" w:eastAsia="Pretendard" w:hAnsi="Pretendard"/>
           <w:b/>
           <w:bCs/>
           <w:color w:val="1A1A1A"/>
@@ -1559,7 +1559,7 @@
       </w:r>
       <w:r>
         <w:rPr>
-          <w:rFonts w:ascii="맑은 고딕" w:cs="맑은 고딕" w:eastAsia="맑은 고딕" w:hAnsi="맑은 고딕"/>
+          <w:rFonts w:ascii="Pretendard" w:cs="Pretendard" w:eastAsia="Pretendard" w:hAnsi="Pretendard"/>
           <w:color w:val="1A1A1A"/>
           <w:sz w:val="20"/>
           <w:szCs w:val="20"/>
@@ -1574,7 +1574,7 @@
       </w:pPr>
       <w:r>
         <w:rPr>
-          <w:rFonts w:ascii="맑은 고딕" w:cs="맑은 고딕" w:eastAsia="맑은 고딕" w:hAnsi="맑은 고딕"/>
+          <w:rFonts w:ascii="Pretendard" w:cs="Pretendard" w:eastAsia="Pretendard" w:hAnsi="Pretendard"/>
           <w:b/>
           <w:bCs/>
           <w:color w:val="111E6C"/>
@@ -1590,7 +1590,7 @@
       </w:pPr>
       <w:r>
         <w:rPr>
-          <w:rFonts w:ascii="맑은 고딕" w:cs="맑은 고딕" w:eastAsia="맑은 고딕" w:hAnsi="맑은 고딕"/>
+          <w:rFonts w:ascii="Pretendard" w:cs="Pretendard" w:eastAsia="Pretendard" w:hAnsi="Pretendard"/>
           <w:b/>
           <w:bCs/>
           <w:color w:val="1A1A1A"/>
@@ -1601,7 +1601,7 @@
       </w:r>
       <w:r>
         <w:rPr>
-          <w:rFonts w:ascii="맑은 고딕" w:cs="맑은 고딕" w:eastAsia="맑은 고딕" w:hAnsi="맑은 고딕"/>
+          <w:rFonts w:ascii="Pretendard" w:cs="Pretendard" w:eastAsia="Pretendard" w:hAnsi="Pretendard"/>
           <w:color w:val="1A1A1A"/>
           <w:sz w:val="20"/>
           <w:szCs w:val="20"/>
@@ -1615,7 +1615,7 @@
       </w:pPr>
       <w:r>
         <w:rPr>
-          <w:rFonts w:ascii="맑은 고딕" w:cs="맑은 고딕" w:eastAsia="맑은 고딕" w:hAnsi="맑은 고딕"/>
+          <w:rFonts w:ascii="Pretendard" w:cs="Pretendard" w:eastAsia="Pretendard" w:hAnsi="Pretendard"/>
           <w:b/>
           <w:bCs/>
           <w:color w:val="1A1A1A"/>
@@ -1626,7 +1626,7 @@
       </w:r>
       <w:r>
         <w:rPr>
-          <w:rFonts w:ascii="맑은 고딕" w:cs="맑은 고딕" w:eastAsia="맑은 고딕" w:hAnsi="맑은 고딕"/>
+          <w:rFonts w:ascii="Pretendard" w:cs="Pretendard" w:eastAsia="Pretendard" w:hAnsi="Pretendard"/>
           <w:color w:val="1A1A1A"/>
           <w:sz w:val="20"/>
           <w:szCs w:val="20"/>
@@ -1646,7 +1646,7 @@
       </w:pPr>
       <w:r>
         <w:rPr>
-          <w:rFonts w:ascii="맑은 고딕" w:cs="맑은 고딕" w:eastAsia="맑은 고딕" w:hAnsi="맑은 고딕"/>
+          <w:rFonts w:ascii="Pretendard" w:cs="Pretendard" w:eastAsia="Pretendard" w:hAnsi="Pretendard"/>
           <w:b/>
           <w:bCs/>
           <w:color w:val="111E6C"/>
@@ -1662,7 +1662,7 @@
       </w:pPr>
       <w:r>
         <w:rPr>
-          <w:rFonts w:ascii="맑은 고딕" w:cs="맑은 고딕" w:eastAsia="맑은 고딕" w:hAnsi="맑은 고딕"/>
+          <w:rFonts w:ascii="Pretendard" w:cs="Pretendard" w:eastAsia="Pretendard" w:hAnsi="Pretendard"/>
           <w:color w:val="1A1A1A"/>
           <w:sz w:val="20"/>
           <w:szCs w:val="20"/>
@@ -1677,7 +1677,7 @@
       </w:pPr>
       <w:r>
         <w:rPr>
-          <w:rFonts w:ascii="맑은 고딕" w:cs="맑은 고딕" w:eastAsia="맑은 고딕" w:hAnsi="맑은 고딕"/>
+          <w:rFonts w:ascii="Pretendard" w:cs="Pretendard" w:eastAsia="Pretendard" w:hAnsi="Pretendard"/>
           <w:b/>
           <w:bCs/>
           <w:color w:val="1A1A1A"/>
@@ -1693,7 +1693,7 @@
       </w:pPr>
       <w:r>
         <w:rPr>
-          <w:rFonts w:ascii="맑은 고딕" w:cs="맑은 고딕" w:eastAsia="맑은 고딕" w:hAnsi="맑은 고딕"/>
+          <w:rFonts w:ascii="Pretendard" w:cs="Pretendard" w:eastAsia="Pretendard" w:hAnsi="Pretendard"/>
           <w:color w:val="1A1A1A"/>
           <w:sz w:val="20"/>
           <w:szCs w:val="20"/>
@@ -1702,7 +1702,7 @@
       </w:r>
       <w:r>
         <w:rPr>
-          <w:rFonts w:ascii="맑은 고딕" w:cs="맑은 고딕" w:eastAsia="맑은 고딕" w:hAnsi="맑은 고딕"/>
+          <w:rFonts w:ascii="Pretendard" w:cs="Pretendard" w:eastAsia="Pretendard" w:hAnsi="Pretendard"/>
           <w:b/>
           <w:bCs/>
           <w:color w:val="1A1A1A"/>
@@ -1713,7 +1713,7 @@
       </w:r>
       <w:r>
         <w:rPr>
-          <w:rFonts w:ascii="맑은 고딕" w:cs="맑은 고딕" w:eastAsia="맑은 고딕" w:hAnsi="맑은 고딕"/>
+          <w:rFonts w:ascii="Pretendard" w:cs="Pretendard" w:eastAsia="Pretendard" w:hAnsi="Pretendard"/>
           <w:color w:val="1A1A1A"/>
           <w:sz w:val="20"/>
           <w:szCs w:val="20"/>
@@ -1722,7 +1722,7 @@
       </w:r>
       <w:r>
         <w:rPr>
-          <w:rFonts w:ascii="맑은 고딕" w:cs="맑은 고딕" w:eastAsia="맑은 고딕" w:hAnsi="맑은 고딕"/>
+          <w:rFonts w:ascii="Pretendard" w:cs="Pretendard" w:eastAsia="Pretendard" w:hAnsi="Pretendard"/>
           <w:b/>
           <w:bCs/>
           <w:color w:val="1A1A1A"/>
@@ -1733,7 +1733,7 @@
       </w:r>
       <w:r>
         <w:rPr>
-          <w:rFonts w:ascii="맑은 고딕" w:cs="맑은 고딕" w:eastAsia="맑은 고딕" w:hAnsi="맑은 고딕"/>
+          <w:rFonts w:ascii="Pretendard" w:cs="Pretendard" w:eastAsia="Pretendard" w:hAnsi="Pretendard"/>
           <w:color w:val="1A1A1A"/>
           <w:sz w:val="20"/>
           <w:szCs w:val="20"/>
@@ -1742,7 +1742,7 @@
       </w:r>
       <w:r>
         <w:rPr>
-          <w:rFonts w:ascii="맑은 고딕" w:cs="맑은 고딕" w:eastAsia="맑은 고딕" w:hAnsi="맑은 고딕"/>
+          <w:rFonts w:ascii="Pretendard" w:cs="Pretendard" w:eastAsia="Pretendard" w:hAnsi="Pretendard"/>
           <w:b/>
           <w:bCs/>
           <w:color w:val="1A1A1A"/>
@@ -1758,7 +1758,7 @@
       </w:pPr>
       <w:r>
         <w:rPr>
-          <w:rFonts w:ascii="맑은 고딕" w:cs="맑은 고딕" w:eastAsia="맑은 고딕" w:hAnsi="맑은 고딕"/>
+          <w:rFonts w:ascii="Pretendard" w:cs="Pretendard" w:eastAsia="Pretendard" w:hAnsi="Pretendard"/>
           <w:color w:val="1A1A1A"/>
           <w:sz w:val="20"/>
           <w:szCs w:val="20"/>
@@ -1772,7 +1772,7 @@
       </w:pPr>
       <w:r>
         <w:rPr>
-          <w:rFonts w:ascii="맑은 고딕" w:cs="맑은 고딕" w:eastAsia="맑은 고딕" w:hAnsi="맑은 고딕"/>
+          <w:rFonts w:ascii="Pretendard" w:cs="Pretendard" w:eastAsia="Pretendard" w:hAnsi="Pretendard"/>
           <w:b/>
           <w:bCs/>
           <w:color w:val="1A1A1A"/>
@@ -1783,7 +1783,7 @@
       </w:r>
       <w:r>
         <w:rPr>
-          <w:rFonts w:ascii="맑은 고딕" w:cs="맑은 고딕" w:eastAsia="맑은 고딕" w:hAnsi="맑은 고딕"/>
+          <w:rFonts w:ascii="Pretendard" w:cs="Pretendard" w:eastAsia="Pretendard" w:hAnsi="Pretendard"/>
           <w:color w:val="1A1A1A"/>
           <w:sz w:val="20"/>
           <w:szCs w:val="20"/>
@@ -1798,7 +1798,7 @@
       </w:pPr>
       <w:r>
         <w:rPr>
-          <w:rFonts w:ascii="맑은 고딕" w:cs="맑은 고딕" w:eastAsia="맑은 고딕" w:hAnsi="맑은 고딕"/>
+          <w:rFonts w:ascii="Pretendard" w:cs="Pretendard" w:eastAsia="Pretendard" w:hAnsi="Pretendard"/>
           <w:b/>
           <w:bCs/>
           <w:color w:val="1A1A1A"/>
@@ -1814,7 +1814,7 @@
       </w:pPr>
       <w:r>
         <w:rPr>
-          <w:rFonts w:ascii="맑은 고딕" w:cs="맑은 고딕" w:eastAsia="맑은 고딕" w:hAnsi="맑은 고딕"/>
+          <w:rFonts w:ascii="Pretendard" w:cs="Pretendard" w:eastAsia="Pretendard" w:hAnsi="Pretendard"/>
           <w:color w:val="1A1A1A"/>
           <w:sz w:val="20"/>
           <w:szCs w:val="20"/>
@@ -1833,7 +1833,7 @@
       </w:pPr>
       <w:r>
         <w:rPr>
-          <w:rFonts w:ascii="맑은 고딕" w:cs="맑은 고딕" w:eastAsia="맑은 고딕" w:hAnsi="맑은 고딕"/>
+          <w:rFonts w:ascii="Pretendard" w:cs="Pretendard" w:eastAsia="Pretendard" w:hAnsi="Pretendard"/>
           <w:color w:val="1A1A1A"/>
           <w:sz w:val="20"/>
           <w:szCs w:val="20"/>
@@ -1852,7 +1852,7 @@
       </w:pPr>
       <w:r>
         <w:rPr>
-          <w:rFonts w:ascii="맑은 고딕" w:cs="맑은 고딕" w:eastAsia="맑은 고딕" w:hAnsi="맑은 고딕"/>
+          <w:rFonts w:ascii="Pretendard" w:cs="Pretendard" w:eastAsia="Pretendard" w:hAnsi="Pretendard"/>
           <w:color w:val="1A1A1A"/>
           <w:sz w:val="20"/>
           <w:szCs w:val="20"/>
@@ -1871,7 +1871,7 @@
       </w:pPr>
       <w:r>
         <w:rPr>
-          <w:rFonts w:ascii="맑은 고딕" w:cs="맑은 고딕" w:eastAsia="맑은 고딕" w:hAnsi="맑은 고딕"/>
+          <w:rFonts w:ascii="Pretendard" w:cs="Pretendard" w:eastAsia="Pretendard" w:hAnsi="Pretendard"/>
           <w:color w:val="1A1A1A"/>
           <w:sz w:val="20"/>
           <w:szCs w:val="20"/>
@@ -1886,7 +1886,7 @@
       </w:pPr>
       <w:r>
         <w:rPr>
-          <w:rFonts w:ascii="맑은 고딕" w:cs="맑은 고딕" w:eastAsia="맑은 고딕" w:hAnsi="맑은 고딕"/>
+          <w:rFonts w:ascii="Pretendard" w:cs="Pretendard" w:eastAsia="Pretendard" w:hAnsi="Pretendard"/>
           <w:b/>
           <w:bCs/>
           <w:color w:val="1A1A1A"/>
@@ -1902,7 +1902,7 @@
       </w:pPr>
       <w:r>
         <w:rPr>
-          <w:rFonts w:ascii="맑은 고딕" w:cs="맑은 고딕" w:eastAsia="맑은 고딕" w:hAnsi="맑은 고딕"/>
+          <w:rFonts w:ascii="Pretendard" w:cs="Pretendard" w:eastAsia="Pretendard" w:hAnsi="Pretendard"/>
           <w:color w:val="1A1A1A"/>
           <w:sz w:val="20"/>
           <w:szCs w:val="20"/>
@@ -1916,7 +1916,7 @@
       </w:pPr>
       <w:r>
         <w:rPr>
-          <w:rFonts w:ascii="맑은 고딕" w:cs="맑은 고딕" w:eastAsia="맑은 고딕" w:hAnsi="맑은 고딕"/>
+          <w:rFonts w:ascii="Pretendard" w:cs="Pretendard" w:eastAsia="Pretendard" w:hAnsi="Pretendard"/>
           <w:b/>
           <w:bCs/>
           <w:color w:val="1A1A1A"/>
@@ -1927,7 +1927,7 @@
       </w:r>
       <w:r>
         <w:rPr>
-          <w:rFonts w:ascii="맑은 고딕" w:cs="맑은 고딕" w:eastAsia="맑은 고딕" w:hAnsi="맑은 고딕"/>
+          <w:rFonts w:ascii="Pretendard" w:cs="Pretendard" w:eastAsia="Pretendard" w:hAnsi="Pretendard"/>
           <w:color w:val="1A1A1A"/>
           <w:sz w:val="20"/>
           <w:szCs w:val="20"/>
@@ -1942,7 +1942,7 @@
       </w:pPr>
       <w:r>
         <w:rPr>
-          <w:rFonts w:ascii="맑은 고딕" w:cs="맑은 고딕" w:eastAsia="맑은 고딕" w:hAnsi="맑은 고딕"/>
+          <w:rFonts w:ascii="Pretendard" w:cs="Pretendard" w:eastAsia="Pretendard" w:hAnsi="Pretendard"/>
           <w:b/>
           <w:bCs/>
           <w:color w:val="1A1A1A"/>
@@ -1996,7 +1996,7 @@
             </w:pPr>
             <w:r>
               <w:rPr>
-                <w:rFonts w:ascii="맑은 고딕" w:cs="맑은 고딕" w:eastAsia="맑은 고딕" w:hAnsi="맑은 고딕"/>
+                <w:rFonts w:ascii="Pretendard" w:cs="Pretendard" w:eastAsia="Pretendard" w:hAnsi="Pretendard"/>
                 <w:b/>
                 <w:bCs/>
                 <w:color w:val="FFFFFF"/>
@@ -2025,7 +2025,7 @@
             </w:pPr>
             <w:r>
               <w:rPr>
-                <w:rFonts w:ascii="맑은 고딕" w:cs="맑은 고딕" w:eastAsia="맑은 고딕" w:hAnsi="맑은 고딕"/>
+                <w:rFonts w:ascii="Pretendard" w:cs="Pretendard" w:eastAsia="Pretendard" w:hAnsi="Pretendard"/>
                 <w:b/>
                 <w:bCs/>
                 <w:color w:val="FFFFFF"/>
@@ -2054,7 +2054,7 @@
             </w:pPr>
             <w:r>
               <w:rPr>
-                <w:rFonts w:ascii="맑은 고딕" w:cs="맑은 고딕" w:eastAsia="맑은 고딕" w:hAnsi="맑은 고딕"/>
+                <w:rFonts w:ascii="Pretendard" w:cs="Pretendard" w:eastAsia="Pretendard" w:hAnsi="Pretendard"/>
                 <w:b/>
                 <w:bCs/>
                 <w:color w:val="FFFFFF"/>
@@ -2087,7 +2087,7 @@
             </w:pPr>
             <w:r>
               <w:rPr>
-                <w:rFonts w:ascii="맑은 고딕" w:cs="맑은 고딕" w:eastAsia="맑은 고딕" w:hAnsi="맑은 고딕"/>
+                <w:rFonts w:ascii="Pretendard" w:cs="Pretendard" w:eastAsia="Pretendard" w:hAnsi="Pretendard"/>
                 <w:b w:val="false"/>
                 <w:bCs w:val="false"/>
                 <w:color w:val="1A1A1A"/>
@@ -2115,7 +2115,7 @@
             </w:pPr>
             <w:r>
               <w:rPr>
-                <w:rFonts w:ascii="맑은 고딕" w:cs="맑은 고딕" w:eastAsia="맑은 고딕" w:hAnsi="맑은 고딕"/>
+                <w:rFonts w:ascii="Pretendard" w:cs="Pretendard" w:eastAsia="Pretendard" w:hAnsi="Pretendard"/>
                 <w:b w:val="false"/>
                 <w:bCs w:val="false"/>
                 <w:color w:val="1A1A1A"/>
@@ -2143,7 +2143,7 @@
             </w:pPr>
             <w:r>
               <w:rPr>
-                <w:rFonts w:ascii="맑은 고딕" w:cs="맑은 고딕" w:eastAsia="맑은 고딕" w:hAnsi="맑은 고딕"/>
+                <w:rFonts w:ascii="Pretendard" w:cs="Pretendard" w:eastAsia="Pretendard" w:hAnsi="Pretendard"/>
                 <w:b w:val="false"/>
                 <w:bCs w:val="false"/>
                 <w:color w:val="1A1A1A"/>
@@ -2176,7 +2176,7 @@
             </w:pPr>
             <w:r>
               <w:rPr>
-                <w:rFonts w:ascii="맑은 고딕" w:cs="맑은 고딕" w:eastAsia="맑은 고딕" w:hAnsi="맑은 고딕"/>
+                <w:rFonts w:ascii="Pretendard" w:cs="Pretendard" w:eastAsia="Pretendard" w:hAnsi="Pretendard"/>
                 <w:b w:val="false"/>
                 <w:bCs w:val="false"/>
                 <w:color w:val="1A1A1A"/>
@@ -2204,7 +2204,7 @@
             </w:pPr>
             <w:r>
               <w:rPr>
-                <w:rFonts w:ascii="맑은 고딕" w:cs="맑은 고딕" w:eastAsia="맑은 고딕" w:hAnsi="맑은 고딕"/>
+                <w:rFonts w:ascii="Pretendard" w:cs="Pretendard" w:eastAsia="Pretendard" w:hAnsi="Pretendard"/>
                 <w:b w:val="false"/>
                 <w:bCs w:val="false"/>
                 <w:color w:val="1A1A1A"/>
@@ -2232,7 +2232,7 @@
             </w:pPr>
             <w:r>
               <w:rPr>
-                <w:rFonts w:ascii="맑은 고딕" w:cs="맑은 고딕" w:eastAsia="맑은 고딕" w:hAnsi="맑은 고딕"/>
+                <w:rFonts w:ascii="Pretendard" w:cs="Pretendard" w:eastAsia="Pretendard" w:hAnsi="Pretendard"/>
                 <w:b w:val="false"/>
                 <w:bCs w:val="false"/>
                 <w:color w:val="1A1A1A"/>
@@ -2265,7 +2265,7 @@
             </w:pPr>
             <w:r>
               <w:rPr>
-                <w:rFonts w:ascii="맑은 고딕" w:cs="맑은 고딕" w:eastAsia="맑은 고딕" w:hAnsi="맑은 고딕"/>
+                <w:rFonts w:ascii="Pretendard" w:cs="Pretendard" w:eastAsia="Pretendard" w:hAnsi="Pretendard"/>
                 <w:b w:val="false"/>
                 <w:bCs w:val="false"/>
                 <w:color w:val="1A1A1A"/>
@@ -2293,7 +2293,7 @@
             </w:pPr>
             <w:r>
               <w:rPr>
-                <w:rFonts w:ascii="맑은 고딕" w:cs="맑은 고딕" w:eastAsia="맑은 고딕" w:hAnsi="맑은 고딕"/>
+                <w:rFonts w:ascii="Pretendard" w:cs="Pretendard" w:eastAsia="Pretendard" w:hAnsi="Pretendard"/>
                 <w:b w:val="false"/>
                 <w:bCs w:val="false"/>
                 <w:color w:val="1A1A1A"/>
@@ -2321,7 +2321,7 @@
             </w:pPr>
             <w:r>
               <w:rPr>
-                <w:rFonts w:ascii="맑은 고딕" w:cs="맑은 고딕" w:eastAsia="맑은 고딕" w:hAnsi="맑은 고딕"/>
+                <w:rFonts w:ascii="Pretendard" w:cs="Pretendard" w:eastAsia="Pretendard" w:hAnsi="Pretendard"/>
                 <w:b w:val="false"/>
                 <w:bCs w:val="false"/>
                 <w:color w:val="1A1A1A"/>
@@ -2354,7 +2354,7 @@
             </w:pPr>
             <w:r>
               <w:rPr>
-                <w:rFonts w:ascii="맑은 고딕" w:cs="맑은 고딕" w:eastAsia="맑은 고딕" w:hAnsi="맑은 고딕"/>
+                <w:rFonts w:ascii="Pretendard" w:cs="Pretendard" w:eastAsia="Pretendard" w:hAnsi="Pretendard"/>
                 <w:b w:val="false"/>
                 <w:bCs w:val="false"/>
                 <w:color w:val="1A1A1A"/>
@@ -2382,7 +2382,7 @@
             </w:pPr>
             <w:r>
               <w:rPr>
-                <w:rFonts w:ascii="맑은 고딕" w:cs="맑은 고딕" w:eastAsia="맑은 고딕" w:hAnsi="맑은 고딕"/>
+                <w:rFonts w:ascii="Pretendard" w:cs="Pretendard" w:eastAsia="Pretendard" w:hAnsi="Pretendard"/>
                 <w:b w:val="false"/>
                 <w:bCs w:val="false"/>
                 <w:color w:val="1A1A1A"/>
@@ -2410,7 +2410,7 @@
             </w:pPr>
             <w:r>
               <w:rPr>
-                <w:rFonts w:ascii="맑은 고딕" w:cs="맑은 고딕" w:eastAsia="맑은 고딕" w:hAnsi="맑은 고딕"/>
+                <w:rFonts w:ascii="Pretendard" w:cs="Pretendard" w:eastAsia="Pretendard" w:hAnsi="Pretendard"/>
                 <w:b w:val="false"/>
                 <w:bCs w:val="false"/>
                 <w:color w:val="1A1A1A"/>
@@ -2443,7 +2443,7 @@
             </w:pPr>
             <w:r>
               <w:rPr>
-                <w:rFonts w:ascii="맑은 고딕" w:cs="맑은 고딕" w:eastAsia="맑은 고딕" w:hAnsi="맑은 고딕"/>
+                <w:rFonts w:ascii="Pretendard" w:cs="Pretendard" w:eastAsia="Pretendard" w:hAnsi="Pretendard"/>
                 <w:b w:val="false"/>
                 <w:bCs w:val="false"/>
                 <w:color w:val="1A1A1A"/>
@@ -2471,7 +2471,7 @@
             </w:pPr>
             <w:r>
               <w:rPr>
-                <w:rFonts w:ascii="맑은 고딕" w:cs="맑은 고딕" w:eastAsia="맑은 고딕" w:hAnsi="맑은 고딕"/>
+                <w:rFonts w:ascii="Pretendard" w:cs="Pretendard" w:eastAsia="Pretendard" w:hAnsi="Pretendard"/>
                 <w:b w:val="false"/>
                 <w:bCs w:val="false"/>
                 <w:color w:val="1A1A1A"/>
@@ -2499,7 +2499,7 @@
             </w:pPr>
             <w:r>
               <w:rPr>
-                <w:rFonts w:ascii="맑은 고딕" w:cs="맑은 고딕" w:eastAsia="맑은 고딕" w:hAnsi="맑은 고딕"/>
+                <w:rFonts w:ascii="Pretendard" w:cs="Pretendard" w:eastAsia="Pretendard" w:hAnsi="Pretendard"/>
                 <w:b w:val="false"/>
                 <w:bCs w:val="false"/>
                 <w:color w:val="1A1A1A"/>
@@ -2527,7 +2527,7 @@
       </w:pPr>
       <w:r>
         <w:rPr>
-          <w:rFonts w:ascii="맑은 고딕" w:cs="맑은 고딕" w:eastAsia="맑은 고딕" w:hAnsi="맑은 고딕"/>
+          <w:rFonts w:ascii="Pretendard" w:cs="Pretendard" w:eastAsia="Pretendard" w:hAnsi="Pretendard"/>
           <w:b/>
           <w:bCs/>
           <w:color w:val="1A1A1A"/>
@@ -2541,7 +2541,7 @@
       </w:r>
       <w:r>
         <w:rPr>
-          <w:rFonts w:ascii="맑은 고딕" w:cs="맑은 고딕" w:eastAsia="맑은 고딕" w:hAnsi="맑은 고딕"/>
+          <w:rFonts w:ascii="Pretendard" w:cs="Pretendard" w:eastAsia="Pretendard" w:hAnsi="Pretendard"/>
           <w:color w:val="5C5C5C"/>
           <w:sz w:val="19"/>
           <w:szCs w:val="19"/>
@@ -2561,7 +2561,7 @@
       </w:pPr>
       <w:r>
         <w:rPr>
-          <w:rFonts w:ascii="맑은 고딕" w:cs="맑은 고딕" w:eastAsia="맑은 고딕" w:hAnsi="맑은 고딕"/>
+          <w:rFonts w:ascii="Pretendard" w:cs="Pretendard" w:eastAsia="Pretendard" w:hAnsi="Pretendard"/>
           <w:b/>
           <w:bCs/>
           <w:color w:val="111E6C"/>
@@ -2578,7 +2578,7 @@
       </w:pPr>
       <w:r>
         <w:rPr>
-          <w:rFonts w:ascii="맑은 고딕" w:cs="맑은 고딕" w:eastAsia="맑은 고딕" w:hAnsi="맑은 고딕"/>
+          <w:rFonts w:ascii="Pretendard" w:cs="Pretendard" w:eastAsia="Pretendard" w:hAnsi="Pretendard"/>
           <w:b/>
           <w:bCs/>
           <w:color w:val="1A1A1A"/>
@@ -2632,7 +2632,7 @@
             </w:pPr>
             <w:r>
               <w:rPr>
-                <w:rFonts w:ascii="맑은 고딕" w:cs="맑은 고딕" w:eastAsia="맑은 고딕" w:hAnsi="맑은 고딕"/>
+                <w:rFonts w:ascii="Pretendard" w:cs="Pretendard" w:eastAsia="Pretendard" w:hAnsi="Pretendard"/>
                 <w:b/>
                 <w:bCs/>
                 <w:color w:val="FFFFFF"/>
@@ -2661,7 +2661,7 @@
             </w:pPr>
             <w:r>
               <w:rPr>
-                <w:rFonts w:ascii="맑은 고딕" w:cs="맑은 고딕" w:eastAsia="맑은 고딕" w:hAnsi="맑은 고딕"/>
+                <w:rFonts w:ascii="Pretendard" w:cs="Pretendard" w:eastAsia="Pretendard" w:hAnsi="Pretendard"/>
                 <w:b/>
                 <w:bCs/>
                 <w:color w:val="FFFFFF"/>
@@ -2690,7 +2690,7 @@
             </w:pPr>
             <w:r>
               <w:rPr>
-                <w:rFonts w:ascii="맑은 고딕" w:cs="맑은 고딕" w:eastAsia="맑은 고딕" w:hAnsi="맑은 고딕"/>
+                <w:rFonts w:ascii="Pretendard" w:cs="Pretendard" w:eastAsia="Pretendard" w:hAnsi="Pretendard"/>
                 <w:b/>
                 <w:bCs/>
                 <w:color w:val="FFFFFF"/>
@@ -2723,7 +2723,7 @@
             </w:pPr>
             <w:r>
               <w:rPr>
-                <w:rFonts w:ascii="맑은 고딕" w:cs="맑은 고딕" w:eastAsia="맑은 고딕" w:hAnsi="맑은 고딕"/>
+                <w:rFonts w:ascii="Pretendard" w:cs="Pretendard" w:eastAsia="Pretendard" w:hAnsi="Pretendard"/>
                 <w:b w:val="false"/>
                 <w:bCs w:val="false"/>
                 <w:color w:val="1A1A1A"/>
@@ -2751,7 +2751,7 @@
             </w:pPr>
             <w:r>
               <w:rPr>
-                <w:rFonts w:ascii="맑은 고딕" w:cs="맑은 고딕" w:eastAsia="맑은 고딕" w:hAnsi="맑은 고딕"/>
+                <w:rFonts w:ascii="Pretendard" w:cs="Pretendard" w:eastAsia="Pretendard" w:hAnsi="Pretendard"/>
                 <w:b w:val="false"/>
                 <w:bCs w:val="false"/>
                 <w:color w:val="1A1A1A"/>
@@ -2779,7 +2779,7 @@
             </w:pPr>
             <w:r>
               <w:rPr>
-                <w:rFonts w:ascii="맑은 고딕" w:cs="맑은 고딕" w:eastAsia="맑은 고딕" w:hAnsi="맑은 고딕"/>
+                <w:rFonts w:ascii="Pretendard" w:cs="Pretendard" w:eastAsia="Pretendard" w:hAnsi="Pretendard"/>
                 <w:b w:val="false"/>
                 <w:bCs w:val="false"/>
                 <w:color w:val="1A1A1A"/>
@@ -2812,7 +2812,7 @@
             </w:pPr>
             <w:r>
               <w:rPr>
-                <w:rFonts w:ascii="맑은 고딕" w:cs="맑은 고딕" w:eastAsia="맑은 고딕" w:hAnsi="맑은 고딕"/>
+                <w:rFonts w:ascii="Pretendard" w:cs="Pretendard" w:eastAsia="Pretendard" w:hAnsi="Pretendard"/>
                 <w:b w:val="false"/>
                 <w:bCs w:val="false"/>
                 <w:color w:val="1A1A1A"/>
@@ -2840,7 +2840,7 @@
             </w:pPr>
             <w:r>
               <w:rPr>
-                <w:rFonts w:ascii="맑은 고딕" w:cs="맑은 고딕" w:eastAsia="맑은 고딕" w:hAnsi="맑은 고딕"/>
+                <w:rFonts w:ascii="Pretendard" w:cs="Pretendard" w:eastAsia="Pretendard" w:hAnsi="Pretendard"/>
                 <w:b w:val="false"/>
                 <w:bCs w:val="false"/>
                 <w:color w:val="1A1A1A"/>
@@ -2868,7 +2868,7 @@
             </w:pPr>
             <w:r>
               <w:rPr>
-                <w:rFonts w:ascii="맑은 고딕" w:cs="맑은 고딕" w:eastAsia="맑은 고딕" w:hAnsi="맑은 고딕"/>
+                <w:rFonts w:ascii="Pretendard" w:cs="Pretendard" w:eastAsia="Pretendard" w:hAnsi="Pretendard"/>
                 <w:b w:val="false"/>
                 <w:bCs w:val="false"/>
                 <w:color w:val="1A1A1A"/>
@@ -2901,7 +2901,7 @@
             </w:pPr>
             <w:r>
               <w:rPr>
-                <w:rFonts w:ascii="맑은 고딕" w:cs="맑은 고딕" w:eastAsia="맑은 고딕" w:hAnsi="맑은 고딕"/>
+                <w:rFonts w:ascii="Pretendard" w:cs="Pretendard" w:eastAsia="Pretendard" w:hAnsi="Pretendard"/>
                 <w:b w:val="false"/>
                 <w:bCs w:val="false"/>
                 <w:color w:val="1A1A1A"/>
@@ -2929,7 +2929,7 @@
             </w:pPr>
             <w:r>
               <w:rPr>
-                <w:rFonts w:ascii="맑은 고딕" w:cs="맑은 고딕" w:eastAsia="맑은 고딕" w:hAnsi="맑은 고딕"/>
+                <w:rFonts w:ascii="Pretendard" w:cs="Pretendard" w:eastAsia="Pretendard" w:hAnsi="Pretendard"/>
                 <w:b w:val="false"/>
                 <w:bCs w:val="false"/>
                 <w:color w:val="1A1A1A"/>
@@ -2957,7 +2957,7 @@
             </w:pPr>
             <w:r>
               <w:rPr>
-                <w:rFonts w:ascii="맑은 고딕" w:cs="맑은 고딕" w:eastAsia="맑은 고딕" w:hAnsi="맑은 고딕"/>
+                <w:rFonts w:ascii="Pretendard" w:cs="Pretendard" w:eastAsia="Pretendard" w:hAnsi="Pretendard"/>
                 <w:b w:val="false"/>
                 <w:bCs w:val="false"/>
                 <w:color w:val="1A1A1A"/>
@@ -2990,7 +2990,7 @@
             </w:pPr>
             <w:r>
               <w:rPr>
-                <w:rFonts w:ascii="맑은 고딕" w:cs="맑은 고딕" w:eastAsia="맑은 고딕" w:hAnsi="맑은 고딕"/>
+                <w:rFonts w:ascii="Pretendard" w:cs="Pretendard" w:eastAsia="Pretendard" w:hAnsi="Pretendard"/>
                 <w:b w:val="false"/>
                 <w:bCs w:val="false"/>
                 <w:color w:val="1A1A1A"/>
@@ -3018,7 +3018,7 @@
             </w:pPr>
             <w:r>
               <w:rPr>
-                <w:rFonts w:ascii="맑은 고딕" w:cs="맑은 고딕" w:eastAsia="맑은 고딕" w:hAnsi="맑은 고딕"/>
+                <w:rFonts w:ascii="Pretendard" w:cs="Pretendard" w:eastAsia="Pretendard" w:hAnsi="Pretendard"/>
                 <w:b w:val="false"/>
                 <w:bCs w:val="false"/>
                 <w:color w:val="1A1A1A"/>
@@ -3046,7 +3046,7 @@
             </w:pPr>
             <w:r>
               <w:rPr>
-                <w:rFonts w:ascii="맑은 고딕" w:cs="맑은 고딕" w:eastAsia="맑은 고딕" w:hAnsi="맑은 고딕"/>
+                <w:rFonts w:ascii="Pretendard" w:cs="Pretendard" w:eastAsia="Pretendard" w:hAnsi="Pretendard"/>
                 <w:b w:val="false"/>
                 <w:bCs w:val="false"/>
                 <w:color w:val="1A1A1A"/>
@@ -3079,7 +3079,7 @@
             </w:pPr>
             <w:r>
               <w:rPr>
-                <w:rFonts w:ascii="맑은 고딕" w:cs="맑은 고딕" w:eastAsia="맑은 고딕" w:hAnsi="맑은 고딕"/>
+                <w:rFonts w:ascii="Pretendard" w:cs="Pretendard" w:eastAsia="Pretendard" w:hAnsi="Pretendard"/>
                 <w:b w:val="false"/>
                 <w:bCs w:val="false"/>
                 <w:color w:val="1A1A1A"/>
@@ -3107,7 +3107,7 @@
             </w:pPr>
             <w:r>
               <w:rPr>
-                <w:rFonts w:ascii="맑은 고딕" w:cs="맑은 고딕" w:eastAsia="맑은 고딕" w:hAnsi="맑은 고딕"/>
+                <w:rFonts w:ascii="Pretendard" w:cs="Pretendard" w:eastAsia="Pretendard" w:hAnsi="Pretendard"/>
                 <w:b w:val="false"/>
                 <w:bCs w:val="false"/>
                 <w:color w:val="1A1A1A"/>
@@ -3135,7 +3135,7 @@
             </w:pPr>
             <w:r>
               <w:rPr>
-                <w:rFonts w:ascii="맑은 고딕" w:cs="맑은 고딕" w:eastAsia="맑은 고딕" w:hAnsi="맑은 고딕"/>
+                <w:rFonts w:ascii="Pretendard" w:cs="Pretendard" w:eastAsia="Pretendard" w:hAnsi="Pretendard"/>
                 <w:b w:val="false"/>
                 <w:bCs w:val="false"/>
                 <w:color w:val="1A1A1A"/>
@@ -3168,7 +3168,7 @@
             </w:pPr>
             <w:r>
               <w:rPr>
-                <w:rFonts w:ascii="맑은 고딕" w:cs="맑은 고딕" w:eastAsia="맑은 고딕" w:hAnsi="맑은 고딕"/>
+                <w:rFonts w:ascii="Pretendard" w:cs="Pretendard" w:eastAsia="Pretendard" w:hAnsi="Pretendard"/>
                 <w:b w:val="false"/>
                 <w:bCs w:val="false"/>
                 <w:color w:val="1A1A1A"/>
@@ -3196,7 +3196,7 @@
             </w:pPr>
             <w:r>
               <w:rPr>
-                <w:rFonts w:ascii="맑은 고딕" w:cs="맑은 고딕" w:eastAsia="맑은 고딕" w:hAnsi="맑은 고딕"/>
+                <w:rFonts w:ascii="Pretendard" w:cs="Pretendard" w:eastAsia="Pretendard" w:hAnsi="Pretendard"/>
                 <w:b w:val="false"/>
                 <w:bCs w:val="false"/>
                 <w:color w:val="1A1A1A"/>
@@ -3224,7 +3224,7 @@
             </w:pPr>
             <w:r>
               <w:rPr>
-                <w:rFonts w:ascii="맑은 고딕" w:cs="맑은 고딕" w:eastAsia="맑은 고딕" w:hAnsi="맑은 고딕"/>
+                <w:rFonts w:ascii="Pretendard" w:cs="Pretendard" w:eastAsia="Pretendard" w:hAnsi="Pretendard"/>
                 <w:b w:val="false"/>
                 <w:bCs w:val="false"/>
                 <w:color w:val="1A1A1A"/>
@@ -3257,7 +3257,7 @@
             </w:pPr>
             <w:r>
               <w:rPr>
-                <w:rFonts w:ascii="맑은 고딕" w:cs="맑은 고딕" w:eastAsia="맑은 고딕" w:hAnsi="맑은 고딕"/>
+                <w:rFonts w:ascii="Pretendard" w:cs="Pretendard" w:eastAsia="Pretendard" w:hAnsi="Pretendard"/>
                 <w:b w:val="false"/>
                 <w:bCs w:val="false"/>
                 <w:color w:val="1A1A1A"/>
@@ -3285,7 +3285,7 @@
             </w:pPr>
             <w:r>
               <w:rPr>
-                <w:rFonts w:ascii="맑은 고딕" w:cs="맑은 고딕" w:eastAsia="맑은 고딕" w:hAnsi="맑은 고딕"/>
+                <w:rFonts w:ascii="Pretendard" w:cs="Pretendard" w:eastAsia="Pretendard" w:hAnsi="Pretendard"/>
                 <w:b w:val="false"/>
                 <w:bCs w:val="false"/>
                 <w:color w:val="1A1A1A"/>
@@ -3313,7 +3313,7 @@
             </w:pPr>
             <w:r>
               <w:rPr>
-                <w:rFonts w:ascii="맑은 고딕" w:cs="맑은 고딕" w:eastAsia="맑은 고딕" w:hAnsi="맑은 고딕"/>
+                <w:rFonts w:ascii="Pretendard" w:cs="Pretendard" w:eastAsia="Pretendard" w:hAnsi="Pretendard"/>
                 <w:b w:val="false"/>
                 <w:bCs w:val="false"/>
                 <w:color w:val="1A1A1A"/>
@@ -3346,7 +3346,7 @@
             </w:pPr>
             <w:r>
               <w:rPr>
-                <w:rFonts w:ascii="맑은 고딕" w:cs="맑은 고딕" w:eastAsia="맑은 고딕" w:hAnsi="맑은 고딕"/>
+                <w:rFonts w:ascii="Pretendard" w:cs="Pretendard" w:eastAsia="Pretendard" w:hAnsi="Pretendard"/>
                 <w:b w:val="false"/>
                 <w:bCs w:val="false"/>
                 <w:color w:val="1A1A1A"/>
@@ -3374,7 +3374,7 @@
             </w:pPr>
             <w:r>
               <w:rPr>
-                <w:rFonts w:ascii="맑은 고딕" w:cs="맑은 고딕" w:eastAsia="맑은 고딕" w:hAnsi="맑은 고딕"/>
+                <w:rFonts w:ascii="Pretendard" w:cs="Pretendard" w:eastAsia="Pretendard" w:hAnsi="Pretendard"/>
                 <w:b w:val="false"/>
                 <w:bCs w:val="false"/>
                 <w:color w:val="1A1A1A"/>
@@ -3402,7 +3402,7 @@
             </w:pPr>
             <w:r>
               <w:rPr>
-                <w:rFonts w:ascii="맑은 고딕" w:cs="맑은 고딕" w:eastAsia="맑은 고딕" w:hAnsi="맑은 고딕"/>
+                <w:rFonts w:ascii="Pretendard" w:cs="Pretendard" w:eastAsia="Pretendard" w:hAnsi="Pretendard"/>
                 <w:b w:val="false"/>
                 <w:bCs w:val="false"/>
                 <w:color w:val="1A1A1A"/>
@@ -3435,7 +3435,7 @@
             </w:pPr>
             <w:r>
               <w:rPr>
-                <w:rFonts w:ascii="맑은 고딕" w:cs="맑은 고딕" w:eastAsia="맑은 고딕" w:hAnsi="맑은 고딕"/>
+                <w:rFonts w:ascii="Pretendard" w:cs="Pretendard" w:eastAsia="Pretendard" w:hAnsi="Pretendard"/>
                 <w:b w:val="false"/>
                 <w:bCs w:val="false"/>
                 <w:color w:val="1A1A1A"/>
@@ -3463,7 +3463,7 @@
             </w:pPr>
             <w:r>
               <w:rPr>
-                <w:rFonts w:ascii="맑은 고딕" w:cs="맑은 고딕" w:eastAsia="맑은 고딕" w:hAnsi="맑은 고딕"/>
+                <w:rFonts w:ascii="Pretendard" w:cs="Pretendard" w:eastAsia="Pretendard" w:hAnsi="Pretendard"/>
                 <w:b w:val="false"/>
                 <w:bCs w:val="false"/>
                 <w:color w:val="1A1A1A"/>
@@ -3491,7 +3491,7 @@
             </w:pPr>
             <w:r>
               <w:rPr>
-                <w:rFonts w:ascii="맑은 고딕" w:cs="맑은 고딕" w:eastAsia="맑은 고딕" w:hAnsi="맑은 고딕"/>
+                <w:rFonts w:ascii="Pretendard" w:cs="Pretendard" w:eastAsia="Pretendard" w:hAnsi="Pretendard"/>
                 <w:b w:val="false"/>
                 <w:bCs w:val="false"/>
                 <w:color w:val="1A1A1A"/>
@@ -3524,7 +3524,7 @@
             </w:pPr>
             <w:r>
               <w:rPr>
-                <w:rFonts w:ascii="맑은 고딕" w:cs="맑은 고딕" w:eastAsia="맑은 고딕" w:hAnsi="맑은 고딕"/>
+                <w:rFonts w:ascii="Pretendard" w:cs="Pretendard" w:eastAsia="Pretendard" w:hAnsi="Pretendard"/>
                 <w:b w:val="false"/>
                 <w:bCs w:val="false"/>
                 <w:color w:val="1A1A1A"/>
@@ -3552,7 +3552,7 @@
             </w:pPr>
             <w:r>
               <w:rPr>
-                <w:rFonts w:ascii="맑은 고딕" w:cs="맑은 고딕" w:eastAsia="맑은 고딕" w:hAnsi="맑은 고딕"/>
+                <w:rFonts w:ascii="Pretendard" w:cs="Pretendard" w:eastAsia="Pretendard" w:hAnsi="Pretendard"/>
                 <w:b w:val="false"/>
                 <w:bCs w:val="false"/>
                 <w:color w:val="1A1A1A"/>
@@ -3580,7 +3580,7 @@
             </w:pPr>
             <w:r>
               <w:rPr>
-                <w:rFonts w:ascii="맑은 고딕" w:cs="맑은 고딕" w:eastAsia="맑은 고딕" w:hAnsi="맑은 고딕"/>
+                <w:rFonts w:ascii="Pretendard" w:cs="Pretendard" w:eastAsia="Pretendard" w:hAnsi="Pretendard"/>
                 <w:b w:val="false"/>
                 <w:bCs w:val="false"/>
                 <w:color w:val="1A1A1A"/>
@@ -3605,7 +3605,7 @@
       </w:pPr>
       <w:r>
         <w:rPr>
-          <w:rFonts w:ascii="맑은 고딕" w:cs="맑은 고딕" w:eastAsia="맑은 고딕" w:hAnsi="맑은 고딕"/>
+          <w:rFonts w:ascii="Pretendard" w:cs="Pretendard" w:eastAsia="Pretendard" w:hAnsi="Pretendard"/>
           <w:b/>
           <w:bCs/>
           <w:color w:val="111E6C"/>
@@ -3621,7 +3621,7 @@
       </w:pPr>
       <w:r>
         <w:rPr>
-          <w:rFonts w:ascii="맑은 고딕" w:cs="맑은 고딕" w:eastAsia="맑은 고딕" w:hAnsi="맑은 고딕"/>
+          <w:rFonts w:ascii="Pretendard" w:cs="Pretendard" w:eastAsia="Pretendard" w:hAnsi="Pretendard"/>
           <w:color w:val="1A1A1A"/>
           <w:sz w:val="20"/>
           <w:szCs w:val="20"/>
@@ -3635,7 +3635,7 @@
       </w:pPr>
       <w:r>
         <w:rPr>
-          <w:rFonts w:ascii="맑은 고딕" w:cs="맑은 고딕" w:eastAsia="맑은 고딕" w:hAnsi="맑은 고딕"/>
+          <w:rFonts w:ascii="Pretendard" w:cs="Pretendard" w:eastAsia="Pretendard" w:hAnsi="Pretendard"/>
           <w:color w:val="1A1A1A"/>
           <w:sz w:val="20"/>
           <w:szCs w:val="20"/>
@@ -3650,7 +3650,7 @@
       </w:pPr>
       <w:r>
         <w:rPr>
-          <w:rFonts w:ascii="맑은 고딕" w:cs="맑은 고딕" w:eastAsia="맑은 고딕" w:hAnsi="맑은 고딕"/>
+          <w:rFonts w:ascii="Pretendard" w:cs="Pretendard" w:eastAsia="Pretendard" w:hAnsi="Pretendard"/>
           <w:b/>
           <w:bCs/>
           <w:color w:val="111E6C"/>
@@ -3666,7 +3666,7 @@
       </w:pPr>
       <w:r>
         <w:rPr>
-          <w:rFonts w:ascii="맑은 고딕" w:cs="맑은 고딕" w:eastAsia="맑은 고딕" w:hAnsi="맑은 고딕"/>
+          <w:rFonts w:ascii="Pretendard" w:cs="Pretendard" w:eastAsia="Pretendard" w:hAnsi="Pretendard"/>
           <w:color w:val="1A1A1A"/>
           <w:sz w:val="20"/>
           <w:szCs w:val="20"/>
@@ -3720,7 +3720,7 @@
             </w:pPr>
             <w:r>
               <w:rPr>
-                <w:rFonts w:ascii="맑은 고딕" w:cs="맑은 고딕" w:eastAsia="맑은 고딕" w:hAnsi="맑은 고딕"/>
+                <w:rFonts w:ascii="Pretendard" w:cs="Pretendard" w:eastAsia="Pretendard" w:hAnsi="Pretendard"/>
                 <w:b/>
                 <w:bCs/>
                 <w:color w:val="FFFFFF"/>
@@ -3749,7 +3749,7 @@
             </w:pPr>
             <w:r>
               <w:rPr>
-                <w:rFonts w:ascii="맑은 고딕" w:cs="맑은 고딕" w:eastAsia="맑은 고딕" w:hAnsi="맑은 고딕"/>
+                <w:rFonts w:ascii="Pretendard" w:cs="Pretendard" w:eastAsia="Pretendard" w:hAnsi="Pretendard"/>
                 <w:b/>
                 <w:bCs/>
                 <w:color w:val="FFFFFF"/>
@@ -3778,7 +3778,7 @@
             </w:pPr>
             <w:r>
               <w:rPr>
-                <w:rFonts w:ascii="맑은 고딕" w:cs="맑은 고딕" w:eastAsia="맑은 고딕" w:hAnsi="맑은 고딕"/>
+                <w:rFonts w:ascii="Pretendard" w:cs="Pretendard" w:eastAsia="Pretendard" w:hAnsi="Pretendard"/>
                 <w:b/>
                 <w:bCs/>
                 <w:color w:val="FFFFFF"/>
@@ -3807,7 +3807,7 @@
             </w:pPr>
             <w:r>
               <w:rPr>
-                <w:rFonts w:ascii="맑은 고딕" w:cs="맑은 고딕" w:eastAsia="맑은 고딕" w:hAnsi="맑은 고딕"/>
+                <w:rFonts w:ascii="Pretendard" w:cs="Pretendard" w:eastAsia="Pretendard" w:hAnsi="Pretendard"/>
                 <w:b/>
                 <w:bCs/>
                 <w:color w:val="FFFFFF"/>
@@ -3836,7 +3836,7 @@
             </w:pPr>
             <w:r>
               <w:rPr>
-                <w:rFonts w:ascii="맑은 고딕" w:cs="맑은 고딕" w:eastAsia="맑은 고딕" w:hAnsi="맑은 고딕"/>
+                <w:rFonts w:ascii="Pretendard" w:cs="Pretendard" w:eastAsia="Pretendard" w:hAnsi="Pretendard"/>
                 <w:b/>
                 <w:bCs/>
                 <w:color w:val="FFFFFF"/>
@@ -3869,7 +3869,7 @@
             </w:pPr>
             <w:r>
               <w:rPr>
-                <w:rFonts w:ascii="맑은 고딕" w:cs="맑은 고딕" w:eastAsia="맑은 고딕" w:hAnsi="맑은 고딕"/>
+                <w:rFonts w:ascii="Pretendard" w:cs="Pretendard" w:eastAsia="Pretendard" w:hAnsi="Pretendard"/>
                 <w:b w:val="false"/>
                 <w:bCs w:val="false"/>
                 <w:color w:val="1A1A1A"/>
@@ -3897,7 +3897,7 @@
             </w:pPr>
             <w:r>
               <w:rPr>
-                <w:rFonts w:ascii="맑은 고딕" w:cs="맑은 고딕" w:eastAsia="맑은 고딕" w:hAnsi="맑은 고딕"/>
+                <w:rFonts w:ascii="Pretendard" w:cs="Pretendard" w:eastAsia="Pretendard" w:hAnsi="Pretendard"/>
                 <w:b w:val="false"/>
                 <w:bCs w:val="false"/>
                 <w:color w:val="1A1A1A"/>
@@ -3925,7 +3925,7 @@
             </w:pPr>
             <w:r>
               <w:rPr>
-                <w:rFonts w:ascii="맑은 고딕" w:cs="맑은 고딕" w:eastAsia="맑은 고딕" w:hAnsi="맑은 고딕"/>
+                <w:rFonts w:ascii="Pretendard" w:cs="Pretendard" w:eastAsia="Pretendard" w:hAnsi="Pretendard"/>
                 <w:b w:val="false"/>
                 <w:bCs w:val="false"/>
                 <w:color w:val="1A1A1A"/>
@@ -3953,7 +3953,7 @@
             </w:pPr>
             <w:r>
               <w:rPr>
-                <w:rFonts w:ascii="맑은 고딕" w:cs="맑은 고딕" w:eastAsia="맑은 고딕" w:hAnsi="맑은 고딕"/>
+                <w:rFonts w:ascii="Pretendard" w:cs="Pretendard" w:eastAsia="Pretendard" w:hAnsi="Pretendard"/>
                 <w:b w:val="false"/>
                 <w:bCs w:val="false"/>
                 <w:color w:val="1A1A1A"/>
@@ -3981,7 +3981,7 @@
             </w:pPr>
             <w:r>
               <w:rPr>
-                <w:rFonts w:ascii="맑은 고딕" w:cs="맑은 고딕" w:eastAsia="맑은 고딕" w:hAnsi="맑은 고딕"/>
+                <w:rFonts w:ascii="Pretendard" w:cs="Pretendard" w:eastAsia="Pretendard" w:hAnsi="Pretendard"/>
                 <w:b w:val="false"/>
                 <w:bCs w:val="false"/>
                 <w:color w:val="1A1A1A"/>
@@ -4014,7 +4014,7 @@
             </w:pPr>
             <w:r>
               <w:rPr>
-                <w:rFonts w:ascii="맑은 고딕" w:cs="맑은 고딕" w:eastAsia="맑은 고딕" w:hAnsi="맑은 고딕"/>
+                <w:rFonts w:ascii="Pretendard" w:cs="Pretendard" w:eastAsia="Pretendard" w:hAnsi="Pretendard"/>
                 <w:b w:val="false"/>
                 <w:bCs w:val="false"/>
                 <w:color w:val="1A1A1A"/>
@@ -4042,7 +4042,7 @@
             </w:pPr>
             <w:r>
               <w:rPr>
-                <w:rFonts w:ascii="맑은 고딕" w:cs="맑은 고딕" w:eastAsia="맑은 고딕" w:hAnsi="맑은 고딕"/>
+                <w:rFonts w:ascii="Pretendard" w:cs="Pretendard" w:eastAsia="Pretendard" w:hAnsi="Pretendard"/>
                 <w:b w:val="false"/>
                 <w:bCs w:val="false"/>
                 <w:color w:val="1A1A1A"/>
@@ -4070,7 +4070,7 @@
             </w:pPr>
             <w:r>
               <w:rPr>
-                <w:rFonts w:ascii="맑은 고딕" w:cs="맑은 고딕" w:eastAsia="맑은 고딕" w:hAnsi="맑은 고딕"/>
+                <w:rFonts w:ascii="Pretendard" w:cs="Pretendard" w:eastAsia="Pretendard" w:hAnsi="Pretendard"/>
                 <w:b w:val="false"/>
                 <w:bCs w:val="false"/>
                 <w:color w:val="1A1A1A"/>
@@ -4098,7 +4098,7 @@
             </w:pPr>
             <w:r>
               <w:rPr>
-                <w:rFonts w:ascii="맑은 고딕" w:cs="맑은 고딕" w:eastAsia="맑은 고딕" w:hAnsi="맑은 고딕"/>
+                <w:rFonts w:ascii="Pretendard" w:cs="Pretendard" w:eastAsia="Pretendard" w:hAnsi="Pretendard"/>
                 <w:b w:val="false"/>
                 <w:bCs w:val="false"/>
                 <w:color w:val="1A1A1A"/>
@@ -4126,7 +4126,7 @@
             </w:pPr>
             <w:r>
               <w:rPr>
-                <w:rFonts w:ascii="맑은 고딕" w:cs="맑은 고딕" w:eastAsia="맑은 고딕" w:hAnsi="맑은 고딕"/>
+                <w:rFonts w:ascii="Pretendard" w:cs="Pretendard" w:eastAsia="Pretendard" w:hAnsi="Pretendard"/>
                 <w:b w:val="false"/>
                 <w:bCs w:val="false"/>
                 <w:color w:val="1A1A1A"/>
@@ -4159,7 +4159,7 @@
             </w:pPr>
             <w:r>
               <w:rPr>
-                <w:rFonts w:ascii="맑은 고딕" w:cs="맑은 고딕" w:eastAsia="맑은 고딕" w:hAnsi="맑은 고딕"/>
+                <w:rFonts w:ascii="Pretendard" w:cs="Pretendard" w:eastAsia="Pretendard" w:hAnsi="Pretendard"/>
                 <w:b w:val="false"/>
                 <w:bCs w:val="false"/>
                 <w:color w:val="1A1A1A"/>
@@ -4187,7 +4187,7 @@
             </w:pPr>
             <w:r>
               <w:rPr>
-                <w:rFonts w:ascii="맑은 고딕" w:cs="맑은 고딕" w:eastAsia="맑은 고딕" w:hAnsi="맑은 고딕"/>
+                <w:rFonts w:ascii="Pretendard" w:cs="Pretendard" w:eastAsia="Pretendard" w:hAnsi="Pretendard"/>
                 <w:b w:val="false"/>
                 <w:bCs w:val="false"/>
                 <w:color w:val="1A1A1A"/>
@@ -4215,7 +4215,7 @@
             </w:pPr>
             <w:r>
               <w:rPr>
-                <w:rFonts w:ascii="맑은 고딕" w:cs="맑은 고딕" w:eastAsia="맑은 고딕" w:hAnsi="맑은 고딕"/>
+                <w:rFonts w:ascii="Pretendard" w:cs="Pretendard" w:eastAsia="Pretendard" w:hAnsi="Pretendard"/>
                 <w:b w:val="false"/>
                 <w:bCs w:val="false"/>
                 <w:color w:val="1A1A1A"/>
@@ -4243,7 +4243,7 @@
             </w:pPr>
             <w:r>
               <w:rPr>
-                <w:rFonts w:ascii="맑은 고딕" w:cs="맑은 고딕" w:eastAsia="맑은 고딕" w:hAnsi="맑은 고딕"/>
+                <w:rFonts w:ascii="Pretendard" w:cs="Pretendard" w:eastAsia="Pretendard" w:hAnsi="Pretendard"/>
                 <w:b w:val="false"/>
                 <w:bCs w:val="false"/>
                 <w:color w:val="1A1A1A"/>
@@ -4271,7 +4271,7 @@
             </w:pPr>
             <w:r>
               <w:rPr>
-                <w:rFonts w:ascii="맑은 고딕" w:cs="맑은 고딕" w:eastAsia="맑은 고딕" w:hAnsi="맑은 고딕"/>
+                <w:rFonts w:ascii="Pretendard" w:cs="Pretendard" w:eastAsia="Pretendard" w:hAnsi="Pretendard"/>
                 <w:b w:val="false"/>
                 <w:bCs w:val="false"/>
                 <w:color w:val="1A1A1A"/>
@@ -4299,7 +4299,7 @@
       </w:pPr>
       <w:r>
         <w:rPr>
-          <w:rFonts w:ascii="맑은 고딕" w:cs="맑은 고딕" w:eastAsia="맑은 고딕" w:hAnsi="맑은 고딕"/>
+          <w:rFonts w:ascii="Pretendard" w:cs="Pretendard" w:eastAsia="Pretendard" w:hAnsi="Pretendard"/>
           <w:b/>
           <w:bCs/>
           <w:color w:val="1A1A1A"/>
@@ -4313,7 +4313,7 @@
       </w:r>
       <w:r>
         <w:rPr>
-          <w:rFonts w:ascii="맑은 고딕" w:cs="맑은 고딕" w:eastAsia="맑은 고딕" w:hAnsi="맑은 고딕"/>
+          <w:rFonts w:ascii="Pretendard" w:cs="Pretendard" w:eastAsia="Pretendard" w:hAnsi="Pretendard"/>
           <w:color w:val="5C5C5C"/>
           <w:sz w:val="19"/>
           <w:szCs w:val="19"/>
@@ -4328,7 +4328,7 @@
       </w:pPr>
       <w:r>
         <w:rPr>
-          <w:rFonts w:ascii="맑은 고딕" w:cs="맑은 고딕" w:eastAsia="맑은 고딕" w:hAnsi="맑은 고딕"/>
+          <w:rFonts w:ascii="Pretendard" w:cs="Pretendard" w:eastAsia="Pretendard" w:hAnsi="Pretendard"/>
           <w:b/>
           <w:bCs/>
           <w:color w:val="111E6C"/>
@@ -4344,7 +4344,7 @@
       </w:pPr>
       <w:r>
         <w:rPr>
-          <w:rFonts w:ascii="맑은 고딕" w:cs="맑은 고딕" w:eastAsia="맑은 고딕" w:hAnsi="맑은 고딕"/>
+          <w:rFonts w:ascii="Pretendard" w:cs="Pretendard" w:eastAsia="Pretendard" w:hAnsi="Pretendard"/>
           <w:color w:val="1A1A1A"/>
           <w:sz w:val="20"/>
           <w:szCs w:val="20"/>
@@ -4398,7 +4398,7 @@
             </w:pPr>
             <w:r>
               <w:rPr>
-                <w:rFonts w:ascii="맑은 고딕" w:cs="맑은 고딕" w:eastAsia="맑은 고딕" w:hAnsi="맑은 고딕"/>
+                <w:rFonts w:ascii="Pretendard" w:cs="Pretendard" w:eastAsia="Pretendard" w:hAnsi="Pretendard"/>
                 <w:b/>
                 <w:bCs/>
                 <w:color w:val="FFFFFF"/>
@@ -4427,7 +4427,7 @@
             </w:pPr>
             <w:r>
               <w:rPr>
-                <w:rFonts w:ascii="맑은 고딕" w:cs="맑은 고딕" w:eastAsia="맑은 고딕" w:hAnsi="맑은 고딕"/>
+                <w:rFonts w:ascii="Pretendard" w:cs="Pretendard" w:eastAsia="Pretendard" w:hAnsi="Pretendard"/>
                 <w:b/>
                 <w:bCs/>
                 <w:color w:val="FFFFFF"/>
@@ -4456,7 +4456,7 @@
             </w:pPr>
             <w:r>
               <w:rPr>
-                <w:rFonts w:ascii="맑은 고딕" w:cs="맑은 고딕" w:eastAsia="맑은 고딕" w:hAnsi="맑은 고딕"/>
+                <w:rFonts w:ascii="Pretendard" w:cs="Pretendard" w:eastAsia="Pretendard" w:hAnsi="Pretendard"/>
                 <w:b/>
                 <w:bCs/>
                 <w:color w:val="FFFFFF"/>
@@ -4485,7 +4485,7 @@
             </w:pPr>
             <w:r>
               <w:rPr>
-                <w:rFonts w:ascii="맑은 고딕" w:cs="맑은 고딕" w:eastAsia="맑은 고딕" w:hAnsi="맑은 고딕"/>
+                <w:rFonts w:ascii="Pretendard" w:cs="Pretendard" w:eastAsia="Pretendard" w:hAnsi="Pretendard"/>
                 <w:b/>
                 <w:bCs/>
                 <w:color w:val="FFFFFF"/>
@@ -4514,7 +4514,7 @@
             </w:pPr>
             <w:r>
               <w:rPr>
-                <w:rFonts w:ascii="맑은 고딕" w:cs="맑은 고딕" w:eastAsia="맑은 고딕" w:hAnsi="맑은 고딕"/>
+                <w:rFonts w:ascii="Pretendard" w:cs="Pretendard" w:eastAsia="Pretendard" w:hAnsi="Pretendard"/>
                 <w:b/>
                 <w:bCs/>
                 <w:color w:val="FFFFFF"/>
@@ -4547,7 +4547,7 @@
             </w:pPr>
             <w:r>
               <w:rPr>
-                <w:rFonts w:ascii="맑은 고딕" w:cs="맑은 고딕" w:eastAsia="맑은 고딕" w:hAnsi="맑은 고딕"/>
+                <w:rFonts w:ascii="Pretendard" w:cs="Pretendard" w:eastAsia="Pretendard" w:hAnsi="Pretendard"/>
                 <w:b w:val="false"/>
                 <w:bCs w:val="false"/>
                 <w:color w:val="1A1A1A"/>
@@ -4575,7 +4575,7 @@
             </w:pPr>
             <w:r>
               <w:rPr>
-                <w:rFonts w:ascii="맑은 고딕" w:cs="맑은 고딕" w:eastAsia="맑은 고딕" w:hAnsi="맑은 고딕"/>
+                <w:rFonts w:ascii="Pretendard" w:cs="Pretendard" w:eastAsia="Pretendard" w:hAnsi="Pretendard"/>
                 <w:b w:val="false"/>
                 <w:bCs w:val="false"/>
                 <w:color w:val="1A1A1A"/>
@@ -4603,7 +4603,7 @@
             </w:pPr>
             <w:r>
               <w:rPr>
-                <w:rFonts w:ascii="맑은 고딕" w:cs="맑은 고딕" w:eastAsia="맑은 고딕" w:hAnsi="맑은 고딕"/>
+                <w:rFonts w:ascii="Pretendard" w:cs="Pretendard" w:eastAsia="Pretendard" w:hAnsi="Pretendard"/>
                 <w:b w:val="false"/>
                 <w:bCs w:val="false"/>
                 <w:color w:val="1A1A1A"/>
@@ -4631,7 +4631,7 @@
             </w:pPr>
             <w:r>
               <w:rPr>
-                <w:rFonts w:ascii="맑은 고딕" w:cs="맑은 고딕" w:eastAsia="맑은 고딕" w:hAnsi="맑은 고딕"/>
+                <w:rFonts w:ascii="Pretendard" w:cs="Pretendard" w:eastAsia="Pretendard" w:hAnsi="Pretendard"/>
                 <w:b w:val="false"/>
                 <w:bCs w:val="false"/>
                 <w:color w:val="1A1A1A"/>
@@ -4659,7 +4659,7 @@
             </w:pPr>
             <w:r>
               <w:rPr>
-                <w:rFonts w:ascii="맑은 고딕" w:cs="맑은 고딕" w:eastAsia="맑은 고딕" w:hAnsi="맑은 고딕"/>
+                <w:rFonts w:ascii="Pretendard" w:cs="Pretendard" w:eastAsia="Pretendard" w:hAnsi="Pretendard"/>
                 <w:b w:val="false"/>
                 <w:bCs w:val="false"/>
                 <w:color w:val="1A1A1A"/>
@@ -4692,7 +4692,7 @@
             </w:pPr>
             <w:r>
               <w:rPr>
-                <w:rFonts w:ascii="맑은 고딕" w:cs="맑은 고딕" w:eastAsia="맑은 고딕" w:hAnsi="맑은 고딕"/>
+                <w:rFonts w:ascii="Pretendard" w:cs="Pretendard" w:eastAsia="Pretendard" w:hAnsi="Pretendard"/>
                 <w:b w:val="false"/>
                 <w:bCs w:val="false"/>
                 <w:color w:val="1A1A1A"/>
@@ -4720,7 +4720,7 @@
             </w:pPr>
             <w:r>
               <w:rPr>
-                <w:rFonts w:ascii="맑은 고딕" w:cs="맑은 고딕" w:eastAsia="맑은 고딕" w:hAnsi="맑은 고딕"/>
+                <w:rFonts w:ascii="Pretendard" w:cs="Pretendard" w:eastAsia="Pretendard" w:hAnsi="Pretendard"/>
                 <w:b w:val="false"/>
                 <w:bCs w:val="false"/>
                 <w:color w:val="1A1A1A"/>
@@ -4748,7 +4748,7 @@
             </w:pPr>
             <w:r>
               <w:rPr>
-                <w:rFonts w:ascii="맑은 고딕" w:cs="맑은 고딕" w:eastAsia="맑은 고딕" w:hAnsi="맑은 고딕"/>
+                <w:rFonts w:ascii="Pretendard" w:cs="Pretendard" w:eastAsia="Pretendard" w:hAnsi="Pretendard"/>
                 <w:b w:val="false"/>
                 <w:bCs w:val="false"/>
                 <w:color w:val="1A1A1A"/>
@@ -4776,7 +4776,7 @@
             </w:pPr>
             <w:r>
               <w:rPr>
-                <w:rFonts w:ascii="맑은 고딕" w:cs="맑은 고딕" w:eastAsia="맑은 고딕" w:hAnsi="맑은 고딕"/>
+                <w:rFonts w:ascii="Pretendard" w:cs="Pretendard" w:eastAsia="Pretendard" w:hAnsi="Pretendard"/>
                 <w:b w:val="false"/>
                 <w:bCs w:val="false"/>
                 <w:color w:val="1A1A1A"/>
@@ -4804,7 +4804,7 @@
             </w:pPr>
             <w:r>
               <w:rPr>
-                <w:rFonts w:ascii="맑은 고딕" w:cs="맑은 고딕" w:eastAsia="맑은 고딕" w:hAnsi="맑은 고딕"/>
+                <w:rFonts w:ascii="Pretendard" w:cs="Pretendard" w:eastAsia="Pretendard" w:hAnsi="Pretendard"/>
                 <w:b w:val="false"/>
                 <w:bCs w:val="false"/>
                 <w:color w:val="1A1A1A"/>
@@ -4837,7 +4837,7 @@
             </w:pPr>
             <w:r>
               <w:rPr>
-                <w:rFonts w:ascii="맑은 고딕" w:cs="맑은 고딕" w:eastAsia="맑은 고딕" w:hAnsi="맑은 고딕"/>
+                <w:rFonts w:ascii="Pretendard" w:cs="Pretendard" w:eastAsia="Pretendard" w:hAnsi="Pretendard"/>
                 <w:b w:val="false"/>
                 <w:bCs w:val="false"/>
                 <w:color w:val="1A1A1A"/>
@@ -4865,7 +4865,7 @@
             </w:pPr>
             <w:r>
               <w:rPr>
-                <w:rFonts w:ascii="맑은 고딕" w:cs="맑은 고딕" w:eastAsia="맑은 고딕" w:hAnsi="맑은 고딕"/>
+                <w:rFonts w:ascii="Pretendard" w:cs="Pretendard" w:eastAsia="Pretendard" w:hAnsi="Pretendard"/>
                 <w:b w:val="false"/>
                 <w:bCs w:val="false"/>
                 <w:color w:val="1A1A1A"/>
@@ -4893,7 +4893,7 @@
             </w:pPr>
             <w:r>
               <w:rPr>
-                <w:rFonts w:ascii="맑은 고딕" w:cs="맑은 고딕" w:eastAsia="맑은 고딕" w:hAnsi="맑은 고딕"/>
+                <w:rFonts w:ascii="Pretendard" w:cs="Pretendard" w:eastAsia="Pretendard" w:hAnsi="Pretendard"/>
                 <w:b w:val="false"/>
                 <w:bCs w:val="false"/>
                 <w:color w:val="1A1A1A"/>
@@ -4921,7 +4921,7 @@
             </w:pPr>
             <w:r>
               <w:rPr>
-                <w:rFonts w:ascii="맑은 고딕" w:cs="맑은 고딕" w:eastAsia="맑은 고딕" w:hAnsi="맑은 고딕"/>
+                <w:rFonts w:ascii="Pretendard" w:cs="Pretendard" w:eastAsia="Pretendard" w:hAnsi="Pretendard"/>
                 <w:b w:val="false"/>
                 <w:bCs w:val="false"/>
                 <w:color w:val="1A1A1A"/>
@@ -4949,7 +4949,7 @@
             </w:pPr>
             <w:r>
               <w:rPr>
-                <w:rFonts w:ascii="맑은 고딕" w:cs="맑은 고딕" w:eastAsia="맑은 고딕" w:hAnsi="맑은 고딕"/>
+                <w:rFonts w:ascii="Pretendard" w:cs="Pretendard" w:eastAsia="Pretendard" w:hAnsi="Pretendard"/>
                 <w:b w:val="false"/>
                 <w:bCs w:val="false"/>
                 <w:color w:val="1A1A1A"/>
@@ -4973,7 +4973,7 @@
       </w:pPr>
       <w:r>
         <w:rPr>
-          <w:rFonts w:ascii="맑은 고딕" w:cs="맑은 고딕" w:eastAsia="맑은 고딕" w:hAnsi="맑은 고딕"/>
+          <w:rFonts w:ascii="Pretendard" w:cs="Pretendard" w:eastAsia="Pretendard" w:hAnsi="Pretendard"/>
           <w:color w:val="1A1A1A"/>
           <w:sz w:val="20"/>
           <w:szCs w:val="20"/>
@@ -4993,7 +4993,7 @@
       </w:pPr>
       <w:r>
         <w:rPr>
-          <w:rFonts w:ascii="맑은 고딕" w:cs="맑은 고딕" w:eastAsia="맑은 고딕" w:hAnsi="맑은 고딕"/>
+          <w:rFonts w:ascii="Pretendard" w:cs="Pretendard" w:eastAsia="Pretendard" w:hAnsi="Pretendard"/>
           <w:b/>
           <w:bCs/>
           <w:color w:val="1A1A1A"/>
@@ -5009,7 +5009,7 @@
       </w:pPr>
       <w:r>
         <w:rPr>
-          <w:rFonts w:ascii="맑은 고딕" w:cs="맑은 고딕" w:eastAsia="맑은 고딕" w:hAnsi="맑은 고딕"/>
+          <w:rFonts w:ascii="Pretendard" w:cs="Pretendard" w:eastAsia="Pretendard" w:hAnsi="Pretendard"/>
           <w:color w:val="1A1A1A"/>
           <w:sz w:val="20"/>
           <w:szCs w:val="20"/>
@@ -5061,7 +5061,7 @@
             </w:pPr>
             <w:r>
               <w:rPr>
-                <w:rFonts w:ascii="맑은 고딕" w:cs="맑은 고딕" w:eastAsia="맑은 고딕" w:hAnsi="맑은 고딕"/>
+                <w:rFonts w:ascii="Pretendard" w:cs="Pretendard" w:eastAsia="Pretendard" w:hAnsi="Pretendard"/>
                 <w:b/>
                 <w:bCs/>
                 <w:color w:val="FFFFFF"/>
@@ -5090,7 +5090,7 @@
             </w:pPr>
             <w:r>
               <w:rPr>
-                <w:rFonts w:ascii="맑은 고딕" w:cs="맑은 고딕" w:eastAsia="맑은 고딕" w:hAnsi="맑은 고딕"/>
+                <w:rFonts w:ascii="Pretendard" w:cs="Pretendard" w:eastAsia="Pretendard" w:hAnsi="Pretendard"/>
                 <w:b/>
                 <w:bCs/>
                 <w:color w:val="FFFFFF"/>
@@ -5119,7 +5119,7 @@
             </w:pPr>
             <w:r>
               <w:rPr>
-                <w:rFonts w:ascii="맑은 고딕" w:cs="맑은 고딕" w:eastAsia="맑은 고딕" w:hAnsi="맑은 고딕"/>
+                <w:rFonts w:ascii="Pretendard" w:cs="Pretendard" w:eastAsia="Pretendard" w:hAnsi="Pretendard"/>
                 <w:b/>
                 <w:bCs/>
                 <w:color w:val="FFFFFF"/>
@@ -5152,7 +5152,7 @@
             </w:pPr>
             <w:r>
               <w:rPr>
-                <w:rFonts w:ascii="맑은 고딕" w:cs="맑은 고딕" w:eastAsia="맑은 고딕" w:hAnsi="맑은 고딕"/>
+                <w:rFonts w:ascii="Pretendard" w:cs="Pretendard" w:eastAsia="Pretendard" w:hAnsi="Pretendard"/>
                 <w:b w:val="false"/>
                 <w:bCs w:val="false"/>
                 <w:color w:val="1A1A1A"/>
@@ -5180,7 +5180,7 @@
             </w:pPr>
             <w:r>
               <w:rPr>
-                <w:rFonts w:ascii="맑은 고딕" w:cs="맑은 고딕" w:eastAsia="맑은 고딕" w:hAnsi="맑은 고딕"/>
+                <w:rFonts w:ascii="Pretendard" w:cs="Pretendard" w:eastAsia="Pretendard" w:hAnsi="Pretendard"/>
                 <w:b w:val="false"/>
                 <w:bCs w:val="false"/>
                 <w:color w:val="1A1A1A"/>
@@ -5208,7 +5208,7 @@
             </w:pPr>
             <w:r>
               <w:rPr>
-                <w:rFonts w:ascii="맑은 고딕" w:cs="맑은 고딕" w:eastAsia="맑은 고딕" w:hAnsi="맑은 고딕"/>
+                <w:rFonts w:ascii="Pretendard" w:cs="Pretendard" w:eastAsia="Pretendard" w:hAnsi="Pretendard"/>
                 <w:b w:val="false"/>
                 <w:bCs w:val="false"/>
                 <w:color w:val="1A1A1A"/>
@@ -5241,7 +5241,7 @@
             </w:pPr>
             <w:r>
               <w:rPr>
-                <w:rFonts w:ascii="맑은 고딕" w:cs="맑은 고딕" w:eastAsia="맑은 고딕" w:hAnsi="맑은 고딕"/>
+                <w:rFonts w:ascii="Pretendard" w:cs="Pretendard" w:eastAsia="Pretendard" w:hAnsi="Pretendard"/>
                 <w:b w:val="false"/>
                 <w:bCs w:val="false"/>
                 <w:color w:val="1A1A1A"/>
@@ -5269,7 +5269,7 @@
             </w:pPr>
             <w:r>
               <w:rPr>
-                <w:rFonts w:ascii="맑은 고딕" w:cs="맑은 고딕" w:eastAsia="맑은 고딕" w:hAnsi="맑은 고딕"/>
+                <w:rFonts w:ascii="Pretendard" w:cs="Pretendard" w:eastAsia="Pretendard" w:hAnsi="Pretendard"/>
                 <w:b w:val="false"/>
                 <w:bCs w:val="false"/>
                 <w:color w:val="1A1A1A"/>
@@ -5297,7 +5297,7 @@
             </w:pPr>
             <w:r>
               <w:rPr>
-                <w:rFonts w:ascii="맑은 고딕" w:cs="맑은 고딕" w:eastAsia="맑은 고딕" w:hAnsi="맑은 고딕"/>
+                <w:rFonts w:ascii="Pretendard" w:cs="Pretendard" w:eastAsia="Pretendard" w:hAnsi="Pretendard"/>
                 <w:b w:val="false"/>
                 <w:bCs w:val="false"/>
                 <w:color w:val="1A1A1A"/>
@@ -5330,7 +5330,7 @@
             </w:pPr>
             <w:r>
               <w:rPr>
-                <w:rFonts w:ascii="맑은 고딕" w:cs="맑은 고딕" w:eastAsia="맑은 고딕" w:hAnsi="맑은 고딕"/>
+                <w:rFonts w:ascii="Pretendard" w:cs="Pretendard" w:eastAsia="Pretendard" w:hAnsi="Pretendard"/>
                 <w:b w:val="false"/>
                 <w:bCs w:val="false"/>
                 <w:color w:val="1A1A1A"/>
@@ -5358,7 +5358,7 @@
             </w:pPr>
             <w:r>
               <w:rPr>
-                <w:rFonts w:ascii="맑은 고딕" w:cs="맑은 고딕" w:eastAsia="맑은 고딕" w:hAnsi="맑은 고딕"/>
+                <w:rFonts w:ascii="Pretendard" w:cs="Pretendard" w:eastAsia="Pretendard" w:hAnsi="Pretendard"/>
                 <w:b w:val="false"/>
                 <w:bCs w:val="false"/>
                 <w:color w:val="1A1A1A"/>
@@ -5386,7 +5386,7 @@
             </w:pPr>
             <w:r>
               <w:rPr>
-                <w:rFonts w:ascii="맑은 고딕" w:cs="맑은 고딕" w:eastAsia="맑은 고딕" w:hAnsi="맑은 고딕"/>
+                <w:rFonts w:ascii="Pretendard" w:cs="Pretendard" w:eastAsia="Pretendard" w:hAnsi="Pretendard"/>
                 <w:b w:val="false"/>
                 <w:bCs w:val="false"/>
                 <w:color w:val="1A1A1A"/>
@@ -5419,7 +5419,7 @@
             </w:pPr>
             <w:r>
               <w:rPr>
-                <w:rFonts w:ascii="맑은 고딕" w:cs="맑은 고딕" w:eastAsia="맑은 고딕" w:hAnsi="맑은 고딕"/>
+                <w:rFonts w:ascii="Pretendard" w:cs="Pretendard" w:eastAsia="Pretendard" w:hAnsi="Pretendard"/>
                 <w:b w:val="false"/>
                 <w:bCs w:val="false"/>
                 <w:color w:val="1A1A1A"/>
@@ -5447,7 +5447,7 @@
             </w:pPr>
             <w:r>
               <w:rPr>
-                <w:rFonts w:ascii="맑은 고딕" w:cs="맑은 고딕" w:eastAsia="맑은 고딕" w:hAnsi="맑은 고딕"/>
+                <w:rFonts w:ascii="Pretendard" w:cs="Pretendard" w:eastAsia="Pretendard" w:hAnsi="Pretendard"/>
                 <w:b w:val="false"/>
                 <w:bCs w:val="false"/>
                 <w:color w:val="1A1A1A"/>
@@ -5475,7 +5475,7 @@
             </w:pPr>
             <w:r>
               <w:rPr>
-                <w:rFonts w:ascii="맑은 고딕" w:cs="맑은 고딕" w:eastAsia="맑은 고딕" w:hAnsi="맑은 고딕"/>
+                <w:rFonts w:ascii="Pretendard" w:cs="Pretendard" w:eastAsia="Pretendard" w:hAnsi="Pretendard"/>
                 <w:b w:val="false"/>
                 <w:bCs w:val="false"/>
                 <w:color w:val="1A1A1A"/>
@@ -5508,7 +5508,7 @@
             </w:pPr>
             <w:r>
               <w:rPr>
-                <w:rFonts w:ascii="맑은 고딕" w:cs="맑은 고딕" w:eastAsia="맑은 고딕" w:hAnsi="맑은 고딕"/>
+                <w:rFonts w:ascii="Pretendard" w:cs="Pretendard" w:eastAsia="Pretendard" w:hAnsi="Pretendard"/>
                 <w:b w:val="false"/>
                 <w:bCs w:val="false"/>
                 <w:color w:val="1A1A1A"/>
@@ -5536,7 +5536,7 @@
             </w:pPr>
             <w:r>
               <w:rPr>
-                <w:rFonts w:ascii="맑은 고딕" w:cs="맑은 고딕" w:eastAsia="맑은 고딕" w:hAnsi="맑은 고딕"/>
+                <w:rFonts w:ascii="Pretendard" w:cs="Pretendard" w:eastAsia="Pretendard" w:hAnsi="Pretendard"/>
                 <w:b w:val="false"/>
                 <w:bCs w:val="false"/>
                 <w:color w:val="1A1A1A"/>
@@ -5564,7 +5564,7 @@
             </w:pPr>
             <w:r>
               <w:rPr>
-                <w:rFonts w:ascii="맑은 고딕" w:cs="맑은 고딕" w:eastAsia="맑은 고딕" w:hAnsi="맑은 고딕"/>
+                <w:rFonts w:ascii="Pretendard" w:cs="Pretendard" w:eastAsia="Pretendard" w:hAnsi="Pretendard"/>
                 <w:b w:val="false"/>
                 <w:bCs w:val="false"/>
                 <w:color w:val="1A1A1A"/>
@@ -5597,7 +5597,7 @@
             </w:pPr>
             <w:r>
               <w:rPr>
-                <w:rFonts w:ascii="맑은 고딕" w:cs="맑은 고딕" w:eastAsia="맑은 고딕" w:hAnsi="맑은 고딕"/>
+                <w:rFonts w:ascii="Pretendard" w:cs="Pretendard" w:eastAsia="Pretendard" w:hAnsi="Pretendard"/>
                 <w:b w:val="false"/>
                 <w:bCs w:val="false"/>
                 <w:color w:val="1A1A1A"/>
@@ -5625,7 +5625,7 @@
             </w:pPr>
             <w:r>
               <w:rPr>
-                <w:rFonts w:ascii="맑은 고딕" w:cs="맑은 고딕" w:eastAsia="맑은 고딕" w:hAnsi="맑은 고딕"/>
+                <w:rFonts w:ascii="Pretendard" w:cs="Pretendard" w:eastAsia="Pretendard" w:hAnsi="Pretendard"/>
                 <w:b w:val="false"/>
                 <w:bCs w:val="false"/>
                 <w:color w:val="1A1A1A"/>
@@ -5653,7 +5653,7 @@
             </w:pPr>
             <w:r>
               <w:rPr>
-                <w:rFonts w:ascii="맑은 고딕" w:cs="맑은 고딕" w:eastAsia="맑은 고딕" w:hAnsi="맑은 고딕"/>
+                <w:rFonts w:ascii="Pretendard" w:cs="Pretendard" w:eastAsia="Pretendard" w:hAnsi="Pretendard"/>
                 <w:b w:val="false"/>
                 <w:bCs w:val="false"/>
                 <w:color w:val="1A1A1A"/>
@@ -5686,7 +5686,7 @@
             </w:pPr>
             <w:r>
               <w:rPr>
-                <w:rFonts w:ascii="맑은 고딕" w:cs="맑은 고딕" w:eastAsia="맑은 고딕" w:hAnsi="맑은 고딕"/>
+                <w:rFonts w:ascii="Pretendard" w:cs="Pretendard" w:eastAsia="Pretendard" w:hAnsi="Pretendard"/>
                 <w:b w:val="false"/>
                 <w:bCs w:val="false"/>
                 <w:color w:val="1A1A1A"/>
@@ -5714,7 +5714,7 @@
             </w:pPr>
             <w:r>
               <w:rPr>
-                <w:rFonts w:ascii="맑은 고딕" w:cs="맑은 고딕" w:eastAsia="맑은 고딕" w:hAnsi="맑은 고딕"/>
+                <w:rFonts w:ascii="Pretendard" w:cs="Pretendard" w:eastAsia="Pretendard" w:hAnsi="Pretendard"/>
                 <w:b w:val="false"/>
                 <w:bCs w:val="false"/>
                 <w:color w:val="1A1A1A"/>
@@ -5742,7 +5742,7 @@
             </w:pPr>
             <w:r>
               <w:rPr>
-                <w:rFonts w:ascii="맑은 고딕" w:cs="맑은 고딕" w:eastAsia="맑은 고딕" w:hAnsi="맑은 고딕"/>
+                <w:rFonts w:ascii="Pretendard" w:cs="Pretendard" w:eastAsia="Pretendard" w:hAnsi="Pretendard"/>
                 <w:b w:val="false"/>
                 <w:bCs w:val="false"/>
                 <w:color w:val="1A1A1A"/>
@@ -5775,7 +5775,7 @@
             </w:pPr>
             <w:r>
               <w:rPr>
-                <w:rFonts w:ascii="맑은 고딕" w:cs="맑은 고딕" w:eastAsia="맑은 고딕" w:hAnsi="맑은 고딕"/>
+                <w:rFonts w:ascii="Pretendard" w:cs="Pretendard" w:eastAsia="Pretendard" w:hAnsi="Pretendard"/>
                 <w:b w:val="false"/>
                 <w:bCs w:val="false"/>
                 <w:color w:val="1A1A1A"/>
@@ -5803,7 +5803,7 @@
             </w:pPr>
             <w:r>
               <w:rPr>
-                <w:rFonts w:ascii="맑은 고딕" w:cs="맑은 고딕" w:eastAsia="맑은 고딕" w:hAnsi="맑은 고딕"/>
+                <w:rFonts w:ascii="Pretendard" w:cs="Pretendard" w:eastAsia="Pretendard" w:hAnsi="Pretendard"/>
                 <w:b w:val="false"/>
                 <w:bCs w:val="false"/>
                 <w:color w:val="1A1A1A"/>
@@ -5831,7 +5831,7 @@
             </w:pPr>
             <w:r>
               <w:rPr>
-                <w:rFonts w:ascii="맑은 고딕" w:cs="맑은 고딕" w:eastAsia="맑은 고딕" w:hAnsi="맑은 고딕"/>
+                <w:rFonts w:ascii="Pretendard" w:cs="Pretendard" w:eastAsia="Pretendard" w:hAnsi="Pretendard"/>
                 <w:b w:val="false"/>
                 <w:bCs w:val="false"/>
                 <w:color w:val="1A1A1A"/>
@@ -5855,7 +5855,7 @@
       </w:pPr>
       <w:r>
         <w:rPr>
-          <w:rFonts w:ascii="맑은 고딕" w:cs="맑은 고딕" w:eastAsia="맑은 고딕" w:hAnsi="맑은 고딕"/>
+          <w:rFonts w:ascii="Pretendard" w:cs="Pretendard" w:eastAsia="Pretendard" w:hAnsi="Pretendard"/>
           <w:color w:val="1A1A1A"/>
           <w:sz w:val="20"/>
           <w:szCs w:val="20"/>
@@ -5870,7 +5870,7 @@
       </w:pPr>
       <w:r>
         <w:rPr>
-          <w:rFonts w:ascii="맑은 고딕" w:cs="맑은 고딕" w:eastAsia="맑은 고딕" w:hAnsi="맑은 고딕"/>
+          <w:rFonts w:ascii="Pretendard" w:cs="Pretendard" w:eastAsia="Pretendard" w:hAnsi="Pretendard"/>
           <w:b/>
           <w:bCs/>
           <w:color w:val="111E6C"/>
@@ -5886,7 +5886,7 @@
       </w:pPr>
       <w:r>
         <w:rPr>
-          <w:rFonts w:ascii="맑은 고딕" w:cs="맑은 고딕" w:eastAsia="맑은 고딕" w:hAnsi="맑은 고딕"/>
+          <w:rFonts w:ascii="Pretendard" w:cs="Pretendard" w:eastAsia="Pretendard" w:hAnsi="Pretendard"/>
           <w:color w:val="1A1A1A"/>
           <w:sz w:val="20"/>
           <w:szCs w:val="20"/>
@@ -5900,7 +5900,7 @@
       </w:pPr>
       <w:r>
         <w:rPr>
-          <w:rFonts w:ascii="맑은 고딕" w:cs="맑은 고딕" w:eastAsia="맑은 고딕" w:hAnsi="맑은 고딕"/>
+          <w:rFonts w:ascii="Pretendard" w:cs="Pretendard" w:eastAsia="Pretendard" w:hAnsi="Pretendard"/>
           <w:color w:val="1A1A1A"/>
           <w:sz w:val="20"/>
           <w:szCs w:val="20"/>
@@ -5915,7 +5915,7 @@
       </w:pPr>
       <w:r>
         <w:rPr>
-          <w:rFonts w:ascii="맑은 고딕" w:cs="맑은 고딕" w:eastAsia="맑은 고딕" w:hAnsi="맑은 고딕"/>
+          <w:rFonts w:ascii="Pretendard" w:cs="Pretendard" w:eastAsia="Pretendard" w:hAnsi="Pretendard"/>
           <w:b/>
           <w:bCs/>
           <w:color w:val="1A1A1A"/>
@@ -5969,7 +5969,7 @@
             </w:pPr>
             <w:r>
               <w:rPr>
-                <w:rFonts w:ascii="맑은 고딕" w:cs="맑은 고딕" w:eastAsia="맑은 고딕" w:hAnsi="맑은 고딕"/>
+                <w:rFonts w:ascii="Pretendard" w:cs="Pretendard" w:eastAsia="Pretendard" w:hAnsi="Pretendard"/>
                 <w:b/>
                 <w:bCs/>
                 <w:color w:val="FFFFFF"/>
@@ -5998,7 +5998,7 @@
             </w:pPr>
             <w:r>
               <w:rPr>
-                <w:rFonts w:ascii="맑은 고딕" w:cs="맑은 고딕" w:eastAsia="맑은 고딕" w:hAnsi="맑은 고딕"/>
+                <w:rFonts w:ascii="Pretendard" w:cs="Pretendard" w:eastAsia="Pretendard" w:hAnsi="Pretendard"/>
                 <w:b/>
                 <w:bCs/>
                 <w:color w:val="FFFFFF"/>
@@ -6027,7 +6027,7 @@
             </w:pPr>
             <w:r>
               <w:rPr>
-                <w:rFonts w:ascii="맑은 고딕" w:cs="맑은 고딕" w:eastAsia="맑은 고딕" w:hAnsi="맑은 고딕"/>
+                <w:rFonts w:ascii="Pretendard" w:cs="Pretendard" w:eastAsia="Pretendard" w:hAnsi="Pretendard"/>
                 <w:b/>
                 <w:bCs/>
                 <w:color w:val="FFFFFF"/>
@@ -6060,7 +6060,7 @@
             </w:pPr>
             <w:r>
               <w:rPr>
-                <w:rFonts w:ascii="맑은 고딕" w:cs="맑은 고딕" w:eastAsia="맑은 고딕" w:hAnsi="맑은 고딕"/>
+                <w:rFonts w:ascii="Pretendard" w:cs="Pretendard" w:eastAsia="Pretendard" w:hAnsi="Pretendard"/>
                 <w:b w:val="false"/>
                 <w:bCs w:val="false"/>
                 <w:color w:val="1A1A1A"/>
@@ -6088,7 +6088,7 @@
             </w:pPr>
             <w:r>
               <w:rPr>
-                <w:rFonts w:ascii="맑은 고딕" w:cs="맑은 고딕" w:eastAsia="맑은 고딕" w:hAnsi="맑은 고딕"/>
+                <w:rFonts w:ascii="Pretendard" w:cs="Pretendard" w:eastAsia="Pretendard" w:hAnsi="Pretendard"/>
                 <w:b w:val="false"/>
                 <w:bCs w:val="false"/>
                 <w:color w:val="1A1A1A"/>
@@ -6116,7 +6116,7 @@
             </w:pPr>
             <w:r>
               <w:rPr>
-                <w:rFonts w:ascii="맑은 고딕" w:cs="맑은 고딕" w:eastAsia="맑은 고딕" w:hAnsi="맑은 고딕"/>
+                <w:rFonts w:ascii="Pretendard" w:cs="Pretendard" w:eastAsia="Pretendard" w:hAnsi="Pretendard"/>
                 <w:b w:val="false"/>
                 <w:bCs w:val="false"/>
                 <w:color w:val="1A1A1A"/>
@@ -6149,7 +6149,7 @@
             </w:pPr>
             <w:r>
               <w:rPr>
-                <w:rFonts w:ascii="맑은 고딕" w:cs="맑은 고딕" w:eastAsia="맑은 고딕" w:hAnsi="맑은 고딕"/>
+                <w:rFonts w:ascii="Pretendard" w:cs="Pretendard" w:eastAsia="Pretendard" w:hAnsi="Pretendard"/>
                 <w:b w:val="false"/>
                 <w:bCs w:val="false"/>
                 <w:color w:val="1A1A1A"/>
@@ -6177,7 +6177,7 @@
             </w:pPr>
             <w:r>
               <w:rPr>
-                <w:rFonts w:ascii="맑은 고딕" w:cs="맑은 고딕" w:eastAsia="맑은 고딕" w:hAnsi="맑은 고딕"/>
+                <w:rFonts w:ascii="Pretendard" w:cs="Pretendard" w:eastAsia="Pretendard" w:hAnsi="Pretendard"/>
                 <w:b w:val="false"/>
                 <w:bCs w:val="false"/>
                 <w:color w:val="1A1A1A"/>
@@ -6205,7 +6205,7 @@
             </w:pPr>
             <w:r>
               <w:rPr>
-                <w:rFonts w:ascii="맑은 고딕" w:cs="맑은 고딕" w:eastAsia="맑은 고딕" w:hAnsi="맑은 고딕"/>
+                <w:rFonts w:ascii="Pretendard" w:cs="Pretendard" w:eastAsia="Pretendard" w:hAnsi="Pretendard"/>
                 <w:b w:val="false"/>
                 <w:bCs w:val="false"/>
                 <w:color w:val="1A1A1A"/>
@@ -6238,7 +6238,7 @@
             </w:pPr>
             <w:r>
               <w:rPr>
-                <w:rFonts w:ascii="맑은 고딕" w:cs="맑은 고딕" w:eastAsia="맑은 고딕" w:hAnsi="맑은 고딕"/>
+                <w:rFonts w:ascii="Pretendard" w:cs="Pretendard" w:eastAsia="Pretendard" w:hAnsi="Pretendard"/>
                 <w:b w:val="false"/>
                 <w:bCs w:val="false"/>
                 <w:color w:val="1A1A1A"/>
@@ -6266,7 +6266,7 @@
             </w:pPr>
             <w:r>
               <w:rPr>
-                <w:rFonts w:ascii="맑은 고딕" w:cs="맑은 고딕" w:eastAsia="맑은 고딕" w:hAnsi="맑은 고딕"/>
+                <w:rFonts w:ascii="Pretendard" w:cs="Pretendard" w:eastAsia="Pretendard" w:hAnsi="Pretendard"/>
                 <w:b w:val="false"/>
                 <w:bCs w:val="false"/>
                 <w:color w:val="1A1A1A"/>
@@ -6294,7 +6294,7 @@
             </w:pPr>
             <w:r>
               <w:rPr>
-                <w:rFonts w:ascii="맑은 고딕" w:cs="맑은 고딕" w:eastAsia="맑은 고딕" w:hAnsi="맑은 고딕"/>
+                <w:rFonts w:ascii="Pretendard" w:cs="Pretendard" w:eastAsia="Pretendard" w:hAnsi="Pretendard"/>
                 <w:b w:val="false"/>
                 <w:bCs w:val="false"/>
                 <w:color w:val="1A1A1A"/>
@@ -6327,7 +6327,7 @@
             </w:pPr>
             <w:r>
               <w:rPr>
-                <w:rFonts w:ascii="맑은 고딕" w:cs="맑은 고딕" w:eastAsia="맑은 고딕" w:hAnsi="맑은 고딕"/>
+                <w:rFonts w:ascii="Pretendard" w:cs="Pretendard" w:eastAsia="Pretendard" w:hAnsi="Pretendard"/>
                 <w:b w:val="false"/>
                 <w:bCs w:val="false"/>
                 <w:color w:val="1A1A1A"/>
@@ -6355,7 +6355,7 @@
             </w:pPr>
             <w:r>
               <w:rPr>
-                <w:rFonts w:ascii="맑은 고딕" w:cs="맑은 고딕" w:eastAsia="맑은 고딕" w:hAnsi="맑은 고딕"/>
+                <w:rFonts w:ascii="Pretendard" w:cs="Pretendard" w:eastAsia="Pretendard" w:hAnsi="Pretendard"/>
                 <w:b w:val="false"/>
                 <w:bCs w:val="false"/>
                 <w:color w:val="1A1A1A"/>
@@ -6383,7 +6383,7 @@
             </w:pPr>
             <w:r>
               <w:rPr>
-                <w:rFonts w:ascii="맑은 고딕" w:cs="맑은 고딕" w:eastAsia="맑은 고딕" w:hAnsi="맑은 고딕"/>
+                <w:rFonts w:ascii="Pretendard" w:cs="Pretendard" w:eastAsia="Pretendard" w:hAnsi="Pretendard"/>
                 <w:b w:val="false"/>
                 <w:bCs w:val="false"/>
                 <w:color w:val="1A1A1A"/>
@@ -6416,7 +6416,7 @@
             </w:pPr>
             <w:r>
               <w:rPr>
-                <w:rFonts w:ascii="맑은 고딕" w:cs="맑은 고딕" w:eastAsia="맑은 고딕" w:hAnsi="맑은 고딕"/>
+                <w:rFonts w:ascii="Pretendard" w:cs="Pretendard" w:eastAsia="Pretendard" w:hAnsi="Pretendard"/>
                 <w:b w:val="false"/>
                 <w:bCs w:val="false"/>
                 <w:color w:val="1A1A1A"/>
@@ -6444,7 +6444,7 @@
             </w:pPr>
             <w:r>
               <w:rPr>
-                <w:rFonts w:ascii="맑은 고딕" w:cs="맑은 고딕" w:eastAsia="맑은 고딕" w:hAnsi="맑은 고딕"/>
+                <w:rFonts w:ascii="Pretendard" w:cs="Pretendard" w:eastAsia="Pretendard" w:hAnsi="Pretendard"/>
                 <w:b w:val="false"/>
                 <w:bCs w:val="false"/>
                 <w:color w:val="1A1A1A"/>
@@ -6472,7 +6472,7 @@
             </w:pPr>
             <w:r>
               <w:rPr>
-                <w:rFonts w:ascii="맑은 고딕" w:cs="맑은 고딕" w:eastAsia="맑은 고딕" w:hAnsi="맑은 고딕"/>
+                <w:rFonts w:ascii="Pretendard" w:cs="Pretendard" w:eastAsia="Pretendard" w:hAnsi="Pretendard"/>
                 <w:b w:val="false"/>
                 <w:bCs w:val="false"/>
                 <w:color w:val="1A1A1A"/>
@@ -6505,7 +6505,7 @@
             </w:pPr>
             <w:r>
               <w:rPr>
-                <w:rFonts w:ascii="맑은 고딕" w:cs="맑은 고딕" w:eastAsia="맑은 고딕" w:hAnsi="맑은 고딕"/>
+                <w:rFonts w:ascii="Pretendard" w:cs="Pretendard" w:eastAsia="Pretendard" w:hAnsi="Pretendard"/>
                 <w:b w:val="false"/>
                 <w:bCs w:val="false"/>
                 <w:color w:val="1A1A1A"/>
@@ -6533,7 +6533,7 @@
             </w:pPr>
             <w:r>
               <w:rPr>
-                <w:rFonts w:ascii="맑은 고딕" w:cs="맑은 고딕" w:eastAsia="맑은 고딕" w:hAnsi="맑은 고딕"/>
+                <w:rFonts w:ascii="Pretendard" w:cs="Pretendard" w:eastAsia="Pretendard" w:hAnsi="Pretendard"/>
                 <w:b w:val="false"/>
                 <w:bCs w:val="false"/>
                 <w:color w:val="1A1A1A"/>
@@ -6561,7 +6561,7 @@
             </w:pPr>
             <w:r>
               <w:rPr>
-                <w:rFonts w:ascii="맑은 고딕" w:cs="맑은 고딕" w:eastAsia="맑은 고딕" w:hAnsi="맑은 고딕"/>
+                <w:rFonts w:ascii="Pretendard" w:cs="Pretendard" w:eastAsia="Pretendard" w:hAnsi="Pretendard"/>
                 <w:b w:val="false"/>
                 <w:bCs w:val="false"/>
                 <w:color w:val="1A1A1A"/>
@@ -6594,7 +6594,7 @@
             </w:pPr>
             <w:r>
               <w:rPr>
-                <w:rFonts w:ascii="맑은 고딕" w:cs="맑은 고딕" w:eastAsia="맑은 고딕" w:hAnsi="맑은 고딕"/>
+                <w:rFonts w:ascii="Pretendard" w:cs="Pretendard" w:eastAsia="Pretendard" w:hAnsi="Pretendard"/>
                 <w:b w:val="false"/>
                 <w:bCs w:val="false"/>
                 <w:color w:val="1A1A1A"/>
@@ -6622,7 +6622,7 @@
             </w:pPr>
             <w:r>
               <w:rPr>
-                <w:rFonts w:ascii="맑은 고딕" w:cs="맑은 고딕" w:eastAsia="맑은 고딕" w:hAnsi="맑은 고딕"/>
+                <w:rFonts w:ascii="Pretendard" w:cs="Pretendard" w:eastAsia="Pretendard" w:hAnsi="Pretendard"/>
                 <w:b w:val="false"/>
                 <w:bCs w:val="false"/>
                 <w:color w:val="1A1A1A"/>
@@ -6650,7 +6650,7 @@
             </w:pPr>
             <w:r>
               <w:rPr>
-                <w:rFonts w:ascii="맑은 고딕" w:cs="맑은 고딕" w:eastAsia="맑은 고딕" w:hAnsi="맑은 고딕"/>
+                <w:rFonts w:ascii="Pretendard" w:cs="Pretendard" w:eastAsia="Pretendard" w:hAnsi="Pretendard"/>
                 <w:b w:val="false"/>
                 <w:bCs w:val="false"/>
                 <w:color w:val="1A1A1A"/>
@@ -6683,7 +6683,7 @@
             </w:pPr>
             <w:r>
               <w:rPr>
-                <w:rFonts w:ascii="맑은 고딕" w:cs="맑은 고딕" w:eastAsia="맑은 고딕" w:hAnsi="맑은 고딕"/>
+                <w:rFonts w:ascii="Pretendard" w:cs="Pretendard" w:eastAsia="Pretendard" w:hAnsi="Pretendard"/>
                 <w:b w:val="false"/>
                 <w:bCs w:val="false"/>
                 <w:color w:val="1A1A1A"/>
@@ -6711,7 +6711,7 @@
             </w:pPr>
             <w:r>
               <w:rPr>
-                <w:rFonts w:ascii="맑은 고딕" w:cs="맑은 고딕" w:eastAsia="맑은 고딕" w:hAnsi="맑은 고딕"/>
+                <w:rFonts w:ascii="Pretendard" w:cs="Pretendard" w:eastAsia="Pretendard" w:hAnsi="Pretendard"/>
                 <w:b w:val="false"/>
                 <w:bCs w:val="false"/>
                 <w:color w:val="1A1A1A"/>
@@ -6739,7 +6739,7 @@
             </w:pPr>
             <w:r>
               <w:rPr>
-                <w:rFonts w:ascii="맑은 고딕" w:cs="맑은 고딕" w:eastAsia="맑은 고딕" w:hAnsi="맑은 고딕"/>
+                <w:rFonts w:ascii="Pretendard" w:cs="Pretendard" w:eastAsia="Pretendard" w:hAnsi="Pretendard"/>
                 <w:b w:val="false"/>
                 <w:bCs w:val="false"/>
                 <w:color w:val="1A1A1A"/>
@@ -6767,7 +6767,7 @@
       </w:pPr>
       <w:r>
         <w:rPr>
-          <w:rFonts w:ascii="맑은 고딕" w:cs="맑은 고딕" w:eastAsia="맑은 고딕" w:hAnsi="맑은 고딕"/>
+          <w:rFonts w:ascii="Pretendard" w:cs="Pretendard" w:eastAsia="Pretendard" w:hAnsi="Pretendard"/>
           <w:b/>
           <w:bCs/>
           <w:color w:val="1A1A1A"/>
@@ -6781,7 +6781,7 @@
       </w:r>
       <w:r>
         <w:rPr>
-          <w:rFonts w:ascii="맑은 고딕" w:cs="맑은 고딕" w:eastAsia="맑은 고딕" w:hAnsi="맑은 고딕"/>
+          <w:rFonts w:ascii="Pretendard" w:cs="Pretendard" w:eastAsia="Pretendard" w:hAnsi="Pretendard"/>
           <w:color w:val="5C5C5C"/>
           <w:sz w:val="19"/>
           <w:szCs w:val="19"/>
@@ -6796,7 +6796,7 @@
       </w:pPr>
       <w:r>
         <w:rPr>
-          <w:rFonts w:ascii="맑은 고딕" w:cs="맑은 고딕" w:eastAsia="맑은 고딕" w:hAnsi="맑은 고딕"/>
+          <w:rFonts w:ascii="Pretendard" w:cs="Pretendard" w:eastAsia="Pretendard" w:hAnsi="Pretendard"/>
           <w:b/>
           <w:bCs/>
           <w:color w:val="1A1A1A"/>
@@ -6812,7 +6812,7 @@
       </w:pPr>
       <w:r>
         <w:rPr>
-          <w:rFonts w:ascii="맑은 고딕" w:cs="맑은 고딕" w:eastAsia="맑은 고딕" w:hAnsi="맑은 고딕"/>
+          <w:rFonts w:ascii="Pretendard" w:cs="Pretendard" w:eastAsia="Pretendard" w:hAnsi="Pretendard"/>
           <w:color w:val="1A1A1A"/>
           <w:sz w:val="20"/>
           <w:szCs w:val="20"/>
@@ -6865,7 +6865,7 @@
             </w:pPr>
             <w:r>
               <w:rPr>
-                <w:rFonts w:ascii="맑은 고딕" w:cs="맑은 고딕" w:eastAsia="맑은 고딕" w:hAnsi="맑은 고딕"/>
+                <w:rFonts w:ascii="Pretendard" w:cs="Pretendard" w:eastAsia="Pretendard" w:hAnsi="Pretendard"/>
                 <w:b/>
                 <w:bCs/>
                 <w:color w:val="FFFFFF"/>
@@ -6894,7 +6894,7 @@
             </w:pPr>
             <w:r>
               <w:rPr>
-                <w:rFonts w:ascii="맑은 고딕" w:cs="맑은 고딕" w:eastAsia="맑은 고딕" w:hAnsi="맑은 고딕"/>
+                <w:rFonts w:ascii="Pretendard" w:cs="Pretendard" w:eastAsia="Pretendard" w:hAnsi="Pretendard"/>
                 <w:b/>
                 <w:bCs/>
                 <w:color w:val="FFFFFF"/>
@@ -6923,7 +6923,7 @@
             </w:pPr>
             <w:r>
               <w:rPr>
-                <w:rFonts w:ascii="맑은 고딕" w:cs="맑은 고딕" w:eastAsia="맑은 고딕" w:hAnsi="맑은 고딕"/>
+                <w:rFonts w:ascii="Pretendard" w:cs="Pretendard" w:eastAsia="Pretendard" w:hAnsi="Pretendard"/>
                 <w:b/>
                 <w:bCs/>
                 <w:color w:val="FFFFFF"/>
@@ -6952,7 +6952,7 @@
             </w:pPr>
             <w:r>
               <w:rPr>
-                <w:rFonts w:ascii="맑은 고딕" w:cs="맑은 고딕" w:eastAsia="맑은 고딕" w:hAnsi="맑은 고딕"/>
+                <w:rFonts w:ascii="Pretendard" w:cs="Pretendard" w:eastAsia="Pretendard" w:hAnsi="Pretendard"/>
                 <w:b/>
                 <w:bCs/>
                 <w:color w:val="FFFFFF"/>
@@ -6985,7 +6985,7 @@
             </w:pPr>
             <w:r>
               <w:rPr>
-                <w:rFonts w:ascii="맑은 고딕" w:cs="맑은 고딕" w:eastAsia="맑은 고딕" w:hAnsi="맑은 고딕"/>
+                <w:rFonts w:ascii="Pretendard" w:cs="Pretendard" w:eastAsia="Pretendard" w:hAnsi="Pretendard"/>
                 <w:b w:val="false"/>
                 <w:bCs w:val="false"/>
                 <w:color w:val="1A1A1A"/>
@@ -7013,7 +7013,7 @@
             </w:pPr>
             <w:r>
               <w:rPr>
-                <w:rFonts w:ascii="맑은 고딕" w:cs="맑은 고딕" w:eastAsia="맑은 고딕" w:hAnsi="맑은 고딕"/>
+                <w:rFonts w:ascii="Pretendard" w:cs="Pretendard" w:eastAsia="Pretendard" w:hAnsi="Pretendard"/>
                 <w:b w:val="false"/>
                 <w:bCs w:val="false"/>
                 <w:color w:val="1A1A1A"/>
@@ -7041,7 +7041,7 @@
             </w:pPr>
             <w:r>
               <w:rPr>
-                <w:rFonts w:ascii="맑은 고딕" w:cs="맑은 고딕" w:eastAsia="맑은 고딕" w:hAnsi="맑은 고딕"/>
+                <w:rFonts w:ascii="Pretendard" w:cs="Pretendard" w:eastAsia="Pretendard" w:hAnsi="Pretendard"/>
                 <w:b w:val="false"/>
                 <w:bCs w:val="false"/>
                 <w:color w:val="1A1A1A"/>
@@ -7069,7 +7069,7 @@
             </w:pPr>
             <w:r>
               <w:rPr>
-                <w:rFonts w:ascii="맑은 고딕" w:cs="맑은 고딕" w:eastAsia="맑은 고딕" w:hAnsi="맑은 고딕"/>
+                <w:rFonts w:ascii="Pretendard" w:cs="Pretendard" w:eastAsia="Pretendard" w:hAnsi="Pretendard"/>
                 <w:b w:val="false"/>
                 <w:bCs w:val="false"/>
                 <w:color w:val="1A1A1A"/>
@@ -7102,7 +7102,7 @@
             </w:pPr>
             <w:r>
               <w:rPr>
-                <w:rFonts w:ascii="맑은 고딕" w:cs="맑은 고딕" w:eastAsia="맑은 고딕" w:hAnsi="맑은 고딕"/>
+                <w:rFonts w:ascii="Pretendard" w:cs="Pretendard" w:eastAsia="Pretendard" w:hAnsi="Pretendard"/>
                 <w:b w:val="false"/>
                 <w:bCs w:val="false"/>
                 <w:color w:val="1A1A1A"/>
@@ -7130,7 +7130,7 @@
             </w:pPr>
             <w:r>
               <w:rPr>
-                <w:rFonts w:ascii="맑은 고딕" w:cs="맑은 고딕" w:eastAsia="맑은 고딕" w:hAnsi="맑은 고딕"/>
+                <w:rFonts w:ascii="Pretendard" w:cs="Pretendard" w:eastAsia="Pretendard" w:hAnsi="Pretendard"/>
                 <w:b w:val="false"/>
                 <w:bCs w:val="false"/>
                 <w:color w:val="1A1A1A"/>
@@ -7158,7 +7158,7 @@
             </w:pPr>
             <w:r>
               <w:rPr>
-                <w:rFonts w:ascii="맑은 고딕" w:cs="맑은 고딕" w:eastAsia="맑은 고딕" w:hAnsi="맑은 고딕"/>
+                <w:rFonts w:ascii="Pretendard" w:cs="Pretendard" w:eastAsia="Pretendard" w:hAnsi="Pretendard"/>
                 <w:b w:val="false"/>
                 <w:bCs w:val="false"/>
                 <w:color w:val="1A1A1A"/>
@@ -7186,7 +7186,7 @@
             </w:pPr>
             <w:r>
               <w:rPr>
-                <w:rFonts w:ascii="맑은 고딕" w:cs="맑은 고딕" w:eastAsia="맑은 고딕" w:hAnsi="맑은 고딕"/>
+                <w:rFonts w:ascii="Pretendard" w:cs="Pretendard" w:eastAsia="Pretendard" w:hAnsi="Pretendard"/>
                 <w:b w:val="false"/>
                 <w:bCs w:val="false"/>
                 <w:color w:val="1A1A1A"/>
@@ -7219,7 +7219,7 @@
             </w:pPr>
             <w:r>
               <w:rPr>
-                <w:rFonts w:ascii="맑은 고딕" w:cs="맑은 고딕" w:eastAsia="맑은 고딕" w:hAnsi="맑은 고딕"/>
+                <w:rFonts w:ascii="Pretendard" w:cs="Pretendard" w:eastAsia="Pretendard" w:hAnsi="Pretendard"/>
                 <w:b w:val="false"/>
                 <w:bCs w:val="false"/>
                 <w:color w:val="1A1A1A"/>
@@ -7247,7 +7247,7 @@
             </w:pPr>
             <w:r>
               <w:rPr>
-                <w:rFonts w:ascii="맑은 고딕" w:cs="맑은 고딕" w:eastAsia="맑은 고딕" w:hAnsi="맑은 고딕"/>
+                <w:rFonts w:ascii="Pretendard" w:cs="Pretendard" w:eastAsia="Pretendard" w:hAnsi="Pretendard"/>
                 <w:b w:val="false"/>
                 <w:bCs w:val="false"/>
                 <w:color w:val="1A1A1A"/>
@@ -7275,7 +7275,7 @@
             </w:pPr>
             <w:r>
               <w:rPr>
-                <w:rFonts w:ascii="맑은 고딕" w:cs="맑은 고딕" w:eastAsia="맑은 고딕" w:hAnsi="맑은 고딕"/>
+                <w:rFonts w:ascii="Pretendard" w:cs="Pretendard" w:eastAsia="Pretendard" w:hAnsi="Pretendard"/>
                 <w:b w:val="false"/>
                 <w:bCs w:val="false"/>
                 <w:color w:val="1A1A1A"/>
@@ -7303,7 +7303,7 @@
             </w:pPr>
             <w:r>
               <w:rPr>
-                <w:rFonts w:ascii="맑은 고딕" w:cs="맑은 고딕" w:eastAsia="맑은 고딕" w:hAnsi="맑은 고딕"/>
+                <w:rFonts w:ascii="Pretendard" w:cs="Pretendard" w:eastAsia="Pretendard" w:hAnsi="Pretendard"/>
                 <w:b w:val="false"/>
                 <w:bCs w:val="false"/>
                 <w:color w:val="1A1A1A"/>
@@ -7336,7 +7336,7 @@
             </w:pPr>
             <w:r>
               <w:rPr>
-                <w:rFonts w:ascii="맑은 고딕" w:cs="맑은 고딕" w:eastAsia="맑은 고딕" w:hAnsi="맑은 고딕"/>
+                <w:rFonts w:ascii="Pretendard" w:cs="Pretendard" w:eastAsia="Pretendard" w:hAnsi="Pretendard"/>
                 <w:b w:val="false"/>
                 <w:bCs w:val="false"/>
                 <w:color w:val="1A1A1A"/>
@@ -7364,7 +7364,7 @@
             </w:pPr>
             <w:r>
               <w:rPr>
-                <w:rFonts w:ascii="맑은 고딕" w:cs="맑은 고딕" w:eastAsia="맑은 고딕" w:hAnsi="맑은 고딕"/>
+                <w:rFonts w:ascii="Pretendard" w:cs="Pretendard" w:eastAsia="Pretendard" w:hAnsi="Pretendard"/>
                 <w:b w:val="false"/>
                 <w:bCs w:val="false"/>
                 <w:color w:val="1A1A1A"/>
@@ -7392,7 +7392,7 @@
             </w:pPr>
             <w:r>
               <w:rPr>
-                <w:rFonts w:ascii="맑은 고딕" w:cs="맑은 고딕" w:eastAsia="맑은 고딕" w:hAnsi="맑은 고딕"/>
+                <w:rFonts w:ascii="Pretendard" w:cs="Pretendard" w:eastAsia="Pretendard" w:hAnsi="Pretendard"/>
                 <w:b w:val="false"/>
                 <w:bCs w:val="false"/>
                 <w:color w:val="1A1A1A"/>
@@ -7420,7 +7420,7 @@
             </w:pPr>
             <w:r>
               <w:rPr>
-                <w:rFonts w:ascii="맑은 고딕" w:cs="맑은 고딕" w:eastAsia="맑은 고딕" w:hAnsi="맑은 고딕"/>
+                <w:rFonts w:ascii="Pretendard" w:cs="Pretendard" w:eastAsia="Pretendard" w:hAnsi="Pretendard"/>
                 <w:b w:val="false"/>
                 <w:bCs w:val="false"/>
                 <w:color w:val="1A1A1A"/>
@@ -7453,7 +7453,7 @@
             </w:pPr>
             <w:r>
               <w:rPr>
-                <w:rFonts w:ascii="맑은 고딕" w:cs="맑은 고딕" w:eastAsia="맑은 고딕" w:hAnsi="맑은 고딕"/>
+                <w:rFonts w:ascii="Pretendard" w:cs="Pretendard" w:eastAsia="Pretendard" w:hAnsi="Pretendard"/>
                 <w:b w:val="false"/>
                 <w:bCs w:val="false"/>
                 <w:color w:val="1A1A1A"/>
@@ -7481,7 +7481,7 @@
             </w:pPr>
             <w:r>
               <w:rPr>
-                <w:rFonts w:ascii="맑은 고딕" w:cs="맑은 고딕" w:eastAsia="맑은 고딕" w:hAnsi="맑은 고딕"/>
+                <w:rFonts w:ascii="Pretendard" w:cs="Pretendard" w:eastAsia="Pretendard" w:hAnsi="Pretendard"/>
                 <w:b w:val="false"/>
                 <w:bCs w:val="false"/>
                 <w:color w:val="1A1A1A"/>
@@ -7509,7 +7509,7 @@
             </w:pPr>
             <w:r>
               <w:rPr>
-                <w:rFonts w:ascii="맑은 고딕" w:cs="맑은 고딕" w:eastAsia="맑은 고딕" w:hAnsi="맑은 고딕"/>
+                <w:rFonts w:ascii="Pretendard" w:cs="Pretendard" w:eastAsia="Pretendard" w:hAnsi="Pretendard"/>
                 <w:b w:val="false"/>
                 <w:bCs w:val="false"/>
                 <w:color w:val="1A1A1A"/>
@@ -7537,7 +7537,7 @@
             </w:pPr>
             <w:r>
               <w:rPr>
-                <w:rFonts w:ascii="맑은 고딕" w:cs="맑은 고딕" w:eastAsia="맑은 고딕" w:hAnsi="맑은 고딕"/>
+                <w:rFonts w:ascii="Pretendard" w:cs="Pretendard" w:eastAsia="Pretendard" w:hAnsi="Pretendard"/>
                 <w:b w:val="false"/>
                 <w:bCs w:val="false"/>
                 <w:color w:val="1A1A1A"/>
@@ -7561,7 +7561,7 @@
       </w:pPr>
       <w:r>
         <w:rPr>
-          <w:rFonts w:ascii="맑은 고딕" w:cs="맑은 고딕" w:eastAsia="맑은 고딕" w:hAnsi="맑은 고딕"/>
+          <w:rFonts w:ascii="Pretendard" w:cs="Pretendard" w:eastAsia="Pretendard" w:hAnsi="Pretendard"/>
           <w:color w:val="1A1A1A"/>
           <w:sz w:val="20"/>
           <w:szCs w:val="20"/>
@@ -7575,7 +7575,7 @@
       </w:pPr>
       <w:r>
         <w:rPr>
-          <w:rFonts w:ascii="맑은 고딕" w:cs="맑은 고딕" w:eastAsia="맑은 고딕" w:hAnsi="맑은 고딕"/>
+          <w:rFonts w:ascii="Pretendard" w:cs="Pretendard" w:eastAsia="Pretendard" w:hAnsi="Pretendard"/>
           <w:color w:val="1A1A1A"/>
           <w:sz w:val="20"/>
           <w:szCs w:val="20"/>
@@ -7590,7 +7590,7 @@
       </w:pPr>
       <w:r>
         <w:rPr>
-          <w:rFonts w:ascii="맑은 고딕" w:cs="맑은 고딕" w:eastAsia="맑은 고딕" w:hAnsi="맑은 고딕"/>
+          <w:rFonts w:ascii="Pretendard" w:cs="Pretendard" w:eastAsia="Pretendard" w:hAnsi="Pretendard"/>
           <w:b/>
           <w:bCs/>
           <w:color w:val="1A1A1A"/>
@@ -7606,7 +7606,7 @@
       </w:pPr>
       <w:r>
         <w:rPr>
-          <w:rFonts w:ascii="맑은 고딕" w:cs="맑은 고딕" w:eastAsia="맑은 고딕" w:hAnsi="맑은 고딕"/>
+          <w:rFonts w:ascii="Pretendard" w:cs="Pretendard" w:eastAsia="Pretendard" w:hAnsi="Pretendard"/>
           <w:color w:val="1A1A1A"/>
           <w:sz w:val="20"/>
           <w:szCs w:val="20"/>
@@ -7658,7 +7658,7 @@
             </w:pPr>
             <w:r>
               <w:rPr>
-                <w:rFonts w:ascii="맑은 고딕" w:cs="맑은 고딕" w:eastAsia="맑은 고딕" w:hAnsi="맑은 고딕"/>
+                <w:rFonts w:ascii="Pretendard" w:cs="Pretendard" w:eastAsia="Pretendard" w:hAnsi="Pretendard"/>
                 <w:b/>
                 <w:bCs/>
                 <w:color w:val="FFFFFF"/>
@@ -7687,7 +7687,7 @@
             </w:pPr>
             <w:r>
               <w:rPr>
-                <w:rFonts w:ascii="맑은 고딕" w:cs="맑은 고딕" w:eastAsia="맑은 고딕" w:hAnsi="맑은 고딕"/>
+                <w:rFonts w:ascii="Pretendard" w:cs="Pretendard" w:eastAsia="Pretendard" w:hAnsi="Pretendard"/>
                 <w:b/>
                 <w:bCs/>
                 <w:color w:val="FFFFFF"/>
@@ -7716,7 +7716,7 @@
             </w:pPr>
             <w:r>
               <w:rPr>
-                <w:rFonts w:ascii="맑은 고딕" w:cs="맑은 고딕" w:eastAsia="맑은 고딕" w:hAnsi="맑은 고딕"/>
+                <w:rFonts w:ascii="Pretendard" w:cs="Pretendard" w:eastAsia="Pretendard" w:hAnsi="Pretendard"/>
                 <w:b/>
                 <w:bCs/>
                 <w:color w:val="FFFFFF"/>
@@ -7749,7 +7749,7 @@
             </w:pPr>
             <w:r>
               <w:rPr>
-                <w:rFonts w:ascii="맑은 고딕" w:cs="맑은 고딕" w:eastAsia="맑은 고딕" w:hAnsi="맑은 고딕"/>
+                <w:rFonts w:ascii="Pretendard" w:cs="Pretendard" w:eastAsia="Pretendard" w:hAnsi="Pretendard"/>
                 <w:b w:val="false"/>
                 <w:bCs w:val="false"/>
                 <w:color w:val="1A1A1A"/>
@@ -7777,7 +7777,7 @@
             </w:pPr>
             <w:r>
               <w:rPr>
-                <w:rFonts w:ascii="맑은 고딕" w:cs="맑은 고딕" w:eastAsia="맑은 고딕" w:hAnsi="맑은 고딕"/>
+                <w:rFonts w:ascii="Pretendard" w:cs="Pretendard" w:eastAsia="Pretendard" w:hAnsi="Pretendard"/>
                 <w:b w:val="false"/>
                 <w:bCs w:val="false"/>
                 <w:color w:val="1A1A1A"/>
@@ -7805,7 +7805,7 @@
             </w:pPr>
             <w:r>
               <w:rPr>
-                <w:rFonts w:ascii="맑은 고딕" w:cs="맑은 고딕" w:eastAsia="맑은 고딕" w:hAnsi="맑은 고딕"/>
+                <w:rFonts w:ascii="Pretendard" w:cs="Pretendard" w:eastAsia="Pretendard" w:hAnsi="Pretendard"/>
                 <w:b w:val="false"/>
                 <w:bCs w:val="false"/>
                 <w:color w:val="1A1A1A"/>
@@ -7838,7 +7838,7 @@
             </w:pPr>
             <w:r>
               <w:rPr>
-                <w:rFonts w:ascii="맑은 고딕" w:cs="맑은 고딕" w:eastAsia="맑은 고딕" w:hAnsi="맑은 고딕"/>
+                <w:rFonts w:ascii="Pretendard" w:cs="Pretendard" w:eastAsia="Pretendard" w:hAnsi="Pretendard"/>
                 <w:b w:val="false"/>
                 <w:bCs w:val="false"/>
                 <w:color w:val="1A1A1A"/>
@@ -7866,7 +7866,7 @@
             </w:pPr>
             <w:r>
               <w:rPr>
-                <w:rFonts w:ascii="맑은 고딕" w:cs="맑은 고딕" w:eastAsia="맑은 고딕" w:hAnsi="맑은 고딕"/>
+                <w:rFonts w:ascii="Pretendard" w:cs="Pretendard" w:eastAsia="Pretendard" w:hAnsi="Pretendard"/>
                 <w:b w:val="false"/>
                 <w:bCs w:val="false"/>
                 <w:color w:val="1A1A1A"/>
@@ -7894,7 +7894,7 @@
             </w:pPr>
             <w:r>
               <w:rPr>
-                <w:rFonts w:ascii="맑은 고딕" w:cs="맑은 고딕" w:eastAsia="맑은 고딕" w:hAnsi="맑은 고딕"/>
+                <w:rFonts w:ascii="Pretendard" w:cs="Pretendard" w:eastAsia="Pretendard" w:hAnsi="Pretendard"/>
                 <w:b w:val="false"/>
                 <w:bCs w:val="false"/>
                 <w:color w:val="1A1A1A"/>
@@ -7927,7 +7927,7 @@
             </w:pPr>
             <w:r>
               <w:rPr>
-                <w:rFonts w:ascii="맑은 고딕" w:cs="맑은 고딕" w:eastAsia="맑은 고딕" w:hAnsi="맑은 고딕"/>
+                <w:rFonts w:ascii="Pretendard" w:cs="Pretendard" w:eastAsia="Pretendard" w:hAnsi="Pretendard"/>
                 <w:b w:val="false"/>
                 <w:bCs w:val="false"/>
                 <w:color w:val="1A1A1A"/>
@@ -7955,7 +7955,7 @@
             </w:pPr>
             <w:r>
               <w:rPr>
-                <w:rFonts w:ascii="맑은 고딕" w:cs="맑은 고딕" w:eastAsia="맑은 고딕" w:hAnsi="맑은 고딕"/>
+                <w:rFonts w:ascii="Pretendard" w:cs="Pretendard" w:eastAsia="Pretendard" w:hAnsi="Pretendard"/>
                 <w:b w:val="false"/>
                 <w:bCs w:val="false"/>
                 <w:color w:val="1A1A1A"/>
@@ -7983,7 +7983,7 @@
             </w:pPr>
             <w:r>
               <w:rPr>
-                <w:rFonts w:ascii="맑은 고딕" w:cs="맑은 고딕" w:eastAsia="맑은 고딕" w:hAnsi="맑은 고딕"/>
+                <w:rFonts w:ascii="Pretendard" w:cs="Pretendard" w:eastAsia="Pretendard" w:hAnsi="Pretendard"/>
                 <w:b w:val="false"/>
                 <w:bCs w:val="false"/>
                 <w:color w:val="1A1A1A"/>
@@ -8016,7 +8016,7 @@
             </w:pPr>
             <w:r>
               <w:rPr>
-                <w:rFonts w:ascii="맑은 고딕" w:cs="맑은 고딕" w:eastAsia="맑은 고딕" w:hAnsi="맑은 고딕"/>
+                <w:rFonts w:ascii="Pretendard" w:cs="Pretendard" w:eastAsia="Pretendard" w:hAnsi="Pretendard"/>
                 <w:b w:val="false"/>
                 <w:bCs w:val="false"/>
                 <w:color w:val="1A1A1A"/>
@@ -8044,7 +8044,7 @@
             </w:pPr>
             <w:r>
               <w:rPr>
-                <w:rFonts w:ascii="맑은 고딕" w:cs="맑은 고딕" w:eastAsia="맑은 고딕" w:hAnsi="맑은 고딕"/>
+                <w:rFonts w:ascii="Pretendard" w:cs="Pretendard" w:eastAsia="Pretendard" w:hAnsi="Pretendard"/>
                 <w:b w:val="false"/>
                 <w:bCs w:val="false"/>
                 <w:color w:val="1A1A1A"/>
@@ -8072,7 +8072,7 @@
             </w:pPr>
             <w:r>
               <w:rPr>
-                <w:rFonts w:ascii="맑은 고딕" w:cs="맑은 고딕" w:eastAsia="맑은 고딕" w:hAnsi="맑은 고딕"/>
+                <w:rFonts w:ascii="Pretendard" w:cs="Pretendard" w:eastAsia="Pretendard" w:hAnsi="Pretendard"/>
                 <w:b w:val="false"/>
                 <w:bCs w:val="false"/>
                 <w:color w:val="1A1A1A"/>
@@ -8105,7 +8105,7 @@
             </w:pPr>
             <w:r>
               <w:rPr>
-                <w:rFonts w:ascii="맑은 고딕" w:cs="맑은 고딕" w:eastAsia="맑은 고딕" w:hAnsi="맑은 고딕"/>
+                <w:rFonts w:ascii="Pretendard" w:cs="Pretendard" w:eastAsia="Pretendard" w:hAnsi="Pretendard"/>
                 <w:b w:val="false"/>
                 <w:bCs w:val="false"/>
                 <w:color w:val="1A1A1A"/>
@@ -8133,7 +8133,7 @@
             </w:pPr>
             <w:r>
               <w:rPr>
-                <w:rFonts w:ascii="맑은 고딕" w:cs="맑은 고딕" w:eastAsia="맑은 고딕" w:hAnsi="맑은 고딕"/>
+                <w:rFonts w:ascii="Pretendard" w:cs="Pretendard" w:eastAsia="Pretendard" w:hAnsi="Pretendard"/>
                 <w:b w:val="false"/>
                 <w:bCs w:val="false"/>
                 <w:color w:val="1A1A1A"/>
@@ -8161,7 +8161,7 @@
             </w:pPr>
             <w:r>
               <w:rPr>
-                <w:rFonts w:ascii="맑은 고딕" w:cs="맑은 고딕" w:eastAsia="맑은 고딕" w:hAnsi="맑은 고딕"/>
+                <w:rFonts w:ascii="Pretendard" w:cs="Pretendard" w:eastAsia="Pretendard" w:hAnsi="Pretendard"/>
                 <w:b w:val="false"/>
                 <w:bCs w:val="false"/>
                 <w:color w:val="1A1A1A"/>
@@ -8194,7 +8194,7 @@
             </w:pPr>
             <w:r>
               <w:rPr>
-                <w:rFonts w:ascii="맑은 고딕" w:cs="맑은 고딕" w:eastAsia="맑은 고딕" w:hAnsi="맑은 고딕"/>
+                <w:rFonts w:ascii="Pretendard" w:cs="Pretendard" w:eastAsia="Pretendard" w:hAnsi="Pretendard"/>
                 <w:b w:val="false"/>
                 <w:bCs w:val="false"/>
                 <w:color w:val="1A1A1A"/>
@@ -8222,7 +8222,7 @@
             </w:pPr>
             <w:r>
               <w:rPr>
-                <w:rFonts w:ascii="맑은 고딕" w:cs="맑은 고딕" w:eastAsia="맑은 고딕" w:hAnsi="맑은 고딕"/>
+                <w:rFonts w:ascii="Pretendard" w:cs="Pretendard" w:eastAsia="Pretendard" w:hAnsi="Pretendard"/>
                 <w:b w:val="false"/>
                 <w:bCs w:val="false"/>
                 <w:color w:val="1A1A1A"/>
@@ -8250,7 +8250,7 @@
             </w:pPr>
             <w:r>
               <w:rPr>
-                <w:rFonts w:ascii="맑은 고딕" w:cs="맑은 고딕" w:eastAsia="맑은 고딕" w:hAnsi="맑은 고딕"/>
+                <w:rFonts w:ascii="Pretendard" w:cs="Pretendard" w:eastAsia="Pretendard" w:hAnsi="Pretendard"/>
                 <w:b w:val="false"/>
                 <w:bCs w:val="false"/>
                 <w:color w:val="1A1A1A"/>
@@ -8283,7 +8283,7 @@
             </w:pPr>
             <w:r>
               <w:rPr>
-                <w:rFonts w:ascii="맑은 고딕" w:cs="맑은 고딕" w:eastAsia="맑은 고딕" w:hAnsi="맑은 고딕"/>
+                <w:rFonts w:ascii="Pretendard" w:cs="Pretendard" w:eastAsia="Pretendard" w:hAnsi="Pretendard"/>
                 <w:b w:val="false"/>
                 <w:bCs w:val="false"/>
                 <w:color w:val="1A1A1A"/>
@@ -8311,7 +8311,7 @@
             </w:pPr>
             <w:r>
               <w:rPr>
-                <w:rFonts w:ascii="맑은 고딕" w:cs="맑은 고딕" w:eastAsia="맑은 고딕" w:hAnsi="맑은 고딕"/>
+                <w:rFonts w:ascii="Pretendard" w:cs="Pretendard" w:eastAsia="Pretendard" w:hAnsi="Pretendard"/>
                 <w:b w:val="false"/>
                 <w:bCs w:val="false"/>
                 <w:color w:val="1A1A1A"/>
@@ -8339,7 +8339,7 @@
             </w:pPr>
             <w:r>
               <w:rPr>
-                <w:rFonts w:ascii="맑은 고딕" w:cs="맑은 고딕" w:eastAsia="맑은 고딕" w:hAnsi="맑은 고딕"/>
+                <w:rFonts w:ascii="Pretendard" w:cs="Pretendard" w:eastAsia="Pretendard" w:hAnsi="Pretendard"/>
                 <w:b w:val="false"/>
                 <w:bCs w:val="false"/>
                 <w:color w:val="1A1A1A"/>
@@ -8363,7 +8363,7 @@
       </w:pPr>
       <w:r>
         <w:rPr>
-          <w:rFonts w:ascii="맑은 고딕" w:cs="맑은 고딕" w:eastAsia="맑은 고딕" w:hAnsi="맑은 고딕"/>
+          <w:rFonts w:ascii="Pretendard" w:cs="Pretendard" w:eastAsia="Pretendard" w:hAnsi="Pretendard"/>
           <w:color w:val="1A1A1A"/>
           <w:sz w:val="20"/>
           <w:szCs w:val="20"/>
@@ -8377,7 +8377,7 @@
       </w:pPr>
       <w:r>
         <w:rPr>
-          <w:rFonts w:ascii="맑은 고딕" w:cs="맑은 고딕" w:eastAsia="맑은 고딕" w:hAnsi="맑은 고딕"/>
+          <w:rFonts w:ascii="Pretendard" w:cs="Pretendard" w:eastAsia="Pretendard" w:hAnsi="Pretendard"/>
           <w:color w:val="1A1A1A"/>
           <w:sz w:val="20"/>
           <w:szCs w:val="20"/>
@@ -8397,7 +8397,7 @@
       </w:pPr>
       <w:r>
         <w:rPr>
-          <w:rFonts w:ascii="맑은 고딕" w:cs="맑은 고딕" w:eastAsia="맑은 고딕" w:hAnsi="맑은 고딕"/>
+          <w:rFonts w:ascii="Pretendard" w:cs="Pretendard" w:eastAsia="Pretendard" w:hAnsi="Pretendard"/>
           <w:b/>
           <w:bCs/>
           <w:color w:val="111E6C"/>
@@ -8413,7 +8413,7 @@
       </w:pPr>
       <w:r>
         <w:rPr>
-          <w:rFonts w:ascii="맑은 고딕" w:cs="맑은 고딕" w:eastAsia="맑은 고딕" w:hAnsi="맑은 고딕"/>
+          <w:rFonts w:ascii="Pretendard" w:cs="Pretendard" w:eastAsia="Pretendard" w:hAnsi="Pretendard"/>
           <w:color w:val="1A1A1A"/>
           <w:sz w:val="20"/>
           <w:szCs w:val="20"/>
@@ -8465,7 +8465,7 @@
             </w:pPr>
             <w:r>
               <w:rPr>
-                <w:rFonts w:ascii="맑은 고딕" w:cs="맑은 고딕" w:eastAsia="맑은 고딕" w:hAnsi="맑은 고딕"/>
+                <w:rFonts w:ascii="Pretendard" w:cs="Pretendard" w:eastAsia="Pretendard" w:hAnsi="Pretendard"/>
                 <w:b/>
                 <w:bCs/>
                 <w:color w:val="FFFFFF"/>
@@ -8494,7 +8494,7 @@
             </w:pPr>
             <w:r>
               <w:rPr>
-                <w:rFonts w:ascii="맑은 고딕" w:cs="맑은 고딕" w:eastAsia="맑은 고딕" w:hAnsi="맑은 고딕"/>
+                <w:rFonts w:ascii="Pretendard" w:cs="Pretendard" w:eastAsia="Pretendard" w:hAnsi="Pretendard"/>
                 <w:b/>
                 <w:bCs/>
                 <w:color w:val="FFFFFF"/>
@@ -8523,7 +8523,7 @@
             </w:pPr>
             <w:r>
               <w:rPr>
-                <w:rFonts w:ascii="맑은 고딕" w:cs="맑은 고딕" w:eastAsia="맑은 고딕" w:hAnsi="맑은 고딕"/>
+                <w:rFonts w:ascii="Pretendard" w:cs="Pretendard" w:eastAsia="Pretendard" w:hAnsi="Pretendard"/>
                 <w:b/>
                 <w:bCs/>
                 <w:color w:val="FFFFFF"/>
@@ -8556,7 +8556,7 @@
             </w:pPr>
             <w:r>
               <w:rPr>
-                <w:rFonts w:ascii="맑은 고딕" w:cs="맑은 고딕" w:eastAsia="맑은 고딕" w:hAnsi="맑은 고딕"/>
+                <w:rFonts w:ascii="Pretendard" w:cs="Pretendard" w:eastAsia="Pretendard" w:hAnsi="Pretendard"/>
                 <w:b w:val="false"/>
                 <w:bCs w:val="false"/>
                 <w:color w:val="1A1A1A"/>
@@ -8584,7 +8584,7 @@
             </w:pPr>
             <w:r>
               <w:rPr>
-                <w:rFonts w:ascii="맑은 고딕" w:cs="맑은 고딕" w:eastAsia="맑은 고딕" w:hAnsi="맑은 고딕"/>
+                <w:rFonts w:ascii="Pretendard" w:cs="Pretendard" w:eastAsia="Pretendard" w:hAnsi="Pretendard"/>
                 <w:b w:val="false"/>
                 <w:bCs w:val="false"/>
                 <w:color w:val="1A1A1A"/>
@@ -8612,7 +8612,7 @@
             </w:pPr>
             <w:r>
               <w:rPr>
-                <w:rFonts w:ascii="맑은 고딕" w:cs="맑은 고딕" w:eastAsia="맑은 고딕" w:hAnsi="맑은 고딕"/>
+                <w:rFonts w:ascii="Pretendard" w:cs="Pretendard" w:eastAsia="Pretendard" w:hAnsi="Pretendard"/>
                 <w:b w:val="false"/>
                 <w:bCs w:val="false"/>
                 <w:color w:val="1A1A1A"/>
@@ -8645,7 +8645,7 @@
             </w:pPr>
             <w:r>
               <w:rPr>
-                <w:rFonts w:ascii="맑은 고딕" w:cs="맑은 고딕" w:eastAsia="맑은 고딕" w:hAnsi="맑은 고딕"/>
+                <w:rFonts w:ascii="Pretendard" w:cs="Pretendard" w:eastAsia="Pretendard" w:hAnsi="Pretendard"/>
                 <w:b w:val="false"/>
                 <w:bCs w:val="false"/>
                 <w:color w:val="1A1A1A"/>
@@ -8673,7 +8673,7 @@
             </w:pPr>
             <w:r>
               <w:rPr>
-                <w:rFonts w:ascii="맑은 고딕" w:cs="맑은 고딕" w:eastAsia="맑은 고딕" w:hAnsi="맑은 고딕"/>
+                <w:rFonts w:ascii="Pretendard" w:cs="Pretendard" w:eastAsia="Pretendard" w:hAnsi="Pretendard"/>
                 <w:b w:val="false"/>
                 <w:bCs w:val="false"/>
                 <w:color w:val="1A1A1A"/>
@@ -8701,7 +8701,7 @@
             </w:pPr>
             <w:r>
               <w:rPr>
-                <w:rFonts w:ascii="맑은 고딕" w:cs="맑은 고딕" w:eastAsia="맑은 고딕" w:hAnsi="맑은 고딕"/>
+                <w:rFonts w:ascii="Pretendard" w:cs="Pretendard" w:eastAsia="Pretendard" w:hAnsi="Pretendard"/>
                 <w:b w:val="false"/>
                 <w:bCs w:val="false"/>
                 <w:color w:val="1A1A1A"/>
@@ -8734,7 +8734,7 @@
             </w:pPr>
             <w:r>
               <w:rPr>
-                <w:rFonts w:ascii="맑은 고딕" w:cs="맑은 고딕" w:eastAsia="맑은 고딕" w:hAnsi="맑은 고딕"/>
+                <w:rFonts w:ascii="Pretendard" w:cs="Pretendard" w:eastAsia="Pretendard" w:hAnsi="Pretendard"/>
                 <w:b w:val="false"/>
                 <w:bCs w:val="false"/>
                 <w:color w:val="1A1A1A"/>
@@ -8762,7 +8762,7 @@
             </w:pPr>
             <w:r>
               <w:rPr>
-                <w:rFonts w:ascii="맑은 고딕" w:cs="맑은 고딕" w:eastAsia="맑은 고딕" w:hAnsi="맑은 고딕"/>
+                <w:rFonts w:ascii="Pretendard" w:cs="Pretendard" w:eastAsia="Pretendard" w:hAnsi="Pretendard"/>
                 <w:b w:val="false"/>
                 <w:bCs w:val="false"/>
                 <w:color w:val="1A1A1A"/>
@@ -8790,7 +8790,7 @@
             </w:pPr>
             <w:r>
               <w:rPr>
-                <w:rFonts w:ascii="맑은 고딕" w:cs="맑은 고딕" w:eastAsia="맑은 고딕" w:hAnsi="맑은 고딕"/>
+                <w:rFonts w:ascii="Pretendard" w:cs="Pretendard" w:eastAsia="Pretendard" w:hAnsi="Pretendard"/>
                 <w:b w:val="false"/>
                 <w:bCs w:val="false"/>
                 <w:color w:val="1A1A1A"/>
@@ -8823,7 +8823,7 @@
             </w:pPr>
             <w:r>
               <w:rPr>
-                <w:rFonts w:ascii="맑은 고딕" w:cs="맑은 고딕" w:eastAsia="맑은 고딕" w:hAnsi="맑은 고딕"/>
+                <w:rFonts w:ascii="Pretendard" w:cs="Pretendard" w:eastAsia="Pretendard" w:hAnsi="Pretendard"/>
                 <w:b w:val="false"/>
                 <w:bCs w:val="false"/>
                 <w:color w:val="1A1A1A"/>
@@ -8851,7 +8851,7 @@
             </w:pPr>
             <w:r>
               <w:rPr>
-                <w:rFonts w:ascii="맑은 고딕" w:cs="맑은 고딕" w:eastAsia="맑은 고딕" w:hAnsi="맑은 고딕"/>
+                <w:rFonts w:ascii="Pretendard" w:cs="Pretendard" w:eastAsia="Pretendard" w:hAnsi="Pretendard"/>
                 <w:b w:val="false"/>
                 <w:bCs w:val="false"/>
                 <w:color w:val="1A1A1A"/>
@@ -8879,7 +8879,7 @@
             </w:pPr>
             <w:r>
               <w:rPr>
-                <w:rFonts w:ascii="맑은 고딕" w:cs="맑은 고딕" w:eastAsia="맑은 고딕" w:hAnsi="맑은 고딕"/>
+                <w:rFonts w:ascii="Pretendard" w:cs="Pretendard" w:eastAsia="Pretendard" w:hAnsi="Pretendard"/>
                 <w:b w:val="false"/>
                 <w:bCs w:val="false"/>
                 <w:color w:val="1A1A1A"/>
@@ -8907,7 +8907,7 @@
       </w:pPr>
       <w:r>
         <w:rPr>
-          <w:rFonts w:ascii="맑은 고딕" w:cs="맑은 고딕" w:eastAsia="맑은 고딕" w:hAnsi="맑은 고딕"/>
+          <w:rFonts w:ascii="Pretendard" w:cs="Pretendard" w:eastAsia="Pretendard" w:hAnsi="Pretendard"/>
           <w:b/>
           <w:bCs/>
           <w:color w:val="1A1A1A"/>
@@ -8921,7 +8921,7 @@
       </w:r>
       <w:r>
         <w:rPr>
-          <w:rFonts w:ascii="맑은 고딕" w:cs="맑은 고딕" w:eastAsia="맑은 고딕" w:hAnsi="맑은 고딕"/>
+          <w:rFonts w:ascii="Pretendard" w:cs="Pretendard" w:eastAsia="Pretendard" w:hAnsi="Pretendard"/>
           <w:color w:val="5C5C5C"/>
           <w:sz w:val="19"/>
           <w:szCs w:val="19"/>
@@ -8936,7 +8936,7 @@
       </w:pPr>
       <w:r>
         <w:rPr>
-          <w:rFonts w:ascii="맑은 고딕" w:cs="맑은 고딕" w:eastAsia="맑은 고딕" w:hAnsi="맑은 고딕"/>
+          <w:rFonts w:ascii="Pretendard" w:cs="Pretendard" w:eastAsia="Pretendard" w:hAnsi="Pretendard"/>
           <w:b/>
           <w:bCs/>
           <w:color w:val="111E6C"/>
@@ -8956,7 +8956,7 @@
       </w:pPr>
       <w:r>
         <w:rPr>
-          <w:rFonts w:ascii="맑은 고딕" w:cs="맑은 고딕" w:eastAsia="맑은 고딕" w:hAnsi="맑은 고딕"/>
+          <w:rFonts w:ascii="Pretendard" w:cs="Pretendard" w:eastAsia="Pretendard" w:hAnsi="Pretendard"/>
           <w:b/>
           <w:bCs/>
           <w:color w:val="1A1A1A"/>
@@ -8970,7 +8970,7 @@
       </w:r>
       <w:r>
         <w:rPr>
-          <w:rFonts w:ascii="맑은 고딕" w:cs="맑은 고딕" w:eastAsia="맑은 고딕" w:hAnsi="맑은 고딕"/>
+          <w:rFonts w:ascii="Pretendard" w:cs="Pretendard" w:eastAsia="Pretendard" w:hAnsi="Pretendard"/>
           <w:color w:val="5C5C5C"/>
           <w:sz w:val="19"/>
           <w:szCs w:val="19"/>
@@ -9022,7 +9022,7 @@
             </w:pPr>
             <w:r>
               <w:rPr>
-                <w:rFonts w:ascii="맑은 고딕" w:cs="맑은 고딕" w:eastAsia="맑은 고딕" w:hAnsi="맑은 고딕"/>
+                <w:rFonts w:ascii="Pretendard" w:cs="Pretendard" w:eastAsia="Pretendard" w:hAnsi="Pretendard"/>
                 <w:b/>
                 <w:bCs/>
                 <w:color w:val="FFFFFF"/>
@@ -9051,7 +9051,7 @@
             </w:pPr>
             <w:r>
               <w:rPr>
-                <w:rFonts w:ascii="맑은 고딕" w:cs="맑은 고딕" w:eastAsia="맑은 고딕" w:hAnsi="맑은 고딕"/>
+                <w:rFonts w:ascii="Pretendard" w:cs="Pretendard" w:eastAsia="Pretendard" w:hAnsi="Pretendard"/>
                 <w:b/>
                 <w:bCs/>
                 <w:color w:val="FFFFFF"/>
@@ -9080,7 +9080,7 @@
             </w:pPr>
             <w:r>
               <w:rPr>
-                <w:rFonts w:ascii="맑은 고딕" w:cs="맑은 고딕" w:eastAsia="맑은 고딕" w:hAnsi="맑은 고딕"/>
+                <w:rFonts w:ascii="Pretendard" w:cs="Pretendard" w:eastAsia="Pretendard" w:hAnsi="Pretendard"/>
                 <w:b/>
                 <w:bCs/>
                 <w:color w:val="FFFFFF"/>
@@ -9113,7 +9113,7 @@
             </w:pPr>
             <w:r>
               <w:rPr>
-                <w:rFonts w:ascii="맑은 고딕" w:cs="맑은 고딕" w:eastAsia="맑은 고딕" w:hAnsi="맑은 고딕"/>
+                <w:rFonts w:ascii="Pretendard" w:cs="Pretendard" w:eastAsia="Pretendard" w:hAnsi="Pretendard"/>
                 <w:b w:val="false"/>
                 <w:bCs w:val="false"/>
                 <w:color w:val="1A1A1A"/>
@@ -9141,7 +9141,7 @@
             </w:pPr>
             <w:r>
               <w:rPr>
-                <w:rFonts w:ascii="맑은 고딕" w:cs="맑은 고딕" w:eastAsia="맑은 고딕" w:hAnsi="맑은 고딕"/>
+                <w:rFonts w:ascii="Pretendard" w:cs="Pretendard" w:eastAsia="Pretendard" w:hAnsi="Pretendard"/>
                 <w:b w:val="false"/>
                 <w:bCs w:val="false"/>
                 <w:color w:val="1A1A1A"/>
@@ -9169,7 +9169,7 @@
             </w:pPr>
             <w:r>
               <w:rPr>
-                <w:rFonts w:ascii="맑은 고딕" w:cs="맑은 고딕" w:eastAsia="맑은 고딕" w:hAnsi="맑은 고딕"/>
+                <w:rFonts w:ascii="Pretendard" w:cs="Pretendard" w:eastAsia="Pretendard" w:hAnsi="Pretendard"/>
                 <w:b w:val="false"/>
                 <w:bCs w:val="false"/>
                 <w:color w:val="1A1A1A"/>
@@ -9202,7 +9202,7 @@
             </w:pPr>
             <w:r>
               <w:rPr>
-                <w:rFonts w:ascii="맑은 고딕" w:cs="맑은 고딕" w:eastAsia="맑은 고딕" w:hAnsi="맑은 고딕"/>
+                <w:rFonts w:ascii="Pretendard" w:cs="Pretendard" w:eastAsia="Pretendard" w:hAnsi="Pretendard"/>
                 <w:b w:val="false"/>
                 <w:bCs w:val="false"/>
                 <w:color w:val="1A1A1A"/>
@@ -9230,7 +9230,7 @@
             </w:pPr>
             <w:r>
               <w:rPr>
-                <w:rFonts w:ascii="맑은 고딕" w:cs="맑은 고딕" w:eastAsia="맑은 고딕" w:hAnsi="맑은 고딕"/>
+                <w:rFonts w:ascii="Pretendard" w:cs="Pretendard" w:eastAsia="Pretendard" w:hAnsi="Pretendard"/>
                 <w:b w:val="false"/>
                 <w:bCs w:val="false"/>
                 <w:color w:val="1A1A1A"/>
@@ -9258,7 +9258,7 @@
             </w:pPr>
             <w:r>
               <w:rPr>
-                <w:rFonts w:ascii="맑은 고딕" w:cs="맑은 고딕" w:eastAsia="맑은 고딕" w:hAnsi="맑은 고딕"/>
+                <w:rFonts w:ascii="Pretendard" w:cs="Pretendard" w:eastAsia="Pretendard" w:hAnsi="Pretendard"/>
                 <w:b w:val="false"/>
                 <w:bCs w:val="false"/>
                 <w:color w:val="1A1A1A"/>
@@ -9291,7 +9291,7 @@
             </w:pPr>
             <w:r>
               <w:rPr>
-                <w:rFonts w:ascii="맑은 고딕" w:cs="맑은 고딕" w:eastAsia="맑은 고딕" w:hAnsi="맑은 고딕"/>
+                <w:rFonts w:ascii="Pretendard" w:cs="Pretendard" w:eastAsia="Pretendard" w:hAnsi="Pretendard"/>
                 <w:b w:val="false"/>
                 <w:bCs w:val="false"/>
                 <w:color w:val="1A1A1A"/>
@@ -9319,7 +9319,7 @@
             </w:pPr>
             <w:r>
               <w:rPr>
-                <w:rFonts w:ascii="맑은 고딕" w:cs="맑은 고딕" w:eastAsia="맑은 고딕" w:hAnsi="맑은 고딕"/>
+                <w:rFonts w:ascii="Pretendard" w:cs="Pretendard" w:eastAsia="Pretendard" w:hAnsi="Pretendard"/>
                 <w:b w:val="false"/>
                 <w:bCs w:val="false"/>
                 <w:color w:val="1A1A1A"/>
@@ -9347,7 +9347,7 @@
             </w:pPr>
             <w:r>
               <w:rPr>
-                <w:rFonts w:ascii="맑은 고딕" w:cs="맑은 고딕" w:eastAsia="맑은 고딕" w:hAnsi="맑은 고딕"/>
+                <w:rFonts w:ascii="Pretendard" w:cs="Pretendard" w:eastAsia="Pretendard" w:hAnsi="Pretendard"/>
                 <w:b w:val="false"/>
                 <w:bCs w:val="false"/>
                 <w:color w:val="1A1A1A"/>
@@ -9380,7 +9380,7 @@
             </w:pPr>
             <w:r>
               <w:rPr>
-                <w:rFonts w:ascii="맑은 고딕" w:cs="맑은 고딕" w:eastAsia="맑은 고딕" w:hAnsi="맑은 고딕"/>
+                <w:rFonts w:ascii="Pretendard" w:cs="Pretendard" w:eastAsia="Pretendard" w:hAnsi="Pretendard"/>
                 <w:b w:val="false"/>
                 <w:bCs w:val="false"/>
                 <w:color w:val="1A1A1A"/>
@@ -9408,7 +9408,7 @@
             </w:pPr>
             <w:r>
               <w:rPr>
-                <w:rFonts w:ascii="맑은 고딕" w:cs="맑은 고딕" w:eastAsia="맑은 고딕" w:hAnsi="맑은 고딕"/>
+                <w:rFonts w:ascii="Pretendard" w:cs="Pretendard" w:eastAsia="Pretendard" w:hAnsi="Pretendard"/>
                 <w:b w:val="false"/>
                 <w:bCs w:val="false"/>
                 <w:color w:val="1A1A1A"/>
@@ -9436,7 +9436,7 @@
             </w:pPr>
             <w:r>
               <w:rPr>
-                <w:rFonts w:ascii="맑은 고딕" w:cs="맑은 고딕" w:eastAsia="맑은 고딕" w:hAnsi="맑은 고딕"/>
+                <w:rFonts w:ascii="Pretendard" w:cs="Pretendard" w:eastAsia="Pretendard" w:hAnsi="Pretendard"/>
                 <w:b w:val="false"/>
                 <w:bCs w:val="false"/>
                 <w:color w:val="1A1A1A"/>
@@ -9469,7 +9469,7 @@
             </w:pPr>
             <w:r>
               <w:rPr>
-                <w:rFonts w:ascii="맑은 고딕" w:cs="맑은 고딕" w:eastAsia="맑은 고딕" w:hAnsi="맑은 고딕"/>
+                <w:rFonts w:ascii="Pretendard" w:cs="Pretendard" w:eastAsia="Pretendard" w:hAnsi="Pretendard"/>
                 <w:b w:val="false"/>
                 <w:bCs w:val="false"/>
                 <w:color w:val="1A1A1A"/>
@@ -9497,7 +9497,7 @@
             </w:pPr>
             <w:r>
               <w:rPr>
-                <w:rFonts w:ascii="맑은 고딕" w:cs="맑은 고딕" w:eastAsia="맑은 고딕" w:hAnsi="맑은 고딕"/>
+                <w:rFonts w:ascii="Pretendard" w:cs="Pretendard" w:eastAsia="Pretendard" w:hAnsi="Pretendard"/>
                 <w:b w:val="false"/>
                 <w:bCs w:val="false"/>
                 <w:color w:val="1A1A1A"/>
@@ -9525,7 +9525,7 @@
             </w:pPr>
             <w:r>
               <w:rPr>
-                <w:rFonts w:ascii="맑은 고딕" w:cs="맑은 고딕" w:eastAsia="맑은 고딕" w:hAnsi="맑은 고딕"/>
+                <w:rFonts w:ascii="Pretendard" w:cs="Pretendard" w:eastAsia="Pretendard" w:hAnsi="Pretendard"/>
                 <w:b w:val="false"/>
                 <w:bCs w:val="false"/>
                 <w:color w:val="1A1A1A"/>
@@ -9558,7 +9558,7 @@
             </w:pPr>
             <w:r>
               <w:rPr>
-                <w:rFonts w:ascii="맑은 고딕" w:cs="맑은 고딕" w:eastAsia="맑은 고딕" w:hAnsi="맑은 고딕"/>
+                <w:rFonts w:ascii="Pretendard" w:cs="Pretendard" w:eastAsia="Pretendard" w:hAnsi="Pretendard"/>
                 <w:b w:val="false"/>
                 <w:bCs w:val="false"/>
                 <w:color w:val="1A1A1A"/>
@@ -9586,7 +9586,7 @@
             </w:pPr>
             <w:r>
               <w:rPr>
-                <w:rFonts w:ascii="맑은 고딕" w:cs="맑은 고딕" w:eastAsia="맑은 고딕" w:hAnsi="맑은 고딕"/>
+                <w:rFonts w:ascii="Pretendard" w:cs="Pretendard" w:eastAsia="Pretendard" w:hAnsi="Pretendard"/>
                 <w:b w:val="false"/>
                 <w:bCs w:val="false"/>
                 <w:color w:val="1A1A1A"/>
@@ -9614,7 +9614,7 @@
             </w:pPr>
             <w:r>
               <w:rPr>
-                <w:rFonts w:ascii="맑은 고딕" w:cs="맑은 고딕" w:eastAsia="맑은 고딕" w:hAnsi="맑은 고딕"/>
+                <w:rFonts w:ascii="Pretendard" w:cs="Pretendard" w:eastAsia="Pretendard" w:hAnsi="Pretendard"/>
                 <w:b w:val="false"/>
                 <w:bCs w:val="false"/>
                 <w:color w:val="1A1A1A"/>
@@ -9647,7 +9647,7 @@
             </w:pPr>
             <w:r>
               <w:rPr>
-                <w:rFonts w:ascii="맑은 고딕" w:cs="맑은 고딕" w:eastAsia="맑은 고딕" w:hAnsi="맑은 고딕"/>
+                <w:rFonts w:ascii="Pretendard" w:cs="Pretendard" w:eastAsia="Pretendard" w:hAnsi="Pretendard"/>
                 <w:b w:val="false"/>
                 <w:bCs w:val="false"/>
                 <w:color w:val="1A1A1A"/>
@@ -9675,7 +9675,7 @@
             </w:pPr>
             <w:r>
               <w:rPr>
-                <w:rFonts w:ascii="맑은 고딕" w:cs="맑은 고딕" w:eastAsia="맑은 고딕" w:hAnsi="맑은 고딕"/>
+                <w:rFonts w:ascii="Pretendard" w:cs="Pretendard" w:eastAsia="Pretendard" w:hAnsi="Pretendard"/>
                 <w:b w:val="false"/>
                 <w:bCs w:val="false"/>
                 <w:color w:val="1A1A1A"/>
@@ -9703,7 +9703,7 @@
             </w:pPr>
             <w:r>
               <w:rPr>
-                <w:rFonts w:ascii="맑은 고딕" w:cs="맑은 고딕" w:eastAsia="맑은 고딕" w:hAnsi="맑은 고딕"/>
+                <w:rFonts w:ascii="Pretendard" w:cs="Pretendard" w:eastAsia="Pretendard" w:hAnsi="Pretendard"/>
                 <w:b w:val="false"/>
                 <w:bCs w:val="false"/>
                 <w:color w:val="1A1A1A"/>
@@ -9727,7 +9727,7 @@
       </w:pPr>
       <w:r>
         <w:rPr>
-          <w:rFonts w:ascii="맑은 고딕" w:cs="맑은 고딕" w:eastAsia="맑은 고딕" w:hAnsi="맑은 고딕"/>
+          <w:rFonts w:ascii="Pretendard" w:cs="Pretendard" w:eastAsia="Pretendard" w:hAnsi="Pretendard"/>
           <w:b/>
           <w:bCs/>
           <w:color w:val="1A1A1A"/>
@@ -9738,7 +9738,7 @@
       </w:r>
       <w:r>
         <w:rPr>
-          <w:rFonts w:ascii="맑은 고딕" w:cs="맑은 고딕" w:eastAsia="맑은 고딕" w:hAnsi="맑은 고딕"/>
+          <w:rFonts w:ascii="Pretendard" w:cs="Pretendard" w:eastAsia="Pretendard" w:hAnsi="Pretendard"/>
           <w:color w:val="1A1A1A"/>
           <w:sz w:val="20"/>
           <w:szCs w:val="20"/>
@@ -9752,7 +9752,7 @@
       </w:pPr>
       <w:r>
         <w:rPr>
-          <w:rFonts w:ascii="맑은 고딕" w:cs="맑은 고딕" w:eastAsia="맑은 고딕" w:hAnsi="맑은 고딕"/>
+          <w:rFonts w:ascii="Pretendard" w:cs="Pretendard" w:eastAsia="Pretendard" w:hAnsi="Pretendard"/>
           <w:color w:val="1A1A1A"/>
           <w:sz w:val="20"/>
           <w:szCs w:val="20"/>
@@ -9772,7 +9772,7 @@
       </w:pPr>
       <w:r>
         <w:rPr>
-          <w:rFonts w:ascii="맑은 고딕" w:cs="맑은 고딕" w:eastAsia="맑은 고딕" w:hAnsi="맑은 고딕"/>
+          <w:rFonts w:ascii="Pretendard" w:cs="Pretendard" w:eastAsia="Pretendard" w:hAnsi="Pretendard"/>
           <w:b/>
           <w:bCs/>
           <w:color w:val="111E6C"/>
@@ -9789,7 +9789,7 @@
       </w:pPr>
       <w:r>
         <w:rPr>
-          <w:rFonts w:ascii="맑은 고딕" w:cs="맑은 고딕" w:eastAsia="맑은 고딕" w:hAnsi="맑은 고딕"/>
+          <w:rFonts w:ascii="Pretendard" w:cs="Pretendard" w:eastAsia="Pretendard" w:hAnsi="Pretendard"/>
           <w:b/>
           <w:bCs/>
           <w:color w:val="1A1A1A"/>
@@ -9842,7 +9842,7 @@
             </w:pPr>
             <w:r>
               <w:rPr>
-                <w:rFonts w:ascii="맑은 고딕" w:cs="맑은 고딕" w:eastAsia="맑은 고딕" w:hAnsi="맑은 고딕"/>
+                <w:rFonts w:ascii="Pretendard" w:cs="Pretendard" w:eastAsia="Pretendard" w:hAnsi="Pretendard"/>
                 <w:b/>
                 <w:bCs/>
                 <w:color w:val="FFFFFF"/>
@@ -9871,7 +9871,7 @@
             </w:pPr>
             <w:r>
               <w:rPr>
-                <w:rFonts w:ascii="맑은 고딕" w:cs="맑은 고딕" w:eastAsia="맑은 고딕" w:hAnsi="맑은 고딕"/>
+                <w:rFonts w:ascii="Pretendard" w:cs="Pretendard" w:eastAsia="Pretendard" w:hAnsi="Pretendard"/>
                 <w:b/>
                 <w:bCs/>
                 <w:color w:val="FFFFFF"/>
@@ -9904,7 +9904,7 @@
             </w:pPr>
             <w:r>
               <w:rPr>
-                <w:rFonts w:ascii="맑은 고딕" w:cs="맑은 고딕" w:eastAsia="맑은 고딕" w:hAnsi="맑은 고딕"/>
+                <w:rFonts w:ascii="Pretendard" w:cs="Pretendard" w:eastAsia="Pretendard" w:hAnsi="Pretendard"/>
                 <w:b w:val="false"/>
                 <w:bCs w:val="false"/>
                 <w:color w:val="1A1A1A"/>
@@ -9932,7 +9932,7 @@
             </w:pPr>
             <w:r>
               <w:rPr>
-                <w:rFonts w:ascii="맑은 고딕" w:cs="맑은 고딕" w:eastAsia="맑은 고딕" w:hAnsi="맑은 고딕"/>
+                <w:rFonts w:ascii="Pretendard" w:cs="Pretendard" w:eastAsia="Pretendard" w:hAnsi="Pretendard"/>
                 <w:b w:val="false"/>
                 <w:bCs w:val="false"/>
                 <w:color w:val="1A1A1A"/>
@@ -9965,7 +9965,7 @@
             </w:pPr>
             <w:r>
               <w:rPr>
-                <w:rFonts w:ascii="맑은 고딕" w:cs="맑은 고딕" w:eastAsia="맑은 고딕" w:hAnsi="맑은 고딕"/>
+                <w:rFonts w:ascii="Pretendard" w:cs="Pretendard" w:eastAsia="Pretendard" w:hAnsi="Pretendard"/>
                 <w:b w:val="false"/>
                 <w:bCs w:val="false"/>
                 <w:color w:val="1A1A1A"/>
@@ -9993,7 +9993,7 @@
             </w:pPr>
             <w:r>
               <w:rPr>
-                <w:rFonts w:ascii="맑은 고딕" w:cs="맑은 고딕" w:eastAsia="맑은 고딕" w:hAnsi="맑은 고딕"/>
+                <w:rFonts w:ascii="Pretendard" w:cs="Pretendard" w:eastAsia="Pretendard" w:hAnsi="Pretendard"/>
                 <w:b w:val="false"/>
                 <w:bCs w:val="false"/>
                 <w:color w:val="1A1A1A"/>
@@ -10026,7 +10026,7 @@
             </w:pPr>
             <w:r>
               <w:rPr>
-                <w:rFonts w:ascii="맑은 고딕" w:cs="맑은 고딕" w:eastAsia="맑은 고딕" w:hAnsi="맑은 고딕"/>
+                <w:rFonts w:ascii="Pretendard" w:cs="Pretendard" w:eastAsia="Pretendard" w:hAnsi="Pretendard"/>
                 <w:b w:val="false"/>
                 <w:bCs w:val="false"/>
                 <w:color w:val="1A1A1A"/>
@@ -10054,7 +10054,7 @@
             </w:pPr>
             <w:r>
               <w:rPr>
-                <w:rFonts w:ascii="맑은 고딕" w:cs="맑은 고딕" w:eastAsia="맑은 고딕" w:hAnsi="맑은 고딕"/>
+                <w:rFonts w:ascii="Pretendard" w:cs="Pretendard" w:eastAsia="Pretendard" w:hAnsi="Pretendard"/>
                 <w:b w:val="false"/>
                 <w:bCs w:val="false"/>
                 <w:color w:val="1A1A1A"/>
@@ -10087,7 +10087,7 @@
             </w:pPr>
             <w:r>
               <w:rPr>
-                <w:rFonts w:ascii="맑은 고딕" w:cs="맑은 고딕" w:eastAsia="맑은 고딕" w:hAnsi="맑은 고딕"/>
+                <w:rFonts w:ascii="Pretendard" w:cs="Pretendard" w:eastAsia="Pretendard" w:hAnsi="Pretendard"/>
                 <w:b w:val="false"/>
                 <w:bCs w:val="false"/>
                 <w:color w:val="1A1A1A"/>
@@ -10115,7 +10115,7 @@
             </w:pPr>
             <w:r>
               <w:rPr>
-                <w:rFonts w:ascii="맑은 고딕" w:cs="맑은 고딕" w:eastAsia="맑은 고딕" w:hAnsi="맑은 고딕"/>
+                <w:rFonts w:ascii="Pretendard" w:cs="Pretendard" w:eastAsia="Pretendard" w:hAnsi="Pretendard"/>
                 <w:b w:val="false"/>
                 <w:bCs w:val="false"/>
                 <w:color w:val="1A1A1A"/>
@@ -10148,7 +10148,7 @@
             </w:pPr>
             <w:r>
               <w:rPr>
-                <w:rFonts w:ascii="맑은 고딕" w:cs="맑은 고딕" w:eastAsia="맑은 고딕" w:hAnsi="맑은 고딕"/>
+                <w:rFonts w:ascii="Pretendard" w:cs="Pretendard" w:eastAsia="Pretendard" w:hAnsi="Pretendard"/>
                 <w:b w:val="false"/>
                 <w:bCs w:val="false"/>
                 <w:color w:val="1A1A1A"/>
@@ -10176,7 +10176,7 @@
             </w:pPr>
             <w:r>
               <w:rPr>
-                <w:rFonts w:ascii="맑은 고딕" w:cs="맑은 고딕" w:eastAsia="맑은 고딕" w:hAnsi="맑은 고딕"/>
+                <w:rFonts w:ascii="Pretendard" w:cs="Pretendard" w:eastAsia="Pretendard" w:hAnsi="Pretendard"/>
                 <w:b w:val="false"/>
                 <w:bCs w:val="false"/>
                 <w:color w:val="1A1A1A"/>
@@ -10209,7 +10209,7 @@
             </w:pPr>
             <w:r>
               <w:rPr>
-                <w:rFonts w:ascii="맑은 고딕" w:cs="맑은 고딕" w:eastAsia="맑은 고딕" w:hAnsi="맑은 고딕"/>
+                <w:rFonts w:ascii="Pretendard" w:cs="Pretendard" w:eastAsia="Pretendard" w:hAnsi="Pretendard"/>
                 <w:b w:val="false"/>
                 <w:bCs w:val="false"/>
                 <w:color w:val="1A1A1A"/>
@@ -10237,7 +10237,7 @@
             </w:pPr>
             <w:r>
               <w:rPr>
-                <w:rFonts w:ascii="맑은 고딕" w:cs="맑은 고딕" w:eastAsia="맑은 고딕" w:hAnsi="맑은 고딕"/>
+                <w:rFonts w:ascii="Pretendard" w:cs="Pretendard" w:eastAsia="Pretendard" w:hAnsi="Pretendard"/>
                 <w:b w:val="false"/>
                 <w:bCs w:val="false"/>
                 <w:color w:val="1A1A1A"/>
@@ -10270,7 +10270,7 @@
             </w:pPr>
             <w:r>
               <w:rPr>
-                <w:rFonts w:ascii="맑은 고딕" w:cs="맑은 고딕" w:eastAsia="맑은 고딕" w:hAnsi="맑은 고딕"/>
+                <w:rFonts w:ascii="Pretendard" w:cs="Pretendard" w:eastAsia="Pretendard" w:hAnsi="Pretendard"/>
                 <w:b w:val="false"/>
                 <w:bCs w:val="false"/>
                 <w:color w:val="1A1A1A"/>
@@ -10298,7 +10298,7 @@
             </w:pPr>
             <w:r>
               <w:rPr>
-                <w:rFonts w:ascii="맑은 고딕" w:cs="맑은 고딕" w:eastAsia="맑은 고딕" w:hAnsi="맑은 고딕"/>
+                <w:rFonts w:ascii="Pretendard" w:cs="Pretendard" w:eastAsia="Pretendard" w:hAnsi="Pretendard"/>
                 <w:b w:val="false"/>
                 <w:bCs w:val="false"/>
                 <w:color w:val="1A1A1A"/>
@@ -10331,7 +10331,7 @@
             </w:pPr>
             <w:r>
               <w:rPr>
-                <w:rFonts w:ascii="맑은 고딕" w:cs="맑은 고딕" w:eastAsia="맑은 고딕" w:hAnsi="맑은 고딕"/>
+                <w:rFonts w:ascii="Pretendard" w:cs="Pretendard" w:eastAsia="Pretendard" w:hAnsi="Pretendard"/>
                 <w:b w:val="false"/>
                 <w:bCs w:val="false"/>
                 <w:color w:val="1A1A1A"/>
@@ -10359,7 +10359,7 @@
             </w:pPr>
             <w:r>
               <w:rPr>
-                <w:rFonts w:ascii="맑은 고딕" w:cs="맑은 고딕" w:eastAsia="맑은 고딕" w:hAnsi="맑은 고딕"/>
+                <w:rFonts w:ascii="Pretendard" w:cs="Pretendard" w:eastAsia="Pretendard" w:hAnsi="Pretendard"/>
                 <w:b w:val="false"/>
                 <w:bCs w:val="false"/>
                 <w:color w:val="1A1A1A"/>
@@ -10392,7 +10392,7 @@
             </w:pPr>
             <w:r>
               <w:rPr>
-                <w:rFonts w:ascii="맑은 고딕" w:cs="맑은 고딕" w:eastAsia="맑은 고딕" w:hAnsi="맑은 고딕"/>
+                <w:rFonts w:ascii="Pretendard" w:cs="Pretendard" w:eastAsia="Pretendard" w:hAnsi="Pretendard"/>
                 <w:b w:val="false"/>
                 <w:bCs w:val="false"/>
                 <w:color w:val="1A1A1A"/>
@@ -10420,7 +10420,7 @@
             </w:pPr>
             <w:r>
               <w:rPr>
-                <w:rFonts w:ascii="맑은 고딕" w:cs="맑은 고딕" w:eastAsia="맑은 고딕" w:hAnsi="맑은 고딕"/>
+                <w:rFonts w:ascii="Pretendard" w:cs="Pretendard" w:eastAsia="Pretendard" w:hAnsi="Pretendard"/>
                 <w:b w:val="false"/>
                 <w:bCs w:val="false"/>
                 <w:color w:val="1A1A1A"/>
@@ -10453,7 +10453,7 @@
             </w:pPr>
             <w:r>
               <w:rPr>
-                <w:rFonts w:ascii="맑은 고딕" w:cs="맑은 고딕" w:eastAsia="맑은 고딕" w:hAnsi="맑은 고딕"/>
+                <w:rFonts w:ascii="Pretendard" w:cs="Pretendard" w:eastAsia="Pretendard" w:hAnsi="Pretendard"/>
                 <w:b w:val="false"/>
                 <w:bCs w:val="false"/>
                 <w:color w:val="1A1A1A"/>
@@ -10481,7 +10481,7 @@
             </w:pPr>
             <w:r>
               <w:rPr>
-                <w:rFonts w:ascii="맑은 고딕" w:cs="맑은 고딕" w:eastAsia="맑은 고딕" w:hAnsi="맑은 고딕"/>
+                <w:rFonts w:ascii="Pretendard" w:cs="Pretendard" w:eastAsia="Pretendard" w:hAnsi="Pretendard"/>
                 <w:b w:val="false"/>
                 <w:bCs w:val="false"/>
                 <w:color w:val="1A1A1A"/>
@@ -10514,7 +10514,7 @@
             </w:pPr>
             <w:r>
               <w:rPr>
-                <w:rFonts w:ascii="맑은 고딕" w:cs="맑은 고딕" w:eastAsia="맑은 고딕" w:hAnsi="맑은 고딕"/>
+                <w:rFonts w:ascii="Pretendard" w:cs="Pretendard" w:eastAsia="Pretendard" w:hAnsi="Pretendard"/>
                 <w:b w:val="false"/>
                 <w:bCs w:val="false"/>
                 <w:color w:val="1A1A1A"/>
@@ -10542,7 +10542,7 @@
             </w:pPr>
             <w:r>
               <w:rPr>
-                <w:rFonts w:ascii="맑은 고딕" w:cs="맑은 고딕" w:eastAsia="맑은 고딕" w:hAnsi="맑은 고딕"/>
+                <w:rFonts w:ascii="Pretendard" w:cs="Pretendard" w:eastAsia="Pretendard" w:hAnsi="Pretendard"/>
                 <w:b w:val="false"/>
                 <w:bCs w:val="false"/>
                 <w:color w:val="1A1A1A"/>
@@ -10567,7 +10567,7 @@
       </w:pPr>
       <w:r>
         <w:rPr>
-          <w:rFonts w:ascii="맑은 고딕" w:cs="맑은 고딕" w:eastAsia="맑은 고딕" w:hAnsi="맑은 고딕"/>
+          <w:rFonts w:ascii="Pretendard" w:cs="Pretendard" w:eastAsia="Pretendard" w:hAnsi="Pretendard"/>
           <w:b/>
           <w:bCs/>
           <w:color w:val="1A1A1A"/>
@@ -10620,7 +10620,7 @@
             </w:pPr>
             <w:r>
               <w:rPr>
-                <w:rFonts w:ascii="맑은 고딕" w:cs="맑은 고딕" w:eastAsia="맑은 고딕" w:hAnsi="맑은 고딕"/>
+                <w:rFonts w:ascii="Pretendard" w:cs="Pretendard" w:eastAsia="Pretendard" w:hAnsi="Pretendard"/>
                 <w:b/>
                 <w:bCs/>
                 <w:color w:val="FFFFFF"/>
@@ -10649,7 +10649,7 @@
             </w:pPr>
             <w:r>
               <w:rPr>
-                <w:rFonts w:ascii="맑은 고딕" w:cs="맑은 고딕" w:eastAsia="맑은 고딕" w:hAnsi="맑은 고딕"/>
+                <w:rFonts w:ascii="Pretendard" w:cs="Pretendard" w:eastAsia="Pretendard" w:hAnsi="Pretendard"/>
                 <w:b/>
                 <w:bCs/>
                 <w:color w:val="FFFFFF"/>
@@ -10682,7 +10682,7 @@
             </w:pPr>
             <w:r>
               <w:rPr>
-                <w:rFonts w:ascii="맑은 고딕" w:cs="맑은 고딕" w:eastAsia="맑은 고딕" w:hAnsi="맑은 고딕"/>
+                <w:rFonts w:ascii="Pretendard" w:cs="Pretendard" w:eastAsia="Pretendard" w:hAnsi="Pretendard"/>
                 <w:b w:val="false"/>
                 <w:bCs w:val="false"/>
                 <w:color w:val="1A1A1A"/>
@@ -10710,7 +10710,7 @@
             </w:pPr>
             <w:r>
               <w:rPr>
-                <w:rFonts w:ascii="맑은 고딕" w:cs="맑은 고딕" w:eastAsia="맑은 고딕" w:hAnsi="맑은 고딕"/>
+                <w:rFonts w:ascii="Pretendard" w:cs="Pretendard" w:eastAsia="Pretendard" w:hAnsi="Pretendard"/>
                 <w:b w:val="false"/>
                 <w:bCs w:val="false"/>
                 <w:color w:val="1A1A1A"/>
@@ -10743,7 +10743,7 @@
             </w:pPr>
             <w:r>
               <w:rPr>
-                <w:rFonts w:ascii="맑은 고딕" w:cs="맑은 고딕" w:eastAsia="맑은 고딕" w:hAnsi="맑은 고딕"/>
+                <w:rFonts w:ascii="Pretendard" w:cs="Pretendard" w:eastAsia="Pretendard" w:hAnsi="Pretendard"/>
                 <w:b w:val="false"/>
                 <w:bCs w:val="false"/>
                 <w:color w:val="1A1A1A"/>
@@ -10771,7 +10771,7 @@
             </w:pPr>
             <w:r>
               <w:rPr>
-                <w:rFonts w:ascii="맑은 고딕" w:cs="맑은 고딕" w:eastAsia="맑은 고딕" w:hAnsi="맑은 고딕"/>
+                <w:rFonts w:ascii="Pretendard" w:cs="Pretendard" w:eastAsia="Pretendard" w:hAnsi="Pretendard"/>
                 <w:b w:val="false"/>
                 <w:bCs w:val="false"/>
                 <w:color w:val="1A1A1A"/>
@@ -10804,7 +10804,7 @@
             </w:pPr>
             <w:r>
               <w:rPr>
-                <w:rFonts w:ascii="맑은 고딕" w:cs="맑은 고딕" w:eastAsia="맑은 고딕" w:hAnsi="맑은 고딕"/>
+                <w:rFonts w:ascii="Pretendard" w:cs="Pretendard" w:eastAsia="Pretendard" w:hAnsi="Pretendard"/>
                 <w:b w:val="false"/>
                 <w:bCs w:val="false"/>
                 <w:color w:val="1A1A1A"/>
@@ -10832,7 +10832,7 @@
             </w:pPr>
             <w:r>
               <w:rPr>
-                <w:rFonts w:ascii="맑은 고딕" w:cs="맑은 고딕" w:eastAsia="맑은 고딕" w:hAnsi="맑은 고딕"/>
+                <w:rFonts w:ascii="Pretendard" w:cs="Pretendard" w:eastAsia="Pretendard" w:hAnsi="Pretendard"/>
                 <w:b w:val="false"/>
                 <w:bCs w:val="false"/>
                 <w:color w:val="1A1A1A"/>
@@ -10865,7 +10865,7 @@
             </w:pPr>
             <w:r>
               <w:rPr>
-                <w:rFonts w:ascii="맑은 고딕" w:cs="맑은 고딕" w:eastAsia="맑은 고딕" w:hAnsi="맑은 고딕"/>
+                <w:rFonts w:ascii="Pretendard" w:cs="Pretendard" w:eastAsia="Pretendard" w:hAnsi="Pretendard"/>
                 <w:b w:val="false"/>
                 <w:bCs w:val="false"/>
                 <w:color w:val="1A1A1A"/>
@@ -10893,7 +10893,7 @@
             </w:pPr>
             <w:r>
               <w:rPr>
-                <w:rFonts w:ascii="맑은 고딕" w:cs="맑은 고딕" w:eastAsia="맑은 고딕" w:hAnsi="맑은 고딕"/>
+                <w:rFonts w:ascii="Pretendard" w:cs="Pretendard" w:eastAsia="Pretendard" w:hAnsi="Pretendard"/>
                 <w:b w:val="false"/>
                 <w:bCs w:val="false"/>
                 <w:color w:val="1A1A1A"/>
@@ -10917,7 +10917,7 @@
       </w:pPr>
       <w:r>
         <w:rPr>
-          <w:rFonts w:ascii="맑은 고딕" w:cs="맑은 고딕" w:eastAsia="맑은 고딕" w:hAnsi="맑은 고딕"/>
+          <w:rFonts w:ascii="Pretendard" w:cs="Pretendard" w:eastAsia="Pretendard" w:hAnsi="Pretendard"/>
           <w:color w:val="1A1A1A"/>
           <w:sz w:val="20"/>
           <w:szCs w:val="20"/>
@@ -10939,7 +10939,7 @@
       </w:pPr>
       <w:r>
         <w:rPr>
-          <w:rFonts w:ascii="맑은 고딕" w:cs="맑은 고딕" w:eastAsia="맑은 고딕" w:hAnsi="맑은 고딕"/>
+          <w:rFonts w:ascii="Pretendard" w:cs="Pretendard" w:eastAsia="Pretendard" w:hAnsi="Pretendard"/>
           <w:color w:val="5C5C5C"/>
           <w:sz w:val="17"/>
           <w:szCs w:val="17"/>
@@ -11153,7 +11153,7 @@
   <w:docDefaults>
     <w:rPrDefault>
       <w:rPr>
-        <w:rFonts w:ascii="맑은 고딕" w:cs="맑은 고딕" w:eastAsia="맑은 고딕" w:hAnsi="맑은 고딕"/>
+        <w:rFonts w:ascii="Pretendard" w:cs="Pretendard" w:eastAsia="Pretendard" w:hAnsi="Pretendard"/>
         <w:color w:val="1A1A1A"/>
         <w:sz w:val="20"/>
         <w:szCs w:val="20"/>

</xml_diff>

<commit_message>
docs(ciclo-v2): 보고서 폰트를 Pretendard 로 되돌림
본고딕(Noto Sans KR) 시안을 확인한 뒤 Pretendard 로 확정.
스크립트 기본값이 Pretendard 라 인자 없이 재생성했다.

검증: document.xml·styles.xml 폰트 'Pretendard' 하나뿐
      Noto 잔존 0 · 맑은 고딕 잔존 0
      rFonts 네 슬롯(ascii·hAnsi·cs·eastAsia) 전부 Pretendard
      표 너비 9026 = A4 본문 폭 · 넘침 0 · 런 414개 전부 폰트 지정
      음영 clear · 개행문자 0 · 깨진 문자 0 · 8쪽

Co-Authored-By: Claude Opus 5 <noreply@anthropic.com>
Claude-Session: https://claude.ai/code/session_01WexMN5qMzsTVufd77zVtDk
</commit_message>
<xml_diff>
--- a/ciclo-v2/씨클로-홈페이지-v2-작업보고서.docx
+++ b/ciclo-v2/씨클로-홈페이지-v2-작업보고서.docx
@@ -13,7 +13,7 @@
       </w:pPr>
       <w:r>
         <w:rPr>
-          <w:rFonts w:ascii="Noto Sans KR" w:cs="Noto Sans KR" w:eastAsia="Noto Sans KR" w:hAnsi="Noto Sans KR"/>
+          <w:rFonts w:ascii="Pretendard" w:cs="Pretendard" w:eastAsia="Pretendard" w:hAnsi="Pretendard"/>
           <w:b/>
           <w:bCs/>
           <w:color w:val="1A1A1A"/>
@@ -32,7 +32,7 @@
       </w:pPr>
       <w:r>
         <w:rPr>
-          <w:rFonts w:ascii="Noto Sans KR" w:cs="Noto Sans KR" w:eastAsia="Noto Sans KR" w:hAnsi="Noto Sans KR"/>
+          <w:rFonts w:ascii="Pretendard" w:cs="Pretendard" w:eastAsia="Pretendard" w:hAnsi="Pretendard"/>
           <w:b/>
           <w:bCs/>
           <w:color w:val="111E6C"/>
@@ -48,7 +48,7 @@
       </w:pPr>
       <w:r>
         <w:rPr>
-          <w:rFonts w:ascii="Noto Sans KR" w:cs="Noto Sans KR" w:eastAsia="Noto Sans KR" w:hAnsi="Noto Sans KR"/>
+          <w:rFonts w:ascii="Pretendard" w:cs="Pretendard" w:eastAsia="Pretendard" w:hAnsi="Pretendard"/>
           <w:color w:val="5C5C5C"/>
           <w:sz w:val="22"/>
           <w:szCs w:val="22"/>
@@ -94,7 +94,7 @@
             </w:pPr>
             <w:r>
               <w:rPr>
-                <w:rFonts w:ascii="Noto Sans KR" w:cs="Noto Sans KR" w:eastAsia="Noto Sans KR" w:hAnsi="Noto Sans KR"/>
+                <w:rFonts w:ascii="Pretendard" w:cs="Pretendard" w:eastAsia="Pretendard" w:hAnsi="Pretendard"/>
                 <w:b/>
                 <w:bCs/>
                 <w:color w:val="FFFFFF"/>
@@ -123,7 +123,7 @@
             </w:pPr>
             <w:r>
               <w:rPr>
-                <w:rFonts w:ascii="Noto Sans KR" w:cs="Noto Sans KR" w:eastAsia="Noto Sans KR" w:hAnsi="Noto Sans KR"/>
+                <w:rFonts w:ascii="Pretendard" w:cs="Pretendard" w:eastAsia="Pretendard" w:hAnsi="Pretendard"/>
                 <w:b/>
                 <w:bCs/>
                 <w:color w:val="FFFFFF"/>
@@ -156,7 +156,7 @@
             </w:pPr>
             <w:r>
               <w:rPr>
-                <w:rFonts w:ascii="Noto Sans KR" w:cs="Noto Sans KR" w:eastAsia="Noto Sans KR" w:hAnsi="Noto Sans KR"/>
+                <w:rFonts w:ascii="Pretendard" w:cs="Pretendard" w:eastAsia="Pretendard" w:hAnsi="Pretendard"/>
                 <w:b w:val="false"/>
                 <w:bCs w:val="false"/>
                 <w:color w:val="1A1A1A"/>
@@ -184,7 +184,7 @@
             </w:pPr>
             <w:r>
               <w:rPr>
-                <w:rFonts w:ascii="Noto Sans KR" w:cs="Noto Sans KR" w:eastAsia="Noto Sans KR" w:hAnsi="Noto Sans KR"/>
+                <w:rFonts w:ascii="Pretendard" w:cs="Pretendard" w:eastAsia="Pretendard" w:hAnsi="Pretendard"/>
                 <w:b w:val="false"/>
                 <w:bCs w:val="false"/>
                 <w:color w:val="1A1A1A"/>
@@ -217,7 +217,7 @@
             </w:pPr>
             <w:r>
               <w:rPr>
-                <w:rFonts w:ascii="Noto Sans KR" w:cs="Noto Sans KR" w:eastAsia="Noto Sans KR" w:hAnsi="Noto Sans KR"/>
+                <w:rFonts w:ascii="Pretendard" w:cs="Pretendard" w:eastAsia="Pretendard" w:hAnsi="Pretendard"/>
                 <w:b w:val="false"/>
                 <w:bCs w:val="false"/>
                 <w:color w:val="1A1A1A"/>
@@ -245,7 +245,7 @@
             </w:pPr>
             <w:r>
               <w:rPr>
-                <w:rFonts w:ascii="Noto Sans KR" w:cs="Noto Sans KR" w:eastAsia="Noto Sans KR" w:hAnsi="Noto Sans KR"/>
+                <w:rFonts w:ascii="Pretendard" w:cs="Pretendard" w:eastAsia="Pretendard" w:hAnsi="Pretendard"/>
                 <w:b w:val="false"/>
                 <w:bCs w:val="false"/>
                 <w:color w:val="1A1A1A"/>
@@ -278,7 +278,7 @@
             </w:pPr>
             <w:r>
               <w:rPr>
-                <w:rFonts w:ascii="Noto Sans KR" w:cs="Noto Sans KR" w:eastAsia="Noto Sans KR" w:hAnsi="Noto Sans KR"/>
+                <w:rFonts w:ascii="Pretendard" w:cs="Pretendard" w:eastAsia="Pretendard" w:hAnsi="Pretendard"/>
                 <w:b w:val="false"/>
                 <w:bCs w:val="false"/>
                 <w:color w:val="1A1A1A"/>
@@ -306,7 +306,7 @@
             </w:pPr>
             <w:r>
               <w:rPr>
-                <w:rFonts w:ascii="Noto Sans KR" w:cs="Noto Sans KR" w:eastAsia="Noto Sans KR" w:hAnsi="Noto Sans KR"/>
+                <w:rFonts w:ascii="Pretendard" w:cs="Pretendard" w:eastAsia="Pretendard" w:hAnsi="Pretendard"/>
                 <w:b w:val="false"/>
                 <w:bCs w:val="false"/>
                 <w:color w:val="1A1A1A"/>
@@ -339,7 +339,7 @@
             </w:pPr>
             <w:r>
               <w:rPr>
-                <w:rFonts w:ascii="Noto Sans KR" w:cs="Noto Sans KR" w:eastAsia="Noto Sans KR" w:hAnsi="Noto Sans KR"/>
+                <w:rFonts w:ascii="Pretendard" w:cs="Pretendard" w:eastAsia="Pretendard" w:hAnsi="Pretendard"/>
                 <w:b w:val="false"/>
                 <w:bCs w:val="false"/>
                 <w:color w:val="1A1A1A"/>
@@ -367,7 +367,7 @@
             </w:pPr>
             <w:r>
               <w:rPr>
-                <w:rFonts w:ascii="Noto Sans KR" w:cs="Noto Sans KR" w:eastAsia="Noto Sans KR" w:hAnsi="Noto Sans KR"/>
+                <w:rFonts w:ascii="Pretendard" w:cs="Pretendard" w:eastAsia="Pretendard" w:hAnsi="Pretendard"/>
                 <w:b w:val="false"/>
                 <w:bCs w:val="false"/>
                 <w:color w:val="1A1A1A"/>
@@ -400,7 +400,7 @@
             </w:pPr>
             <w:r>
               <w:rPr>
-                <w:rFonts w:ascii="Noto Sans KR" w:cs="Noto Sans KR" w:eastAsia="Noto Sans KR" w:hAnsi="Noto Sans KR"/>
+                <w:rFonts w:ascii="Pretendard" w:cs="Pretendard" w:eastAsia="Pretendard" w:hAnsi="Pretendard"/>
                 <w:b w:val="false"/>
                 <w:bCs w:val="false"/>
                 <w:color w:val="1A1A1A"/>
@@ -428,7 +428,7 @@
             </w:pPr>
             <w:r>
               <w:rPr>
-                <w:rFonts w:ascii="Noto Sans KR" w:cs="Noto Sans KR" w:eastAsia="Noto Sans KR" w:hAnsi="Noto Sans KR"/>
+                <w:rFonts w:ascii="Pretendard" w:cs="Pretendard" w:eastAsia="Pretendard" w:hAnsi="Pretendard"/>
                 <w:b w:val="false"/>
                 <w:bCs w:val="false"/>
                 <w:color w:val="1A1A1A"/>
@@ -453,7 +453,7 @@
       </w:pPr>
       <w:r>
         <w:rPr>
-          <w:rFonts w:ascii="Noto Sans KR" w:cs="Noto Sans KR" w:eastAsia="Noto Sans KR" w:hAnsi="Noto Sans KR"/>
+          <w:rFonts w:ascii="Pretendard" w:cs="Pretendard" w:eastAsia="Pretendard" w:hAnsi="Pretendard"/>
           <w:b/>
           <w:bCs/>
           <w:color w:val="111E6C"/>
@@ -469,7 +469,7 @@
       </w:pPr>
       <w:r>
         <w:rPr>
-          <w:rFonts w:ascii="Noto Sans KR" w:cs="Noto Sans KR" w:eastAsia="Noto Sans KR" w:hAnsi="Noto Sans KR"/>
+          <w:rFonts w:ascii="Pretendard" w:cs="Pretendard" w:eastAsia="Pretendard" w:hAnsi="Pretendard"/>
           <w:color w:val="1A1A1A"/>
           <w:sz w:val="20"/>
           <w:szCs w:val="20"/>
@@ -484,7 +484,7 @@
       </w:pPr>
       <w:r>
         <w:rPr>
-          <w:rFonts w:ascii="Noto Sans KR" w:cs="Noto Sans KR" w:eastAsia="Noto Sans KR" w:hAnsi="Noto Sans KR"/>
+          <w:rFonts w:ascii="Pretendard" w:cs="Pretendard" w:eastAsia="Pretendard" w:hAnsi="Pretendard"/>
           <w:b/>
           <w:bCs/>
           <w:color w:val="1A1A1A"/>
@@ -505,7 +505,7 @@
       </w:pPr>
       <w:r>
         <w:rPr>
-          <w:rFonts w:ascii="Noto Sans KR" w:cs="Noto Sans KR" w:eastAsia="Noto Sans KR" w:hAnsi="Noto Sans KR"/>
+          <w:rFonts w:ascii="Pretendard" w:cs="Pretendard" w:eastAsia="Pretendard" w:hAnsi="Pretendard"/>
           <w:color w:val="1A1A1A"/>
           <w:sz w:val="20"/>
           <w:szCs w:val="20"/>
@@ -514,7 +514,7 @@
       </w:r>
       <w:r>
         <w:rPr>
-          <w:rFonts w:ascii="Noto Sans KR" w:cs="Noto Sans KR" w:eastAsia="Noto Sans KR" w:hAnsi="Noto Sans KR"/>
+          <w:rFonts w:ascii="Pretendard" w:cs="Pretendard" w:eastAsia="Pretendard" w:hAnsi="Pretendard"/>
           <w:b/>
           <w:bCs/>
           <w:color w:val="1A1A1A"/>
@@ -525,7 +525,7 @@
       </w:r>
       <w:r>
         <w:rPr>
-          <w:rFonts w:ascii="Noto Sans KR" w:cs="Noto Sans KR" w:eastAsia="Noto Sans KR" w:hAnsi="Noto Sans KR"/>
+          <w:rFonts w:ascii="Pretendard" w:cs="Pretendard" w:eastAsia="Pretendard" w:hAnsi="Pretendard"/>
           <w:color w:val="1A1A1A"/>
           <w:sz w:val="20"/>
           <w:szCs w:val="20"/>
@@ -544,7 +544,7 @@
       </w:pPr>
       <w:r>
         <w:rPr>
-          <w:rFonts w:ascii="Noto Sans KR" w:cs="Noto Sans KR" w:eastAsia="Noto Sans KR" w:hAnsi="Noto Sans KR"/>
+          <w:rFonts w:ascii="Pretendard" w:cs="Pretendard" w:eastAsia="Pretendard" w:hAnsi="Pretendard"/>
           <w:color w:val="1A1A1A"/>
           <w:sz w:val="20"/>
           <w:szCs w:val="20"/>
@@ -553,7 +553,7 @@
       </w:r>
       <w:r>
         <w:rPr>
-          <w:rFonts w:ascii="Noto Sans KR" w:cs="Noto Sans KR" w:eastAsia="Noto Sans KR" w:hAnsi="Noto Sans KR"/>
+          <w:rFonts w:ascii="Pretendard" w:cs="Pretendard" w:eastAsia="Pretendard" w:hAnsi="Pretendard"/>
           <w:b/>
           <w:bCs/>
           <w:color w:val="1A1A1A"/>
@@ -564,7 +564,7 @@
       </w:r>
       <w:r>
         <w:rPr>
-          <w:rFonts w:ascii="Noto Sans KR" w:cs="Noto Sans KR" w:eastAsia="Noto Sans KR" w:hAnsi="Noto Sans KR"/>
+          <w:rFonts w:ascii="Pretendard" w:cs="Pretendard" w:eastAsia="Pretendard" w:hAnsi="Pretendard"/>
           <w:color w:val="1A1A1A"/>
           <w:sz w:val="20"/>
           <w:szCs w:val="20"/>
@@ -583,7 +583,7 @@
       </w:pPr>
       <w:r>
         <w:rPr>
-          <w:rFonts w:ascii="Noto Sans KR" w:cs="Noto Sans KR" w:eastAsia="Noto Sans KR" w:hAnsi="Noto Sans KR"/>
+          <w:rFonts w:ascii="Pretendard" w:cs="Pretendard" w:eastAsia="Pretendard" w:hAnsi="Pretendard"/>
           <w:color w:val="1A1A1A"/>
           <w:sz w:val="20"/>
           <w:szCs w:val="20"/>
@@ -592,7 +592,7 @@
       </w:r>
       <w:r>
         <w:rPr>
-          <w:rFonts w:ascii="Noto Sans KR" w:cs="Noto Sans KR" w:eastAsia="Noto Sans KR" w:hAnsi="Noto Sans KR"/>
+          <w:rFonts w:ascii="Pretendard" w:cs="Pretendard" w:eastAsia="Pretendard" w:hAnsi="Pretendard"/>
           <w:b/>
           <w:bCs/>
           <w:color w:val="1A1A1A"/>
@@ -603,7 +603,7 @@
       </w:r>
       <w:r>
         <w:rPr>
-          <w:rFonts w:ascii="Noto Sans KR" w:cs="Noto Sans KR" w:eastAsia="Noto Sans KR" w:hAnsi="Noto Sans KR"/>
+          <w:rFonts w:ascii="Pretendard" w:cs="Pretendard" w:eastAsia="Pretendard" w:hAnsi="Pretendard"/>
           <w:color w:val="1A1A1A"/>
           <w:sz w:val="20"/>
           <w:szCs w:val="20"/>
@@ -621,7 +621,7 @@
       </w:pPr>
       <w:r>
         <w:rPr>
-          <w:rFonts w:ascii="Noto Sans KR" w:cs="Noto Sans KR" w:eastAsia="Noto Sans KR" w:hAnsi="Noto Sans KR"/>
+          <w:rFonts w:ascii="Pretendard" w:cs="Pretendard" w:eastAsia="Pretendard" w:hAnsi="Pretendard"/>
           <w:b/>
           <w:bCs/>
           <w:color w:val="1A1A1A"/>
@@ -635,7 +635,7 @@
       </w:r>
       <w:r>
         <w:rPr>
-          <w:rFonts w:ascii="Noto Sans KR" w:cs="Noto Sans KR" w:eastAsia="Noto Sans KR" w:hAnsi="Noto Sans KR"/>
+          <w:rFonts w:ascii="Pretendard" w:cs="Pretendard" w:eastAsia="Pretendard" w:hAnsi="Pretendard"/>
           <w:color w:val="5C5C5C"/>
           <w:sz w:val="19"/>
           <w:szCs w:val="19"/>
@@ -655,7 +655,7 @@
       </w:pPr>
       <w:r>
         <w:rPr>
-          <w:rFonts w:ascii="Noto Sans KR" w:cs="Noto Sans KR" w:eastAsia="Noto Sans KR" w:hAnsi="Noto Sans KR"/>
+          <w:rFonts w:ascii="Pretendard" w:cs="Pretendard" w:eastAsia="Pretendard" w:hAnsi="Pretendard"/>
           <w:b/>
           <w:bCs/>
           <w:color w:val="111E6C"/>
@@ -671,7 +671,7 @@
       </w:pPr>
       <w:r>
         <w:rPr>
-          <w:rFonts w:ascii="Noto Sans KR" w:cs="Noto Sans KR" w:eastAsia="Noto Sans KR" w:hAnsi="Noto Sans KR"/>
+          <w:rFonts w:ascii="Pretendard" w:cs="Pretendard" w:eastAsia="Pretendard" w:hAnsi="Pretendard"/>
           <w:color w:val="1A1A1A"/>
           <w:sz w:val="20"/>
           <w:szCs w:val="20"/>
@@ -723,7 +723,7 @@
             </w:pPr>
             <w:r>
               <w:rPr>
-                <w:rFonts w:ascii="Noto Sans KR" w:cs="Noto Sans KR" w:eastAsia="Noto Sans KR" w:hAnsi="Noto Sans KR"/>
+                <w:rFonts w:ascii="Pretendard" w:cs="Pretendard" w:eastAsia="Pretendard" w:hAnsi="Pretendard"/>
                 <w:b/>
                 <w:bCs/>
                 <w:color w:val="FFFFFF"/>
@@ -752,7 +752,7 @@
             </w:pPr>
             <w:r>
               <w:rPr>
-                <w:rFonts w:ascii="Noto Sans KR" w:cs="Noto Sans KR" w:eastAsia="Noto Sans KR" w:hAnsi="Noto Sans KR"/>
+                <w:rFonts w:ascii="Pretendard" w:cs="Pretendard" w:eastAsia="Pretendard" w:hAnsi="Pretendard"/>
                 <w:b/>
                 <w:bCs/>
                 <w:color w:val="FFFFFF"/>
@@ -781,7 +781,7 @@
             </w:pPr>
             <w:r>
               <w:rPr>
-                <w:rFonts w:ascii="Noto Sans KR" w:cs="Noto Sans KR" w:eastAsia="Noto Sans KR" w:hAnsi="Noto Sans KR"/>
+                <w:rFonts w:ascii="Pretendard" w:cs="Pretendard" w:eastAsia="Pretendard" w:hAnsi="Pretendard"/>
                 <w:b/>
                 <w:bCs/>
                 <w:color w:val="FFFFFF"/>
@@ -814,7 +814,7 @@
             </w:pPr>
             <w:r>
               <w:rPr>
-                <w:rFonts w:ascii="Noto Sans KR" w:cs="Noto Sans KR" w:eastAsia="Noto Sans KR" w:hAnsi="Noto Sans KR"/>
+                <w:rFonts w:ascii="Pretendard" w:cs="Pretendard" w:eastAsia="Pretendard" w:hAnsi="Pretendard"/>
                 <w:b w:val="false"/>
                 <w:bCs w:val="false"/>
                 <w:color w:val="1A1A1A"/>
@@ -842,7 +842,7 @@
             </w:pPr>
             <w:r>
               <w:rPr>
-                <w:rFonts w:ascii="Noto Sans KR" w:cs="Noto Sans KR" w:eastAsia="Noto Sans KR" w:hAnsi="Noto Sans KR"/>
+                <w:rFonts w:ascii="Pretendard" w:cs="Pretendard" w:eastAsia="Pretendard" w:hAnsi="Pretendard"/>
                 <w:b w:val="false"/>
                 <w:bCs w:val="false"/>
                 <w:color w:val="1A1A1A"/>
@@ -870,7 +870,7 @@
             </w:pPr>
             <w:r>
               <w:rPr>
-                <w:rFonts w:ascii="Noto Sans KR" w:cs="Noto Sans KR" w:eastAsia="Noto Sans KR" w:hAnsi="Noto Sans KR"/>
+                <w:rFonts w:ascii="Pretendard" w:cs="Pretendard" w:eastAsia="Pretendard" w:hAnsi="Pretendard"/>
                 <w:b w:val="false"/>
                 <w:bCs w:val="false"/>
                 <w:color w:val="1A1A1A"/>
@@ -903,7 +903,7 @@
             </w:pPr>
             <w:r>
               <w:rPr>
-                <w:rFonts w:ascii="Noto Sans KR" w:cs="Noto Sans KR" w:eastAsia="Noto Sans KR" w:hAnsi="Noto Sans KR"/>
+                <w:rFonts w:ascii="Pretendard" w:cs="Pretendard" w:eastAsia="Pretendard" w:hAnsi="Pretendard"/>
                 <w:b w:val="false"/>
                 <w:bCs w:val="false"/>
                 <w:color w:val="1A1A1A"/>
@@ -931,7 +931,7 @@
             </w:pPr>
             <w:r>
               <w:rPr>
-                <w:rFonts w:ascii="Noto Sans KR" w:cs="Noto Sans KR" w:eastAsia="Noto Sans KR" w:hAnsi="Noto Sans KR"/>
+                <w:rFonts w:ascii="Pretendard" w:cs="Pretendard" w:eastAsia="Pretendard" w:hAnsi="Pretendard"/>
                 <w:b w:val="false"/>
                 <w:bCs w:val="false"/>
                 <w:color w:val="1A1A1A"/>
@@ -959,7 +959,7 @@
             </w:pPr>
             <w:r>
               <w:rPr>
-                <w:rFonts w:ascii="Noto Sans KR" w:cs="Noto Sans KR" w:eastAsia="Noto Sans KR" w:hAnsi="Noto Sans KR"/>
+                <w:rFonts w:ascii="Pretendard" w:cs="Pretendard" w:eastAsia="Pretendard" w:hAnsi="Pretendard"/>
                 <w:b w:val="false"/>
                 <w:bCs w:val="false"/>
                 <w:color w:val="1A1A1A"/>
@@ -992,7 +992,7 @@
             </w:pPr>
             <w:r>
               <w:rPr>
-                <w:rFonts w:ascii="Noto Sans KR" w:cs="Noto Sans KR" w:eastAsia="Noto Sans KR" w:hAnsi="Noto Sans KR"/>
+                <w:rFonts w:ascii="Pretendard" w:cs="Pretendard" w:eastAsia="Pretendard" w:hAnsi="Pretendard"/>
                 <w:b w:val="false"/>
                 <w:bCs w:val="false"/>
                 <w:color w:val="1A1A1A"/>
@@ -1020,7 +1020,7 @@
             </w:pPr>
             <w:r>
               <w:rPr>
-                <w:rFonts w:ascii="Noto Sans KR" w:cs="Noto Sans KR" w:eastAsia="Noto Sans KR" w:hAnsi="Noto Sans KR"/>
+                <w:rFonts w:ascii="Pretendard" w:cs="Pretendard" w:eastAsia="Pretendard" w:hAnsi="Pretendard"/>
                 <w:b w:val="false"/>
                 <w:bCs w:val="false"/>
                 <w:color w:val="1A1A1A"/>
@@ -1048,7 +1048,7 @@
             </w:pPr>
             <w:r>
               <w:rPr>
-                <w:rFonts w:ascii="Noto Sans KR" w:cs="Noto Sans KR" w:eastAsia="Noto Sans KR" w:hAnsi="Noto Sans KR"/>
+                <w:rFonts w:ascii="Pretendard" w:cs="Pretendard" w:eastAsia="Pretendard" w:hAnsi="Pretendard"/>
                 <w:b w:val="false"/>
                 <w:bCs w:val="false"/>
                 <w:color w:val="1A1A1A"/>
@@ -1081,7 +1081,7 @@
             </w:pPr>
             <w:r>
               <w:rPr>
-                <w:rFonts w:ascii="Noto Sans KR" w:cs="Noto Sans KR" w:eastAsia="Noto Sans KR" w:hAnsi="Noto Sans KR"/>
+                <w:rFonts w:ascii="Pretendard" w:cs="Pretendard" w:eastAsia="Pretendard" w:hAnsi="Pretendard"/>
                 <w:b w:val="false"/>
                 <w:bCs w:val="false"/>
                 <w:color w:val="1A1A1A"/>
@@ -1109,7 +1109,7 @@
             </w:pPr>
             <w:r>
               <w:rPr>
-                <w:rFonts w:ascii="Noto Sans KR" w:cs="Noto Sans KR" w:eastAsia="Noto Sans KR" w:hAnsi="Noto Sans KR"/>
+                <w:rFonts w:ascii="Pretendard" w:cs="Pretendard" w:eastAsia="Pretendard" w:hAnsi="Pretendard"/>
                 <w:b w:val="false"/>
                 <w:bCs w:val="false"/>
                 <w:color w:val="1A1A1A"/>
@@ -1137,7 +1137,7 @@
             </w:pPr>
             <w:r>
               <w:rPr>
-                <w:rFonts w:ascii="Noto Sans KR" w:cs="Noto Sans KR" w:eastAsia="Noto Sans KR" w:hAnsi="Noto Sans KR"/>
+                <w:rFonts w:ascii="Pretendard" w:cs="Pretendard" w:eastAsia="Pretendard" w:hAnsi="Pretendard"/>
                 <w:b w:val="false"/>
                 <w:bCs w:val="false"/>
                 <w:color w:val="1A1A1A"/>
@@ -1170,7 +1170,7 @@
             </w:pPr>
             <w:r>
               <w:rPr>
-                <w:rFonts w:ascii="Noto Sans KR" w:cs="Noto Sans KR" w:eastAsia="Noto Sans KR" w:hAnsi="Noto Sans KR"/>
+                <w:rFonts w:ascii="Pretendard" w:cs="Pretendard" w:eastAsia="Pretendard" w:hAnsi="Pretendard"/>
                 <w:b w:val="false"/>
                 <w:bCs w:val="false"/>
                 <w:color w:val="1A1A1A"/>
@@ -1198,7 +1198,7 @@
             </w:pPr>
             <w:r>
               <w:rPr>
-                <w:rFonts w:ascii="Noto Sans KR" w:cs="Noto Sans KR" w:eastAsia="Noto Sans KR" w:hAnsi="Noto Sans KR"/>
+                <w:rFonts w:ascii="Pretendard" w:cs="Pretendard" w:eastAsia="Pretendard" w:hAnsi="Pretendard"/>
                 <w:b w:val="false"/>
                 <w:bCs w:val="false"/>
                 <w:color w:val="1A1A1A"/>
@@ -1226,7 +1226,7 @@
             </w:pPr>
             <w:r>
               <w:rPr>
-                <w:rFonts w:ascii="Noto Sans KR" w:cs="Noto Sans KR" w:eastAsia="Noto Sans KR" w:hAnsi="Noto Sans KR"/>
+                <w:rFonts w:ascii="Pretendard" w:cs="Pretendard" w:eastAsia="Pretendard" w:hAnsi="Pretendard"/>
                 <w:b w:val="false"/>
                 <w:bCs w:val="false"/>
                 <w:color w:val="1A1A1A"/>
@@ -1259,7 +1259,7 @@
             </w:pPr>
             <w:r>
               <w:rPr>
-                <w:rFonts w:ascii="Noto Sans KR" w:cs="Noto Sans KR" w:eastAsia="Noto Sans KR" w:hAnsi="Noto Sans KR"/>
+                <w:rFonts w:ascii="Pretendard" w:cs="Pretendard" w:eastAsia="Pretendard" w:hAnsi="Pretendard"/>
                 <w:b w:val="false"/>
                 <w:bCs w:val="false"/>
                 <w:color w:val="1A1A1A"/>
@@ -1287,7 +1287,7 @@
             </w:pPr>
             <w:r>
               <w:rPr>
-                <w:rFonts w:ascii="Noto Sans KR" w:cs="Noto Sans KR" w:eastAsia="Noto Sans KR" w:hAnsi="Noto Sans KR"/>
+                <w:rFonts w:ascii="Pretendard" w:cs="Pretendard" w:eastAsia="Pretendard" w:hAnsi="Pretendard"/>
                 <w:b w:val="false"/>
                 <w:bCs w:val="false"/>
                 <w:color w:val="1A1A1A"/>
@@ -1315,7 +1315,7 @@
             </w:pPr>
             <w:r>
               <w:rPr>
-                <w:rFonts w:ascii="Noto Sans KR" w:cs="Noto Sans KR" w:eastAsia="Noto Sans KR" w:hAnsi="Noto Sans KR"/>
+                <w:rFonts w:ascii="Pretendard" w:cs="Pretendard" w:eastAsia="Pretendard" w:hAnsi="Pretendard"/>
                 <w:b w:val="false"/>
                 <w:bCs w:val="false"/>
                 <w:color w:val="1A1A1A"/>
@@ -1348,7 +1348,7 @@
             </w:pPr>
             <w:r>
               <w:rPr>
-                <w:rFonts w:ascii="Noto Sans KR" w:cs="Noto Sans KR" w:eastAsia="Noto Sans KR" w:hAnsi="Noto Sans KR"/>
+                <w:rFonts w:ascii="Pretendard" w:cs="Pretendard" w:eastAsia="Pretendard" w:hAnsi="Pretendard"/>
                 <w:b w:val="false"/>
                 <w:bCs w:val="false"/>
                 <w:color w:val="1A1A1A"/>
@@ -1376,7 +1376,7 @@
             </w:pPr>
             <w:r>
               <w:rPr>
-                <w:rFonts w:ascii="Noto Sans KR" w:cs="Noto Sans KR" w:eastAsia="Noto Sans KR" w:hAnsi="Noto Sans KR"/>
+                <w:rFonts w:ascii="Pretendard" w:cs="Pretendard" w:eastAsia="Pretendard" w:hAnsi="Pretendard"/>
                 <w:b w:val="false"/>
                 <w:bCs w:val="false"/>
                 <w:color w:val="1A1A1A"/>
@@ -1404,7 +1404,7 @@
             </w:pPr>
             <w:r>
               <w:rPr>
-                <w:rFonts w:ascii="Noto Sans KR" w:cs="Noto Sans KR" w:eastAsia="Noto Sans KR" w:hAnsi="Noto Sans KR"/>
+                <w:rFonts w:ascii="Pretendard" w:cs="Pretendard" w:eastAsia="Pretendard" w:hAnsi="Pretendard"/>
                 <w:b w:val="false"/>
                 <w:bCs w:val="false"/>
                 <w:color w:val="1A1A1A"/>
@@ -1437,7 +1437,7 @@
             </w:pPr>
             <w:r>
               <w:rPr>
-                <w:rFonts w:ascii="Noto Sans KR" w:cs="Noto Sans KR" w:eastAsia="Noto Sans KR" w:hAnsi="Noto Sans KR"/>
+                <w:rFonts w:ascii="Pretendard" w:cs="Pretendard" w:eastAsia="Pretendard" w:hAnsi="Pretendard"/>
                 <w:b w:val="false"/>
                 <w:bCs w:val="false"/>
                 <w:color w:val="1A1A1A"/>
@@ -1465,7 +1465,7 @@
             </w:pPr>
             <w:r>
               <w:rPr>
-                <w:rFonts w:ascii="Noto Sans KR" w:cs="Noto Sans KR" w:eastAsia="Noto Sans KR" w:hAnsi="Noto Sans KR"/>
+                <w:rFonts w:ascii="Pretendard" w:cs="Pretendard" w:eastAsia="Pretendard" w:hAnsi="Pretendard"/>
                 <w:b w:val="false"/>
                 <w:bCs w:val="false"/>
                 <w:color w:val="1A1A1A"/>
@@ -1493,7 +1493,7 @@
             </w:pPr>
             <w:r>
               <w:rPr>
-                <w:rFonts w:ascii="Noto Sans KR" w:cs="Noto Sans KR" w:eastAsia="Noto Sans KR" w:hAnsi="Noto Sans KR"/>
+                <w:rFonts w:ascii="Pretendard" w:cs="Pretendard" w:eastAsia="Pretendard" w:hAnsi="Pretendard"/>
                 <w:b w:val="false"/>
                 <w:bCs w:val="false"/>
                 <w:color w:val="1A1A1A"/>
@@ -1518,7 +1518,7 @@
       </w:pPr>
       <w:r>
         <w:rPr>
-          <w:rFonts w:ascii="Noto Sans KR" w:cs="Noto Sans KR" w:eastAsia="Noto Sans KR" w:hAnsi="Noto Sans KR"/>
+          <w:rFonts w:ascii="Pretendard" w:cs="Pretendard" w:eastAsia="Pretendard" w:hAnsi="Pretendard"/>
           <w:b/>
           <w:bCs/>
           <w:color w:val="111E6C"/>
@@ -1534,7 +1534,7 @@
       </w:pPr>
       <w:r>
         <w:rPr>
-          <w:rFonts w:ascii="Noto Sans KR" w:cs="Noto Sans KR" w:eastAsia="Noto Sans KR" w:hAnsi="Noto Sans KR"/>
+          <w:rFonts w:ascii="Pretendard" w:cs="Pretendard" w:eastAsia="Pretendard" w:hAnsi="Pretendard"/>
           <w:color w:val="1A1A1A"/>
           <w:sz w:val="20"/>
           <w:szCs w:val="20"/>
@@ -1548,7 +1548,7 @@
       </w:pPr>
       <w:r>
         <w:rPr>
-          <w:rFonts w:ascii="Noto Sans KR" w:cs="Noto Sans KR" w:eastAsia="Noto Sans KR" w:hAnsi="Noto Sans KR"/>
+          <w:rFonts w:ascii="Pretendard" w:cs="Pretendard" w:eastAsia="Pretendard" w:hAnsi="Pretendard"/>
           <w:b/>
           <w:bCs/>
           <w:color w:val="1A1A1A"/>
@@ -1559,7 +1559,7 @@
       </w:r>
       <w:r>
         <w:rPr>
-          <w:rFonts w:ascii="Noto Sans KR" w:cs="Noto Sans KR" w:eastAsia="Noto Sans KR" w:hAnsi="Noto Sans KR"/>
+          <w:rFonts w:ascii="Pretendard" w:cs="Pretendard" w:eastAsia="Pretendard" w:hAnsi="Pretendard"/>
           <w:color w:val="1A1A1A"/>
           <w:sz w:val="20"/>
           <w:szCs w:val="20"/>
@@ -1574,7 +1574,7 @@
       </w:pPr>
       <w:r>
         <w:rPr>
-          <w:rFonts w:ascii="Noto Sans KR" w:cs="Noto Sans KR" w:eastAsia="Noto Sans KR" w:hAnsi="Noto Sans KR"/>
+          <w:rFonts w:ascii="Pretendard" w:cs="Pretendard" w:eastAsia="Pretendard" w:hAnsi="Pretendard"/>
           <w:b/>
           <w:bCs/>
           <w:color w:val="111E6C"/>
@@ -1590,7 +1590,7 @@
       </w:pPr>
       <w:r>
         <w:rPr>
-          <w:rFonts w:ascii="Noto Sans KR" w:cs="Noto Sans KR" w:eastAsia="Noto Sans KR" w:hAnsi="Noto Sans KR"/>
+          <w:rFonts w:ascii="Pretendard" w:cs="Pretendard" w:eastAsia="Pretendard" w:hAnsi="Pretendard"/>
           <w:b/>
           <w:bCs/>
           <w:color w:val="1A1A1A"/>
@@ -1601,7 +1601,7 @@
       </w:r>
       <w:r>
         <w:rPr>
-          <w:rFonts w:ascii="Noto Sans KR" w:cs="Noto Sans KR" w:eastAsia="Noto Sans KR" w:hAnsi="Noto Sans KR"/>
+          <w:rFonts w:ascii="Pretendard" w:cs="Pretendard" w:eastAsia="Pretendard" w:hAnsi="Pretendard"/>
           <w:color w:val="1A1A1A"/>
           <w:sz w:val="20"/>
           <w:szCs w:val="20"/>
@@ -1615,7 +1615,7 @@
       </w:pPr>
       <w:r>
         <w:rPr>
-          <w:rFonts w:ascii="Noto Sans KR" w:cs="Noto Sans KR" w:eastAsia="Noto Sans KR" w:hAnsi="Noto Sans KR"/>
+          <w:rFonts w:ascii="Pretendard" w:cs="Pretendard" w:eastAsia="Pretendard" w:hAnsi="Pretendard"/>
           <w:b/>
           <w:bCs/>
           <w:color w:val="1A1A1A"/>
@@ -1626,7 +1626,7 @@
       </w:r>
       <w:r>
         <w:rPr>
-          <w:rFonts w:ascii="Noto Sans KR" w:cs="Noto Sans KR" w:eastAsia="Noto Sans KR" w:hAnsi="Noto Sans KR"/>
+          <w:rFonts w:ascii="Pretendard" w:cs="Pretendard" w:eastAsia="Pretendard" w:hAnsi="Pretendard"/>
           <w:color w:val="1A1A1A"/>
           <w:sz w:val="20"/>
           <w:szCs w:val="20"/>
@@ -1646,7 +1646,7 @@
       </w:pPr>
       <w:r>
         <w:rPr>
-          <w:rFonts w:ascii="Noto Sans KR" w:cs="Noto Sans KR" w:eastAsia="Noto Sans KR" w:hAnsi="Noto Sans KR"/>
+          <w:rFonts w:ascii="Pretendard" w:cs="Pretendard" w:eastAsia="Pretendard" w:hAnsi="Pretendard"/>
           <w:b/>
           <w:bCs/>
           <w:color w:val="111E6C"/>
@@ -1662,7 +1662,7 @@
       </w:pPr>
       <w:r>
         <w:rPr>
-          <w:rFonts w:ascii="Noto Sans KR" w:cs="Noto Sans KR" w:eastAsia="Noto Sans KR" w:hAnsi="Noto Sans KR"/>
+          <w:rFonts w:ascii="Pretendard" w:cs="Pretendard" w:eastAsia="Pretendard" w:hAnsi="Pretendard"/>
           <w:color w:val="1A1A1A"/>
           <w:sz w:val="20"/>
           <w:szCs w:val="20"/>
@@ -1677,7 +1677,7 @@
       </w:pPr>
       <w:r>
         <w:rPr>
-          <w:rFonts w:ascii="Noto Sans KR" w:cs="Noto Sans KR" w:eastAsia="Noto Sans KR" w:hAnsi="Noto Sans KR"/>
+          <w:rFonts w:ascii="Pretendard" w:cs="Pretendard" w:eastAsia="Pretendard" w:hAnsi="Pretendard"/>
           <w:b/>
           <w:bCs/>
           <w:color w:val="1A1A1A"/>
@@ -1693,7 +1693,7 @@
       </w:pPr>
       <w:r>
         <w:rPr>
-          <w:rFonts w:ascii="Noto Sans KR" w:cs="Noto Sans KR" w:eastAsia="Noto Sans KR" w:hAnsi="Noto Sans KR"/>
+          <w:rFonts w:ascii="Pretendard" w:cs="Pretendard" w:eastAsia="Pretendard" w:hAnsi="Pretendard"/>
           <w:color w:val="1A1A1A"/>
           <w:sz w:val="20"/>
           <w:szCs w:val="20"/>
@@ -1702,7 +1702,7 @@
       </w:r>
       <w:r>
         <w:rPr>
-          <w:rFonts w:ascii="Noto Sans KR" w:cs="Noto Sans KR" w:eastAsia="Noto Sans KR" w:hAnsi="Noto Sans KR"/>
+          <w:rFonts w:ascii="Pretendard" w:cs="Pretendard" w:eastAsia="Pretendard" w:hAnsi="Pretendard"/>
           <w:b/>
           <w:bCs/>
           <w:color w:val="1A1A1A"/>
@@ -1713,7 +1713,7 @@
       </w:r>
       <w:r>
         <w:rPr>
-          <w:rFonts w:ascii="Noto Sans KR" w:cs="Noto Sans KR" w:eastAsia="Noto Sans KR" w:hAnsi="Noto Sans KR"/>
+          <w:rFonts w:ascii="Pretendard" w:cs="Pretendard" w:eastAsia="Pretendard" w:hAnsi="Pretendard"/>
           <w:color w:val="1A1A1A"/>
           <w:sz w:val="20"/>
           <w:szCs w:val="20"/>
@@ -1722,7 +1722,7 @@
       </w:r>
       <w:r>
         <w:rPr>
-          <w:rFonts w:ascii="Noto Sans KR" w:cs="Noto Sans KR" w:eastAsia="Noto Sans KR" w:hAnsi="Noto Sans KR"/>
+          <w:rFonts w:ascii="Pretendard" w:cs="Pretendard" w:eastAsia="Pretendard" w:hAnsi="Pretendard"/>
           <w:b/>
           <w:bCs/>
           <w:color w:val="1A1A1A"/>
@@ -1733,7 +1733,7 @@
       </w:r>
       <w:r>
         <w:rPr>
-          <w:rFonts w:ascii="Noto Sans KR" w:cs="Noto Sans KR" w:eastAsia="Noto Sans KR" w:hAnsi="Noto Sans KR"/>
+          <w:rFonts w:ascii="Pretendard" w:cs="Pretendard" w:eastAsia="Pretendard" w:hAnsi="Pretendard"/>
           <w:color w:val="1A1A1A"/>
           <w:sz w:val="20"/>
           <w:szCs w:val="20"/>
@@ -1742,7 +1742,7 @@
       </w:r>
       <w:r>
         <w:rPr>
-          <w:rFonts w:ascii="Noto Sans KR" w:cs="Noto Sans KR" w:eastAsia="Noto Sans KR" w:hAnsi="Noto Sans KR"/>
+          <w:rFonts w:ascii="Pretendard" w:cs="Pretendard" w:eastAsia="Pretendard" w:hAnsi="Pretendard"/>
           <w:b/>
           <w:bCs/>
           <w:color w:val="1A1A1A"/>
@@ -1758,7 +1758,7 @@
       </w:pPr>
       <w:r>
         <w:rPr>
-          <w:rFonts w:ascii="Noto Sans KR" w:cs="Noto Sans KR" w:eastAsia="Noto Sans KR" w:hAnsi="Noto Sans KR"/>
+          <w:rFonts w:ascii="Pretendard" w:cs="Pretendard" w:eastAsia="Pretendard" w:hAnsi="Pretendard"/>
           <w:color w:val="1A1A1A"/>
           <w:sz w:val="20"/>
           <w:szCs w:val="20"/>
@@ -1772,7 +1772,7 @@
       </w:pPr>
       <w:r>
         <w:rPr>
-          <w:rFonts w:ascii="Noto Sans KR" w:cs="Noto Sans KR" w:eastAsia="Noto Sans KR" w:hAnsi="Noto Sans KR"/>
+          <w:rFonts w:ascii="Pretendard" w:cs="Pretendard" w:eastAsia="Pretendard" w:hAnsi="Pretendard"/>
           <w:b/>
           <w:bCs/>
           <w:color w:val="1A1A1A"/>
@@ -1783,7 +1783,7 @@
       </w:r>
       <w:r>
         <w:rPr>
-          <w:rFonts w:ascii="Noto Sans KR" w:cs="Noto Sans KR" w:eastAsia="Noto Sans KR" w:hAnsi="Noto Sans KR"/>
+          <w:rFonts w:ascii="Pretendard" w:cs="Pretendard" w:eastAsia="Pretendard" w:hAnsi="Pretendard"/>
           <w:color w:val="1A1A1A"/>
           <w:sz w:val="20"/>
           <w:szCs w:val="20"/>
@@ -1798,7 +1798,7 @@
       </w:pPr>
       <w:r>
         <w:rPr>
-          <w:rFonts w:ascii="Noto Sans KR" w:cs="Noto Sans KR" w:eastAsia="Noto Sans KR" w:hAnsi="Noto Sans KR"/>
+          <w:rFonts w:ascii="Pretendard" w:cs="Pretendard" w:eastAsia="Pretendard" w:hAnsi="Pretendard"/>
           <w:b/>
           <w:bCs/>
           <w:color w:val="1A1A1A"/>
@@ -1814,7 +1814,7 @@
       </w:pPr>
       <w:r>
         <w:rPr>
-          <w:rFonts w:ascii="Noto Sans KR" w:cs="Noto Sans KR" w:eastAsia="Noto Sans KR" w:hAnsi="Noto Sans KR"/>
+          <w:rFonts w:ascii="Pretendard" w:cs="Pretendard" w:eastAsia="Pretendard" w:hAnsi="Pretendard"/>
           <w:color w:val="1A1A1A"/>
           <w:sz w:val="20"/>
           <w:szCs w:val="20"/>
@@ -1833,7 +1833,7 @@
       </w:pPr>
       <w:r>
         <w:rPr>
-          <w:rFonts w:ascii="Noto Sans KR" w:cs="Noto Sans KR" w:eastAsia="Noto Sans KR" w:hAnsi="Noto Sans KR"/>
+          <w:rFonts w:ascii="Pretendard" w:cs="Pretendard" w:eastAsia="Pretendard" w:hAnsi="Pretendard"/>
           <w:color w:val="1A1A1A"/>
           <w:sz w:val="20"/>
           <w:szCs w:val="20"/>
@@ -1852,7 +1852,7 @@
       </w:pPr>
       <w:r>
         <w:rPr>
-          <w:rFonts w:ascii="Noto Sans KR" w:cs="Noto Sans KR" w:eastAsia="Noto Sans KR" w:hAnsi="Noto Sans KR"/>
+          <w:rFonts w:ascii="Pretendard" w:cs="Pretendard" w:eastAsia="Pretendard" w:hAnsi="Pretendard"/>
           <w:color w:val="1A1A1A"/>
           <w:sz w:val="20"/>
           <w:szCs w:val="20"/>
@@ -1871,7 +1871,7 @@
       </w:pPr>
       <w:r>
         <w:rPr>
-          <w:rFonts w:ascii="Noto Sans KR" w:cs="Noto Sans KR" w:eastAsia="Noto Sans KR" w:hAnsi="Noto Sans KR"/>
+          <w:rFonts w:ascii="Pretendard" w:cs="Pretendard" w:eastAsia="Pretendard" w:hAnsi="Pretendard"/>
           <w:color w:val="1A1A1A"/>
           <w:sz w:val="20"/>
           <w:szCs w:val="20"/>
@@ -1886,7 +1886,7 @@
       </w:pPr>
       <w:r>
         <w:rPr>
-          <w:rFonts w:ascii="Noto Sans KR" w:cs="Noto Sans KR" w:eastAsia="Noto Sans KR" w:hAnsi="Noto Sans KR"/>
+          <w:rFonts w:ascii="Pretendard" w:cs="Pretendard" w:eastAsia="Pretendard" w:hAnsi="Pretendard"/>
           <w:b/>
           <w:bCs/>
           <w:color w:val="1A1A1A"/>
@@ -1902,7 +1902,7 @@
       </w:pPr>
       <w:r>
         <w:rPr>
-          <w:rFonts w:ascii="Noto Sans KR" w:cs="Noto Sans KR" w:eastAsia="Noto Sans KR" w:hAnsi="Noto Sans KR"/>
+          <w:rFonts w:ascii="Pretendard" w:cs="Pretendard" w:eastAsia="Pretendard" w:hAnsi="Pretendard"/>
           <w:color w:val="1A1A1A"/>
           <w:sz w:val="20"/>
           <w:szCs w:val="20"/>
@@ -1916,7 +1916,7 @@
       </w:pPr>
       <w:r>
         <w:rPr>
-          <w:rFonts w:ascii="Noto Sans KR" w:cs="Noto Sans KR" w:eastAsia="Noto Sans KR" w:hAnsi="Noto Sans KR"/>
+          <w:rFonts w:ascii="Pretendard" w:cs="Pretendard" w:eastAsia="Pretendard" w:hAnsi="Pretendard"/>
           <w:b/>
           <w:bCs/>
           <w:color w:val="1A1A1A"/>
@@ -1927,7 +1927,7 @@
       </w:r>
       <w:r>
         <w:rPr>
-          <w:rFonts w:ascii="Noto Sans KR" w:cs="Noto Sans KR" w:eastAsia="Noto Sans KR" w:hAnsi="Noto Sans KR"/>
+          <w:rFonts w:ascii="Pretendard" w:cs="Pretendard" w:eastAsia="Pretendard" w:hAnsi="Pretendard"/>
           <w:color w:val="1A1A1A"/>
           <w:sz w:val="20"/>
           <w:szCs w:val="20"/>
@@ -1942,7 +1942,7 @@
       </w:pPr>
       <w:r>
         <w:rPr>
-          <w:rFonts w:ascii="Noto Sans KR" w:cs="Noto Sans KR" w:eastAsia="Noto Sans KR" w:hAnsi="Noto Sans KR"/>
+          <w:rFonts w:ascii="Pretendard" w:cs="Pretendard" w:eastAsia="Pretendard" w:hAnsi="Pretendard"/>
           <w:b/>
           <w:bCs/>
           <w:color w:val="1A1A1A"/>
@@ -1996,7 +1996,7 @@
             </w:pPr>
             <w:r>
               <w:rPr>
-                <w:rFonts w:ascii="Noto Sans KR" w:cs="Noto Sans KR" w:eastAsia="Noto Sans KR" w:hAnsi="Noto Sans KR"/>
+                <w:rFonts w:ascii="Pretendard" w:cs="Pretendard" w:eastAsia="Pretendard" w:hAnsi="Pretendard"/>
                 <w:b/>
                 <w:bCs/>
                 <w:color w:val="FFFFFF"/>
@@ -2025,7 +2025,7 @@
             </w:pPr>
             <w:r>
               <w:rPr>
-                <w:rFonts w:ascii="Noto Sans KR" w:cs="Noto Sans KR" w:eastAsia="Noto Sans KR" w:hAnsi="Noto Sans KR"/>
+                <w:rFonts w:ascii="Pretendard" w:cs="Pretendard" w:eastAsia="Pretendard" w:hAnsi="Pretendard"/>
                 <w:b/>
                 <w:bCs/>
                 <w:color w:val="FFFFFF"/>
@@ -2054,7 +2054,7 @@
             </w:pPr>
             <w:r>
               <w:rPr>
-                <w:rFonts w:ascii="Noto Sans KR" w:cs="Noto Sans KR" w:eastAsia="Noto Sans KR" w:hAnsi="Noto Sans KR"/>
+                <w:rFonts w:ascii="Pretendard" w:cs="Pretendard" w:eastAsia="Pretendard" w:hAnsi="Pretendard"/>
                 <w:b/>
                 <w:bCs/>
                 <w:color w:val="FFFFFF"/>
@@ -2087,7 +2087,7 @@
             </w:pPr>
             <w:r>
               <w:rPr>
-                <w:rFonts w:ascii="Noto Sans KR" w:cs="Noto Sans KR" w:eastAsia="Noto Sans KR" w:hAnsi="Noto Sans KR"/>
+                <w:rFonts w:ascii="Pretendard" w:cs="Pretendard" w:eastAsia="Pretendard" w:hAnsi="Pretendard"/>
                 <w:b w:val="false"/>
                 <w:bCs w:val="false"/>
                 <w:color w:val="1A1A1A"/>
@@ -2115,7 +2115,7 @@
             </w:pPr>
             <w:r>
               <w:rPr>
-                <w:rFonts w:ascii="Noto Sans KR" w:cs="Noto Sans KR" w:eastAsia="Noto Sans KR" w:hAnsi="Noto Sans KR"/>
+                <w:rFonts w:ascii="Pretendard" w:cs="Pretendard" w:eastAsia="Pretendard" w:hAnsi="Pretendard"/>
                 <w:b w:val="false"/>
                 <w:bCs w:val="false"/>
                 <w:color w:val="1A1A1A"/>
@@ -2143,7 +2143,7 @@
             </w:pPr>
             <w:r>
               <w:rPr>
-                <w:rFonts w:ascii="Noto Sans KR" w:cs="Noto Sans KR" w:eastAsia="Noto Sans KR" w:hAnsi="Noto Sans KR"/>
+                <w:rFonts w:ascii="Pretendard" w:cs="Pretendard" w:eastAsia="Pretendard" w:hAnsi="Pretendard"/>
                 <w:b w:val="false"/>
                 <w:bCs w:val="false"/>
                 <w:color w:val="1A1A1A"/>
@@ -2176,7 +2176,7 @@
             </w:pPr>
             <w:r>
               <w:rPr>
-                <w:rFonts w:ascii="Noto Sans KR" w:cs="Noto Sans KR" w:eastAsia="Noto Sans KR" w:hAnsi="Noto Sans KR"/>
+                <w:rFonts w:ascii="Pretendard" w:cs="Pretendard" w:eastAsia="Pretendard" w:hAnsi="Pretendard"/>
                 <w:b w:val="false"/>
                 <w:bCs w:val="false"/>
                 <w:color w:val="1A1A1A"/>
@@ -2204,7 +2204,7 @@
             </w:pPr>
             <w:r>
               <w:rPr>
-                <w:rFonts w:ascii="Noto Sans KR" w:cs="Noto Sans KR" w:eastAsia="Noto Sans KR" w:hAnsi="Noto Sans KR"/>
+                <w:rFonts w:ascii="Pretendard" w:cs="Pretendard" w:eastAsia="Pretendard" w:hAnsi="Pretendard"/>
                 <w:b w:val="false"/>
                 <w:bCs w:val="false"/>
                 <w:color w:val="1A1A1A"/>
@@ -2232,7 +2232,7 @@
             </w:pPr>
             <w:r>
               <w:rPr>
-                <w:rFonts w:ascii="Noto Sans KR" w:cs="Noto Sans KR" w:eastAsia="Noto Sans KR" w:hAnsi="Noto Sans KR"/>
+                <w:rFonts w:ascii="Pretendard" w:cs="Pretendard" w:eastAsia="Pretendard" w:hAnsi="Pretendard"/>
                 <w:b w:val="false"/>
                 <w:bCs w:val="false"/>
                 <w:color w:val="1A1A1A"/>
@@ -2265,7 +2265,7 @@
             </w:pPr>
             <w:r>
               <w:rPr>
-                <w:rFonts w:ascii="Noto Sans KR" w:cs="Noto Sans KR" w:eastAsia="Noto Sans KR" w:hAnsi="Noto Sans KR"/>
+                <w:rFonts w:ascii="Pretendard" w:cs="Pretendard" w:eastAsia="Pretendard" w:hAnsi="Pretendard"/>
                 <w:b w:val="false"/>
                 <w:bCs w:val="false"/>
                 <w:color w:val="1A1A1A"/>
@@ -2293,7 +2293,7 @@
             </w:pPr>
             <w:r>
               <w:rPr>
-                <w:rFonts w:ascii="Noto Sans KR" w:cs="Noto Sans KR" w:eastAsia="Noto Sans KR" w:hAnsi="Noto Sans KR"/>
+                <w:rFonts w:ascii="Pretendard" w:cs="Pretendard" w:eastAsia="Pretendard" w:hAnsi="Pretendard"/>
                 <w:b w:val="false"/>
                 <w:bCs w:val="false"/>
                 <w:color w:val="1A1A1A"/>
@@ -2321,7 +2321,7 @@
             </w:pPr>
             <w:r>
               <w:rPr>
-                <w:rFonts w:ascii="Noto Sans KR" w:cs="Noto Sans KR" w:eastAsia="Noto Sans KR" w:hAnsi="Noto Sans KR"/>
+                <w:rFonts w:ascii="Pretendard" w:cs="Pretendard" w:eastAsia="Pretendard" w:hAnsi="Pretendard"/>
                 <w:b w:val="false"/>
                 <w:bCs w:val="false"/>
                 <w:color w:val="1A1A1A"/>
@@ -2354,7 +2354,7 @@
             </w:pPr>
             <w:r>
               <w:rPr>
-                <w:rFonts w:ascii="Noto Sans KR" w:cs="Noto Sans KR" w:eastAsia="Noto Sans KR" w:hAnsi="Noto Sans KR"/>
+                <w:rFonts w:ascii="Pretendard" w:cs="Pretendard" w:eastAsia="Pretendard" w:hAnsi="Pretendard"/>
                 <w:b w:val="false"/>
                 <w:bCs w:val="false"/>
                 <w:color w:val="1A1A1A"/>
@@ -2382,7 +2382,7 @@
             </w:pPr>
             <w:r>
               <w:rPr>
-                <w:rFonts w:ascii="Noto Sans KR" w:cs="Noto Sans KR" w:eastAsia="Noto Sans KR" w:hAnsi="Noto Sans KR"/>
+                <w:rFonts w:ascii="Pretendard" w:cs="Pretendard" w:eastAsia="Pretendard" w:hAnsi="Pretendard"/>
                 <w:b w:val="false"/>
                 <w:bCs w:val="false"/>
                 <w:color w:val="1A1A1A"/>
@@ -2410,7 +2410,7 @@
             </w:pPr>
             <w:r>
               <w:rPr>
-                <w:rFonts w:ascii="Noto Sans KR" w:cs="Noto Sans KR" w:eastAsia="Noto Sans KR" w:hAnsi="Noto Sans KR"/>
+                <w:rFonts w:ascii="Pretendard" w:cs="Pretendard" w:eastAsia="Pretendard" w:hAnsi="Pretendard"/>
                 <w:b w:val="false"/>
                 <w:bCs w:val="false"/>
                 <w:color w:val="1A1A1A"/>
@@ -2443,7 +2443,7 @@
             </w:pPr>
             <w:r>
               <w:rPr>
-                <w:rFonts w:ascii="Noto Sans KR" w:cs="Noto Sans KR" w:eastAsia="Noto Sans KR" w:hAnsi="Noto Sans KR"/>
+                <w:rFonts w:ascii="Pretendard" w:cs="Pretendard" w:eastAsia="Pretendard" w:hAnsi="Pretendard"/>
                 <w:b w:val="false"/>
                 <w:bCs w:val="false"/>
                 <w:color w:val="1A1A1A"/>
@@ -2471,7 +2471,7 @@
             </w:pPr>
             <w:r>
               <w:rPr>
-                <w:rFonts w:ascii="Noto Sans KR" w:cs="Noto Sans KR" w:eastAsia="Noto Sans KR" w:hAnsi="Noto Sans KR"/>
+                <w:rFonts w:ascii="Pretendard" w:cs="Pretendard" w:eastAsia="Pretendard" w:hAnsi="Pretendard"/>
                 <w:b w:val="false"/>
                 <w:bCs w:val="false"/>
                 <w:color w:val="1A1A1A"/>
@@ -2499,7 +2499,7 @@
             </w:pPr>
             <w:r>
               <w:rPr>
-                <w:rFonts w:ascii="Noto Sans KR" w:cs="Noto Sans KR" w:eastAsia="Noto Sans KR" w:hAnsi="Noto Sans KR"/>
+                <w:rFonts w:ascii="Pretendard" w:cs="Pretendard" w:eastAsia="Pretendard" w:hAnsi="Pretendard"/>
                 <w:b w:val="false"/>
                 <w:bCs w:val="false"/>
                 <w:color w:val="1A1A1A"/>
@@ -2527,7 +2527,7 @@
       </w:pPr>
       <w:r>
         <w:rPr>
-          <w:rFonts w:ascii="Noto Sans KR" w:cs="Noto Sans KR" w:eastAsia="Noto Sans KR" w:hAnsi="Noto Sans KR"/>
+          <w:rFonts w:ascii="Pretendard" w:cs="Pretendard" w:eastAsia="Pretendard" w:hAnsi="Pretendard"/>
           <w:b/>
           <w:bCs/>
           <w:color w:val="1A1A1A"/>
@@ -2541,7 +2541,7 @@
       </w:r>
       <w:r>
         <w:rPr>
-          <w:rFonts w:ascii="Noto Sans KR" w:cs="Noto Sans KR" w:eastAsia="Noto Sans KR" w:hAnsi="Noto Sans KR"/>
+          <w:rFonts w:ascii="Pretendard" w:cs="Pretendard" w:eastAsia="Pretendard" w:hAnsi="Pretendard"/>
           <w:color w:val="5C5C5C"/>
           <w:sz w:val="19"/>
           <w:szCs w:val="19"/>
@@ -2561,7 +2561,7 @@
       </w:pPr>
       <w:r>
         <w:rPr>
-          <w:rFonts w:ascii="Noto Sans KR" w:cs="Noto Sans KR" w:eastAsia="Noto Sans KR" w:hAnsi="Noto Sans KR"/>
+          <w:rFonts w:ascii="Pretendard" w:cs="Pretendard" w:eastAsia="Pretendard" w:hAnsi="Pretendard"/>
           <w:b/>
           <w:bCs/>
           <w:color w:val="111E6C"/>
@@ -2578,7 +2578,7 @@
       </w:pPr>
       <w:r>
         <w:rPr>
-          <w:rFonts w:ascii="Noto Sans KR" w:cs="Noto Sans KR" w:eastAsia="Noto Sans KR" w:hAnsi="Noto Sans KR"/>
+          <w:rFonts w:ascii="Pretendard" w:cs="Pretendard" w:eastAsia="Pretendard" w:hAnsi="Pretendard"/>
           <w:b/>
           <w:bCs/>
           <w:color w:val="1A1A1A"/>
@@ -2632,7 +2632,7 @@
             </w:pPr>
             <w:r>
               <w:rPr>
-                <w:rFonts w:ascii="Noto Sans KR" w:cs="Noto Sans KR" w:eastAsia="Noto Sans KR" w:hAnsi="Noto Sans KR"/>
+                <w:rFonts w:ascii="Pretendard" w:cs="Pretendard" w:eastAsia="Pretendard" w:hAnsi="Pretendard"/>
                 <w:b/>
                 <w:bCs/>
                 <w:color w:val="FFFFFF"/>
@@ -2661,7 +2661,7 @@
             </w:pPr>
             <w:r>
               <w:rPr>
-                <w:rFonts w:ascii="Noto Sans KR" w:cs="Noto Sans KR" w:eastAsia="Noto Sans KR" w:hAnsi="Noto Sans KR"/>
+                <w:rFonts w:ascii="Pretendard" w:cs="Pretendard" w:eastAsia="Pretendard" w:hAnsi="Pretendard"/>
                 <w:b/>
                 <w:bCs/>
                 <w:color w:val="FFFFFF"/>
@@ -2690,7 +2690,7 @@
             </w:pPr>
             <w:r>
               <w:rPr>
-                <w:rFonts w:ascii="Noto Sans KR" w:cs="Noto Sans KR" w:eastAsia="Noto Sans KR" w:hAnsi="Noto Sans KR"/>
+                <w:rFonts w:ascii="Pretendard" w:cs="Pretendard" w:eastAsia="Pretendard" w:hAnsi="Pretendard"/>
                 <w:b/>
                 <w:bCs/>
                 <w:color w:val="FFFFFF"/>
@@ -2723,7 +2723,7 @@
             </w:pPr>
             <w:r>
               <w:rPr>
-                <w:rFonts w:ascii="Noto Sans KR" w:cs="Noto Sans KR" w:eastAsia="Noto Sans KR" w:hAnsi="Noto Sans KR"/>
+                <w:rFonts w:ascii="Pretendard" w:cs="Pretendard" w:eastAsia="Pretendard" w:hAnsi="Pretendard"/>
                 <w:b w:val="false"/>
                 <w:bCs w:val="false"/>
                 <w:color w:val="1A1A1A"/>
@@ -2751,7 +2751,7 @@
             </w:pPr>
             <w:r>
               <w:rPr>
-                <w:rFonts w:ascii="Noto Sans KR" w:cs="Noto Sans KR" w:eastAsia="Noto Sans KR" w:hAnsi="Noto Sans KR"/>
+                <w:rFonts w:ascii="Pretendard" w:cs="Pretendard" w:eastAsia="Pretendard" w:hAnsi="Pretendard"/>
                 <w:b w:val="false"/>
                 <w:bCs w:val="false"/>
                 <w:color w:val="1A1A1A"/>
@@ -2779,7 +2779,7 @@
             </w:pPr>
             <w:r>
               <w:rPr>
-                <w:rFonts w:ascii="Noto Sans KR" w:cs="Noto Sans KR" w:eastAsia="Noto Sans KR" w:hAnsi="Noto Sans KR"/>
+                <w:rFonts w:ascii="Pretendard" w:cs="Pretendard" w:eastAsia="Pretendard" w:hAnsi="Pretendard"/>
                 <w:b w:val="false"/>
                 <w:bCs w:val="false"/>
                 <w:color w:val="1A1A1A"/>
@@ -2812,7 +2812,7 @@
             </w:pPr>
             <w:r>
               <w:rPr>
-                <w:rFonts w:ascii="Noto Sans KR" w:cs="Noto Sans KR" w:eastAsia="Noto Sans KR" w:hAnsi="Noto Sans KR"/>
+                <w:rFonts w:ascii="Pretendard" w:cs="Pretendard" w:eastAsia="Pretendard" w:hAnsi="Pretendard"/>
                 <w:b w:val="false"/>
                 <w:bCs w:val="false"/>
                 <w:color w:val="1A1A1A"/>
@@ -2840,7 +2840,7 @@
             </w:pPr>
             <w:r>
               <w:rPr>
-                <w:rFonts w:ascii="Noto Sans KR" w:cs="Noto Sans KR" w:eastAsia="Noto Sans KR" w:hAnsi="Noto Sans KR"/>
+                <w:rFonts w:ascii="Pretendard" w:cs="Pretendard" w:eastAsia="Pretendard" w:hAnsi="Pretendard"/>
                 <w:b w:val="false"/>
                 <w:bCs w:val="false"/>
                 <w:color w:val="1A1A1A"/>
@@ -2868,7 +2868,7 @@
             </w:pPr>
             <w:r>
               <w:rPr>
-                <w:rFonts w:ascii="Noto Sans KR" w:cs="Noto Sans KR" w:eastAsia="Noto Sans KR" w:hAnsi="Noto Sans KR"/>
+                <w:rFonts w:ascii="Pretendard" w:cs="Pretendard" w:eastAsia="Pretendard" w:hAnsi="Pretendard"/>
                 <w:b w:val="false"/>
                 <w:bCs w:val="false"/>
                 <w:color w:val="1A1A1A"/>
@@ -2901,7 +2901,7 @@
             </w:pPr>
             <w:r>
               <w:rPr>
-                <w:rFonts w:ascii="Noto Sans KR" w:cs="Noto Sans KR" w:eastAsia="Noto Sans KR" w:hAnsi="Noto Sans KR"/>
+                <w:rFonts w:ascii="Pretendard" w:cs="Pretendard" w:eastAsia="Pretendard" w:hAnsi="Pretendard"/>
                 <w:b w:val="false"/>
                 <w:bCs w:val="false"/>
                 <w:color w:val="1A1A1A"/>
@@ -2929,7 +2929,7 @@
             </w:pPr>
             <w:r>
               <w:rPr>
-                <w:rFonts w:ascii="Noto Sans KR" w:cs="Noto Sans KR" w:eastAsia="Noto Sans KR" w:hAnsi="Noto Sans KR"/>
+                <w:rFonts w:ascii="Pretendard" w:cs="Pretendard" w:eastAsia="Pretendard" w:hAnsi="Pretendard"/>
                 <w:b w:val="false"/>
                 <w:bCs w:val="false"/>
                 <w:color w:val="1A1A1A"/>
@@ -2957,7 +2957,7 @@
             </w:pPr>
             <w:r>
               <w:rPr>
-                <w:rFonts w:ascii="Noto Sans KR" w:cs="Noto Sans KR" w:eastAsia="Noto Sans KR" w:hAnsi="Noto Sans KR"/>
+                <w:rFonts w:ascii="Pretendard" w:cs="Pretendard" w:eastAsia="Pretendard" w:hAnsi="Pretendard"/>
                 <w:b w:val="false"/>
                 <w:bCs w:val="false"/>
                 <w:color w:val="1A1A1A"/>
@@ -2990,7 +2990,7 @@
             </w:pPr>
             <w:r>
               <w:rPr>
-                <w:rFonts w:ascii="Noto Sans KR" w:cs="Noto Sans KR" w:eastAsia="Noto Sans KR" w:hAnsi="Noto Sans KR"/>
+                <w:rFonts w:ascii="Pretendard" w:cs="Pretendard" w:eastAsia="Pretendard" w:hAnsi="Pretendard"/>
                 <w:b w:val="false"/>
                 <w:bCs w:val="false"/>
                 <w:color w:val="1A1A1A"/>
@@ -3018,7 +3018,7 @@
             </w:pPr>
             <w:r>
               <w:rPr>
-                <w:rFonts w:ascii="Noto Sans KR" w:cs="Noto Sans KR" w:eastAsia="Noto Sans KR" w:hAnsi="Noto Sans KR"/>
+                <w:rFonts w:ascii="Pretendard" w:cs="Pretendard" w:eastAsia="Pretendard" w:hAnsi="Pretendard"/>
                 <w:b w:val="false"/>
                 <w:bCs w:val="false"/>
                 <w:color w:val="1A1A1A"/>
@@ -3046,7 +3046,7 @@
             </w:pPr>
             <w:r>
               <w:rPr>
-                <w:rFonts w:ascii="Noto Sans KR" w:cs="Noto Sans KR" w:eastAsia="Noto Sans KR" w:hAnsi="Noto Sans KR"/>
+                <w:rFonts w:ascii="Pretendard" w:cs="Pretendard" w:eastAsia="Pretendard" w:hAnsi="Pretendard"/>
                 <w:b w:val="false"/>
                 <w:bCs w:val="false"/>
                 <w:color w:val="1A1A1A"/>
@@ -3079,7 +3079,7 @@
             </w:pPr>
             <w:r>
               <w:rPr>
-                <w:rFonts w:ascii="Noto Sans KR" w:cs="Noto Sans KR" w:eastAsia="Noto Sans KR" w:hAnsi="Noto Sans KR"/>
+                <w:rFonts w:ascii="Pretendard" w:cs="Pretendard" w:eastAsia="Pretendard" w:hAnsi="Pretendard"/>
                 <w:b w:val="false"/>
                 <w:bCs w:val="false"/>
                 <w:color w:val="1A1A1A"/>
@@ -3107,7 +3107,7 @@
             </w:pPr>
             <w:r>
               <w:rPr>
-                <w:rFonts w:ascii="Noto Sans KR" w:cs="Noto Sans KR" w:eastAsia="Noto Sans KR" w:hAnsi="Noto Sans KR"/>
+                <w:rFonts w:ascii="Pretendard" w:cs="Pretendard" w:eastAsia="Pretendard" w:hAnsi="Pretendard"/>
                 <w:b w:val="false"/>
                 <w:bCs w:val="false"/>
                 <w:color w:val="1A1A1A"/>
@@ -3135,7 +3135,7 @@
             </w:pPr>
             <w:r>
               <w:rPr>
-                <w:rFonts w:ascii="Noto Sans KR" w:cs="Noto Sans KR" w:eastAsia="Noto Sans KR" w:hAnsi="Noto Sans KR"/>
+                <w:rFonts w:ascii="Pretendard" w:cs="Pretendard" w:eastAsia="Pretendard" w:hAnsi="Pretendard"/>
                 <w:b w:val="false"/>
                 <w:bCs w:val="false"/>
                 <w:color w:val="1A1A1A"/>
@@ -3168,7 +3168,7 @@
             </w:pPr>
             <w:r>
               <w:rPr>
-                <w:rFonts w:ascii="Noto Sans KR" w:cs="Noto Sans KR" w:eastAsia="Noto Sans KR" w:hAnsi="Noto Sans KR"/>
+                <w:rFonts w:ascii="Pretendard" w:cs="Pretendard" w:eastAsia="Pretendard" w:hAnsi="Pretendard"/>
                 <w:b w:val="false"/>
                 <w:bCs w:val="false"/>
                 <w:color w:val="1A1A1A"/>
@@ -3196,7 +3196,7 @@
             </w:pPr>
             <w:r>
               <w:rPr>
-                <w:rFonts w:ascii="Noto Sans KR" w:cs="Noto Sans KR" w:eastAsia="Noto Sans KR" w:hAnsi="Noto Sans KR"/>
+                <w:rFonts w:ascii="Pretendard" w:cs="Pretendard" w:eastAsia="Pretendard" w:hAnsi="Pretendard"/>
                 <w:b w:val="false"/>
                 <w:bCs w:val="false"/>
                 <w:color w:val="1A1A1A"/>
@@ -3224,7 +3224,7 @@
             </w:pPr>
             <w:r>
               <w:rPr>
-                <w:rFonts w:ascii="Noto Sans KR" w:cs="Noto Sans KR" w:eastAsia="Noto Sans KR" w:hAnsi="Noto Sans KR"/>
+                <w:rFonts w:ascii="Pretendard" w:cs="Pretendard" w:eastAsia="Pretendard" w:hAnsi="Pretendard"/>
                 <w:b w:val="false"/>
                 <w:bCs w:val="false"/>
                 <w:color w:val="1A1A1A"/>
@@ -3257,7 +3257,7 @@
             </w:pPr>
             <w:r>
               <w:rPr>
-                <w:rFonts w:ascii="Noto Sans KR" w:cs="Noto Sans KR" w:eastAsia="Noto Sans KR" w:hAnsi="Noto Sans KR"/>
+                <w:rFonts w:ascii="Pretendard" w:cs="Pretendard" w:eastAsia="Pretendard" w:hAnsi="Pretendard"/>
                 <w:b w:val="false"/>
                 <w:bCs w:val="false"/>
                 <w:color w:val="1A1A1A"/>
@@ -3285,7 +3285,7 @@
             </w:pPr>
             <w:r>
               <w:rPr>
-                <w:rFonts w:ascii="Noto Sans KR" w:cs="Noto Sans KR" w:eastAsia="Noto Sans KR" w:hAnsi="Noto Sans KR"/>
+                <w:rFonts w:ascii="Pretendard" w:cs="Pretendard" w:eastAsia="Pretendard" w:hAnsi="Pretendard"/>
                 <w:b w:val="false"/>
                 <w:bCs w:val="false"/>
                 <w:color w:val="1A1A1A"/>
@@ -3313,7 +3313,7 @@
             </w:pPr>
             <w:r>
               <w:rPr>
-                <w:rFonts w:ascii="Noto Sans KR" w:cs="Noto Sans KR" w:eastAsia="Noto Sans KR" w:hAnsi="Noto Sans KR"/>
+                <w:rFonts w:ascii="Pretendard" w:cs="Pretendard" w:eastAsia="Pretendard" w:hAnsi="Pretendard"/>
                 <w:b w:val="false"/>
                 <w:bCs w:val="false"/>
                 <w:color w:val="1A1A1A"/>
@@ -3346,7 +3346,7 @@
             </w:pPr>
             <w:r>
               <w:rPr>
-                <w:rFonts w:ascii="Noto Sans KR" w:cs="Noto Sans KR" w:eastAsia="Noto Sans KR" w:hAnsi="Noto Sans KR"/>
+                <w:rFonts w:ascii="Pretendard" w:cs="Pretendard" w:eastAsia="Pretendard" w:hAnsi="Pretendard"/>
                 <w:b w:val="false"/>
                 <w:bCs w:val="false"/>
                 <w:color w:val="1A1A1A"/>
@@ -3374,7 +3374,7 @@
             </w:pPr>
             <w:r>
               <w:rPr>
-                <w:rFonts w:ascii="Noto Sans KR" w:cs="Noto Sans KR" w:eastAsia="Noto Sans KR" w:hAnsi="Noto Sans KR"/>
+                <w:rFonts w:ascii="Pretendard" w:cs="Pretendard" w:eastAsia="Pretendard" w:hAnsi="Pretendard"/>
                 <w:b w:val="false"/>
                 <w:bCs w:val="false"/>
                 <w:color w:val="1A1A1A"/>
@@ -3402,7 +3402,7 @@
             </w:pPr>
             <w:r>
               <w:rPr>
-                <w:rFonts w:ascii="Noto Sans KR" w:cs="Noto Sans KR" w:eastAsia="Noto Sans KR" w:hAnsi="Noto Sans KR"/>
+                <w:rFonts w:ascii="Pretendard" w:cs="Pretendard" w:eastAsia="Pretendard" w:hAnsi="Pretendard"/>
                 <w:b w:val="false"/>
                 <w:bCs w:val="false"/>
                 <w:color w:val="1A1A1A"/>
@@ -3435,7 +3435,7 @@
             </w:pPr>
             <w:r>
               <w:rPr>
-                <w:rFonts w:ascii="Noto Sans KR" w:cs="Noto Sans KR" w:eastAsia="Noto Sans KR" w:hAnsi="Noto Sans KR"/>
+                <w:rFonts w:ascii="Pretendard" w:cs="Pretendard" w:eastAsia="Pretendard" w:hAnsi="Pretendard"/>
                 <w:b w:val="false"/>
                 <w:bCs w:val="false"/>
                 <w:color w:val="1A1A1A"/>
@@ -3463,7 +3463,7 @@
             </w:pPr>
             <w:r>
               <w:rPr>
-                <w:rFonts w:ascii="Noto Sans KR" w:cs="Noto Sans KR" w:eastAsia="Noto Sans KR" w:hAnsi="Noto Sans KR"/>
+                <w:rFonts w:ascii="Pretendard" w:cs="Pretendard" w:eastAsia="Pretendard" w:hAnsi="Pretendard"/>
                 <w:b w:val="false"/>
                 <w:bCs w:val="false"/>
                 <w:color w:val="1A1A1A"/>
@@ -3491,7 +3491,7 @@
             </w:pPr>
             <w:r>
               <w:rPr>
-                <w:rFonts w:ascii="Noto Sans KR" w:cs="Noto Sans KR" w:eastAsia="Noto Sans KR" w:hAnsi="Noto Sans KR"/>
+                <w:rFonts w:ascii="Pretendard" w:cs="Pretendard" w:eastAsia="Pretendard" w:hAnsi="Pretendard"/>
                 <w:b w:val="false"/>
                 <w:bCs w:val="false"/>
                 <w:color w:val="1A1A1A"/>
@@ -3524,7 +3524,7 @@
             </w:pPr>
             <w:r>
               <w:rPr>
-                <w:rFonts w:ascii="Noto Sans KR" w:cs="Noto Sans KR" w:eastAsia="Noto Sans KR" w:hAnsi="Noto Sans KR"/>
+                <w:rFonts w:ascii="Pretendard" w:cs="Pretendard" w:eastAsia="Pretendard" w:hAnsi="Pretendard"/>
                 <w:b w:val="false"/>
                 <w:bCs w:val="false"/>
                 <w:color w:val="1A1A1A"/>
@@ -3552,7 +3552,7 @@
             </w:pPr>
             <w:r>
               <w:rPr>
-                <w:rFonts w:ascii="Noto Sans KR" w:cs="Noto Sans KR" w:eastAsia="Noto Sans KR" w:hAnsi="Noto Sans KR"/>
+                <w:rFonts w:ascii="Pretendard" w:cs="Pretendard" w:eastAsia="Pretendard" w:hAnsi="Pretendard"/>
                 <w:b w:val="false"/>
                 <w:bCs w:val="false"/>
                 <w:color w:val="1A1A1A"/>
@@ -3580,7 +3580,7 @@
             </w:pPr>
             <w:r>
               <w:rPr>
-                <w:rFonts w:ascii="Noto Sans KR" w:cs="Noto Sans KR" w:eastAsia="Noto Sans KR" w:hAnsi="Noto Sans KR"/>
+                <w:rFonts w:ascii="Pretendard" w:cs="Pretendard" w:eastAsia="Pretendard" w:hAnsi="Pretendard"/>
                 <w:b w:val="false"/>
                 <w:bCs w:val="false"/>
                 <w:color w:val="1A1A1A"/>
@@ -3605,7 +3605,7 @@
       </w:pPr>
       <w:r>
         <w:rPr>
-          <w:rFonts w:ascii="Noto Sans KR" w:cs="Noto Sans KR" w:eastAsia="Noto Sans KR" w:hAnsi="Noto Sans KR"/>
+          <w:rFonts w:ascii="Pretendard" w:cs="Pretendard" w:eastAsia="Pretendard" w:hAnsi="Pretendard"/>
           <w:b/>
           <w:bCs/>
           <w:color w:val="111E6C"/>
@@ -3621,7 +3621,7 @@
       </w:pPr>
       <w:r>
         <w:rPr>
-          <w:rFonts w:ascii="Noto Sans KR" w:cs="Noto Sans KR" w:eastAsia="Noto Sans KR" w:hAnsi="Noto Sans KR"/>
+          <w:rFonts w:ascii="Pretendard" w:cs="Pretendard" w:eastAsia="Pretendard" w:hAnsi="Pretendard"/>
           <w:color w:val="1A1A1A"/>
           <w:sz w:val="20"/>
           <w:szCs w:val="20"/>
@@ -3635,7 +3635,7 @@
       </w:pPr>
       <w:r>
         <w:rPr>
-          <w:rFonts w:ascii="Noto Sans KR" w:cs="Noto Sans KR" w:eastAsia="Noto Sans KR" w:hAnsi="Noto Sans KR"/>
+          <w:rFonts w:ascii="Pretendard" w:cs="Pretendard" w:eastAsia="Pretendard" w:hAnsi="Pretendard"/>
           <w:color w:val="1A1A1A"/>
           <w:sz w:val="20"/>
           <w:szCs w:val="20"/>
@@ -3650,7 +3650,7 @@
       </w:pPr>
       <w:r>
         <w:rPr>
-          <w:rFonts w:ascii="Noto Sans KR" w:cs="Noto Sans KR" w:eastAsia="Noto Sans KR" w:hAnsi="Noto Sans KR"/>
+          <w:rFonts w:ascii="Pretendard" w:cs="Pretendard" w:eastAsia="Pretendard" w:hAnsi="Pretendard"/>
           <w:b/>
           <w:bCs/>
           <w:color w:val="111E6C"/>
@@ -3666,7 +3666,7 @@
       </w:pPr>
       <w:r>
         <w:rPr>
-          <w:rFonts w:ascii="Noto Sans KR" w:cs="Noto Sans KR" w:eastAsia="Noto Sans KR" w:hAnsi="Noto Sans KR"/>
+          <w:rFonts w:ascii="Pretendard" w:cs="Pretendard" w:eastAsia="Pretendard" w:hAnsi="Pretendard"/>
           <w:color w:val="1A1A1A"/>
           <w:sz w:val="20"/>
           <w:szCs w:val="20"/>
@@ -3720,7 +3720,7 @@
             </w:pPr>
             <w:r>
               <w:rPr>
-                <w:rFonts w:ascii="Noto Sans KR" w:cs="Noto Sans KR" w:eastAsia="Noto Sans KR" w:hAnsi="Noto Sans KR"/>
+                <w:rFonts w:ascii="Pretendard" w:cs="Pretendard" w:eastAsia="Pretendard" w:hAnsi="Pretendard"/>
                 <w:b/>
                 <w:bCs/>
                 <w:color w:val="FFFFFF"/>
@@ -3749,7 +3749,7 @@
             </w:pPr>
             <w:r>
               <w:rPr>
-                <w:rFonts w:ascii="Noto Sans KR" w:cs="Noto Sans KR" w:eastAsia="Noto Sans KR" w:hAnsi="Noto Sans KR"/>
+                <w:rFonts w:ascii="Pretendard" w:cs="Pretendard" w:eastAsia="Pretendard" w:hAnsi="Pretendard"/>
                 <w:b/>
                 <w:bCs/>
                 <w:color w:val="FFFFFF"/>
@@ -3778,7 +3778,7 @@
             </w:pPr>
             <w:r>
               <w:rPr>
-                <w:rFonts w:ascii="Noto Sans KR" w:cs="Noto Sans KR" w:eastAsia="Noto Sans KR" w:hAnsi="Noto Sans KR"/>
+                <w:rFonts w:ascii="Pretendard" w:cs="Pretendard" w:eastAsia="Pretendard" w:hAnsi="Pretendard"/>
                 <w:b/>
                 <w:bCs/>
                 <w:color w:val="FFFFFF"/>
@@ -3807,7 +3807,7 @@
             </w:pPr>
             <w:r>
               <w:rPr>
-                <w:rFonts w:ascii="Noto Sans KR" w:cs="Noto Sans KR" w:eastAsia="Noto Sans KR" w:hAnsi="Noto Sans KR"/>
+                <w:rFonts w:ascii="Pretendard" w:cs="Pretendard" w:eastAsia="Pretendard" w:hAnsi="Pretendard"/>
                 <w:b/>
                 <w:bCs/>
                 <w:color w:val="FFFFFF"/>
@@ -3836,7 +3836,7 @@
             </w:pPr>
             <w:r>
               <w:rPr>
-                <w:rFonts w:ascii="Noto Sans KR" w:cs="Noto Sans KR" w:eastAsia="Noto Sans KR" w:hAnsi="Noto Sans KR"/>
+                <w:rFonts w:ascii="Pretendard" w:cs="Pretendard" w:eastAsia="Pretendard" w:hAnsi="Pretendard"/>
                 <w:b/>
                 <w:bCs/>
                 <w:color w:val="FFFFFF"/>
@@ -3869,7 +3869,7 @@
             </w:pPr>
             <w:r>
               <w:rPr>
-                <w:rFonts w:ascii="Noto Sans KR" w:cs="Noto Sans KR" w:eastAsia="Noto Sans KR" w:hAnsi="Noto Sans KR"/>
+                <w:rFonts w:ascii="Pretendard" w:cs="Pretendard" w:eastAsia="Pretendard" w:hAnsi="Pretendard"/>
                 <w:b w:val="false"/>
                 <w:bCs w:val="false"/>
                 <w:color w:val="1A1A1A"/>
@@ -3897,7 +3897,7 @@
             </w:pPr>
             <w:r>
               <w:rPr>
-                <w:rFonts w:ascii="Noto Sans KR" w:cs="Noto Sans KR" w:eastAsia="Noto Sans KR" w:hAnsi="Noto Sans KR"/>
+                <w:rFonts w:ascii="Pretendard" w:cs="Pretendard" w:eastAsia="Pretendard" w:hAnsi="Pretendard"/>
                 <w:b w:val="false"/>
                 <w:bCs w:val="false"/>
                 <w:color w:val="1A1A1A"/>
@@ -3925,7 +3925,7 @@
             </w:pPr>
             <w:r>
               <w:rPr>
-                <w:rFonts w:ascii="Noto Sans KR" w:cs="Noto Sans KR" w:eastAsia="Noto Sans KR" w:hAnsi="Noto Sans KR"/>
+                <w:rFonts w:ascii="Pretendard" w:cs="Pretendard" w:eastAsia="Pretendard" w:hAnsi="Pretendard"/>
                 <w:b w:val="false"/>
                 <w:bCs w:val="false"/>
                 <w:color w:val="1A1A1A"/>
@@ -3953,7 +3953,7 @@
             </w:pPr>
             <w:r>
               <w:rPr>
-                <w:rFonts w:ascii="Noto Sans KR" w:cs="Noto Sans KR" w:eastAsia="Noto Sans KR" w:hAnsi="Noto Sans KR"/>
+                <w:rFonts w:ascii="Pretendard" w:cs="Pretendard" w:eastAsia="Pretendard" w:hAnsi="Pretendard"/>
                 <w:b w:val="false"/>
                 <w:bCs w:val="false"/>
                 <w:color w:val="1A1A1A"/>
@@ -3981,7 +3981,7 @@
             </w:pPr>
             <w:r>
               <w:rPr>
-                <w:rFonts w:ascii="Noto Sans KR" w:cs="Noto Sans KR" w:eastAsia="Noto Sans KR" w:hAnsi="Noto Sans KR"/>
+                <w:rFonts w:ascii="Pretendard" w:cs="Pretendard" w:eastAsia="Pretendard" w:hAnsi="Pretendard"/>
                 <w:b w:val="false"/>
                 <w:bCs w:val="false"/>
                 <w:color w:val="1A1A1A"/>
@@ -4014,7 +4014,7 @@
             </w:pPr>
             <w:r>
               <w:rPr>
-                <w:rFonts w:ascii="Noto Sans KR" w:cs="Noto Sans KR" w:eastAsia="Noto Sans KR" w:hAnsi="Noto Sans KR"/>
+                <w:rFonts w:ascii="Pretendard" w:cs="Pretendard" w:eastAsia="Pretendard" w:hAnsi="Pretendard"/>
                 <w:b w:val="false"/>
                 <w:bCs w:val="false"/>
                 <w:color w:val="1A1A1A"/>
@@ -4042,7 +4042,7 @@
             </w:pPr>
             <w:r>
               <w:rPr>
-                <w:rFonts w:ascii="Noto Sans KR" w:cs="Noto Sans KR" w:eastAsia="Noto Sans KR" w:hAnsi="Noto Sans KR"/>
+                <w:rFonts w:ascii="Pretendard" w:cs="Pretendard" w:eastAsia="Pretendard" w:hAnsi="Pretendard"/>
                 <w:b w:val="false"/>
                 <w:bCs w:val="false"/>
                 <w:color w:val="1A1A1A"/>
@@ -4070,7 +4070,7 @@
             </w:pPr>
             <w:r>
               <w:rPr>
-                <w:rFonts w:ascii="Noto Sans KR" w:cs="Noto Sans KR" w:eastAsia="Noto Sans KR" w:hAnsi="Noto Sans KR"/>
+                <w:rFonts w:ascii="Pretendard" w:cs="Pretendard" w:eastAsia="Pretendard" w:hAnsi="Pretendard"/>
                 <w:b w:val="false"/>
                 <w:bCs w:val="false"/>
                 <w:color w:val="1A1A1A"/>
@@ -4098,7 +4098,7 @@
             </w:pPr>
             <w:r>
               <w:rPr>
-                <w:rFonts w:ascii="Noto Sans KR" w:cs="Noto Sans KR" w:eastAsia="Noto Sans KR" w:hAnsi="Noto Sans KR"/>
+                <w:rFonts w:ascii="Pretendard" w:cs="Pretendard" w:eastAsia="Pretendard" w:hAnsi="Pretendard"/>
                 <w:b w:val="false"/>
                 <w:bCs w:val="false"/>
                 <w:color w:val="1A1A1A"/>
@@ -4126,7 +4126,7 @@
             </w:pPr>
             <w:r>
               <w:rPr>
-                <w:rFonts w:ascii="Noto Sans KR" w:cs="Noto Sans KR" w:eastAsia="Noto Sans KR" w:hAnsi="Noto Sans KR"/>
+                <w:rFonts w:ascii="Pretendard" w:cs="Pretendard" w:eastAsia="Pretendard" w:hAnsi="Pretendard"/>
                 <w:b w:val="false"/>
                 <w:bCs w:val="false"/>
                 <w:color w:val="1A1A1A"/>
@@ -4159,7 +4159,7 @@
             </w:pPr>
             <w:r>
               <w:rPr>
-                <w:rFonts w:ascii="Noto Sans KR" w:cs="Noto Sans KR" w:eastAsia="Noto Sans KR" w:hAnsi="Noto Sans KR"/>
+                <w:rFonts w:ascii="Pretendard" w:cs="Pretendard" w:eastAsia="Pretendard" w:hAnsi="Pretendard"/>
                 <w:b w:val="false"/>
                 <w:bCs w:val="false"/>
                 <w:color w:val="1A1A1A"/>
@@ -4187,7 +4187,7 @@
             </w:pPr>
             <w:r>
               <w:rPr>
-                <w:rFonts w:ascii="Noto Sans KR" w:cs="Noto Sans KR" w:eastAsia="Noto Sans KR" w:hAnsi="Noto Sans KR"/>
+                <w:rFonts w:ascii="Pretendard" w:cs="Pretendard" w:eastAsia="Pretendard" w:hAnsi="Pretendard"/>
                 <w:b w:val="false"/>
                 <w:bCs w:val="false"/>
                 <w:color w:val="1A1A1A"/>
@@ -4215,7 +4215,7 @@
             </w:pPr>
             <w:r>
               <w:rPr>
-                <w:rFonts w:ascii="Noto Sans KR" w:cs="Noto Sans KR" w:eastAsia="Noto Sans KR" w:hAnsi="Noto Sans KR"/>
+                <w:rFonts w:ascii="Pretendard" w:cs="Pretendard" w:eastAsia="Pretendard" w:hAnsi="Pretendard"/>
                 <w:b w:val="false"/>
                 <w:bCs w:val="false"/>
                 <w:color w:val="1A1A1A"/>
@@ -4243,7 +4243,7 @@
             </w:pPr>
             <w:r>
               <w:rPr>
-                <w:rFonts w:ascii="Noto Sans KR" w:cs="Noto Sans KR" w:eastAsia="Noto Sans KR" w:hAnsi="Noto Sans KR"/>
+                <w:rFonts w:ascii="Pretendard" w:cs="Pretendard" w:eastAsia="Pretendard" w:hAnsi="Pretendard"/>
                 <w:b w:val="false"/>
                 <w:bCs w:val="false"/>
                 <w:color w:val="1A1A1A"/>
@@ -4271,7 +4271,7 @@
             </w:pPr>
             <w:r>
               <w:rPr>
-                <w:rFonts w:ascii="Noto Sans KR" w:cs="Noto Sans KR" w:eastAsia="Noto Sans KR" w:hAnsi="Noto Sans KR"/>
+                <w:rFonts w:ascii="Pretendard" w:cs="Pretendard" w:eastAsia="Pretendard" w:hAnsi="Pretendard"/>
                 <w:b w:val="false"/>
                 <w:bCs w:val="false"/>
                 <w:color w:val="1A1A1A"/>
@@ -4299,7 +4299,7 @@
       </w:pPr>
       <w:r>
         <w:rPr>
-          <w:rFonts w:ascii="Noto Sans KR" w:cs="Noto Sans KR" w:eastAsia="Noto Sans KR" w:hAnsi="Noto Sans KR"/>
+          <w:rFonts w:ascii="Pretendard" w:cs="Pretendard" w:eastAsia="Pretendard" w:hAnsi="Pretendard"/>
           <w:b/>
           <w:bCs/>
           <w:color w:val="1A1A1A"/>
@@ -4313,7 +4313,7 @@
       </w:r>
       <w:r>
         <w:rPr>
-          <w:rFonts w:ascii="Noto Sans KR" w:cs="Noto Sans KR" w:eastAsia="Noto Sans KR" w:hAnsi="Noto Sans KR"/>
+          <w:rFonts w:ascii="Pretendard" w:cs="Pretendard" w:eastAsia="Pretendard" w:hAnsi="Pretendard"/>
           <w:color w:val="5C5C5C"/>
           <w:sz w:val="19"/>
           <w:szCs w:val="19"/>
@@ -4328,7 +4328,7 @@
       </w:pPr>
       <w:r>
         <w:rPr>
-          <w:rFonts w:ascii="Noto Sans KR" w:cs="Noto Sans KR" w:eastAsia="Noto Sans KR" w:hAnsi="Noto Sans KR"/>
+          <w:rFonts w:ascii="Pretendard" w:cs="Pretendard" w:eastAsia="Pretendard" w:hAnsi="Pretendard"/>
           <w:b/>
           <w:bCs/>
           <w:color w:val="111E6C"/>
@@ -4344,7 +4344,7 @@
       </w:pPr>
       <w:r>
         <w:rPr>
-          <w:rFonts w:ascii="Noto Sans KR" w:cs="Noto Sans KR" w:eastAsia="Noto Sans KR" w:hAnsi="Noto Sans KR"/>
+          <w:rFonts w:ascii="Pretendard" w:cs="Pretendard" w:eastAsia="Pretendard" w:hAnsi="Pretendard"/>
           <w:color w:val="1A1A1A"/>
           <w:sz w:val="20"/>
           <w:szCs w:val="20"/>
@@ -4398,7 +4398,7 @@
             </w:pPr>
             <w:r>
               <w:rPr>
-                <w:rFonts w:ascii="Noto Sans KR" w:cs="Noto Sans KR" w:eastAsia="Noto Sans KR" w:hAnsi="Noto Sans KR"/>
+                <w:rFonts w:ascii="Pretendard" w:cs="Pretendard" w:eastAsia="Pretendard" w:hAnsi="Pretendard"/>
                 <w:b/>
                 <w:bCs/>
                 <w:color w:val="FFFFFF"/>
@@ -4427,7 +4427,7 @@
             </w:pPr>
             <w:r>
               <w:rPr>
-                <w:rFonts w:ascii="Noto Sans KR" w:cs="Noto Sans KR" w:eastAsia="Noto Sans KR" w:hAnsi="Noto Sans KR"/>
+                <w:rFonts w:ascii="Pretendard" w:cs="Pretendard" w:eastAsia="Pretendard" w:hAnsi="Pretendard"/>
                 <w:b/>
                 <w:bCs/>
                 <w:color w:val="FFFFFF"/>
@@ -4456,7 +4456,7 @@
             </w:pPr>
             <w:r>
               <w:rPr>
-                <w:rFonts w:ascii="Noto Sans KR" w:cs="Noto Sans KR" w:eastAsia="Noto Sans KR" w:hAnsi="Noto Sans KR"/>
+                <w:rFonts w:ascii="Pretendard" w:cs="Pretendard" w:eastAsia="Pretendard" w:hAnsi="Pretendard"/>
                 <w:b/>
                 <w:bCs/>
                 <w:color w:val="FFFFFF"/>
@@ -4485,7 +4485,7 @@
             </w:pPr>
             <w:r>
               <w:rPr>
-                <w:rFonts w:ascii="Noto Sans KR" w:cs="Noto Sans KR" w:eastAsia="Noto Sans KR" w:hAnsi="Noto Sans KR"/>
+                <w:rFonts w:ascii="Pretendard" w:cs="Pretendard" w:eastAsia="Pretendard" w:hAnsi="Pretendard"/>
                 <w:b/>
                 <w:bCs/>
                 <w:color w:val="FFFFFF"/>
@@ -4514,7 +4514,7 @@
             </w:pPr>
             <w:r>
               <w:rPr>
-                <w:rFonts w:ascii="Noto Sans KR" w:cs="Noto Sans KR" w:eastAsia="Noto Sans KR" w:hAnsi="Noto Sans KR"/>
+                <w:rFonts w:ascii="Pretendard" w:cs="Pretendard" w:eastAsia="Pretendard" w:hAnsi="Pretendard"/>
                 <w:b/>
                 <w:bCs/>
                 <w:color w:val="FFFFFF"/>
@@ -4547,7 +4547,7 @@
             </w:pPr>
             <w:r>
               <w:rPr>
-                <w:rFonts w:ascii="Noto Sans KR" w:cs="Noto Sans KR" w:eastAsia="Noto Sans KR" w:hAnsi="Noto Sans KR"/>
+                <w:rFonts w:ascii="Pretendard" w:cs="Pretendard" w:eastAsia="Pretendard" w:hAnsi="Pretendard"/>
                 <w:b w:val="false"/>
                 <w:bCs w:val="false"/>
                 <w:color w:val="1A1A1A"/>
@@ -4575,7 +4575,7 @@
             </w:pPr>
             <w:r>
               <w:rPr>
-                <w:rFonts w:ascii="Noto Sans KR" w:cs="Noto Sans KR" w:eastAsia="Noto Sans KR" w:hAnsi="Noto Sans KR"/>
+                <w:rFonts w:ascii="Pretendard" w:cs="Pretendard" w:eastAsia="Pretendard" w:hAnsi="Pretendard"/>
                 <w:b w:val="false"/>
                 <w:bCs w:val="false"/>
                 <w:color w:val="1A1A1A"/>
@@ -4603,7 +4603,7 @@
             </w:pPr>
             <w:r>
               <w:rPr>
-                <w:rFonts w:ascii="Noto Sans KR" w:cs="Noto Sans KR" w:eastAsia="Noto Sans KR" w:hAnsi="Noto Sans KR"/>
+                <w:rFonts w:ascii="Pretendard" w:cs="Pretendard" w:eastAsia="Pretendard" w:hAnsi="Pretendard"/>
                 <w:b w:val="false"/>
                 <w:bCs w:val="false"/>
                 <w:color w:val="1A1A1A"/>
@@ -4631,7 +4631,7 @@
             </w:pPr>
             <w:r>
               <w:rPr>
-                <w:rFonts w:ascii="Noto Sans KR" w:cs="Noto Sans KR" w:eastAsia="Noto Sans KR" w:hAnsi="Noto Sans KR"/>
+                <w:rFonts w:ascii="Pretendard" w:cs="Pretendard" w:eastAsia="Pretendard" w:hAnsi="Pretendard"/>
                 <w:b w:val="false"/>
                 <w:bCs w:val="false"/>
                 <w:color w:val="1A1A1A"/>
@@ -4659,7 +4659,7 @@
             </w:pPr>
             <w:r>
               <w:rPr>
-                <w:rFonts w:ascii="Noto Sans KR" w:cs="Noto Sans KR" w:eastAsia="Noto Sans KR" w:hAnsi="Noto Sans KR"/>
+                <w:rFonts w:ascii="Pretendard" w:cs="Pretendard" w:eastAsia="Pretendard" w:hAnsi="Pretendard"/>
                 <w:b w:val="false"/>
                 <w:bCs w:val="false"/>
                 <w:color w:val="1A1A1A"/>
@@ -4692,7 +4692,7 @@
             </w:pPr>
             <w:r>
               <w:rPr>
-                <w:rFonts w:ascii="Noto Sans KR" w:cs="Noto Sans KR" w:eastAsia="Noto Sans KR" w:hAnsi="Noto Sans KR"/>
+                <w:rFonts w:ascii="Pretendard" w:cs="Pretendard" w:eastAsia="Pretendard" w:hAnsi="Pretendard"/>
                 <w:b w:val="false"/>
                 <w:bCs w:val="false"/>
                 <w:color w:val="1A1A1A"/>
@@ -4720,7 +4720,7 @@
             </w:pPr>
             <w:r>
               <w:rPr>
-                <w:rFonts w:ascii="Noto Sans KR" w:cs="Noto Sans KR" w:eastAsia="Noto Sans KR" w:hAnsi="Noto Sans KR"/>
+                <w:rFonts w:ascii="Pretendard" w:cs="Pretendard" w:eastAsia="Pretendard" w:hAnsi="Pretendard"/>
                 <w:b w:val="false"/>
                 <w:bCs w:val="false"/>
                 <w:color w:val="1A1A1A"/>
@@ -4748,7 +4748,7 @@
             </w:pPr>
             <w:r>
               <w:rPr>
-                <w:rFonts w:ascii="Noto Sans KR" w:cs="Noto Sans KR" w:eastAsia="Noto Sans KR" w:hAnsi="Noto Sans KR"/>
+                <w:rFonts w:ascii="Pretendard" w:cs="Pretendard" w:eastAsia="Pretendard" w:hAnsi="Pretendard"/>
                 <w:b w:val="false"/>
                 <w:bCs w:val="false"/>
                 <w:color w:val="1A1A1A"/>
@@ -4776,7 +4776,7 @@
             </w:pPr>
             <w:r>
               <w:rPr>
-                <w:rFonts w:ascii="Noto Sans KR" w:cs="Noto Sans KR" w:eastAsia="Noto Sans KR" w:hAnsi="Noto Sans KR"/>
+                <w:rFonts w:ascii="Pretendard" w:cs="Pretendard" w:eastAsia="Pretendard" w:hAnsi="Pretendard"/>
                 <w:b w:val="false"/>
                 <w:bCs w:val="false"/>
                 <w:color w:val="1A1A1A"/>
@@ -4804,7 +4804,7 @@
             </w:pPr>
             <w:r>
               <w:rPr>
-                <w:rFonts w:ascii="Noto Sans KR" w:cs="Noto Sans KR" w:eastAsia="Noto Sans KR" w:hAnsi="Noto Sans KR"/>
+                <w:rFonts w:ascii="Pretendard" w:cs="Pretendard" w:eastAsia="Pretendard" w:hAnsi="Pretendard"/>
                 <w:b w:val="false"/>
                 <w:bCs w:val="false"/>
                 <w:color w:val="1A1A1A"/>
@@ -4837,7 +4837,7 @@
             </w:pPr>
             <w:r>
               <w:rPr>
-                <w:rFonts w:ascii="Noto Sans KR" w:cs="Noto Sans KR" w:eastAsia="Noto Sans KR" w:hAnsi="Noto Sans KR"/>
+                <w:rFonts w:ascii="Pretendard" w:cs="Pretendard" w:eastAsia="Pretendard" w:hAnsi="Pretendard"/>
                 <w:b w:val="false"/>
                 <w:bCs w:val="false"/>
                 <w:color w:val="1A1A1A"/>
@@ -4865,7 +4865,7 @@
             </w:pPr>
             <w:r>
               <w:rPr>
-                <w:rFonts w:ascii="Noto Sans KR" w:cs="Noto Sans KR" w:eastAsia="Noto Sans KR" w:hAnsi="Noto Sans KR"/>
+                <w:rFonts w:ascii="Pretendard" w:cs="Pretendard" w:eastAsia="Pretendard" w:hAnsi="Pretendard"/>
                 <w:b w:val="false"/>
                 <w:bCs w:val="false"/>
                 <w:color w:val="1A1A1A"/>
@@ -4893,7 +4893,7 @@
             </w:pPr>
             <w:r>
               <w:rPr>
-                <w:rFonts w:ascii="Noto Sans KR" w:cs="Noto Sans KR" w:eastAsia="Noto Sans KR" w:hAnsi="Noto Sans KR"/>
+                <w:rFonts w:ascii="Pretendard" w:cs="Pretendard" w:eastAsia="Pretendard" w:hAnsi="Pretendard"/>
                 <w:b w:val="false"/>
                 <w:bCs w:val="false"/>
                 <w:color w:val="1A1A1A"/>
@@ -4921,7 +4921,7 @@
             </w:pPr>
             <w:r>
               <w:rPr>
-                <w:rFonts w:ascii="Noto Sans KR" w:cs="Noto Sans KR" w:eastAsia="Noto Sans KR" w:hAnsi="Noto Sans KR"/>
+                <w:rFonts w:ascii="Pretendard" w:cs="Pretendard" w:eastAsia="Pretendard" w:hAnsi="Pretendard"/>
                 <w:b w:val="false"/>
                 <w:bCs w:val="false"/>
                 <w:color w:val="1A1A1A"/>
@@ -4949,7 +4949,7 @@
             </w:pPr>
             <w:r>
               <w:rPr>
-                <w:rFonts w:ascii="Noto Sans KR" w:cs="Noto Sans KR" w:eastAsia="Noto Sans KR" w:hAnsi="Noto Sans KR"/>
+                <w:rFonts w:ascii="Pretendard" w:cs="Pretendard" w:eastAsia="Pretendard" w:hAnsi="Pretendard"/>
                 <w:b w:val="false"/>
                 <w:bCs w:val="false"/>
                 <w:color w:val="1A1A1A"/>
@@ -4973,7 +4973,7 @@
       </w:pPr>
       <w:r>
         <w:rPr>
-          <w:rFonts w:ascii="Noto Sans KR" w:cs="Noto Sans KR" w:eastAsia="Noto Sans KR" w:hAnsi="Noto Sans KR"/>
+          <w:rFonts w:ascii="Pretendard" w:cs="Pretendard" w:eastAsia="Pretendard" w:hAnsi="Pretendard"/>
           <w:color w:val="1A1A1A"/>
           <w:sz w:val="20"/>
           <w:szCs w:val="20"/>
@@ -4993,7 +4993,7 @@
       </w:pPr>
       <w:r>
         <w:rPr>
-          <w:rFonts w:ascii="Noto Sans KR" w:cs="Noto Sans KR" w:eastAsia="Noto Sans KR" w:hAnsi="Noto Sans KR"/>
+          <w:rFonts w:ascii="Pretendard" w:cs="Pretendard" w:eastAsia="Pretendard" w:hAnsi="Pretendard"/>
           <w:b/>
           <w:bCs/>
           <w:color w:val="1A1A1A"/>
@@ -5009,7 +5009,7 @@
       </w:pPr>
       <w:r>
         <w:rPr>
-          <w:rFonts w:ascii="Noto Sans KR" w:cs="Noto Sans KR" w:eastAsia="Noto Sans KR" w:hAnsi="Noto Sans KR"/>
+          <w:rFonts w:ascii="Pretendard" w:cs="Pretendard" w:eastAsia="Pretendard" w:hAnsi="Pretendard"/>
           <w:color w:val="1A1A1A"/>
           <w:sz w:val="20"/>
           <w:szCs w:val="20"/>
@@ -5061,7 +5061,7 @@
             </w:pPr>
             <w:r>
               <w:rPr>
-                <w:rFonts w:ascii="Noto Sans KR" w:cs="Noto Sans KR" w:eastAsia="Noto Sans KR" w:hAnsi="Noto Sans KR"/>
+                <w:rFonts w:ascii="Pretendard" w:cs="Pretendard" w:eastAsia="Pretendard" w:hAnsi="Pretendard"/>
                 <w:b/>
                 <w:bCs/>
                 <w:color w:val="FFFFFF"/>
@@ -5090,7 +5090,7 @@
             </w:pPr>
             <w:r>
               <w:rPr>
-                <w:rFonts w:ascii="Noto Sans KR" w:cs="Noto Sans KR" w:eastAsia="Noto Sans KR" w:hAnsi="Noto Sans KR"/>
+                <w:rFonts w:ascii="Pretendard" w:cs="Pretendard" w:eastAsia="Pretendard" w:hAnsi="Pretendard"/>
                 <w:b/>
                 <w:bCs/>
                 <w:color w:val="FFFFFF"/>
@@ -5119,7 +5119,7 @@
             </w:pPr>
             <w:r>
               <w:rPr>
-                <w:rFonts w:ascii="Noto Sans KR" w:cs="Noto Sans KR" w:eastAsia="Noto Sans KR" w:hAnsi="Noto Sans KR"/>
+                <w:rFonts w:ascii="Pretendard" w:cs="Pretendard" w:eastAsia="Pretendard" w:hAnsi="Pretendard"/>
                 <w:b/>
                 <w:bCs/>
                 <w:color w:val="FFFFFF"/>
@@ -5152,7 +5152,7 @@
             </w:pPr>
             <w:r>
               <w:rPr>
-                <w:rFonts w:ascii="Noto Sans KR" w:cs="Noto Sans KR" w:eastAsia="Noto Sans KR" w:hAnsi="Noto Sans KR"/>
+                <w:rFonts w:ascii="Pretendard" w:cs="Pretendard" w:eastAsia="Pretendard" w:hAnsi="Pretendard"/>
                 <w:b w:val="false"/>
                 <w:bCs w:val="false"/>
                 <w:color w:val="1A1A1A"/>
@@ -5180,7 +5180,7 @@
             </w:pPr>
             <w:r>
               <w:rPr>
-                <w:rFonts w:ascii="Noto Sans KR" w:cs="Noto Sans KR" w:eastAsia="Noto Sans KR" w:hAnsi="Noto Sans KR"/>
+                <w:rFonts w:ascii="Pretendard" w:cs="Pretendard" w:eastAsia="Pretendard" w:hAnsi="Pretendard"/>
                 <w:b w:val="false"/>
                 <w:bCs w:val="false"/>
                 <w:color w:val="1A1A1A"/>
@@ -5208,7 +5208,7 @@
             </w:pPr>
             <w:r>
               <w:rPr>
-                <w:rFonts w:ascii="Noto Sans KR" w:cs="Noto Sans KR" w:eastAsia="Noto Sans KR" w:hAnsi="Noto Sans KR"/>
+                <w:rFonts w:ascii="Pretendard" w:cs="Pretendard" w:eastAsia="Pretendard" w:hAnsi="Pretendard"/>
                 <w:b w:val="false"/>
                 <w:bCs w:val="false"/>
                 <w:color w:val="1A1A1A"/>
@@ -5241,7 +5241,7 @@
             </w:pPr>
             <w:r>
               <w:rPr>
-                <w:rFonts w:ascii="Noto Sans KR" w:cs="Noto Sans KR" w:eastAsia="Noto Sans KR" w:hAnsi="Noto Sans KR"/>
+                <w:rFonts w:ascii="Pretendard" w:cs="Pretendard" w:eastAsia="Pretendard" w:hAnsi="Pretendard"/>
                 <w:b w:val="false"/>
                 <w:bCs w:val="false"/>
                 <w:color w:val="1A1A1A"/>
@@ -5269,7 +5269,7 @@
             </w:pPr>
             <w:r>
               <w:rPr>
-                <w:rFonts w:ascii="Noto Sans KR" w:cs="Noto Sans KR" w:eastAsia="Noto Sans KR" w:hAnsi="Noto Sans KR"/>
+                <w:rFonts w:ascii="Pretendard" w:cs="Pretendard" w:eastAsia="Pretendard" w:hAnsi="Pretendard"/>
                 <w:b w:val="false"/>
                 <w:bCs w:val="false"/>
                 <w:color w:val="1A1A1A"/>
@@ -5297,7 +5297,7 @@
             </w:pPr>
             <w:r>
               <w:rPr>
-                <w:rFonts w:ascii="Noto Sans KR" w:cs="Noto Sans KR" w:eastAsia="Noto Sans KR" w:hAnsi="Noto Sans KR"/>
+                <w:rFonts w:ascii="Pretendard" w:cs="Pretendard" w:eastAsia="Pretendard" w:hAnsi="Pretendard"/>
                 <w:b w:val="false"/>
                 <w:bCs w:val="false"/>
                 <w:color w:val="1A1A1A"/>
@@ -5330,7 +5330,7 @@
             </w:pPr>
             <w:r>
               <w:rPr>
-                <w:rFonts w:ascii="Noto Sans KR" w:cs="Noto Sans KR" w:eastAsia="Noto Sans KR" w:hAnsi="Noto Sans KR"/>
+                <w:rFonts w:ascii="Pretendard" w:cs="Pretendard" w:eastAsia="Pretendard" w:hAnsi="Pretendard"/>
                 <w:b w:val="false"/>
                 <w:bCs w:val="false"/>
                 <w:color w:val="1A1A1A"/>
@@ -5358,7 +5358,7 @@
             </w:pPr>
             <w:r>
               <w:rPr>
-                <w:rFonts w:ascii="Noto Sans KR" w:cs="Noto Sans KR" w:eastAsia="Noto Sans KR" w:hAnsi="Noto Sans KR"/>
+                <w:rFonts w:ascii="Pretendard" w:cs="Pretendard" w:eastAsia="Pretendard" w:hAnsi="Pretendard"/>
                 <w:b w:val="false"/>
                 <w:bCs w:val="false"/>
                 <w:color w:val="1A1A1A"/>
@@ -5386,7 +5386,7 @@
             </w:pPr>
             <w:r>
               <w:rPr>
-                <w:rFonts w:ascii="Noto Sans KR" w:cs="Noto Sans KR" w:eastAsia="Noto Sans KR" w:hAnsi="Noto Sans KR"/>
+                <w:rFonts w:ascii="Pretendard" w:cs="Pretendard" w:eastAsia="Pretendard" w:hAnsi="Pretendard"/>
                 <w:b w:val="false"/>
                 <w:bCs w:val="false"/>
                 <w:color w:val="1A1A1A"/>
@@ -5419,7 +5419,7 @@
             </w:pPr>
             <w:r>
               <w:rPr>
-                <w:rFonts w:ascii="Noto Sans KR" w:cs="Noto Sans KR" w:eastAsia="Noto Sans KR" w:hAnsi="Noto Sans KR"/>
+                <w:rFonts w:ascii="Pretendard" w:cs="Pretendard" w:eastAsia="Pretendard" w:hAnsi="Pretendard"/>
                 <w:b w:val="false"/>
                 <w:bCs w:val="false"/>
                 <w:color w:val="1A1A1A"/>
@@ -5447,7 +5447,7 @@
             </w:pPr>
             <w:r>
               <w:rPr>
-                <w:rFonts w:ascii="Noto Sans KR" w:cs="Noto Sans KR" w:eastAsia="Noto Sans KR" w:hAnsi="Noto Sans KR"/>
+                <w:rFonts w:ascii="Pretendard" w:cs="Pretendard" w:eastAsia="Pretendard" w:hAnsi="Pretendard"/>
                 <w:b w:val="false"/>
                 <w:bCs w:val="false"/>
                 <w:color w:val="1A1A1A"/>
@@ -5475,7 +5475,7 @@
             </w:pPr>
             <w:r>
               <w:rPr>
-                <w:rFonts w:ascii="Noto Sans KR" w:cs="Noto Sans KR" w:eastAsia="Noto Sans KR" w:hAnsi="Noto Sans KR"/>
+                <w:rFonts w:ascii="Pretendard" w:cs="Pretendard" w:eastAsia="Pretendard" w:hAnsi="Pretendard"/>
                 <w:b w:val="false"/>
                 <w:bCs w:val="false"/>
                 <w:color w:val="1A1A1A"/>
@@ -5508,7 +5508,7 @@
             </w:pPr>
             <w:r>
               <w:rPr>
-                <w:rFonts w:ascii="Noto Sans KR" w:cs="Noto Sans KR" w:eastAsia="Noto Sans KR" w:hAnsi="Noto Sans KR"/>
+                <w:rFonts w:ascii="Pretendard" w:cs="Pretendard" w:eastAsia="Pretendard" w:hAnsi="Pretendard"/>
                 <w:b w:val="false"/>
                 <w:bCs w:val="false"/>
                 <w:color w:val="1A1A1A"/>
@@ -5536,7 +5536,7 @@
             </w:pPr>
             <w:r>
               <w:rPr>
-                <w:rFonts w:ascii="Noto Sans KR" w:cs="Noto Sans KR" w:eastAsia="Noto Sans KR" w:hAnsi="Noto Sans KR"/>
+                <w:rFonts w:ascii="Pretendard" w:cs="Pretendard" w:eastAsia="Pretendard" w:hAnsi="Pretendard"/>
                 <w:b w:val="false"/>
                 <w:bCs w:val="false"/>
                 <w:color w:val="1A1A1A"/>
@@ -5564,7 +5564,7 @@
             </w:pPr>
             <w:r>
               <w:rPr>
-                <w:rFonts w:ascii="Noto Sans KR" w:cs="Noto Sans KR" w:eastAsia="Noto Sans KR" w:hAnsi="Noto Sans KR"/>
+                <w:rFonts w:ascii="Pretendard" w:cs="Pretendard" w:eastAsia="Pretendard" w:hAnsi="Pretendard"/>
                 <w:b w:val="false"/>
                 <w:bCs w:val="false"/>
                 <w:color w:val="1A1A1A"/>
@@ -5597,7 +5597,7 @@
             </w:pPr>
             <w:r>
               <w:rPr>
-                <w:rFonts w:ascii="Noto Sans KR" w:cs="Noto Sans KR" w:eastAsia="Noto Sans KR" w:hAnsi="Noto Sans KR"/>
+                <w:rFonts w:ascii="Pretendard" w:cs="Pretendard" w:eastAsia="Pretendard" w:hAnsi="Pretendard"/>
                 <w:b w:val="false"/>
                 <w:bCs w:val="false"/>
                 <w:color w:val="1A1A1A"/>
@@ -5625,7 +5625,7 @@
             </w:pPr>
             <w:r>
               <w:rPr>
-                <w:rFonts w:ascii="Noto Sans KR" w:cs="Noto Sans KR" w:eastAsia="Noto Sans KR" w:hAnsi="Noto Sans KR"/>
+                <w:rFonts w:ascii="Pretendard" w:cs="Pretendard" w:eastAsia="Pretendard" w:hAnsi="Pretendard"/>
                 <w:b w:val="false"/>
                 <w:bCs w:val="false"/>
                 <w:color w:val="1A1A1A"/>
@@ -5653,7 +5653,7 @@
             </w:pPr>
             <w:r>
               <w:rPr>
-                <w:rFonts w:ascii="Noto Sans KR" w:cs="Noto Sans KR" w:eastAsia="Noto Sans KR" w:hAnsi="Noto Sans KR"/>
+                <w:rFonts w:ascii="Pretendard" w:cs="Pretendard" w:eastAsia="Pretendard" w:hAnsi="Pretendard"/>
                 <w:b w:val="false"/>
                 <w:bCs w:val="false"/>
                 <w:color w:val="1A1A1A"/>
@@ -5686,7 +5686,7 @@
             </w:pPr>
             <w:r>
               <w:rPr>
-                <w:rFonts w:ascii="Noto Sans KR" w:cs="Noto Sans KR" w:eastAsia="Noto Sans KR" w:hAnsi="Noto Sans KR"/>
+                <w:rFonts w:ascii="Pretendard" w:cs="Pretendard" w:eastAsia="Pretendard" w:hAnsi="Pretendard"/>
                 <w:b w:val="false"/>
                 <w:bCs w:val="false"/>
                 <w:color w:val="1A1A1A"/>
@@ -5714,7 +5714,7 @@
             </w:pPr>
             <w:r>
               <w:rPr>
-                <w:rFonts w:ascii="Noto Sans KR" w:cs="Noto Sans KR" w:eastAsia="Noto Sans KR" w:hAnsi="Noto Sans KR"/>
+                <w:rFonts w:ascii="Pretendard" w:cs="Pretendard" w:eastAsia="Pretendard" w:hAnsi="Pretendard"/>
                 <w:b w:val="false"/>
                 <w:bCs w:val="false"/>
                 <w:color w:val="1A1A1A"/>
@@ -5742,7 +5742,7 @@
             </w:pPr>
             <w:r>
               <w:rPr>
-                <w:rFonts w:ascii="Noto Sans KR" w:cs="Noto Sans KR" w:eastAsia="Noto Sans KR" w:hAnsi="Noto Sans KR"/>
+                <w:rFonts w:ascii="Pretendard" w:cs="Pretendard" w:eastAsia="Pretendard" w:hAnsi="Pretendard"/>
                 <w:b w:val="false"/>
                 <w:bCs w:val="false"/>
                 <w:color w:val="1A1A1A"/>
@@ -5775,7 +5775,7 @@
             </w:pPr>
             <w:r>
               <w:rPr>
-                <w:rFonts w:ascii="Noto Sans KR" w:cs="Noto Sans KR" w:eastAsia="Noto Sans KR" w:hAnsi="Noto Sans KR"/>
+                <w:rFonts w:ascii="Pretendard" w:cs="Pretendard" w:eastAsia="Pretendard" w:hAnsi="Pretendard"/>
                 <w:b w:val="false"/>
                 <w:bCs w:val="false"/>
                 <w:color w:val="1A1A1A"/>
@@ -5803,7 +5803,7 @@
             </w:pPr>
             <w:r>
               <w:rPr>
-                <w:rFonts w:ascii="Noto Sans KR" w:cs="Noto Sans KR" w:eastAsia="Noto Sans KR" w:hAnsi="Noto Sans KR"/>
+                <w:rFonts w:ascii="Pretendard" w:cs="Pretendard" w:eastAsia="Pretendard" w:hAnsi="Pretendard"/>
                 <w:b w:val="false"/>
                 <w:bCs w:val="false"/>
                 <w:color w:val="1A1A1A"/>
@@ -5831,7 +5831,7 @@
             </w:pPr>
             <w:r>
               <w:rPr>
-                <w:rFonts w:ascii="Noto Sans KR" w:cs="Noto Sans KR" w:eastAsia="Noto Sans KR" w:hAnsi="Noto Sans KR"/>
+                <w:rFonts w:ascii="Pretendard" w:cs="Pretendard" w:eastAsia="Pretendard" w:hAnsi="Pretendard"/>
                 <w:b w:val="false"/>
                 <w:bCs w:val="false"/>
                 <w:color w:val="1A1A1A"/>
@@ -5855,7 +5855,7 @@
       </w:pPr>
       <w:r>
         <w:rPr>
-          <w:rFonts w:ascii="Noto Sans KR" w:cs="Noto Sans KR" w:eastAsia="Noto Sans KR" w:hAnsi="Noto Sans KR"/>
+          <w:rFonts w:ascii="Pretendard" w:cs="Pretendard" w:eastAsia="Pretendard" w:hAnsi="Pretendard"/>
           <w:color w:val="1A1A1A"/>
           <w:sz w:val="20"/>
           <w:szCs w:val="20"/>
@@ -5870,7 +5870,7 @@
       </w:pPr>
       <w:r>
         <w:rPr>
-          <w:rFonts w:ascii="Noto Sans KR" w:cs="Noto Sans KR" w:eastAsia="Noto Sans KR" w:hAnsi="Noto Sans KR"/>
+          <w:rFonts w:ascii="Pretendard" w:cs="Pretendard" w:eastAsia="Pretendard" w:hAnsi="Pretendard"/>
           <w:b/>
           <w:bCs/>
           <w:color w:val="111E6C"/>
@@ -5886,7 +5886,7 @@
       </w:pPr>
       <w:r>
         <w:rPr>
-          <w:rFonts w:ascii="Noto Sans KR" w:cs="Noto Sans KR" w:eastAsia="Noto Sans KR" w:hAnsi="Noto Sans KR"/>
+          <w:rFonts w:ascii="Pretendard" w:cs="Pretendard" w:eastAsia="Pretendard" w:hAnsi="Pretendard"/>
           <w:color w:val="1A1A1A"/>
           <w:sz w:val="20"/>
           <w:szCs w:val="20"/>
@@ -5900,7 +5900,7 @@
       </w:pPr>
       <w:r>
         <w:rPr>
-          <w:rFonts w:ascii="Noto Sans KR" w:cs="Noto Sans KR" w:eastAsia="Noto Sans KR" w:hAnsi="Noto Sans KR"/>
+          <w:rFonts w:ascii="Pretendard" w:cs="Pretendard" w:eastAsia="Pretendard" w:hAnsi="Pretendard"/>
           <w:color w:val="1A1A1A"/>
           <w:sz w:val="20"/>
           <w:szCs w:val="20"/>
@@ -5915,7 +5915,7 @@
       </w:pPr>
       <w:r>
         <w:rPr>
-          <w:rFonts w:ascii="Noto Sans KR" w:cs="Noto Sans KR" w:eastAsia="Noto Sans KR" w:hAnsi="Noto Sans KR"/>
+          <w:rFonts w:ascii="Pretendard" w:cs="Pretendard" w:eastAsia="Pretendard" w:hAnsi="Pretendard"/>
           <w:b/>
           <w:bCs/>
           <w:color w:val="1A1A1A"/>
@@ -5969,7 +5969,7 @@
             </w:pPr>
             <w:r>
               <w:rPr>
-                <w:rFonts w:ascii="Noto Sans KR" w:cs="Noto Sans KR" w:eastAsia="Noto Sans KR" w:hAnsi="Noto Sans KR"/>
+                <w:rFonts w:ascii="Pretendard" w:cs="Pretendard" w:eastAsia="Pretendard" w:hAnsi="Pretendard"/>
                 <w:b/>
                 <w:bCs/>
                 <w:color w:val="FFFFFF"/>
@@ -5998,7 +5998,7 @@
             </w:pPr>
             <w:r>
               <w:rPr>
-                <w:rFonts w:ascii="Noto Sans KR" w:cs="Noto Sans KR" w:eastAsia="Noto Sans KR" w:hAnsi="Noto Sans KR"/>
+                <w:rFonts w:ascii="Pretendard" w:cs="Pretendard" w:eastAsia="Pretendard" w:hAnsi="Pretendard"/>
                 <w:b/>
                 <w:bCs/>
                 <w:color w:val="FFFFFF"/>
@@ -6027,7 +6027,7 @@
             </w:pPr>
             <w:r>
               <w:rPr>
-                <w:rFonts w:ascii="Noto Sans KR" w:cs="Noto Sans KR" w:eastAsia="Noto Sans KR" w:hAnsi="Noto Sans KR"/>
+                <w:rFonts w:ascii="Pretendard" w:cs="Pretendard" w:eastAsia="Pretendard" w:hAnsi="Pretendard"/>
                 <w:b/>
                 <w:bCs/>
                 <w:color w:val="FFFFFF"/>
@@ -6060,7 +6060,7 @@
             </w:pPr>
             <w:r>
               <w:rPr>
-                <w:rFonts w:ascii="Noto Sans KR" w:cs="Noto Sans KR" w:eastAsia="Noto Sans KR" w:hAnsi="Noto Sans KR"/>
+                <w:rFonts w:ascii="Pretendard" w:cs="Pretendard" w:eastAsia="Pretendard" w:hAnsi="Pretendard"/>
                 <w:b w:val="false"/>
                 <w:bCs w:val="false"/>
                 <w:color w:val="1A1A1A"/>
@@ -6088,7 +6088,7 @@
             </w:pPr>
             <w:r>
               <w:rPr>
-                <w:rFonts w:ascii="Noto Sans KR" w:cs="Noto Sans KR" w:eastAsia="Noto Sans KR" w:hAnsi="Noto Sans KR"/>
+                <w:rFonts w:ascii="Pretendard" w:cs="Pretendard" w:eastAsia="Pretendard" w:hAnsi="Pretendard"/>
                 <w:b w:val="false"/>
                 <w:bCs w:val="false"/>
                 <w:color w:val="1A1A1A"/>
@@ -6116,7 +6116,7 @@
             </w:pPr>
             <w:r>
               <w:rPr>
-                <w:rFonts w:ascii="Noto Sans KR" w:cs="Noto Sans KR" w:eastAsia="Noto Sans KR" w:hAnsi="Noto Sans KR"/>
+                <w:rFonts w:ascii="Pretendard" w:cs="Pretendard" w:eastAsia="Pretendard" w:hAnsi="Pretendard"/>
                 <w:b w:val="false"/>
                 <w:bCs w:val="false"/>
                 <w:color w:val="1A1A1A"/>
@@ -6149,7 +6149,7 @@
             </w:pPr>
             <w:r>
               <w:rPr>
-                <w:rFonts w:ascii="Noto Sans KR" w:cs="Noto Sans KR" w:eastAsia="Noto Sans KR" w:hAnsi="Noto Sans KR"/>
+                <w:rFonts w:ascii="Pretendard" w:cs="Pretendard" w:eastAsia="Pretendard" w:hAnsi="Pretendard"/>
                 <w:b w:val="false"/>
                 <w:bCs w:val="false"/>
                 <w:color w:val="1A1A1A"/>
@@ -6177,7 +6177,7 @@
             </w:pPr>
             <w:r>
               <w:rPr>
-                <w:rFonts w:ascii="Noto Sans KR" w:cs="Noto Sans KR" w:eastAsia="Noto Sans KR" w:hAnsi="Noto Sans KR"/>
+                <w:rFonts w:ascii="Pretendard" w:cs="Pretendard" w:eastAsia="Pretendard" w:hAnsi="Pretendard"/>
                 <w:b w:val="false"/>
                 <w:bCs w:val="false"/>
                 <w:color w:val="1A1A1A"/>
@@ -6205,7 +6205,7 @@
             </w:pPr>
             <w:r>
               <w:rPr>
-                <w:rFonts w:ascii="Noto Sans KR" w:cs="Noto Sans KR" w:eastAsia="Noto Sans KR" w:hAnsi="Noto Sans KR"/>
+                <w:rFonts w:ascii="Pretendard" w:cs="Pretendard" w:eastAsia="Pretendard" w:hAnsi="Pretendard"/>
                 <w:b w:val="false"/>
                 <w:bCs w:val="false"/>
                 <w:color w:val="1A1A1A"/>
@@ -6238,7 +6238,7 @@
             </w:pPr>
             <w:r>
               <w:rPr>
-                <w:rFonts w:ascii="Noto Sans KR" w:cs="Noto Sans KR" w:eastAsia="Noto Sans KR" w:hAnsi="Noto Sans KR"/>
+                <w:rFonts w:ascii="Pretendard" w:cs="Pretendard" w:eastAsia="Pretendard" w:hAnsi="Pretendard"/>
                 <w:b w:val="false"/>
                 <w:bCs w:val="false"/>
                 <w:color w:val="1A1A1A"/>
@@ -6266,7 +6266,7 @@
             </w:pPr>
             <w:r>
               <w:rPr>
-                <w:rFonts w:ascii="Noto Sans KR" w:cs="Noto Sans KR" w:eastAsia="Noto Sans KR" w:hAnsi="Noto Sans KR"/>
+                <w:rFonts w:ascii="Pretendard" w:cs="Pretendard" w:eastAsia="Pretendard" w:hAnsi="Pretendard"/>
                 <w:b w:val="false"/>
                 <w:bCs w:val="false"/>
                 <w:color w:val="1A1A1A"/>
@@ -6294,7 +6294,7 @@
             </w:pPr>
             <w:r>
               <w:rPr>
-                <w:rFonts w:ascii="Noto Sans KR" w:cs="Noto Sans KR" w:eastAsia="Noto Sans KR" w:hAnsi="Noto Sans KR"/>
+                <w:rFonts w:ascii="Pretendard" w:cs="Pretendard" w:eastAsia="Pretendard" w:hAnsi="Pretendard"/>
                 <w:b w:val="false"/>
                 <w:bCs w:val="false"/>
                 <w:color w:val="1A1A1A"/>
@@ -6327,7 +6327,7 @@
             </w:pPr>
             <w:r>
               <w:rPr>
-                <w:rFonts w:ascii="Noto Sans KR" w:cs="Noto Sans KR" w:eastAsia="Noto Sans KR" w:hAnsi="Noto Sans KR"/>
+                <w:rFonts w:ascii="Pretendard" w:cs="Pretendard" w:eastAsia="Pretendard" w:hAnsi="Pretendard"/>
                 <w:b w:val="false"/>
                 <w:bCs w:val="false"/>
                 <w:color w:val="1A1A1A"/>
@@ -6355,7 +6355,7 @@
             </w:pPr>
             <w:r>
               <w:rPr>
-                <w:rFonts w:ascii="Noto Sans KR" w:cs="Noto Sans KR" w:eastAsia="Noto Sans KR" w:hAnsi="Noto Sans KR"/>
+                <w:rFonts w:ascii="Pretendard" w:cs="Pretendard" w:eastAsia="Pretendard" w:hAnsi="Pretendard"/>
                 <w:b w:val="false"/>
                 <w:bCs w:val="false"/>
                 <w:color w:val="1A1A1A"/>
@@ -6383,7 +6383,7 @@
             </w:pPr>
             <w:r>
               <w:rPr>
-                <w:rFonts w:ascii="Noto Sans KR" w:cs="Noto Sans KR" w:eastAsia="Noto Sans KR" w:hAnsi="Noto Sans KR"/>
+                <w:rFonts w:ascii="Pretendard" w:cs="Pretendard" w:eastAsia="Pretendard" w:hAnsi="Pretendard"/>
                 <w:b w:val="false"/>
                 <w:bCs w:val="false"/>
                 <w:color w:val="1A1A1A"/>
@@ -6416,7 +6416,7 @@
             </w:pPr>
             <w:r>
               <w:rPr>
-                <w:rFonts w:ascii="Noto Sans KR" w:cs="Noto Sans KR" w:eastAsia="Noto Sans KR" w:hAnsi="Noto Sans KR"/>
+                <w:rFonts w:ascii="Pretendard" w:cs="Pretendard" w:eastAsia="Pretendard" w:hAnsi="Pretendard"/>
                 <w:b w:val="false"/>
                 <w:bCs w:val="false"/>
                 <w:color w:val="1A1A1A"/>
@@ -6444,7 +6444,7 @@
             </w:pPr>
             <w:r>
               <w:rPr>
-                <w:rFonts w:ascii="Noto Sans KR" w:cs="Noto Sans KR" w:eastAsia="Noto Sans KR" w:hAnsi="Noto Sans KR"/>
+                <w:rFonts w:ascii="Pretendard" w:cs="Pretendard" w:eastAsia="Pretendard" w:hAnsi="Pretendard"/>
                 <w:b w:val="false"/>
                 <w:bCs w:val="false"/>
                 <w:color w:val="1A1A1A"/>
@@ -6472,7 +6472,7 @@
             </w:pPr>
             <w:r>
               <w:rPr>
-                <w:rFonts w:ascii="Noto Sans KR" w:cs="Noto Sans KR" w:eastAsia="Noto Sans KR" w:hAnsi="Noto Sans KR"/>
+                <w:rFonts w:ascii="Pretendard" w:cs="Pretendard" w:eastAsia="Pretendard" w:hAnsi="Pretendard"/>
                 <w:b w:val="false"/>
                 <w:bCs w:val="false"/>
                 <w:color w:val="1A1A1A"/>
@@ -6505,7 +6505,7 @@
             </w:pPr>
             <w:r>
               <w:rPr>
-                <w:rFonts w:ascii="Noto Sans KR" w:cs="Noto Sans KR" w:eastAsia="Noto Sans KR" w:hAnsi="Noto Sans KR"/>
+                <w:rFonts w:ascii="Pretendard" w:cs="Pretendard" w:eastAsia="Pretendard" w:hAnsi="Pretendard"/>
                 <w:b w:val="false"/>
                 <w:bCs w:val="false"/>
                 <w:color w:val="1A1A1A"/>
@@ -6533,7 +6533,7 @@
             </w:pPr>
             <w:r>
               <w:rPr>
-                <w:rFonts w:ascii="Noto Sans KR" w:cs="Noto Sans KR" w:eastAsia="Noto Sans KR" w:hAnsi="Noto Sans KR"/>
+                <w:rFonts w:ascii="Pretendard" w:cs="Pretendard" w:eastAsia="Pretendard" w:hAnsi="Pretendard"/>
                 <w:b w:val="false"/>
                 <w:bCs w:val="false"/>
                 <w:color w:val="1A1A1A"/>
@@ -6561,7 +6561,7 @@
             </w:pPr>
             <w:r>
               <w:rPr>
-                <w:rFonts w:ascii="Noto Sans KR" w:cs="Noto Sans KR" w:eastAsia="Noto Sans KR" w:hAnsi="Noto Sans KR"/>
+                <w:rFonts w:ascii="Pretendard" w:cs="Pretendard" w:eastAsia="Pretendard" w:hAnsi="Pretendard"/>
                 <w:b w:val="false"/>
                 <w:bCs w:val="false"/>
                 <w:color w:val="1A1A1A"/>
@@ -6594,7 +6594,7 @@
             </w:pPr>
             <w:r>
               <w:rPr>
-                <w:rFonts w:ascii="Noto Sans KR" w:cs="Noto Sans KR" w:eastAsia="Noto Sans KR" w:hAnsi="Noto Sans KR"/>
+                <w:rFonts w:ascii="Pretendard" w:cs="Pretendard" w:eastAsia="Pretendard" w:hAnsi="Pretendard"/>
                 <w:b w:val="false"/>
                 <w:bCs w:val="false"/>
                 <w:color w:val="1A1A1A"/>
@@ -6622,7 +6622,7 @@
             </w:pPr>
             <w:r>
               <w:rPr>
-                <w:rFonts w:ascii="Noto Sans KR" w:cs="Noto Sans KR" w:eastAsia="Noto Sans KR" w:hAnsi="Noto Sans KR"/>
+                <w:rFonts w:ascii="Pretendard" w:cs="Pretendard" w:eastAsia="Pretendard" w:hAnsi="Pretendard"/>
                 <w:b w:val="false"/>
                 <w:bCs w:val="false"/>
                 <w:color w:val="1A1A1A"/>
@@ -6650,7 +6650,7 @@
             </w:pPr>
             <w:r>
               <w:rPr>
-                <w:rFonts w:ascii="Noto Sans KR" w:cs="Noto Sans KR" w:eastAsia="Noto Sans KR" w:hAnsi="Noto Sans KR"/>
+                <w:rFonts w:ascii="Pretendard" w:cs="Pretendard" w:eastAsia="Pretendard" w:hAnsi="Pretendard"/>
                 <w:b w:val="false"/>
                 <w:bCs w:val="false"/>
                 <w:color w:val="1A1A1A"/>
@@ -6683,7 +6683,7 @@
             </w:pPr>
             <w:r>
               <w:rPr>
-                <w:rFonts w:ascii="Noto Sans KR" w:cs="Noto Sans KR" w:eastAsia="Noto Sans KR" w:hAnsi="Noto Sans KR"/>
+                <w:rFonts w:ascii="Pretendard" w:cs="Pretendard" w:eastAsia="Pretendard" w:hAnsi="Pretendard"/>
                 <w:b w:val="false"/>
                 <w:bCs w:val="false"/>
                 <w:color w:val="1A1A1A"/>
@@ -6711,7 +6711,7 @@
             </w:pPr>
             <w:r>
               <w:rPr>
-                <w:rFonts w:ascii="Noto Sans KR" w:cs="Noto Sans KR" w:eastAsia="Noto Sans KR" w:hAnsi="Noto Sans KR"/>
+                <w:rFonts w:ascii="Pretendard" w:cs="Pretendard" w:eastAsia="Pretendard" w:hAnsi="Pretendard"/>
                 <w:b w:val="false"/>
                 <w:bCs w:val="false"/>
                 <w:color w:val="1A1A1A"/>
@@ -6739,7 +6739,7 @@
             </w:pPr>
             <w:r>
               <w:rPr>
-                <w:rFonts w:ascii="Noto Sans KR" w:cs="Noto Sans KR" w:eastAsia="Noto Sans KR" w:hAnsi="Noto Sans KR"/>
+                <w:rFonts w:ascii="Pretendard" w:cs="Pretendard" w:eastAsia="Pretendard" w:hAnsi="Pretendard"/>
                 <w:b w:val="false"/>
                 <w:bCs w:val="false"/>
                 <w:color w:val="1A1A1A"/>
@@ -6767,7 +6767,7 @@
       </w:pPr>
       <w:r>
         <w:rPr>
-          <w:rFonts w:ascii="Noto Sans KR" w:cs="Noto Sans KR" w:eastAsia="Noto Sans KR" w:hAnsi="Noto Sans KR"/>
+          <w:rFonts w:ascii="Pretendard" w:cs="Pretendard" w:eastAsia="Pretendard" w:hAnsi="Pretendard"/>
           <w:b/>
           <w:bCs/>
           <w:color w:val="1A1A1A"/>
@@ -6781,7 +6781,7 @@
       </w:r>
       <w:r>
         <w:rPr>
-          <w:rFonts w:ascii="Noto Sans KR" w:cs="Noto Sans KR" w:eastAsia="Noto Sans KR" w:hAnsi="Noto Sans KR"/>
+          <w:rFonts w:ascii="Pretendard" w:cs="Pretendard" w:eastAsia="Pretendard" w:hAnsi="Pretendard"/>
           <w:color w:val="5C5C5C"/>
           <w:sz w:val="19"/>
           <w:szCs w:val="19"/>
@@ -6796,7 +6796,7 @@
       </w:pPr>
       <w:r>
         <w:rPr>
-          <w:rFonts w:ascii="Noto Sans KR" w:cs="Noto Sans KR" w:eastAsia="Noto Sans KR" w:hAnsi="Noto Sans KR"/>
+          <w:rFonts w:ascii="Pretendard" w:cs="Pretendard" w:eastAsia="Pretendard" w:hAnsi="Pretendard"/>
           <w:b/>
           <w:bCs/>
           <w:color w:val="1A1A1A"/>
@@ -6812,7 +6812,7 @@
       </w:pPr>
       <w:r>
         <w:rPr>
-          <w:rFonts w:ascii="Noto Sans KR" w:cs="Noto Sans KR" w:eastAsia="Noto Sans KR" w:hAnsi="Noto Sans KR"/>
+          <w:rFonts w:ascii="Pretendard" w:cs="Pretendard" w:eastAsia="Pretendard" w:hAnsi="Pretendard"/>
           <w:color w:val="1A1A1A"/>
           <w:sz w:val="20"/>
           <w:szCs w:val="20"/>
@@ -6865,7 +6865,7 @@
             </w:pPr>
             <w:r>
               <w:rPr>
-                <w:rFonts w:ascii="Noto Sans KR" w:cs="Noto Sans KR" w:eastAsia="Noto Sans KR" w:hAnsi="Noto Sans KR"/>
+                <w:rFonts w:ascii="Pretendard" w:cs="Pretendard" w:eastAsia="Pretendard" w:hAnsi="Pretendard"/>
                 <w:b/>
                 <w:bCs/>
                 <w:color w:val="FFFFFF"/>
@@ -6894,7 +6894,7 @@
             </w:pPr>
             <w:r>
               <w:rPr>
-                <w:rFonts w:ascii="Noto Sans KR" w:cs="Noto Sans KR" w:eastAsia="Noto Sans KR" w:hAnsi="Noto Sans KR"/>
+                <w:rFonts w:ascii="Pretendard" w:cs="Pretendard" w:eastAsia="Pretendard" w:hAnsi="Pretendard"/>
                 <w:b/>
                 <w:bCs/>
                 <w:color w:val="FFFFFF"/>
@@ -6923,7 +6923,7 @@
             </w:pPr>
             <w:r>
               <w:rPr>
-                <w:rFonts w:ascii="Noto Sans KR" w:cs="Noto Sans KR" w:eastAsia="Noto Sans KR" w:hAnsi="Noto Sans KR"/>
+                <w:rFonts w:ascii="Pretendard" w:cs="Pretendard" w:eastAsia="Pretendard" w:hAnsi="Pretendard"/>
                 <w:b/>
                 <w:bCs/>
                 <w:color w:val="FFFFFF"/>
@@ -6952,7 +6952,7 @@
             </w:pPr>
             <w:r>
               <w:rPr>
-                <w:rFonts w:ascii="Noto Sans KR" w:cs="Noto Sans KR" w:eastAsia="Noto Sans KR" w:hAnsi="Noto Sans KR"/>
+                <w:rFonts w:ascii="Pretendard" w:cs="Pretendard" w:eastAsia="Pretendard" w:hAnsi="Pretendard"/>
                 <w:b/>
                 <w:bCs/>
                 <w:color w:val="FFFFFF"/>
@@ -6985,7 +6985,7 @@
             </w:pPr>
             <w:r>
               <w:rPr>
-                <w:rFonts w:ascii="Noto Sans KR" w:cs="Noto Sans KR" w:eastAsia="Noto Sans KR" w:hAnsi="Noto Sans KR"/>
+                <w:rFonts w:ascii="Pretendard" w:cs="Pretendard" w:eastAsia="Pretendard" w:hAnsi="Pretendard"/>
                 <w:b w:val="false"/>
                 <w:bCs w:val="false"/>
                 <w:color w:val="1A1A1A"/>
@@ -7013,7 +7013,7 @@
             </w:pPr>
             <w:r>
               <w:rPr>
-                <w:rFonts w:ascii="Noto Sans KR" w:cs="Noto Sans KR" w:eastAsia="Noto Sans KR" w:hAnsi="Noto Sans KR"/>
+                <w:rFonts w:ascii="Pretendard" w:cs="Pretendard" w:eastAsia="Pretendard" w:hAnsi="Pretendard"/>
                 <w:b w:val="false"/>
                 <w:bCs w:val="false"/>
                 <w:color w:val="1A1A1A"/>
@@ -7041,7 +7041,7 @@
             </w:pPr>
             <w:r>
               <w:rPr>
-                <w:rFonts w:ascii="Noto Sans KR" w:cs="Noto Sans KR" w:eastAsia="Noto Sans KR" w:hAnsi="Noto Sans KR"/>
+                <w:rFonts w:ascii="Pretendard" w:cs="Pretendard" w:eastAsia="Pretendard" w:hAnsi="Pretendard"/>
                 <w:b w:val="false"/>
                 <w:bCs w:val="false"/>
                 <w:color w:val="1A1A1A"/>
@@ -7069,7 +7069,7 @@
             </w:pPr>
             <w:r>
               <w:rPr>
-                <w:rFonts w:ascii="Noto Sans KR" w:cs="Noto Sans KR" w:eastAsia="Noto Sans KR" w:hAnsi="Noto Sans KR"/>
+                <w:rFonts w:ascii="Pretendard" w:cs="Pretendard" w:eastAsia="Pretendard" w:hAnsi="Pretendard"/>
                 <w:b w:val="false"/>
                 <w:bCs w:val="false"/>
                 <w:color w:val="1A1A1A"/>
@@ -7102,7 +7102,7 @@
             </w:pPr>
             <w:r>
               <w:rPr>
-                <w:rFonts w:ascii="Noto Sans KR" w:cs="Noto Sans KR" w:eastAsia="Noto Sans KR" w:hAnsi="Noto Sans KR"/>
+                <w:rFonts w:ascii="Pretendard" w:cs="Pretendard" w:eastAsia="Pretendard" w:hAnsi="Pretendard"/>
                 <w:b w:val="false"/>
                 <w:bCs w:val="false"/>
                 <w:color w:val="1A1A1A"/>
@@ -7130,7 +7130,7 @@
             </w:pPr>
             <w:r>
               <w:rPr>
-                <w:rFonts w:ascii="Noto Sans KR" w:cs="Noto Sans KR" w:eastAsia="Noto Sans KR" w:hAnsi="Noto Sans KR"/>
+                <w:rFonts w:ascii="Pretendard" w:cs="Pretendard" w:eastAsia="Pretendard" w:hAnsi="Pretendard"/>
                 <w:b w:val="false"/>
                 <w:bCs w:val="false"/>
                 <w:color w:val="1A1A1A"/>
@@ -7158,7 +7158,7 @@
             </w:pPr>
             <w:r>
               <w:rPr>
-                <w:rFonts w:ascii="Noto Sans KR" w:cs="Noto Sans KR" w:eastAsia="Noto Sans KR" w:hAnsi="Noto Sans KR"/>
+                <w:rFonts w:ascii="Pretendard" w:cs="Pretendard" w:eastAsia="Pretendard" w:hAnsi="Pretendard"/>
                 <w:b w:val="false"/>
                 <w:bCs w:val="false"/>
                 <w:color w:val="1A1A1A"/>
@@ -7186,7 +7186,7 @@
             </w:pPr>
             <w:r>
               <w:rPr>
-                <w:rFonts w:ascii="Noto Sans KR" w:cs="Noto Sans KR" w:eastAsia="Noto Sans KR" w:hAnsi="Noto Sans KR"/>
+                <w:rFonts w:ascii="Pretendard" w:cs="Pretendard" w:eastAsia="Pretendard" w:hAnsi="Pretendard"/>
                 <w:b w:val="false"/>
                 <w:bCs w:val="false"/>
                 <w:color w:val="1A1A1A"/>
@@ -7219,7 +7219,7 @@
             </w:pPr>
             <w:r>
               <w:rPr>
-                <w:rFonts w:ascii="Noto Sans KR" w:cs="Noto Sans KR" w:eastAsia="Noto Sans KR" w:hAnsi="Noto Sans KR"/>
+                <w:rFonts w:ascii="Pretendard" w:cs="Pretendard" w:eastAsia="Pretendard" w:hAnsi="Pretendard"/>
                 <w:b w:val="false"/>
                 <w:bCs w:val="false"/>
                 <w:color w:val="1A1A1A"/>
@@ -7247,7 +7247,7 @@
             </w:pPr>
             <w:r>
               <w:rPr>
-                <w:rFonts w:ascii="Noto Sans KR" w:cs="Noto Sans KR" w:eastAsia="Noto Sans KR" w:hAnsi="Noto Sans KR"/>
+                <w:rFonts w:ascii="Pretendard" w:cs="Pretendard" w:eastAsia="Pretendard" w:hAnsi="Pretendard"/>
                 <w:b w:val="false"/>
                 <w:bCs w:val="false"/>
                 <w:color w:val="1A1A1A"/>
@@ -7275,7 +7275,7 @@
             </w:pPr>
             <w:r>
               <w:rPr>
-                <w:rFonts w:ascii="Noto Sans KR" w:cs="Noto Sans KR" w:eastAsia="Noto Sans KR" w:hAnsi="Noto Sans KR"/>
+                <w:rFonts w:ascii="Pretendard" w:cs="Pretendard" w:eastAsia="Pretendard" w:hAnsi="Pretendard"/>
                 <w:b w:val="false"/>
                 <w:bCs w:val="false"/>
                 <w:color w:val="1A1A1A"/>
@@ -7303,7 +7303,7 @@
             </w:pPr>
             <w:r>
               <w:rPr>
-                <w:rFonts w:ascii="Noto Sans KR" w:cs="Noto Sans KR" w:eastAsia="Noto Sans KR" w:hAnsi="Noto Sans KR"/>
+                <w:rFonts w:ascii="Pretendard" w:cs="Pretendard" w:eastAsia="Pretendard" w:hAnsi="Pretendard"/>
                 <w:b w:val="false"/>
                 <w:bCs w:val="false"/>
                 <w:color w:val="1A1A1A"/>
@@ -7336,7 +7336,7 @@
             </w:pPr>
             <w:r>
               <w:rPr>
-                <w:rFonts w:ascii="Noto Sans KR" w:cs="Noto Sans KR" w:eastAsia="Noto Sans KR" w:hAnsi="Noto Sans KR"/>
+                <w:rFonts w:ascii="Pretendard" w:cs="Pretendard" w:eastAsia="Pretendard" w:hAnsi="Pretendard"/>
                 <w:b w:val="false"/>
                 <w:bCs w:val="false"/>
                 <w:color w:val="1A1A1A"/>
@@ -7364,7 +7364,7 @@
             </w:pPr>
             <w:r>
               <w:rPr>
-                <w:rFonts w:ascii="Noto Sans KR" w:cs="Noto Sans KR" w:eastAsia="Noto Sans KR" w:hAnsi="Noto Sans KR"/>
+                <w:rFonts w:ascii="Pretendard" w:cs="Pretendard" w:eastAsia="Pretendard" w:hAnsi="Pretendard"/>
                 <w:b w:val="false"/>
                 <w:bCs w:val="false"/>
                 <w:color w:val="1A1A1A"/>
@@ -7392,7 +7392,7 @@
             </w:pPr>
             <w:r>
               <w:rPr>
-                <w:rFonts w:ascii="Noto Sans KR" w:cs="Noto Sans KR" w:eastAsia="Noto Sans KR" w:hAnsi="Noto Sans KR"/>
+                <w:rFonts w:ascii="Pretendard" w:cs="Pretendard" w:eastAsia="Pretendard" w:hAnsi="Pretendard"/>
                 <w:b w:val="false"/>
                 <w:bCs w:val="false"/>
                 <w:color w:val="1A1A1A"/>
@@ -7420,7 +7420,7 @@
             </w:pPr>
             <w:r>
               <w:rPr>
-                <w:rFonts w:ascii="Noto Sans KR" w:cs="Noto Sans KR" w:eastAsia="Noto Sans KR" w:hAnsi="Noto Sans KR"/>
+                <w:rFonts w:ascii="Pretendard" w:cs="Pretendard" w:eastAsia="Pretendard" w:hAnsi="Pretendard"/>
                 <w:b w:val="false"/>
                 <w:bCs w:val="false"/>
                 <w:color w:val="1A1A1A"/>
@@ -7453,7 +7453,7 @@
             </w:pPr>
             <w:r>
               <w:rPr>
-                <w:rFonts w:ascii="Noto Sans KR" w:cs="Noto Sans KR" w:eastAsia="Noto Sans KR" w:hAnsi="Noto Sans KR"/>
+                <w:rFonts w:ascii="Pretendard" w:cs="Pretendard" w:eastAsia="Pretendard" w:hAnsi="Pretendard"/>
                 <w:b w:val="false"/>
                 <w:bCs w:val="false"/>
                 <w:color w:val="1A1A1A"/>
@@ -7481,7 +7481,7 @@
             </w:pPr>
             <w:r>
               <w:rPr>
-                <w:rFonts w:ascii="Noto Sans KR" w:cs="Noto Sans KR" w:eastAsia="Noto Sans KR" w:hAnsi="Noto Sans KR"/>
+                <w:rFonts w:ascii="Pretendard" w:cs="Pretendard" w:eastAsia="Pretendard" w:hAnsi="Pretendard"/>
                 <w:b w:val="false"/>
                 <w:bCs w:val="false"/>
                 <w:color w:val="1A1A1A"/>
@@ -7509,7 +7509,7 @@
             </w:pPr>
             <w:r>
               <w:rPr>
-                <w:rFonts w:ascii="Noto Sans KR" w:cs="Noto Sans KR" w:eastAsia="Noto Sans KR" w:hAnsi="Noto Sans KR"/>
+                <w:rFonts w:ascii="Pretendard" w:cs="Pretendard" w:eastAsia="Pretendard" w:hAnsi="Pretendard"/>
                 <w:b w:val="false"/>
                 <w:bCs w:val="false"/>
                 <w:color w:val="1A1A1A"/>
@@ -7537,7 +7537,7 @@
             </w:pPr>
             <w:r>
               <w:rPr>
-                <w:rFonts w:ascii="Noto Sans KR" w:cs="Noto Sans KR" w:eastAsia="Noto Sans KR" w:hAnsi="Noto Sans KR"/>
+                <w:rFonts w:ascii="Pretendard" w:cs="Pretendard" w:eastAsia="Pretendard" w:hAnsi="Pretendard"/>
                 <w:b w:val="false"/>
                 <w:bCs w:val="false"/>
                 <w:color w:val="1A1A1A"/>
@@ -7561,7 +7561,7 @@
       </w:pPr>
       <w:r>
         <w:rPr>
-          <w:rFonts w:ascii="Noto Sans KR" w:cs="Noto Sans KR" w:eastAsia="Noto Sans KR" w:hAnsi="Noto Sans KR"/>
+          <w:rFonts w:ascii="Pretendard" w:cs="Pretendard" w:eastAsia="Pretendard" w:hAnsi="Pretendard"/>
           <w:color w:val="1A1A1A"/>
           <w:sz w:val="20"/>
           <w:szCs w:val="20"/>
@@ -7575,7 +7575,7 @@
       </w:pPr>
       <w:r>
         <w:rPr>
-          <w:rFonts w:ascii="Noto Sans KR" w:cs="Noto Sans KR" w:eastAsia="Noto Sans KR" w:hAnsi="Noto Sans KR"/>
+          <w:rFonts w:ascii="Pretendard" w:cs="Pretendard" w:eastAsia="Pretendard" w:hAnsi="Pretendard"/>
           <w:color w:val="1A1A1A"/>
           <w:sz w:val="20"/>
           <w:szCs w:val="20"/>
@@ -7590,7 +7590,7 @@
       </w:pPr>
       <w:r>
         <w:rPr>
-          <w:rFonts w:ascii="Noto Sans KR" w:cs="Noto Sans KR" w:eastAsia="Noto Sans KR" w:hAnsi="Noto Sans KR"/>
+          <w:rFonts w:ascii="Pretendard" w:cs="Pretendard" w:eastAsia="Pretendard" w:hAnsi="Pretendard"/>
           <w:b/>
           <w:bCs/>
           <w:color w:val="1A1A1A"/>
@@ -7606,7 +7606,7 @@
       </w:pPr>
       <w:r>
         <w:rPr>
-          <w:rFonts w:ascii="Noto Sans KR" w:cs="Noto Sans KR" w:eastAsia="Noto Sans KR" w:hAnsi="Noto Sans KR"/>
+          <w:rFonts w:ascii="Pretendard" w:cs="Pretendard" w:eastAsia="Pretendard" w:hAnsi="Pretendard"/>
           <w:color w:val="1A1A1A"/>
           <w:sz w:val="20"/>
           <w:szCs w:val="20"/>
@@ -7658,7 +7658,7 @@
             </w:pPr>
             <w:r>
               <w:rPr>
-                <w:rFonts w:ascii="Noto Sans KR" w:cs="Noto Sans KR" w:eastAsia="Noto Sans KR" w:hAnsi="Noto Sans KR"/>
+                <w:rFonts w:ascii="Pretendard" w:cs="Pretendard" w:eastAsia="Pretendard" w:hAnsi="Pretendard"/>
                 <w:b/>
                 <w:bCs/>
                 <w:color w:val="FFFFFF"/>
@@ -7687,7 +7687,7 @@
             </w:pPr>
             <w:r>
               <w:rPr>
-                <w:rFonts w:ascii="Noto Sans KR" w:cs="Noto Sans KR" w:eastAsia="Noto Sans KR" w:hAnsi="Noto Sans KR"/>
+                <w:rFonts w:ascii="Pretendard" w:cs="Pretendard" w:eastAsia="Pretendard" w:hAnsi="Pretendard"/>
                 <w:b/>
                 <w:bCs/>
                 <w:color w:val="FFFFFF"/>
@@ -7716,7 +7716,7 @@
             </w:pPr>
             <w:r>
               <w:rPr>
-                <w:rFonts w:ascii="Noto Sans KR" w:cs="Noto Sans KR" w:eastAsia="Noto Sans KR" w:hAnsi="Noto Sans KR"/>
+                <w:rFonts w:ascii="Pretendard" w:cs="Pretendard" w:eastAsia="Pretendard" w:hAnsi="Pretendard"/>
                 <w:b/>
                 <w:bCs/>
                 <w:color w:val="FFFFFF"/>
@@ -7749,7 +7749,7 @@
             </w:pPr>
             <w:r>
               <w:rPr>
-                <w:rFonts w:ascii="Noto Sans KR" w:cs="Noto Sans KR" w:eastAsia="Noto Sans KR" w:hAnsi="Noto Sans KR"/>
+                <w:rFonts w:ascii="Pretendard" w:cs="Pretendard" w:eastAsia="Pretendard" w:hAnsi="Pretendard"/>
                 <w:b w:val="false"/>
                 <w:bCs w:val="false"/>
                 <w:color w:val="1A1A1A"/>
@@ -7777,7 +7777,7 @@
             </w:pPr>
             <w:r>
               <w:rPr>
-                <w:rFonts w:ascii="Noto Sans KR" w:cs="Noto Sans KR" w:eastAsia="Noto Sans KR" w:hAnsi="Noto Sans KR"/>
+                <w:rFonts w:ascii="Pretendard" w:cs="Pretendard" w:eastAsia="Pretendard" w:hAnsi="Pretendard"/>
                 <w:b w:val="false"/>
                 <w:bCs w:val="false"/>
                 <w:color w:val="1A1A1A"/>
@@ -7805,7 +7805,7 @@
             </w:pPr>
             <w:r>
               <w:rPr>
-                <w:rFonts w:ascii="Noto Sans KR" w:cs="Noto Sans KR" w:eastAsia="Noto Sans KR" w:hAnsi="Noto Sans KR"/>
+                <w:rFonts w:ascii="Pretendard" w:cs="Pretendard" w:eastAsia="Pretendard" w:hAnsi="Pretendard"/>
                 <w:b w:val="false"/>
                 <w:bCs w:val="false"/>
                 <w:color w:val="1A1A1A"/>
@@ -7838,7 +7838,7 @@
             </w:pPr>
             <w:r>
               <w:rPr>
-                <w:rFonts w:ascii="Noto Sans KR" w:cs="Noto Sans KR" w:eastAsia="Noto Sans KR" w:hAnsi="Noto Sans KR"/>
+                <w:rFonts w:ascii="Pretendard" w:cs="Pretendard" w:eastAsia="Pretendard" w:hAnsi="Pretendard"/>
                 <w:b w:val="false"/>
                 <w:bCs w:val="false"/>
                 <w:color w:val="1A1A1A"/>
@@ -7866,7 +7866,7 @@
             </w:pPr>
             <w:r>
               <w:rPr>
-                <w:rFonts w:ascii="Noto Sans KR" w:cs="Noto Sans KR" w:eastAsia="Noto Sans KR" w:hAnsi="Noto Sans KR"/>
+                <w:rFonts w:ascii="Pretendard" w:cs="Pretendard" w:eastAsia="Pretendard" w:hAnsi="Pretendard"/>
                 <w:b w:val="false"/>
                 <w:bCs w:val="false"/>
                 <w:color w:val="1A1A1A"/>
@@ -7894,7 +7894,7 @@
             </w:pPr>
             <w:r>
               <w:rPr>
-                <w:rFonts w:ascii="Noto Sans KR" w:cs="Noto Sans KR" w:eastAsia="Noto Sans KR" w:hAnsi="Noto Sans KR"/>
+                <w:rFonts w:ascii="Pretendard" w:cs="Pretendard" w:eastAsia="Pretendard" w:hAnsi="Pretendard"/>
                 <w:b w:val="false"/>
                 <w:bCs w:val="false"/>
                 <w:color w:val="1A1A1A"/>
@@ -7927,7 +7927,7 @@
             </w:pPr>
             <w:r>
               <w:rPr>
-                <w:rFonts w:ascii="Noto Sans KR" w:cs="Noto Sans KR" w:eastAsia="Noto Sans KR" w:hAnsi="Noto Sans KR"/>
+                <w:rFonts w:ascii="Pretendard" w:cs="Pretendard" w:eastAsia="Pretendard" w:hAnsi="Pretendard"/>
                 <w:b w:val="false"/>
                 <w:bCs w:val="false"/>
                 <w:color w:val="1A1A1A"/>
@@ -7955,7 +7955,7 @@
             </w:pPr>
             <w:r>
               <w:rPr>
-                <w:rFonts w:ascii="Noto Sans KR" w:cs="Noto Sans KR" w:eastAsia="Noto Sans KR" w:hAnsi="Noto Sans KR"/>
+                <w:rFonts w:ascii="Pretendard" w:cs="Pretendard" w:eastAsia="Pretendard" w:hAnsi="Pretendard"/>
                 <w:b w:val="false"/>
                 <w:bCs w:val="false"/>
                 <w:color w:val="1A1A1A"/>
@@ -7983,7 +7983,7 @@
             </w:pPr>
             <w:r>
               <w:rPr>
-                <w:rFonts w:ascii="Noto Sans KR" w:cs="Noto Sans KR" w:eastAsia="Noto Sans KR" w:hAnsi="Noto Sans KR"/>
+                <w:rFonts w:ascii="Pretendard" w:cs="Pretendard" w:eastAsia="Pretendard" w:hAnsi="Pretendard"/>
                 <w:b w:val="false"/>
                 <w:bCs w:val="false"/>
                 <w:color w:val="1A1A1A"/>
@@ -8016,7 +8016,7 @@
             </w:pPr>
             <w:r>
               <w:rPr>
-                <w:rFonts w:ascii="Noto Sans KR" w:cs="Noto Sans KR" w:eastAsia="Noto Sans KR" w:hAnsi="Noto Sans KR"/>
+                <w:rFonts w:ascii="Pretendard" w:cs="Pretendard" w:eastAsia="Pretendard" w:hAnsi="Pretendard"/>
                 <w:b w:val="false"/>
                 <w:bCs w:val="false"/>
                 <w:color w:val="1A1A1A"/>
@@ -8044,7 +8044,7 @@
             </w:pPr>
             <w:r>
               <w:rPr>
-                <w:rFonts w:ascii="Noto Sans KR" w:cs="Noto Sans KR" w:eastAsia="Noto Sans KR" w:hAnsi="Noto Sans KR"/>
+                <w:rFonts w:ascii="Pretendard" w:cs="Pretendard" w:eastAsia="Pretendard" w:hAnsi="Pretendard"/>
                 <w:b w:val="false"/>
                 <w:bCs w:val="false"/>
                 <w:color w:val="1A1A1A"/>
@@ -8072,7 +8072,7 @@
             </w:pPr>
             <w:r>
               <w:rPr>
-                <w:rFonts w:ascii="Noto Sans KR" w:cs="Noto Sans KR" w:eastAsia="Noto Sans KR" w:hAnsi="Noto Sans KR"/>
+                <w:rFonts w:ascii="Pretendard" w:cs="Pretendard" w:eastAsia="Pretendard" w:hAnsi="Pretendard"/>
                 <w:b w:val="false"/>
                 <w:bCs w:val="false"/>
                 <w:color w:val="1A1A1A"/>
@@ -8105,7 +8105,7 @@
             </w:pPr>
             <w:r>
               <w:rPr>
-                <w:rFonts w:ascii="Noto Sans KR" w:cs="Noto Sans KR" w:eastAsia="Noto Sans KR" w:hAnsi="Noto Sans KR"/>
+                <w:rFonts w:ascii="Pretendard" w:cs="Pretendard" w:eastAsia="Pretendard" w:hAnsi="Pretendard"/>
                 <w:b w:val="false"/>
                 <w:bCs w:val="false"/>
                 <w:color w:val="1A1A1A"/>
@@ -8133,7 +8133,7 @@
             </w:pPr>
             <w:r>
               <w:rPr>
-                <w:rFonts w:ascii="Noto Sans KR" w:cs="Noto Sans KR" w:eastAsia="Noto Sans KR" w:hAnsi="Noto Sans KR"/>
+                <w:rFonts w:ascii="Pretendard" w:cs="Pretendard" w:eastAsia="Pretendard" w:hAnsi="Pretendard"/>
                 <w:b w:val="false"/>
                 <w:bCs w:val="false"/>
                 <w:color w:val="1A1A1A"/>
@@ -8161,7 +8161,7 @@
             </w:pPr>
             <w:r>
               <w:rPr>
-                <w:rFonts w:ascii="Noto Sans KR" w:cs="Noto Sans KR" w:eastAsia="Noto Sans KR" w:hAnsi="Noto Sans KR"/>
+                <w:rFonts w:ascii="Pretendard" w:cs="Pretendard" w:eastAsia="Pretendard" w:hAnsi="Pretendard"/>
                 <w:b w:val="false"/>
                 <w:bCs w:val="false"/>
                 <w:color w:val="1A1A1A"/>
@@ -8194,7 +8194,7 @@
             </w:pPr>
             <w:r>
               <w:rPr>
-                <w:rFonts w:ascii="Noto Sans KR" w:cs="Noto Sans KR" w:eastAsia="Noto Sans KR" w:hAnsi="Noto Sans KR"/>
+                <w:rFonts w:ascii="Pretendard" w:cs="Pretendard" w:eastAsia="Pretendard" w:hAnsi="Pretendard"/>
                 <w:b w:val="false"/>
                 <w:bCs w:val="false"/>
                 <w:color w:val="1A1A1A"/>
@@ -8222,7 +8222,7 @@
             </w:pPr>
             <w:r>
               <w:rPr>
-                <w:rFonts w:ascii="Noto Sans KR" w:cs="Noto Sans KR" w:eastAsia="Noto Sans KR" w:hAnsi="Noto Sans KR"/>
+                <w:rFonts w:ascii="Pretendard" w:cs="Pretendard" w:eastAsia="Pretendard" w:hAnsi="Pretendard"/>
                 <w:b w:val="false"/>
                 <w:bCs w:val="false"/>
                 <w:color w:val="1A1A1A"/>
@@ -8250,7 +8250,7 @@
             </w:pPr>
             <w:r>
               <w:rPr>
-                <w:rFonts w:ascii="Noto Sans KR" w:cs="Noto Sans KR" w:eastAsia="Noto Sans KR" w:hAnsi="Noto Sans KR"/>
+                <w:rFonts w:ascii="Pretendard" w:cs="Pretendard" w:eastAsia="Pretendard" w:hAnsi="Pretendard"/>
                 <w:b w:val="false"/>
                 <w:bCs w:val="false"/>
                 <w:color w:val="1A1A1A"/>
@@ -8283,7 +8283,7 @@
             </w:pPr>
             <w:r>
               <w:rPr>
-                <w:rFonts w:ascii="Noto Sans KR" w:cs="Noto Sans KR" w:eastAsia="Noto Sans KR" w:hAnsi="Noto Sans KR"/>
+                <w:rFonts w:ascii="Pretendard" w:cs="Pretendard" w:eastAsia="Pretendard" w:hAnsi="Pretendard"/>
                 <w:b w:val="false"/>
                 <w:bCs w:val="false"/>
                 <w:color w:val="1A1A1A"/>
@@ -8311,7 +8311,7 @@
             </w:pPr>
             <w:r>
               <w:rPr>
-                <w:rFonts w:ascii="Noto Sans KR" w:cs="Noto Sans KR" w:eastAsia="Noto Sans KR" w:hAnsi="Noto Sans KR"/>
+                <w:rFonts w:ascii="Pretendard" w:cs="Pretendard" w:eastAsia="Pretendard" w:hAnsi="Pretendard"/>
                 <w:b w:val="false"/>
                 <w:bCs w:val="false"/>
                 <w:color w:val="1A1A1A"/>
@@ -8339,7 +8339,7 @@
             </w:pPr>
             <w:r>
               <w:rPr>
-                <w:rFonts w:ascii="Noto Sans KR" w:cs="Noto Sans KR" w:eastAsia="Noto Sans KR" w:hAnsi="Noto Sans KR"/>
+                <w:rFonts w:ascii="Pretendard" w:cs="Pretendard" w:eastAsia="Pretendard" w:hAnsi="Pretendard"/>
                 <w:b w:val="false"/>
                 <w:bCs w:val="false"/>
                 <w:color w:val="1A1A1A"/>
@@ -8363,7 +8363,7 @@
       </w:pPr>
       <w:r>
         <w:rPr>
-          <w:rFonts w:ascii="Noto Sans KR" w:cs="Noto Sans KR" w:eastAsia="Noto Sans KR" w:hAnsi="Noto Sans KR"/>
+          <w:rFonts w:ascii="Pretendard" w:cs="Pretendard" w:eastAsia="Pretendard" w:hAnsi="Pretendard"/>
           <w:color w:val="1A1A1A"/>
           <w:sz w:val="20"/>
           <w:szCs w:val="20"/>
@@ -8377,7 +8377,7 @@
       </w:pPr>
       <w:r>
         <w:rPr>
-          <w:rFonts w:ascii="Noto Sans KR" w:cs="Noto Sans KR" w:eastAsia="Noto Sans KR" w:hAnsi="Noto Sans KR"/>
+          <w:rFonts w:ascii="Pretendard" w:cs="Pretendard" w:eastAsia="Pretendard" w:hAnsi="Pretendard"/>
           <w:color w:val="1A1A1A"/>
           <w:sz w:val="20"/>
           <w:szCs w:val="20"/>
@@ -8397,7 +8397,7 @@
       </w:pPr>
       <w:r>
         <w:rPr>
-          <w:rFonts w:ascii="Noto Sans KR" w:cs="Noto Sans KR" w:eastAsia="Noto Sans KR" w:hAnsi="Noto Sans KR"/>
+          <w:rFonts w:ascii="Pretendard" w:cs="Pretendard" w:eastAsia="Pretendard" w:hAnsi="Pretendard"/>
           <w:b/>
           <w:bCs/>
           <w:color w:val="111E6C"/>
@@ -8413,7 +8413,7 @@
       </w:pPr>
       <w:r>
         <w:rPr>
-          <w:rFonts w:ascii="Noto Sans KR" w:cs="Noto Sans KR" w:eastAsia="Noto Sans KR" w:hAnsi="Noto Sans KR"/>
+          <w:rFonts w:ascii="Pretendard" w:cs="Pretendard" w:eastAsia="Pretendard" w:hAnsi="Pretendard"/>
           <w:color w:val="1A1A1A"/>
           <w:sz w:val="20"/>
           <w:szCs w:val="20"/>
@@ -8465,7 +8465,7 @@
             </w:pPr>
             <w:r>
               <w:rPr>
-                <w:rFonts w:ascii="Noto Sans KR" w:cs="Noto Sans KR" w:eastAsia="Noto Sans KR" w:hAnsi="Noto Sans KR"/>
+                <w:rFonts w:ascii="Pretendard" w:cs="Pretendard" w:eastAsia="Pretendard" w:hAnsi="Pretendard"/>
                 <w:b/>
                 <w:bCs/>
                 <w:color w:val="FFFFFF"/>
@@ -8494,7 +8494,7 @@
             </w:pPr>
             <w:r>
               <w:rPr>
-                <w:rFonts w:ascii="Noto Sans KR" w:cs="Noto Sans KR" w:eastAsia="Noto Sans KR" w:hAnsi="Noto Sans KR"/>
+                <w:rFonts w:ascii="Pretendard" w:cs="Pretendard" w:eastAsia="Pretendard" w:hAnsi="Pretendard"/>
                 <w:b/>
                 <w:bCs/>
                 <w:color w:val="FFFFFF"/>
@@ -8523,7 +8523,7 @@
             </w:pPr>
             <w:r>
               <w:rPr>
-                <w:rFonts w:ascii="Noto Sans KR" w:cs="Noto Sans KR" w:eastAsia="Noto Sans KR" w:hAnsi="Noto Sans KR"/>
+                <w:rFonts w:ascii="Pretendard" w:cs="Pretendard" w:eastAsia="Pretendard" w:hAnsi="Pretendard"/>
                 <w:b/>
                 <w:bCs/>
                 <w:color w:val="FFFFFF"/>
@@ -8556,7 +8556,7 @@
             </w:pPr>
             <w:r>
               <w:rPr>
-                <w:rFonts w:ascii="Noto Sans KR" w:cs="Noto Sans KR" w:eastAsia="Noto Sans KR" w:hAnsi="Noto Sans KR"/>
+                <w:rFonts w:ascii="Pretendard" w:cs="Pretendard" w:eastAsia="Pretendard" w:hAnsi="Pretendard"/>
                 <w:b w:val="false"/>
                 <w:bCs w:val="false"/>
                 <w:color w:val="1A1A1A"/>
@@ -8584,7 +8584,7 @@
             </w:pPr>
             <w:r>
               <w:rPr>
-                <w:rFonts w:ascii="Noto Sans KR" w:cs="Noto Sans KR" w:eastAsia="Noto Sans KR" w:hAnsi="Noto Sans KR"/>
+                <w:rFonts w:ascii="Pretendard" w:cs="Pretendard" w:eastAsia="Pretendard" w:hAnsi="Pretendard"/>
                 <w:b w:val="false"/>
                 <w:bCs w:val="false"/>
                 <w:color w:val="1A1A1A"/>
@@ -8612,7 +8612,7 @@
             </w:pPr>
             <w:r>
               <w:rPr>
-                <w:rFonts w:ascii="Noto Sans KR" w:cs="Noto Sans KR" w:eastAsia="Noto Sans KR" w:hAnsi="Noto Sans KR"/>
+                <w:rFonts w:ascii="Pretendard" w:cs="Pretendard" w:eastAsia="Pretendard" w:hAnsi="Pretendard"/>
                 <w:b w:val="false"/>
                 <w:bCs w:val="false"/>
                 <w:color w:val="1A1A1A"/>
@@ -8645,7 +8645,7 @@
             </w:pPr>
             <w:r>
               <w:rPr>
-                <w:rFonts w:ascii="Noto Sans KR" w:cs="Noto Sans KR" w:eastAsia="Noto Sans KR" w:hAnsi="Noto Sans KR"/>
+                <w:rFonts w:ascii="Pretendard" w:cs="Pretendard" w:eastAsia="Pretendard" w:hAnsi="Pretendard"/>
                 <w:b w:val="false"/>
                 <w:bCs w:val="false"/>
                 <w:color w:val="1A1A1A"/>
@@ -8673,7 +8673,7 @@
             </w:pPr>
             <w:r>
               <w:rPr>
-                <w:rFonts w:ascii="Noto Sans KR" w:cs="Noto Sans KR" w:eastAsia="Noto Sans KR" w:hAnsi="Noto Sans KR"/>
+                <w:rFonts w:ascii="Pretendard" w:cs="Pretendard" w:eastAsia="Pretendard" w:hAnsi="Pretendard"/>
                 <w:b w:val="false"/>
                 <w:bCs w:val="false"/>
                 <w:color w:val="1A1A1A"/>
@@ -8701,7 +8701,7 @@
             </w:pPr>
             <w:r>
               <w:rPr>
-                <w:rFonts w:ascii="Noto Sans KR" w:cs="Noto Sans KR" w:eastAsia="Noto Sans KR" w:hAnsi="Noto Sans KR"/>
+                <w:rFonts w:ascii="Pretendard" w:cs="Pretendard" w:eastAsia="Pretendard" w:hAnsi="Pretendard"/>
                 <w:b w:val="false"/>
                 <w:bCs w:val="false"/>
                 <w:color w:val="1A1A1A"/>
@@ -8734,7 +8734,7 @@
             </w:pPr>
             <w:r>
               <w:rPr>
-                <w:rFonts w:ascii="Noto Sans KR" w:cs="Noto Sans KR" w:eastAsia="Noto Sans KR" w:hAnsi="Noto Sans KR"/>
+                <w:rFonts w:ascii="Pretendard" w:cs="Pretendard" w:eastAsia="Pretendard" w:hAnsi="Pretendard"/>
                 <w:b w:val="false"/>
                 <w:bCs w:val="false"/>
                 <w:color w:val="1A1A1A"/>
@@ -8762,7 +8762,7 @@
             </w:pPr>
             <w:r>
               <w:rPr>
-                <w:rFonts w:ascii="Noto Sans KR" w:cs="Noto Sans KR" w:eastAsia="Noto Sans KR" w:hAnsi="Noto Sans KR"/>
+                <w:rFonts w:ascii="Pretendard" w:cs="Pretendard" w:eastAsia="Pretendard" w:hAnsi="Pretendard"/>
                 <w:b w:val="false"/>
                 <w:bCs w:val="false"/>
                 <w:color w:val="1A1A1A"/>
@@ -8790,7 +8790,7 @@
             </w:pPr>
             <w:r>
               <w:rPr>
-                <w:rFonts w:ascii="Noto Sans KR" w:cs="Noto Sans KR" w:eastAsia="Noto Sans KR" w:hAnsi="Noto Sans KR"/>
+                <w:rFonts w:ascii="Pretendard" w:cs="Pretendard" w:eastAsia="Pretendard" w:hAnsi="Pretendard"/>
                 <w:b w:val="false"/>
                 <w:bCs w:val="false"/>
                 <w:color w:val="1A1A1A"/>
@@ -8823,7 +8823,7 @@
             </w:pPr>
             <w:r>
               <w:rPr>
-                <w:rFonts w:ascii="Noto Sans KR" w:cs="Noto Sans KR" w:eastAsia="Noto Sans KR" w:hAnsi="Noto Sans KR"/>
+                <w:rFonts w:ascii="Pretendard" w:cs="Pretendard" w:eastAsia="Pretendard" w:hAnsi="Pretendard"/>
                 <w:b w:val="false"/>
                 <w:bCs w:val="false"/>
                 <w:color w:val="1A1A1A"/>
@@ -8851,7 +8851,7 @@
             </w:pPr>
             <w:r>
               <w:rPr>
-                <w:rFonts w:ascii="Noto Sans KR" w:cs="Noto Sans KR" w:eastAsia="Noto Sans KR" w:hAnsi="Noto Sans KR"/>
+                <w:rFonts w:ascii="Pretendard" w:cs="Pretendard" w:eastAsia="Pretendard" w:hAnsi="Pretendard"/>
                 <w:b w:val="false"/>
                 <w:bCs w:val="false"/>
                 <w:color w:val="1A1A1A"/>
@@ -8879,7 +8879,7 @@
             </w:pPr>
             <w:r>
               <w:rPr>
-                <w:rFonts w:ascii="Noto Sans KR" w:cs="Noto Sans KR" w:eastAsia="Noto Sans KR" w:hAnsi="Noto Sans KR"/>
+                <w:rFonts w:ascii="Pretendard" w:cs="Pretendard" w:eastAsia="Pretendard" w:hAnsi="Pretendard"/>
                 <w:b w:val="false"/>
                 <w:bCs w:val="false"/>
                 <w:color w:val="1A1A1A"/>
@@ -8907,7 +8907,7 @@
       </w:pPr>
       <w:r>
         <w:rPr>
-          <w:rFonts w:ascii="Noto Sans KR" w:cs="Noto Sans KR" w:eastAsia="Noto Sans KR" w:hAnsi="Noto Sans KR"/>
+          <w:rFonts w:ascii="Pretendard" w:cs="Pretendard" w:eastAsia="Pretendard" w:hAnsi="Pretendard"/>
           <w:b/>
           <w:bCs/>
           <w:color w:val="1A1A1A"/>
@@ -8921,7 +8921,7 @@
       </w:r>
       <w:r>
         <w:rPr>
-          <w:rFonts w:ascii="Noto Sans KR" w:cs="Noto Sans KR" w:eastAsia="Noto Sans KR" w:hAnsi="Noto Sans KR"/>
+          <w:rFonts w:ascii="Pretendard" w:cs="Pretendard" w:eastAsia="Pretendard" w:hAnsi="Pretendard"/>
           <w:color w:val="5C5C5C"/>
           <w:sz w:val="19"/>
           <w:szCs w:val="19"/>
@@ -8936,7 +8936,7 @@
       </w:pPr>
       <w:r>
         <w:rPr>
-          <w:rFonts w:ascii="Noto Sans KR" w:cs="Noto Sans KR" w:eastAsia="Noto Sans KR" w:hAnsi="Noto Sans KR"/>
+          <w:rFonts w:ascii="Pretendard" w:cs="Pretendard" w:eastAsia="Pretendard" w:hAnsi="Pretendard"/>
           <w:b/>
           <w:bCs/>
           <w:color w:val="111E6C"/>
@@ -8956,7 +8956,7 @@
       </w:pPr>
       <w:r>
         <w:rPr>
-          <w:rFonts w:ascii="Noto Sans KR" w:cs="Noto Sans KR" w:eastAsia="Noto Sans KR" w:hAnsi="Noto Sans KR"/>
+          <w:rFonts w:ascii="Pretendard" w:cs="Pretendard" w:eastAsia="Pretendard" w:hAnsi="Pretendard"/>
           <w:b/>
           <w:bCs/>
           <w:color w:val="1A1A1A"/>
@@ -8970,7 +8970,7 @@
       </w:r>
       <w:r>
         <w:rPr>
-          <w:rFonts w:ascii="Noto Sans KR" w:cs="Noto Sans KR" w:eastAsia="Noto Sans KR" w:hAnsi="Noto Sans KR"/>
+          <w:rFonts w:ascii="Pretendard" w:cs="Pretendard" w:eastAsia="Pretendard" w:hAnsi="Pretendard"/>
           <w:color w:val="5C5C5C"/>
           <w:sz w:val="19"/>
           <w:szCs w:val="19"/>
@@ -9022,7 +9022,7 @@
             </w:pPr>
             <w:r>
               <w:rPr>
-                <w:rFonts w:ascii="Noto Sans KR" w:cs="Noto Sans KR" w:eastAsia="Noto Sans KR" w:hAnsi="Noto Sans KR"/>
+                <w:rFonts w:ascii="Pretendard" w:cs="Pretendard" w:eastAsia="Pretendard" w:hAnsi="Pretendard"/>
                 <w:b/>
                 <w:bCs/>
                 <w:color w:val="FFFFFF"/>
@@ -9051,7 +9051,7 @@
             </w:pPr>
             <w:r>
               <w:rPr>
-                <w:rFonts w:ascii="Noto Sans KR" w:cs="Noto Sans KR" w:eastAsia="Noto Sans KR" w:hAnsi="Noto Sans KR"/>
+                <w:rFonts w:ascii="Pretendard" w:cs="Pretendard" w:eastAsia="Pretendard" w:hAnsi="Pretendard"/>
                 <w:b/>
                 <w:bCs/>
                 <w:color w:val="FFFFFF"/>
@@ -9080,7 +9080,7 @@
             </w:pPr>
             <w:r>
               <w:rPr>
-                <w:rFonts w:ascii="Noto Sans KR" w:cs="Noto Sans KR" w:eastAsia="Noto Sans KR" w:hAnsi="Noto Sans KR"/>
+                <w:rFonts w:ascii="Pretendard" w:cs="Pretendard" w:eastAsia="Pretendard" w:hAnsi="Pretendard"/>
                 <w:b/>
                 <w:bCs/>
                 <w:color w:val="FFFFFF"/>
@@ -9113,7 +9113,7 @@
             </w:pPr>
             <w:r>
               <w:rPr>
-                <w:rFonts w:ascii="Noto Sans KR" w:cs="Noto Sans KR" w:eastAsia="Noto Sans KR" w:hAnsi="Noto Sans KR"/>
+                <w:rFonts w:ascii="Pretendard" w:cs="Pretendard" w:eastAsia="Pretendard" w:hAnsi="Pretendard"/>
                 <w:b w:val="false"/>
                 <w:bCs w:val="false"/>
                 <w:color w:val="1A1A1A"/>
@@ -9141,7 +9141,7 @@
             </w:pPr>
             <w:r>
               <w:rPr>
-                <w:rFonts w:ascii="Noto Sans KR" w:cs="Noto Sans KR" w:eastAsia="Noto Sans KR" w:hAnsi="Noto Sans KR"/>
+                <w:rFonts w:ascii="Pretendard" w:cs="Pretendard" w:eastAsia="Pretendard" w:hAnsi="Pretendard"/>
                 <w:b w:val="false"/>
                 <w:bCs w:val="false"/>
                 <w:color w:val="1A1A1A"/>
@@ -9169,7 +9169,7 @@
             </w:pPr>
             <w:r>
               <w:rPr>
-                <w:rFonts w:ascii="Noto Sans KR" w:cs="Noto Sans KR" w:eastAsia="Noto Sans KR" w:hAnsi="Noto Sans KR"/>
+                <w:rFonts w:ascii="Pretendard" w:cs="Pretendard" w:eastAsia="Pretendard" w:hAnsi="Pretendard"/>
                 <w:b w:val="false"/>
                 <w:bCs w:val="false"/>
                 <w:color w:val="1A1A1A"/>
@@ -9202,7 +9202,7 @@
             </w:pPr>
             <w:r>
               <w:rPr>
-                <w:rFonts w:ascii="Noto Sans KR" w:cs="Noto Sans KR" w:eastAsia="Noto Sans KR" w:hAnsi="Noto Sans KR"/>
+                <w:rFonts w:ascii="Pretendard" w:cs="Pretendard" w:eastAsia="Pretendard" w:hAnsi="Pretendard"/>
                 <w:b w:val="false"/>
                 <w:bCs w:val="false"/>
                 <w:color w:val="1A1A1A"/>
@@ -9230,7 +9230,7 @@
             </w:pPr>
             <w:r>
               <w:rPr>
-                <w:rFonts w:ascii="Noto Sans KR" w:cs="Noto Sans KR" w:eastAsia="Noto Sans KR" w:hAnsi="Noto Sans KR"/>
+                <w:rFonts w:ascii="Pretendard" w:cs="Pretendard" w:eastAsia="Pretendard" w:hAnsi="Pretendard"/>
                 <w:b w:val="false"/>
                 <w:bCs w:val="false"/>
                 <w:color w:val="1A1A1A"/>
@@ -9258,7 +9258,7 @@
             </w:pPr>
             <w:r>
               <w:rPr>
-                <w:rFonts w:ascii="Noto Sans KR" w:cs="Noto Sans KR" w:eastAsia="Noto Sans KR" w:hAnsi="Noto Sans KR"/>
+                <w:rFonts w:ascii="Pretendard" w:cs="Pretendard" w:eastAsia="Pretendard" w:hAnsi="Pretendard"/>
                 <w:b w:val="false"/>
                 <w:bCs w:val="false"/>
                 <w:color w:val="1A1A1A"/>
@@ -9291,7 +9291,7 @@
             </w:pPr>
             <w:r>
               <w:rPr>
-                <w:rFonts w:ascii="Noto Sans KR" w:cs="Noto Sans KR" w:eastAsia="Noto Sans KR" w:hAnsi="Noto Sans KR"/>
+                <w:rFonts w:ascii="Pretendard" w:cs="Pretendard" w:eastAsia="Pretendard" w:hAnsi="Pretendard"/>
                 <w:b w:val="false"/>
                 <w:bCs w:val="false"/>
                 <w:color w:val="1A1A1A"/>
@@ -9319,7 +9319,7 @@
             </w:pPr>
             <w:r>
               <w:rPr>
-                <w:rFonts w:ascii="Noto Sans KR" w:cs="Noto Sans KR" w:eastAsia="Noto Sans KR" w:hAnsi="Noto Sans KR"/>
+                <w:rFonts w:ascii="Pretendard" w:cs="Pretendard" w:eastAsia="Pretendard" w:hAnsi="Pretendard"/>
                 <w:b w:val="false"/>
                 <w:bCs w:val="false"/>
                 <w:color w:val="1A1A1A"/>
@@ -9347,7 +9347,7 @@
             </w:pPr>
             <w:r>
               <w:rPr>
-                <w:rFonts w:ascii="Noto Sans KR" w:cs="Noto Sans KR" w:eastAsia="Noto Sans KR" w:hAnsi="Noto Sans KR"/>
+                <w:rFonts w:ascii="Pretendard" w:cs="Pretendard" w:eastAsia="Pretendard" w:hAnsi="Pretendard"/>
                 <w:b w:val="false"/>
                 <w:bCs w:val="false"/>
                 <w:color w:val="1A1A1A"/>
@@ -9380,7 +9380,7 @@
             </w:pPr>
             <w:r>
               <w:rPr>
-                <w:rFonts w:ascii="Noto Sans KR" w:cs="Noto Sans KR" w:eastAsia="Noto Sans KR" w:hAnsi="Noto Sans KR"/>
+                <w:rFonts w:ascii="Pretendard" w:cs="Pretendard" w:eastAsia="Pretendard" w:hAnsi="Pretendard"/>
                 <w:b w:val="false"/>
                 <w:bCs w:val="false"/>
                 <w:color w:val="1A1A1A"/>
@@ -9408,7 +9408,7 @@
             </w:pPr>
             <w:r>
               <w:rPr>
-                <w:rFonts w:ascii="Noto Sans KR" w:cs="Noto Sans KR" w:eastAsia="Noto Sans KR" w:hAnsi="Noto Sans KR"/>
+                <w:rFonts w:ascii="Pretendard" w:cs="Pretendard" w:eastAsia="Pretendard" w:hAnsi="Pretendard"/>
                 <w:b w:val="false"/>
                 <w:bCs w:val="false"/>
                 <w:color w:val="1A1A1A"/>
@@ -9436,7 +9436,7 @@
             </w:pPr>
             <w:r>
               <w:rPr>
-                <w:rFonts w:ascii="Noto Sans KR" w:cs="Noto Sans KR" w:eastAsia="Noto Sans KR" w:hAnsi="Noto Sans KR"/>
+                <w:rFonts w:ascii="Pretendard" w:cs="Pretendard" w:eastAsia="Pretendard" w:hAnsi="Pretendard"/>
                 <w:b w:val="false"/>
                 <w:bCs w:val="false"/>
                 <w:color w:val="1A1A1A"/>
@@ -9469,7 +9469,7 @@
             </w:pPr>
             <w:r>
               <w:rPr>
-                <w:rFonts w:ascii="Noto Sans KR" w:cs="Noto Sans KR" w:eastAsia="Noto Sans KR" w:hAnsi="Noto Sans KR"/>
+                <w:rFonts w:ascii="Pretendard" w:cs="Pretendard" w:eastAsia="Pretendard" w:hAnsi="Pretendard"/>
                 <w:b w:val="false"/>
                 <w:bCs w:val="false"/>
                 <w:color w:val="1A1A1A"/>
@@ -9497,7 +9497,7 @@
             </w:pPr>
             <w:r>
               <w:rPr>
-                <w:rFonts w:ascii="Noto Sans KR" w:cs="Noto Sans KR" w:eastAsia="Noto Sans KR" w:hAnsi="Noto Sans KR"/>
+                <w:rFonts w:ascii="Pretendard" w:cs="Pretendard" w:eastAsia="Pretendard" w:hAnsi="Pretendard"/>
                 <w:b w:val="false"/>
                 <w:bCs w:val="false"/>
                 <w:color w:val="1A1A1A"/>
@@ -9525,7 +9525,7 @@
             </w:pPr>
             <w:r>
               <w:rPr>
-                <w:rFonts w:ascii="Noto Sans KR" w:cs="Noto Sans KR" w:eastAsia="Noto Sans KR" w:hAnsi="Noto Sans KR"/>
+                <w:rFonts w:ascii="Pretendard" w:cs="Pretendard" w:eastAsia="Pretendard" w:hAnsi="Pretendard"/>
                 <w:b w:val="false"/>
                 <w:bCs w:val="false"/>
                 <w:color w:val="1A1A1A"/>
@@ -9558,7 +9558,7 @@
             </w:pPr>
             <w:r>
               <w:rPr>
-                <w:rFonts w:ascii="Noto Sans KR" w:cs="Noto Sans KR" w:eastAsia="Noto Sans KR" w:hAnsi="Noto Sans KR"/>
+                <w:rFonts w:ascii="Pretendard" w:cs="Pretendard" w:eastAsia="Pretendard" w:hAnsi="Pretendard"/>
                 <w:b w:val="false"/>
                 <w:bCs w:val="false"/>
                 <w:color w:val="1A1A1A"/>
@@ -9586,7 +9586,7 @@
             </w:pPr>
             <w:r>
               <w:rPr>
-                <w:rFonts w:ascii="Noto Sans KR" w:cs="Noto Sans KR" w:eastAsia="Noto Sans KR" w:hAnsi="Noto Sans KR"/>
+                <w:rFonts w:ascii="Pretendard" w:cs="Pretendard" w:eastAsia="Pretendard" w:hAnsi="Pretendard"/>
                 <w:b w:val="false"/>
                 <w:bCs w:val="false"/>
                 <w:color w:val="1A1A1A"/>
@@ -9614,7 +9614,7 @@
             </w:pPr>
             <w:r>
               <w:rPr>
-                <w:rFonts w:ascii="Noto Sans KR" w:cs="Noto Sans KR" w:eastAsia="Noto Sans KR" w:hAnsi="Noto Sans KR"/>
+                <w:rFonts w:ascii="Pretendard" w:cs="Pretendard" w:eastAsia="Pretendard" w:hAnsi="Pretendard"/>
                 <w:b w:val="false"/>
                 <w:bCs w:val="false"/>
                 <w:color w:val="1A1A1A"/>
@@ -9647,7 +9647,7 @@
             </w:pPr>
             <w:r>
               <w:rPr>
-                <w:rFonts w:ascii="Noto Sans KR" w:cs="Noto Sans KR" w:eastAsia="Noto Sans KR" w:hAnsi="Noto Sans KR"/>
+                <w:rFonts w:ascii="Pretendard" w:cs="Pretendard" w:eastAsia="Pretendard" w:hAnsi="Pretendard"/>
                 <w:b w:val="false"/>
                 <w:bCs w:val="false"/>
                 <w:color w:val="1A1A1A"/>
@@ -9675,7 +9675,7 @@
             </w:pPr>
             <w:r>
               <w:rPr>
-                <w:rFonts w:ascii="Noto Sans KR" w:cs="Noto Sans KR" w:eastAsia="Noto Sans KR" w:hAnsi="Noto Sans KR"/>
+                <w:rFonts w:ascii="Pretendard" w:cs="Pretendard" w:eastAsia="Pretendard" w:hAnsi="Pretendard"/>
                 <w:b w:val="false"/>
                 <w:bCs w:val="false"/>
                 <w:color w:val="1A1A1A"/>
@@ -9703,7 +9703,7 @@
             </w:pPr>
             <w:r>
               <w:rPr>
-                <w:rFonts w:ascii="Noto Sans KR" w:cs="Noto Sans KR" w:eastAsia="Noto Sans KR" w:hAnsi="Noto Sans KR"/>
+                <w:rFonts w:ascii="Pretendard" w:cs="Pretendard" w:eastAsia="Pretendard" w:hAnsi="Pretendard"/>
                 <w:b w:val="false"/>
                 <w:bCs w:val="false"/>
                 <w:color w:val="1A1A1A"/>
@@ -9727,7 +9727,7 @@
       </w:pPr>
       <w:r>
         <w:rPr>
-          <w:rFonts w:ascii="Noto Sans KR" w:cs="Noto Sans KR" w:eastAsia="Noto Sans KR" w:hAnsi="Noto Sans KR"/>
+          <w:rFonts w:ascii="Pretendard" w:cs="Pretendard" w:eastAsia="Pretendard" w:hAnsi="Pretendard"/>
           <w:b/>
           <w:bCs/>
           <w:color w:val="1A1A1A"/>
@@ -9738,7 +9738,7 @@
       </w:r>
       <w:r>
         <w:rPr>
-          <w:rFonts w:ascii="Noto Sans KR" w:cs="Noto Sans KR" w:eastAsia="Noto Sans KR" w:hAnsi="Noto Sans KR"/>
+          <w:rFonts w:ascii="Pretendard" w:cs="Pretendard" w:eastAsia="Pretendard" w:hAnsi="Pretendard"/>
           <w:color w:val="1A1A1A"/>
           <w:sz w:val="20"/>
           <w:szCs w:val="20"/>
@@ -9752,7 +9752,7 @@
       </w:pPr>
       <w:r>
         <w:rPr>
-          <w:rFonts w:ascii="Noto Sans KR" w:cs="Noto Sans KR" w:eastAsia="Noto Sans KR" w:hAnsi="Noto Sans KR"/>
+          <w:rFonts w:ascii="Pretendard" w:cs="Pretendard" w:eastAsia="Pretendard" w:hAnsi="Pretendard"/>
           <w:color w:val="1A1A1A"/>
           <w:sz w:val="20"/>
           <w:szCs w:val="20"/>
@@ -9772,7 +9772,7 @@
       </w:pPr>
       <w:r>
         <w:rPr>
-          <w:rFonts w:ascii="Noto Sans KR" w:cs="Noto Sans KR" w:eastAsia="Noto Sans KR" w:hAnsi="Noto Sans KR"/>
+          <w:rFonts w:ascii="Pretendard" w:cs="Pretendard" w:eastAsia="Pretendard" w:hAnsi="Pretendard"/>
           <w:b/>
           <w:bCs/>
           <w:color w:val="111E6C"/>
@@ -9789,7 +9789,7 @@
       </w:pPr>
       <w:r>
         <w:rPr>
-          <w:rFonts w:ascii="Noto Sans KR" w:cs="Noto Sans KR" w:eastAsia="Noto Sans KR" w:hAnsi="Noto Sans KR"/>
+          <w:rFonts w:ascii="Pretendard" w:cs="Pretendard" w:eastAsia="Pretendard" w:hAnsi="Pretendard"/>
           <w:b/>
           <w:bCs/>
           <w:color w:val="1A1A1A"/>
@@ -9842,7 +9842,7 @@
             </w:pPr>
             <w:r>
               <w:rPr>
-                <w:rFonts w:ascii="Noto Sans KR" w:cs="Noto Sans KR" w:eastAsia="Noto Sans KR" w:hAnsi="Noto Sans KR"/>
+                <w:rFonts w:ascii="Pretendard" w:cs="Pretendard" w:eastAsia="Pretendard" w:hAnsi="Pretendard"/>
                 <w:b/>
                 <w:bCs/>
                 <w:color w:val="FFFFFF"/>
@@ -9871,7 +9871,7 @@
             </w:pPr>
             <w:r>
               <w:rPr>
-                <w:rFonts w:ascii="Noto Sans KR" w:cs="Noto Sans KR" w:eastAsia="Noto Sans KR" w:hAnsi="Noto Sans KR"/>
+                <w:rFonts w:ascii="Pretendard" w:cs="Pretendard" w:eastAsia="Pretendard" w:hAnsi="Pretendard"/>
                 <w:b/>
                 <w:bCs/>
                 <w:color w:val="FFFFFF"/>
@@ -9904,7 +9904,7 @@
             </w:pPr>
             <w:r>
               <w:rPr>
-                <w:rFonts w:ascii="Noto Sans KR" w:cs="Noto Sans KR" w:eastAsia="Noto Sans KR" w:hAnsi="Noto Sans KR"/>
+                <w:rFonts w:ascii="Pretendard" w:cs="Pretendard" w:eastAsia="Pretendard" w:hAnsi="Pretendard"/>
                 <w:b w:val="false"/>
                 <w:bCs w:val="false"/>
                 <w:color w:val="1A1A1A"/>
@@ -9932,7 +9932,7 @@
             </w:pPr>
             <w:r>
               <w:rPr>
-                <w:rFonts w:ascii="Noto Sans KR" w:cs="Noto Sans KR" w:eastAsia="Noto Sans KR" w:hAnsi="Noto Sans KR"/>
+                <w:rFonts w:ascii="Pretendard" w:cs="Pretendard" w:eastAsia="Pretendard" w:hAnsi="Pretendard"/>
                 <w:b w:val="false"/>
                 <w:bCs w:val="false"/>
                 <w:color w:val="1A1A1A"/>
@@ -9965,7 +9965,7 @@
             </w:pPr>
             <w:r>
               <w:rPr>
-                <w:rFonts w:ascii="Noto Sans KR" w:cs="Noto Sans KR" w:eastAsia="Noto Sans KR" w:hAnsi="Noto Sans KR"/>
+                <w:rFonts w:ascii="Pretendard" w:cs="Pretendard" w:eastAsia="Pretendard" w:hAnsi="Pretendard"/>
                 <w:b w:val="false"/>
                 <w:bCs w:val="false"/>
                 <w:color w:val="1A1A1A"/>
@@ -9993,7 +9993,7 @@
             </w:pPr>
             <w:r>
               <w:rPr>
-                <w:rFonts w:ascii="Noto Sans KR" w:cs="Noto Sans KR" w:eastAsia="Noto Sans KR" w:hAnsi="Noto Sans KR"/>
+                <w:rFonts w:ascii="Pretendard" w:cs="Pretendard" w:eastAsia="Pretendard" w:hAnsi="Pretendard"/>
                 <w:b w:val="false"/>
                 <w:bCs w:val="false"/>
                 <w:color w:val="1A1A1A"/>
@@ -10026,7 +10026,7 @@
             </w:pPr>
             <w:r>
               <w:rPr>
-                <w:rFonts w:ascii="Noto Sans KR" w:cs="Noto Sans KR" w:eastAsia="Noto Sans KR" w:hAnsi="Noto Sans KR"/>
+                <w:rFonts w:ascii="Pretendard" w:cs="Pretendard" w:eastAsia="Pretendard" w:hAnsi="Pretendard"/>
                 <w:b w:val="false"/>
                 <w:bCs w:val="false"/>
                 <w:color w:val="1A1A1A"/>
@@ -10054,7 +10054,7 @@
             </w:pPr>
             <w:r>
               <w:rPr>
-                <w:rFonts w:ascii="Noto Sans KR" w:cs="Noto Sans KR" w:eastAsia="Noto Sans KR" w:hAnsi="Noto Sans KR"/>
+                <w:rFonts w:ascii="Pretendard" w:cs="Pretendard" w:eastAsia="Pretendard" w:hAnsi="Pretendard"/>
                 <w:b w:val="false"/>
                 <w:bCs w:val="false"/>
                 <w:color w:val="1A1A1A"/>
@@ -10087,7 +10087,7 @@
             </w:pPr>
             <w:r>
               <w:rPr>
-                <w:rFonts w:ascii="Noto Sans KR" w:cs="Noto Sans KR" w:eastAsia="Noto Sans KR" w:hAnsi="Noto Sans KR"/>
+                <w:rFonts w:ascii="Pretendard" w:cs="Pretendard" w:eastAsia="Pretendard" w:hAnsi="Pretendard"/>
                 <w:b w:val="false"/>
                 <w:bCs w:val="false"/>
                 <w:color w:val="1A1A1A"/>
@@ -10115,7 +10115,7 @@
             </w:pPr>
             <w:r>
               <w:rPr>
-                <w:rFonts w:ascii="Noto Sans KR" w:cs="Noto Sans KR" w:eastAsia="Noto Sans KR" w:hAnsi="Noto Sans KR"/>
+                <w:rFonts w:ascii="Pretendard" w:cs="Pretendard" w:eastAsia="Pretendard" w:hAnsi="Pretendard"/>
                 <w:b w:val="false"/>
                 <w:bCs w:val="false"/>
                 <w:color w:val="1A1A1A"/>
@@ -10148,7 +10148,7 @@
             </w:pPr>
             <w:r>
               <w:rPr>
-                <w:rFonts w:ascii="Noto Sans KR" w:cs="Noto Sans KR" w:eastAsia="Noto Sans KR" w:hAnsi="Noto Sans KR"/>
+                <w:rFonts w:ascii="Pretendard" w:cs="Pretendard" w:eastAsia="Pretendard" w:hAnsi="Pretendard"/>
                 <w:b w:val="false"/>
                 <w:bCs w:val="false"/>
                 <w:color w:val="1A1A1A"/>
@@ -10176,7 +10176,7 @@
             </w:pPr>
             <w:r>
               <w:rPr>
-                <w:rFonts w:ascii="Noto Sans KR" w:cs="Noto Sans KR" w:eastAsia="Noto Sans KR" w:hAnsi="Noto Sans KR"/>
+                <w:rFonts w:ascii="Pretendard" w:cs="Pretendard" w:eastAsia="Pretendard" w:hAnsi="Pretendard"/>
                 <w:b w:val="false"/>
                 <w:bCs w:val="false"/>
                 <w:color w:val="1A1A1A"/>
@@ -10209,7 +10209,7 @@
             </w:pPr>
             <w:r>
               <w:rPr>
-                <w:rFonts w:ascii="Noto Sans KR" w:cs="Noto Sans KR" w:eastAsia="Noto Sans KR" w:hAnsi="Noto Sans KR"/>
+                <w:rFonts w:ascii="Pretendard" w:cs="Pretendard" w:eastAsia="Pretendard" w:hAnsi="Pretendard"/>
                 <w:b w:val="false"/>
                 <w:bCs w:val="false"/>
                 <w:color w:val="1A1A1A"/>
@@ -10237,7 +10237,7 @@
             </w:pPr>
             <w:r>
               <w:rPr>
-                <w:rFonts w:ascii="Noto Sans KR" w:cs="Noto Sans KR" w:eastAsia="Noto Sans KR" w:hAnsi="Noto Sans KR"/>
+                <w:rFonts w:ascii="Pretendard" w:cs="Pretendard" w:eastAsia="Pretendard" w:hAnsi="Pretendard"/>
                 <w:b w:val="false"/>
                 <w:bCs w:val="false"/>
                 <w:color w:val="1A1A1A"/>
@@ -10270,7 +10270,7 @@
             </w:pPr>
             <w:r>
               <w:rPr>
-                <w:rFonts w:ascii="Noto Sans KR" w:cs="Noto Sans KR" w:eastAsia="Noto Sans KR" w:hAnsi="Noto Sans KR"/>
+                <w:rFonts w:ascii="Pretendard" w:cs="Pretendard" w:eastAsia="Pretendard" w:hAnsi="Pretendard"/>
                 <w:b w:val="false"/>
                 <w:bCs w:val="false"/>
                 <w:color w:val="1A1A1A"/>
@@ -10298,7 +10298,7 @@
             </w:pPr>
             <w:r>
               <w:rPr>
-                <w:rFonts w:ascii="Noto Sans KR" w:cs="Noto Sans KR" w:eastAsia="Noto Sans KR" w:hAnsi="Noto Sans KR"/>
+                <w:rFonts w:ascii="Pretendard" w:cs="Pretendard" w:eastAsia="Pretendard" w:hAnsi="Pretendard"/>
                 <w:b w:val="false"/>
                 <w:bCs w:val="false"/>
                 <w:color w:val="1A1A1A"/>
@@ -10331,7 +10331,7 @@
             </w:pPr>
             <w:r>
               <w:rPr>
-                <w:rFonts w:ascii="Noto Sans KR" w:cs="Noto Sans KR" w:eastAsia="Noto Sans KR" w:hAnsi="Noto Sans KR"/>
+                <w:rFonts w:ascii="Pretendard" w:cs="Pretendard" w:eastAsia="Pretendard" w:hAnsi="Pretendard"/>
                 <w:b w:val="false"/>
                 <w:bCs w:val="false"/>
                 <w:color w:val="1A1A1A"/>
@@ -10359,7 +10359,7 @@
             </w:pPr>
             <w:r>
               <w:rPr>
-                <w:rFonts w:ascii="Noto Sans KR" w:cs="Noto Sans KR" w:eastAsia="Noto Sans KR" w:hAnsi="Noto Sans KR"/>
+                <w:rFonts w:ascii="Pretendard" w:cs="Pretendard" w:eastAsia="Pretendard" w:hAnsi="Pretendard"/>
                 <w:b w:val="false"/>
                 <w:bCs w:val="false"/>
                 <w:color w:val="1A1A1A"/>
@@ -10392,7 +10392,7 @@
             </w:pPr>
             <w:r>
               <w:rPr>
-                <w:rFonts w:ascii="Noto Sans KR" w:cs="Noto Sans KR" w:eastAsia="Noto Sans KR" w:hAnsi="Noto Sans KR"/>
+                <w:rFonts w:ascii="Pretendard" w:cs="Pretendard" w:eastAsia="Pretendard" w:hAnsi="Pretendard"/>
                 <w:b w:val="false"/>
                 <w:bCs w:val="false"/>
                 <w:color w:val="1A1A1A"/>
@@ -10420,7 +10420,7 @@
             </w:pPr>
             <w:r>
               <w:rPr>
-                <w:rFonts w:ascii="Noto Sans KR" w:cs="Noto Sans KR" w:eastAsia="Noto Sans KR" w:hAnsi="Noto Sans KR"/>
+                <w:rFonts w:ascii="Pretendard" w:cs="Pretendard" w:eastAsia="Pretendard" w:hAnsi="Pretendard"/>
                 <w:b w:val="false"/>
                 <w:bCs w:val="false"/>
                 <w:color w:val="1A1A1A"/>
@@ -10453,7 +10453,7 @@
             </w:pPr>
             <w:r>
               <w:rPr>
-                <w:rFonts w:ascii="Noto Sans KR" w:cs="Noto Sans KR" w:eastAsia="Noto Sans KR" w:hAnsi="Noto Sans KR"/>
+                <w:rFonts w:ascii="Pretendard" w:cs="Pretendard" w:eastAsia="Pretendard" w:hAnsi="Pretendard"/>
                 <w:b w:val="false"/>
                 <w:bCs w:val="false"/>
                 <w:color w:val="1A1A1A"/>
@@ -10481,7 +10481,7 @@
             </w:pPr>
             <w:r>
               <w:rPr>
-                <w:rFonts w:ascii="Noto Sans KR" w:cs="Noto Sans KR" w:eastAsia="Noto Sans KR" w:hAnsi="Noto Sans KR"/>
+                <w:rFonts w:ascii="Pretendard" w:cs="Pretendard" w:eastAsia="Pretendard" w:hAnsi="Pretendard"/>
                 <w:b w:val="false"/>
                 <w:bCs w:val="false"/>
                 <w:color w:val="1A1A1A"/>
@@ -10514,7 +10514,7 @@
             </w:pPr>
             <w:r>
               <w:rPr>
-                <w:rFonts w:ascii="Noto Sans KR" w:cs="Noto Sans KR" w:eastAsia="Noto Sans KR" w:hAnsi="Noto Sans KR"/>
+                <w:rFonts w:ascii="Pretendard" w:cs="Pretendard" w:eastAsia="Pretendard" w:hAnsi="Pretendard"/>
                 <w:b w:val="false"/>
                 <w:bCs w:val="false"/>
                 <w:color w:val="1A1A1A"/>
@@ -10542,7 +10542,7 @@
             </w:pPr>
             <w:r>
               <w:rPr>
-                <w:rFonts w:ascii="Noto Sans KR" w:cs="Noto Sans KR" w:eastAsia="Noto Sans KR" w:hAnsi="Noto Sans KR"/>
+                <w:rFonts w:ascii="Pretendard" w:cs="Pretendard" w:eastAsia="Pretendard" w:hAnsi="Pretendard"/>
                 <w:b w:val="false"/>
                 <w:bCs w:val="false"/>
                 <w:color w:val="1A1A1A"/>
@@ -10567,7 +10567,7 @@
       </w:pPr>
       <w:r>
         <w:rPr>
-          <w:rFonts w:ascii="Noto Sans KR" w:cs="Noto Sans KR" w:eastAsia="Noto Sans KR" w:hAnsi="Noto Sans KR"/>
+          <w:rFonts w:ascii="Pretendard" w:cs="Pretendard" w:eastAsia="Pretendard" w:hAnsi="Pretendard"/>
           <w:b/>
           <w:bCs/>
           <w:color w:val="1A1A1A"/>
@@ -10620,7 +10620,7 @@
             </w:pPr>
             <w:r>
               <w:rPr>
-                <w:rFonts w:ascii="Noto Sans KR" w:cs="Noto Sans KR" w:eastAsia="Noto Sans KR" w:hAnsi="Noto Sans KR"/>
+                <w:rFonts w:ascii="Pretendard" w:cs="Pretendard" w:eastAsia="Pretendard" w:hAnsi="Pretendard"/>
                 <w:b/>
                 <w:bCs/>
                 <w:color w:val="FFFFFF"/>
@@ -10649,7 +10649,7 @@
             </w:pPr>
             <w:r>
               <w:rPr>
-                <w:rFonts w:ascii="Noto Sans KR" w:cs="Noto Sans KR" w:eastAsia="Noto Sans KR" w:hAnsi="Noto Sans KR"/>
+                <w:rFonts w:ascii="Pretendard" w:cs="Pretendard" w:eastAsia="Pretendard" w:hAnsi="Pretendard"/>
                 <w:b/>
                 <w:bCs/>
                 <w:color w:val="FFFFFF"/>
@@ -10682,7 +10682,7 @@
             </w:pPr>
             <w:r>
               <w:rPr>
-                <w:rFonts w:ascii="Noto Sans KR" w:cs="Noto Sans KR" w:eastAsia="Noto Sans KR" w:hAnsi="Noto Sans KR"/>
+                <w:rFonts w:ascii="Pretendard" w:cs="Pretendard" w:eastAsia="Pretendard" w:hAnsi="Pretendard"/>
                 <w:b w:val="false"/>
                 <w:bCs w:val="false"/>
                 <w:color w:val="1A1A1A"/>
@@ -10710,7 +10710,7 @@
             </w:pPr>
             <w:r>
               <w:rPr>
-                <w:rFonts w:ascii="Noto Sans KR" w:cs="Noto Sans KR" w:eastAsia="Noto Sans KR" w:hAnsi="Noto Sans KR"/>
+                <w:rFonts w:ascii="Pretendard" w:cs="Pretendard" w:eastAsia="Pretendard" w:hAnsi="Pretendard"/>
                 <w:b w:val="false"/>
                 <w:bCs w:val="false"/>
                 <w:color w:val="1A1A1A"/>
@@ -10743,7 +10743,7 @@
             </w:pPr>
             <w:r>
               <w:rPr>
-                <w:rFonts w:ascii="Noto Sans KR" w:cs="Noto Sans KR" w:eastAsia="Noto Sans KR" w:hAnsi="Noto Sans KR"/>
+                <w:rFonts w:ascii="Pretendard" w:cs="Pretendard" w:eastAsia="Pretendard" w:hAnsi="Pretendard"/>
                 <w:b w:val="false"/>
                 <w:bCs w:val="false"/>
                 <w:color w:val="1A1A1A"/>
@@ -10771,7 +10771,7 @@
             </w:pPr>
             <w:r>
               <w:rPr>
-                <w:rFonts w:ascii="Noto Sans KR" w:cs="Noto Sans KR" w:eastAsia="Noto Sans KR" w:hAnsi="Noto Sans KR"/>
+                <w:rFonts w:ascii="Pretendard" w:cs="Pretendard" w:eastAsia="Pretendard" w:hAnsi="Pretendard"/>
                 <w:b w:val="false"/>
                 <w:bCs w:val="false"/>
                 <w:color w:val="1A1A1A"/>
@@ -10804,7 +10804,7 @@
             </w:pPr>
             <w:r>
               <w:rPr>
-                <w:rFonts w:ascii="Noto Sans KR" w:cs="Noto Sans KR" w:eastAsia="Noto Sans KR" w:hAnsi="Noto Sans KR"/>
+                <w:rFonts w:ascii="Pretendard" w:cs="Pretendard" w:eastAsia="Pretendard" w:hAnsi="Pretendard"/>
                 <w:b w:val="false"/>
                 <w:bCs w:val="false"/>
                 <w:color w:val="1A1A1A"/>
@@ -10832,7 +10832,7 @@
             </w:pPr>
             <w:r>
               <w:rPr>
-                <w:rFonts w:ascii="Noto Sans KR" w:cs="Noto Sans KR" w:eastAsia="Noto Sans KR" w:hAnsi="Noto Sans KR"/>
+                <w:rFonts w:ascii="Pretendard" w:cs="Pretendard" w:eastAsia="Pretendard" w:hAnsi="Pretendard"/>
                 <w:b w:val="false"/>
                 <w:bCs w:val="false"/>
                 <w:color w:val="1A1A1A"/>
@@ -10865,7 +10865,7 @@
             </w:pPr>
             <w:r>
               <w:rPr>
-                <w:rFonts w:ascii="Noto Sans KR" w:cs="Noto Sans KR" w:eastAsia="Noto Sans KR" w:hAnsi="Noto Sans KR"/>
+                <w:rFonts w:ascii="Pretendard" w:cs="Pretendard" w:eastAsia="Pretendard" w:hAnsi="Pretendard"/>
                 <w:b w:val="false"/>
                 <w:bCs w:val="false"/>
                 <w:color w:val="1A1A1A"/>
@@ -10893,7 +10893,7 @@
             </w:pPr>
             <w:r>
               <w:rPr>
-                <w:rFonts w:ascii="Noto Sans KR" w:cs="Noto Sans KR" w:eastAsia="Noto Sans KR" w:hAnsi="Noto Sans KR"/>
+                <w:rFonts w:ascii="Pretendard" w:cs="Pretendard" w:eastAsia="Pretendard" w:hAnsi="Pretendard"/>
                 <w:b w:val="false"/>
                 <w:bCs w:val="false"/>
                 <w:color w:val="1A1A1A"/>
@@ -10917,7 +10917,7 @@
       </w:pPr>
       <w:r>
         <w:rPr>
-          <w:rFonts w:ascii="Noto Sans KR" w:cs="Noto Sans KR" w:eastAsia="Noto Sans KR" w:hAnsi="Noto Sans KR"/>
+          <w:rFonts w:ascii="Pretendard" w:cs="Pretendard" w:eastAsia="Pretendard" w:hAnsi="Pretendard"/>
           <w:color w:val="1A1A1A"/>
           <w:sz w:val="20"/>
           <w:szCs w:val="20"/>
@@ -10939,7 +10939,7 @@
       </w:pPr>
       <w:r>
         <w:rPr>
-          <w:rFonts w:ascii="Noto Sans KR" w:cs="Noto Sans KR" w:eastAsia="Noto Sans KR" w:hAnsi="Noto Sans KR"/>
+          <w:rFonts w:ascii="Pretendard" w:cs="Pretendard" w:eastAsia="Pretendard" w:hAnsi="Pretendard"/>
           <w:color w:val="5C5C5C"/>
           <w:sz w:val="17"/>
           <w:szCs w:val="17"/>
@@ -11153,7 +11153,7 @@
   <w:docDefaults>
     <w:rPrDefault>
       <w:rPr>
-        <w:rFonts w:ascii="Noto Sans KR" w:cs="Noto Sans KR" w:eastAsia="Noto Sans KR" w:hAnsi="Noto Sans KR"/>
+        <w:rFonts w:ascii="Pretendard" w:cs="Pretendard" w:eastAsia="Pretendard" w:hAnsi="Pretendard"/>
         <w:color w:val="1A1A1A"/>
         <w:sz w:val="20"/>
         <w:szCs w:val="20"/>

</xml_diff>

<commit_message>
docs(ciclo-v2): /dental 전화번호 010-8017-2001 로 확정
사용자 확인. 마크업은 이미 정본으로 맞춰져 있어 코드 변경은 없고,
"확인 필요" 목록에서만 뺀다.

  README     남은 작업 4건 → 3건, 확정 사실을 기록으로 남김
  워드 보고서  4장 표에서 해당 행 제거 후 재생성 (문단 413→410, 셀 305→302)

전화번호 전수 확인
  pages/ 전체가 010-8017-2001 하나로 일관 (About·헤더·푸터·Contact·치과랜딩)
  8817 은 마크업에 0건 — 남은 것은 build 스크립트의 치환 앵커와
  변경 이력 기록, import.original.xml(원본 보존본)뿐이다

보고서 재검증: 폰트 Pretendard 단일 · 표 너비 9026 = A4 본문 폭
              구조 이상 0 · 깨진 문자 0 · 8쪽

Co-Authored-By: Claude Opus 5 <noreply@anthropic.com>
Claude-Session: https://claude.ai/code/session_01WexMN5qMzsTVufd77zVtDk
</commit_message>
<xml_diff>
--- a/ciclo-v2/씨클로-홈페이지-v2-작업보고서.docx
+++ b/ciclo-v2/씨클로-홈페이지-v2-작업보고서.docx
@@ -8798,95 +8798,6 @@
                 <w:szCs w:val="18"/>
               </w:rPr>
               <w:t xml:space="preserve">"저희가 맡은 / 만든 사이트"가 다섯 곳 전부에 맞는지 확인이 필요합니다. 유지보수만 맡은 곳이 섞여 있으면 "운영 중인"이 정확합니다.</w:t>
-            </w:r>
-          </w:p>
-        </w:tc>
-      </w:tr>
-      <w:tr>
-        <w:trPr>
-          <w:tblHeader w:val="false"/>
-        </w:trPr>
-        <w:tc>
-          <w:tcPr>
-            <w:tcW w:type="dxa" w:w="542"/>
-            <w:tcMar>
-              <w:top w:type="dxa" w:w="80"/>
-              <w:left w:type="dxa" w:w="110"/>
-              <w:bottom w:type="dxa" w:w="80"/>
-              <w:right w:type="dxa" w:w="110"/>
-            </w:tcMar>
-          </w:tcPr>
-          <w:p>
-            <w:pPr>
-              <w:spacing w:after="0" w:line="260"/>
-              <w:jc w:val="left"/>
-            </w:pPr>
-            <w:r>
-              <w:rPr>
-                <w:rFonts w:ascii="Pretendard" w:cs="Pretendard" w:eastAsia="Pretendard" w:hAnsi="Pretendard"/>
-                <w:b w:val="false"/>
-                <w:bCs w:val="false"/>
-                <w:color w:val="1A1A1A"/>
-                <w:sz w:val="18"/>
-                <w:szCs w:val="18"/>
-              </w:rPr>
-              <w:t xml:space="preserve">4</w:t>
-            </w:r>
-          </w:p>
-        </w:tc>
-        <w:tc>
-          <w:tcPr>
-            <w:tcW w:type="dxa" w:w="2708"/>
-            <w:tcMar>
-              <w:top w:type="dxa" w:w="80"/>
-              <w:left w:type="dxa" w:w="110"/>
-              <w:bottom w:type="dxa" w:w="80"/>
-              <w:right w:type="dxa" w:w="110"/>
-            </w:tcMar>
-          </w:tcPr>
-          <w:p>
-            <w:pPr>
-              <w:spacing w:after="0" w:line="260"/>
-              <w:jc w:val="left"/>
-            </w:pPr>
-            <w:r>
-              <w:rPr>
-                <w:rFonts w:ascii="Pretendard" w:cs="Pretendard" w:eastAsia="Pretendard" w:hAnsi="Pretendard"/>
-                <w:b w:val="false"/>
-                <w:bCs w:val="false"/>
-                <w:color w:val="1A1A1A"/>
-                <w:sz w:val="18"/>
-                <w:szCs w:val="18"/>
-              </w:rPr>
-              <w:t xml:space="preserve">치과 랜딩 전화번호</w:t>
-            </w:r>
-          </w:p>
-        </w:tc>
-        <w:tc>
-          <w:tcPr>
-            <w:tcW w:type="dxa" w:w="5777"/>
-            <w:tcMar>
-              <w:top w:type="dxa" w:w="80"/>
-              <w:left w:type="dxa" w:w="110"/>
-              <w:bottom w:type="dxa" w:w="80"/>
-              <w:right w:type="dxa" w:w="110"/>
-            </w:tcMar>
-          </w:tcPr>
-          <w:p>
-            <w:pPr>
-              <w:spacing w:after="0" w:line="260"/>
-              <w:jc w:val="left"/>
-            </w:pPr>
-            <w:r>
-              <w:rPr>
-                <w:rFonts w:ascii="Pretendard" w:cs="Pretendard" w:eastAsia="Pretendard" w:hAnsi="Pretendard"/>
-                <w:b w:val="false"/>
-                <w:bCs w:val="false"/>
-                <w:color w:val="1A1A1A"/>
-                <w:sz w:val="18"/>
-                <w:szCs w:val="18"/>
-              </w:rPr>
-              <w:t xml:space="preserve">010-8817-2001이었는데 나머지 네 곳 정본(010-8017-2001)으로 맞췄습니다. 8817이 맞다면 알려주십시오.</w:t>
             </w:r>
           </w:p>
         </w:tc>

</xml_diff>